<commit_message>
Make Word export read date-first for all CV entries
Previously \resumeSubheading expanded to 'title (date)', so entries with a
non-empty title showed the date trailing while Qualifikationen (empty title)
led with it. Lead with the date column (arg #2) uniformly so every entry in
the .docx reads date-first, matching the timeline ordering.

Co-Authored-By: Claude Opus 4.8 <noreply@anthropic.com>
</commit_message>
<xml_diff>
--- a/Helge_Kminek_Lebenslauf.docx
+++ b/Helge_Kminek_Lebenslauf.docx
@@ -105,8 +105,8 @@
       </w:pPr>
       <w:r>
         <w:rPr>
-          <w:i/>
-          <w:iCs/>
+          <w:b/>
+          <w:bCs/>
         </w:rPr>
         <w:t xml:space="preserve">05/2017</w:t>
       </w:r>
@@ -114,6 +114,10 @@
         <w:t xml:space="preserve"> </w:t>
       </w:r>
       <w:r>
+        <w:rPr>
+          <w:i/>
+          <w:iCs/>
+        </w:rPr>
         <w:t xml:space="preserve">Promotion: „Philosophie und Philosophieren im Unterricht. Empirische Erschließung einer widersprüchlichen Praxis.“ Goethe-Universität Frankfurt am Main.</w:t>
       </w:r>
     </w:p>
@@ -126,8 +130,8 @@
       </w:pPr>
       <w:r>
         <w:rPr>
-          <w:i/>
-          <w:iCs/>
+          <w:b/>
+          <w:bCs/>
         </w:rPr>
         <w:t xml:space="preserve">04/2010</w:t>
       </w:r>
@@ -135,6 +139,10 @@
         <w:t xml:space="preserve"> </w:t>
       </w:r>
       <w:r>
+        <w:rPr>
+          <w:i/>
+          <w:iCs/>
+        </w:rPr>
         <w:t xml:space="preserve">Staatsexamen für das Lehramt an Gymnasien mit den Fächern: Politik und Wirtschaft, Philosophie und Ethik, Goethe-Universität Frankfurt am Main.</w:t>
       </w:r>
     </w:p>
@@ -147,8 +155,8 @@
       </w:pPr>
       <w:r>
         <w:rPr>
-          <w:i/>
-          <w:iCs/>
+          <w:b/>
+          <w:bCs/>
         </w:rPr>
         <w:t xml:space="preserve">10/2006</w:t>
       </w:r>
@@ -156,6 +164,10 @@
         <w:t xml:space="preserve"> </w:t>
       </w:r>
       <w:r>
+        <w:rPr>
+          <w:i/>
+          <w:iCs/>
+        </w:rPr>
         <w:t xml:space="preserve">Diplom in Pädagogik, Goethe-Universität Frankfurt am Main.</w:t>
       </w:r>
     </w:p>
@@ -171,23 +183,13 @@
           <w:b/>
           <w:bCs/>
         </w:rPr>
+        <w:t xml:space="preserve">06/1999</w:t>
+      </w:r>
+      <w:r>
+        <w:t xml:space="preserve"> </w:t>
+      </w:r>
+      <w:r>
         <w:t xml:space="preserve">Abitur, Goethe Gymnasium Neu-Isenburg.</w:t>
-      </w:r>
-      <w:r>
-        <w:t xml:space="preserve"> </w:t>
-      </w:r>
-      <w:r>
-        <w:t xml:space="preserve">(</w:t>
-      </w:r>
-      <w:r>
-        <w:rPr>
-          <w:i/>
-          <w:iCs/>
-        </w:rPr>
-        <w:t xml:space="preserve">06/1999</w:t>
-      </w:r>
-      <w:r>
-        <w:t xml:space="preserve">)</w:t>
       </w:r>
     </w:p>
     <w:bookmarkEnd w:id="24"/>
@@ -212,28 +214,22 @@
           <w:b/>
           <w:bCs/>
         </w:rPr>
+        <w:t xml:space="preserve">seit 04/2024</w:t>
+      </w:r>
+      <w:r>
+        <w:t xml:space="preserve"> </w:t>
+      </w:r>
+      <w:r>
         <w:t xml:space="preserve">Alpen-Adria-Universität Klagenfurt, Institut für Unterrichts- und Schulentwicklung</w:t>
       </w:r>
       <w:r>
         <w:t xml:space="preserve"> </w:t>
       </w:r>
       <w:r>
-        <w:t xml:space="preserve">(</w:t>
-      </w:r>
-      <w:r>
-        <w:rPr>
-          <w:i/>
-          <w:iCs/>
-        </w:rPr>
-        <w:t xml:space="preserve">seit 04/2024</w:t>
-      </w:r>
-      <w:r>
-        <w:t xml:space="preserve">)</w:t>
-      </w:r>
-      <w:r>
-        <w:t xml:space="preserve"> </w:t>
-      </w:r>
-      <w:r>
+        <w:rPr>
+          <w:i/>
+          <w:iCs/>
+        </w:rPr>
         <w:t xml:space="preserve">Senior Scientist</w:t>
       </w:r>
     </w:p>
@@ -249,28 +245,22 @@
           <w:b/>
           <w:bCs/>
         </w:rPr>
+        <w:t xml:space="preserve">04/2021–03/2024</w:t>
+      </w:r>
+      <w:r>
+        <w:t xml:space="preserve"> </w:t>
+      </w:r>
+      <w:r>
         <w:t xml:space="preserve">Goethe-Universität, Fachbereich Erziehungswissenschaften</w:t>
       </w:r>
       <w:r>
         <w:t xml:space="preserve"> </w:t>
       </w:r>
       <w:r>
-        <w:t xml:space="preserve">(</w:t>
-      </w:r>
-      <w:r>
-        <w:rPr>
-          <w:i/>
-          <w:iCs/>
-        </w:rPr>
-        <w:t xml:space="preserve">04/2021–03/2024</w:t>
-      </w:r>
-      <w:r>
-        <w:t xml:space="preserve">)</w:t>
-      </w:r>
-      <w:r>
-        <w:t xml:space="preserve"> </w:t>
-      </w:r>
-      <w:r>
+        <w:rPr>
+          <w:i/>
+          <w:iCs/>
+        </w:rPr>
         <w:t xml:space="preserve">Wissenschaftlicher Mitarbeiter</w:t>
       </w:r>
     </w:p>
@@ -286,28 +276,22 @@
           <w:b/>
           <w:bCs/>
         </w:rPr>
+        <w:t xml:space="preserve">10/2019–03/2021</w:t>
+      </w:r>
+      <w:r>
+        <w:t xml:space="preserve"> </w:t>
+      </w:r>
+      <w:r>
         <w:t xml:space="preserve">Goethe-Universität, Fachbereich Erziehungswissenschaften</w:t>
       </w:r>
       <w:r>
         <w:t xml:space="preserve"> </w:t>
       </w:r>
       <w:r>
-        <w:t xml:space="preserve">(</w:t>
-      </w:r>
-      <w:r>
-        <w:rPr>
-          <w:i/>
-          <w:iCs/>
-        </w:rPr>
-        <w:t xml:space="preserve">10/2019–03/2021</w:t>
-      </w:r>
-      <w:r>
-        <w:t xml:space="preserve">)</w:t>
-      </w:r>
-      <w:r>
-        <w:t xml:space="preserve"> </w:t>
-      </w:r>
-      <w:r>
+        <w:rPr>
+          <w:i/>
+          <w:iCs/>
+        </w:rPr>
         <w:t xml:space="preserve">Vertretung der W3-Professur „Sozialpädagogik und Familienforschung“</w:t>
       </w:r>
     </w:p>
@@ -323,28 +307,22 @@
           <w:b/>
           <w:bCs/>
         </w:rPr>
+        <w:t xml:space="preserve">10/2013–09/2019</w:t>
+      </w:r>
+      <w:r>
+        <w:t xml:space="preserve"> </w:t>
+      </w:r>
+      <w:r>
         <w:t xml:space="preserve">Goethe-Universität, Fachbereich Erziehungswissenschaften</w:t>
       </w:r>
       <w:r>
         <w:t xml:space="preserve"> </w:t>
       </w:r>
       <w:r>
-        <w:t xml:space="preserve">(</w:t>
-      </w:r>
-      <w:r>
-        <w:rPr>
-          <w:i/>
-          <w:iCs/>
-        </w:rPr>
-        <w:t xml:space="preserve">10/2013–09/2019</w:t>
-      </w:r>
-      <w:r>
-        <w:t xml:space="preserve">)</w:t>
-      </w:r>
-      <w:r>
-        <w:t xml:space="preserve"> </w:t>
-      </w:r>
-      <w:r>
+        <w:rPr>
+          <w:i/>
+          <w:iCs/>
+        </w:rPr>
         <w:t xml:space="preserve">Wissenschaftlicher Mitarbeiter</w:t>
       </w:r>
     </w:p>
@@ -360,28 +338,22 @@
           <w:b/>
           <w:bCs/>
         </w:rPr>
+        <w:t xml:space="preserve">2012–2013</w:t>
+      </w:r>
+      <w:r>
+        <w:t xml:space="preserve"> </w:t>
+      </w:r>
+      <w:r>
         <w:t xml:space="preserve">Goethe-Universität, Fachbereich Erziehungswissenschaften</w:t>
       </w:r>
       <w:r>
         <w:t xml:space="preserve"> </w:t>
       </w:r>
       <w:r>
-        <w:t xml:space="preserve">(</w:t>
-      </w:r>
-      <w:r>
-        <w:rPr>
-          <w:i/>
-          <w:iCs/>
-        </w:rPr>
-        <w:t xml:space="preserve">2012–2013</w:t>
-      </w:r>
-      <w:r>
-        <w:t xml:space="preserve">)</w:t>
-      </w:r>
-      <w:r>
-        <w:t xml:space="preserve"> </w:t>
-      </w:r>
-      <w:r>
+        <w:rPr>
+          <w:i/>
+          <w:iCs/>
+        </w:rPr>
         <w:t xml:space="preserve">Wissenschaftliche Hilfskraft</w:t>
       </w:r>
     </w:p>
@@ -397,28 +369,22 @@
           <w:b/>
           <w:bCs/>
         </w:rPr>
+        <w:t xml:space="preserve">2010–2012</w:t>
+      </w:r>
+      <w:r>
+        <w:t xml:space="preserve"> </w:t>
+      </w:r>
+      <w:r>
         <w:t xml:space="preserve">Studienseminar Offenbach, Stadthof 13, 63065 Offenbach</w:t>
       </w:r>
       <w:r>
         <w:t xml:space="preserve"> </w:t>
       </w:r>
       <w:r>
-        <w:t xml:space="preserve">(</w:t>
-      </w:r>
-      <w:r>
-        <w:rPr>
-          <w:i/>
-          <w:iCs/>
-        </w:rPr>
-        <w:t xml:space="preserve">2010–2012</w:t>
-      </w:r>
-      <w:r>
-        <w:t xml:space="preserve">)</w:t>
-      </w:r>
-      <w:r>
-        <w:t xml:space="preserve"> </w:t>
-      </w:r>
-      <w:r>
+        <w:rPr>
+          <w:i/>
+          <w:iCs/>
+        </w:rPr>
         <w:t xml:space="preserve">Studienreferendar für das Lehramt an Gymnasien</w:t>
       </w:r>
     </w:p>
@@ -434,28 +400,22 @@
           <w:b/>
           <w:bCs/>
         </w:rPr>
+        <w:t xml:space="preserve">2009–2010</w:t>
+      </w:r>
+      <w:r>
+        <w:t xml:space="preserve"> </w:t>
+      </w:r>
+      <w:r>
         <w:t xml:space="preserve">Goethe-Universität, Zentrum für Lehrerbildung</w:t>
       </w:r>
       <w:r>
         <w:t xml:space="preserve"> </w:t>
       </w:r>
       <w:r>
-        <w:t xml:space="preserve">(</w:t>
-      </w:r>
-      <w:r>
-        <w:rPr>
-          <w:i/>
-          <w:iCs/>
-        </w:rPr>
-        <w:t xml:space="preserve">2009–2010</w:t>
-      </w:r>
-      <w:r>
-        <w:t xml:space="preserve">)</w:t>
-      </w:r>
-      <w:r>
-        <w:t xml:space="preserve"> </w:t>
-      </w:r>
-      <w:r>
+        <w:rPr>
+          <w:i/>
+          <w:iCs/>
+        </w:rPr>
         <w:t xml:space="preserve">Wissenschaftliche Hilfskraft</w:t>
       </w:r>
     </w:p>
@@ -471,28 +431,22 @@
           <w:b/>
           <w:bCs/>
         </w:rPr>
+        <w:t xml:space="preserve">2002–2010</w:t>
+      </w:r>
+      <w:r>
+        <w:t xml:space="preserve"> </w:t>
+      </w:r>
+      <w:r>
         <w:t xml:space="preserve">Verein für Psychotherapie, Beratung und Heilpädagogik, Alexanderstr. 29, 60489 Frankfurt</w:t>
       </w:r>
       <w:r>
         <w:t xml:space="preserve"> </w:t>
       </w:r>
       <w:r>
-        <w:t xml:space="preserve">(</w:t>
-      </w:r>
-      <w:r>
-        <w:rPr>
-          <w:i/>
-          <w:iCs/>
-        </w:rPr>
-        <w:t xml:space="preserve">2002–2010</w:t>
-      </w:r>
-      <w:r>
-        <w:t xml:space="preserve">)</w:t>
-      </w:r>
-      <w:r>
-        <w:t xml:space="preserve"> </w:t>
-      </w:r>
-      <w:r>
+        <w:rPr>
+          <w:i/>
+          <w:iCs/>
+        </w:rPr>
         <w:t xml:space="preserve">Pädagogischer Mitarbeiter</w:t>
       </w:r>
     </w:p>
@@ -508,28 +462,22 @@
           <w:b/>
           <w:bCs/>
         </w:rPr>
+        <w:t xml:space="preserve">1999–2002</w:t>
+      </w:r>
+      <w:r>
+        <w:t xml:space="preserve"> </w:t>
+      </w:r>
+      <w:r>
         <w:t xml:space="preserve">Heilpädagogisches Institut Vincenzhaus, Schule für Erziehungshilfe und Kranke, Vincenzstr. 29, 65719 Hofheim</w:t>
       </w:r>
       <w:r>
         <w:t xml:space="preserve"> </w:t>
       </w:r>
       <w:r>
-        <w:t xml:space="preserve">(</w:t>
-      </w:r>
-      <w:r>
-        <w:rPr>
-          <w:i/>
-          <w:iCs/>
-        </w:rPr>
-        <w:t xml:space="preserve">1999–2002</w:t>
-      </w:r>
-      <w:r>
-        <w:t xml:space="preserve">)</w:t>
-      </w:r>
-      <w:r>
-        <w:t xml:space="preserve"> </w:t>
-      </w:r>
-      <w:r>
+        <w:rPr>
+          <w:i/>
+          <w:iCs/>
+        </w:rPr>
         <w:t xml:space="preserve">Zivildienst und Pädagogischer Mitarbeiter</w:t>
       </w:r>
     </w:p>
@@ -1634,8 +1582,8 @@
       </w:pPr>
       <w:r>
         <w:rPr>
-          <w:i/>
-          <w:iCs/>
+          <w:b/>
+          <w:bCs/>
         </w:rPr>
         <w:t xml:space="preserve">Herbstsem. 2017</w:t>
       </w:r>
@@ -1643,6 +1591,10 @@
         <w:t xml:space="preserve"> </w:t>
       </w:r>
       <w:r>
+        <w:rPr>
+          <w:i/>
+          <w:iCs/>
+        </w:rPr>
         <w:t xml:space="preserve">Praktikumsbegleitendes Seminar. Universität Flensburg, Philosophisches Seminar.</w:t>
       </w:r>
     </w:p>
@@ -1655,8 +1607,8 @@
       </w:pPr>
       <w:r>
         <w:rPr>
-          <w:i/>
-          <w:iCs/>
+          <w:b/>
+          <w:bCs/>
         </w:rPr>
         <w:t xml:space="preserve">Frühjahrssem. 2019</w:t>
       </w:r>
@@ -1664,6 +1616,10 @@
         <w:t xml:space="preserve"> </w:t>
       </w:r>
       <w:r>
+        <w:rPr>
+          <w:i/>
+          <w:iCs/>
+        </w:rPr>
         <w:t xml:space="preserve">Übergang in eine transformierte Gesellschaft in und durch Bildung für nachhaltige Entwicklung in Schule und Unterricht. Universität Flensburg, Institut für Erziehungswissenschaften.</w:t>
       </w:r>
     </w:p>
@@ -1676,8 +1632,8 @@
       </w:pPr>
       <w:r>
         <w:rPr>
-          <w:i/>
-          <w:iCs/>
+          <w:b/>
+          <w:bCs/>
         </w:rPr>
         <w:t xml:space="preserve">Sommersem. 2019</w:t>
       </w:r>
@@ -1685,6 +1641,10 @@
         <w:t xml:space="preserve"> </w:t>
       </w:r>
       <w:r>
+        <w:rPr>
+          <w:i/>
+          <w:iCs/>
+        </w:rPr>
         <w:t xml:space="preserve">Erziehung zur Mündigkeit. Universität Flensburg, Institut für Erziehungswissenschaften; Bildung für nachhaltige Entwicklung. Universität Klagenfurt (Österreich); Unterricht beobachten, rekonstruieren, initiieren. Universität Mainz.</w:t>
       </w:r>
     </w:p>
@@ -3092,28 +3052,22 @@
           <w:b/>
           <w:bCs/>
         </w:rPr>
+        <w:t xml:space="preserve">2013–2015, Frankfurt</w:t>
+      </w:r>
+      <w:r>
+        <w:t xml:space="preserve"> </w:t>
+      </w:r>
+      <w:r>
         <w:t xml:space="preserve">Kolloquium</w:t>
       </w:r>
       <w:r>
         <w:t xml:space="preserve"> </w:t>
       </w:r>
       <w:r>
-        <w:t xml:space="preserve">(</w:t>
-      </w:r>
-      <w:r>
-        <w:rPr>
-          <w:i/>
-          <w:iCs/>
-        </w:rPr>
-        <w:t xml:space="preserve">2013–2015, Frankfurt</w:t>
-      </w:r>
-      <w:r>
-        <w:t xml:space="preserve">)</w:t>
-      </w:r>
-      <w:r>
-        <w:t xml:space="preserve"> </w:t>
-      </w:r>
-      <w:r>
+        <w:rPr>
+          <w:i/>
+          <w:iCs/>
+        </w:rPr>
         <w:t xml:space="preserve">Kolloquium der Fachdidaktiken der Goethe-Universität Frankfurt am Main (halbjährlich)</w:t>
       </w:r>
       <w:r>
@@ -3139,28 +3093,22 @@
           <w:b/>
           <w:bCs/>
         </w:rPr>
+        <w:t xml:space="preserve">2014–2018, Frankfurt</w:t>
+      </w:r>
+      <w:r>
+        <w:t xml:space="preserve"> </w:t>
+      </w:r>
+      <w:r>
         <w:t xml:space="preserve">Arbeitstagung</w:t>
       </w:r>
       <w:r>
         <w:t xml:space="preserve"> </w:t>
       </w:r>
       <w:r>
-        <w:t xml:space="preserve">(</w:t>
-      </w:r>
-      <w:r>
-        <w:rPr>
-          <w:i/>
-          <w:iCs/>
-        </w:rPr>
-        <w:t xml:space="preserve">2014–2018, Frankfurt</w:t>
-      </w:r>
-      <w:r>
-        <w:t xml:space="preserve">)</w:t>
-      </w:r>
-      <w:r>
-        <w:t xml:space="preserve"> </w:t>
-      </w:r>
-      <w:r>
+        <w:rPr>
+          <w:i/>
+          <w:iCs/>
+        </w:rPr>
         <w:t xml:space="preserve">1.–5. Arbeitstagung für Doktorand_innen und Habilitand_innen der Philosophiedidaktik (jährlich)</w:t>
       </w:r>
       <w:r>
@@ -3186,28 +3134,22 @@
           <w:b/>
           <w:bCs/>
         </w:rPr>
+        <w:t xml:space="preserve">Juni 2016</w:t>
+      </w:r>
+      <w:r>
+        <w:t xml:space="preserve"> </w:t>
+      </w:r>
+      <w:r>
         <w:t xml:space="preserve">Int. Arbeitstagung Philosophiedidaktik</w:t>
       </w:r>
       <w:r>
         <w:t xml:space="preserve"> </w:t>
       </w:r>
       <w:r>
-        <w:t xml:space="preserve">(</w:t>
-      </w:r>
-      <w:r>
-        <w:rPr>
-          <w:i/>
-          <w:iCs/>
-        </w:rPr>
-        <w:t xml:space="preserve">Juni 2016</w:t>
-      </w:r>
-      <w:r>
-        <w:t xml:space="preserve">)</w:t>
-      </w:r>
-      <w:r>
-        <w:t xml:space="preserve"> </w:t>
-      </w:r>
-      <w:r>
+        <w:rPr>
+          <w:i/>
+          <w:iCs/>
+        </w:rPr>
         <w:t xml:space="preserve">1. Internationale Arbeitstagung der Philosophiedidaktik: Zwischen Präskription und Deskription</w:t>
       </w:r>
       <w:r>
@@ -3233,39 +3175,74 @@
           <w:b/>
           <w:bCs/>
         </w:rPr>
+        <w:t xml:space="preserve">Sept. 2018</w:t>
+      </w:r>
+      <w:r>
+        <w:t xml:space="preserve"> </w:t>
+      </w:r>
+      <w:r>
         <w:t xml:space="preserve">Kommissionstagung Grundschulforschung (DGfE)</w:t>
       </w:r>
       <w:r>
         <w:t xml:space="preserve"> </w:t>
       </w:r>
       <w:r>
-        <w:t xml:space="preserve">(</w:t>
-      </w:r>
-      <w:r>
-        <w:rPr>
-          <w:i/>
-          <w:iCs/>
+        <w:rPr>
+          <w:i/>
+          <w:iCs/>
+        </w:rPr>
+        <w:t xml:space="preserve">Grundschulforschungstagung 2018: Diversität und soziale Ungleichheit</w:t>
+      </w:r>
+      <w:r>
+        <w:t xml:space="preserve"> </w:t>
+      </w:r>
+      <w:r>
+        <w:rPr>
+          <w:i/>
+          <w:iCs/>
+        </w:rPr>
+        <w:t xml:space="preserve">Gutachtertätigkeit</w:t>
+      </w:r>
+    </w:p>
+    <w:p>
+      <w:pPr>
+        <w:numPr>
+          <w:ilvl w:val="0"/>
+          <w:numId w:val="1041"/>
+        </w:numPr>
+      </w:pPr>
+      <w:r>
+        <w:rPr>
+          <w:b/>
+          <w:bCs/>
         </w:rPr>
         <w:t xml:space="preserve">Sept. 2018</w:t>
       </w:r>
       <w:r>
-        <w:t xml:space="preserve">)</w:t>
-      </w:r>
-      <w:r>
-        <w:t xml:space="preserve"> </w:t>
-      </w:r>
-      <w:r>
-        <w:t xml:space="preserve">Grundschulforschungstagung 2018: Diversität und soziale Ungleichheit</w:t>
-      </w:r>
-      <w:r>
-        <w:t xml:space="preserve"> </w:t>
-      </w:r>
-      <w:r>
-        <w:rPr>
-          <w:i/>
-          <w:iCs/>
-        </w:rPr>
-        <w:t xml:space="preserve">Gutachtertätigkeit</w:t>
+        <w:t xml:space="preserve"> </w:t>
+      </w:r>
+      <w:r>
+        <w:t xml:space="preserve">Kommissionstagung Schulforschung u. Didaktik (DGfE)</w:t>
+      </w:r>
+      <w:r>
+        <w:t xml:space="preserve"> </w:t>
+      </w:r>
+      <w:r>
+        <w:rPr>
+          <w:i/>
+          <w:iCs/>
+        </w:rPr>
+        <w:t xml:space="preserve">Transnationale Perspektiven auf Schule und Bildung</w:t>
+      </w:r>
+      <w:r>
+        <w:t xml:space="preserve"> </w:t>
+      </w:r>
+      <w:r>
+        <w:rPr>
+          <w:i/>
+          <w:iCs/>
+        </w:rPr>
+        <w:t xml:space="preserve">Mitglied des Organisationsteams, inkl. Begutachtung der Einreichungen</w:t>
       </w:r>
     </w:p>
     <w:p>
@@ -3280,29 +3257,23 @@
           <w:b/>
           <w:bCs/>
         </w:rPr>
-        <w:t xml:space="preserve">Kommissionstagung Schulforschung u. Didaktik (DGfE)</w:t>
-      </w:r>
-      <w:r>
-        <w:t xml:space="preserve"> </w:t>
-      </w:r>
-      <w:r>
-        <w:t xml:space="preserve">(</w:t>
-      </w:r>
-      <w:r>
-        <w:rPr>
-          <w:i/>
-          <w:iCs/>
-        </w:rPr>
-        <w:t xml:space="preserve">Sept. 2018</w:t>
-      </w:r>
-      <w:r>
-        <w:t xml:space="preserve">)</w:t>
-      </w:r>
-      <w:r>
-        <w:t xml:space="preserve"> </w:t>
-      </w:r>
-      <w:r>
-        <w:t xml:space="preserve">Transnationale Perspektiven auf Schule und Bildung</w:t>
+        <w:t xml:space="preserve">Herbst 2019, Universität Mainz</w:t>
+      </w:r>
+      <w:r>
+        <w:t xml:space="preserve"> </w:t>
+      </w:r>
+      <w:r>
+        <w:t xml:space="preserve">Arbeitstagung</w:t>
+      </w:r>
+      <w:r>
+        <w:t xml:space="preserve"> </w:t>
+      </w:r>
+      <w:r>
+        <w:rPr>
+          <w:i/>
+          <w:iCs/>
+        </w:rPr>
+        <w:t xml:space="preserve">11. Tagung der AG Kasuistik in der Lehrer_innenbildung (SIG der DGfE)</w:t>
       </w:r>
       <w:r>
         <w:t xml:space="preserve"> </w:t>
@@ -3327,29 +3298,146 @@
           <w:b/>
           <w:bCs/>
         </w:rPr>
-        <w:t xml:space="preserve">Arbeitstagung</w:t>
-      </w:r>
-      <w:r>
-        <w:t xml:space="preserve"> </w:t>
-      </w:r>
-      <w:r>
-        <w:t xml:space="preserve">(</w:t>
-      </w:r>
-      <w:r>
-        <w:rPr>
-          <w:i/>
-          <w:iCs/>
-        </w:rPr>
-        <w:t xml:space="preserve">Herbst 2019, Universität Mainz</w:t>
-      </w:r>
-      <w:r>
-        <w:t xml:space="preserve">)</w:t>
-      </w:r>
-      <w:r>
-        <w:t xml:space="preserve"> </w:t>
-      </w:r>
-      <w:r>
-        <w:t xml:space="preserve">11. Tagung der AG Kasuistik in der Lehrer_innenbildung (SIG der DGfE)</w:t>
+        <w:t xml:space="preserve">2021–2022</w:t>
+      </w:r>
+      <w:r>
+        <w:t xml:space="preserve"> </w:t>
+      </w:r>
+      <w:r>
+        <w:t xml:space="preserve">Vortragsreihe</w:t>
+      </w:r>
+      <w:r>
+        <w:t xml:space="preserve"> </w:t>
+      </w:r>
+      <w:r>
+        <w:rPr>
+          <w:i/>
+          <w:iCs/>
+        </w:rPr>
+        <w:t xml:space="preserve">Planetary Thinking (interdisziplinäre Arbeitsgruppe, Goethe-Universität)</w:t>
+      </w:r>
+      <w:r>
+        <w:t xml:space="preserve"> </w:t>
+      </w:r>
+      <w:r>
+        <w:rPr>
+          <w:i/>
+          <w:iCs/>
+        </w:rPr>
+        <w:t xml:space="preserve">Mitglied des Organisationsteams, eigener Vortrag (02/2022)</w:t>
+      </w:r>
+    </w:p>
+    <w:p>
+      <w:pPr>
+        <w:numPr>
+          <w:ilvl w:val="0"/>
+          <w:numId w:val="1041"/>
+        </w:numPr>
+      </w:pPr>
+      <w:r>
+        <w:rPr>
+          <w:b/>
+          <w:bCs/>
+        </w:rPr>
+        <w:t xml:space="preserve">07/2021</w:t>
+      </w:r>
+      <w:r>
+        <w:t xml:space="preserve"> </w:t>
+      </w:r>
+      <w:r>
+        <w:t xml:space="preserve">Workshop</w:t>
+      </w:r>
+      <w:r>
+        <w:t xml:space="preserve"> </w:t>
+      </w:r>
+      <w:r>
+        <w:rPr>
+          <w:i/>
+          <w:iCs/>
+        </w:rPr>
+        <w:t xml:space="preserve">Planetary Boundaries – between Facts and Norms (mit Forschungskolleg Humanwissenschaften, Bad Homburg)</w:t>
+      </w:r>
+      <w:r>
+        <w:t xml:space="preserve"> </w:t>
+      </w:r>
+      <w:r>
+        <w:rPr>
+          <w:i/>
+          <w:iCs/>
+        </w:rPr>
+        <w:t xml:space="preserve">Mitglied des Organisationsteams</w:t>
+      </w:r>
+    </w:p>
+    <w:p>
+      <w:pPr>
+        <w:numPr>
+          <w:ilvl w:val="0"/>
+          <w:numId w:val="1041"/>
+        </w:numPr>
+      </w:pPr>
+      <w:r>
+        <w:rPr>
+          <w:b/>
+          <w:bCs/>
+        </w:rPr>
+        <w:t xml:space="preserve">Sept. 2022</w:t>
+      </w:r>
+      <w:r>
+        <w:t xml:space="preserve"> </w:t>
+      </w:r>
+      <w:r>
+        <w:t xml:space="preserve">DGfE-BNE-Kommissionstagung 2022</w:t>
+      </w:r>
+      <w:r>
+        <w:t xml:space="preserve"> </w:t>
+      </w:r>
+      <w:r>
+        <w:rPr>
+          <w:i/>
+          <w:iCs/>
+        </w:rPr>
+        <w:t xml:space="preserve">„Ökologische, gesellschaftliche und individuelle Umbrüche und ihre Bedeutung für BNE“</w:t>
+      </w:r>
+      <w:r>
+        <w:t xml:space="preserve"> </w:t>
+      </w:r>
+      <w:r>
+        <w:rPr>
+          <w:i/>
+          <w:iCs/>
+        </w:rPr>
+        <w:t xml:space="preserve">Organisation, Durchführung</w:t>
+      </w:r>
+    </w:p>
+    <w:p>
+      <w:pPr>
+        <w:numPr>
+          <w:ilvl w:val="0"/>
+          <w:numId w:val="1041"/>
+        </w:numPr>
+      </w:pPr>
+      <w:r>
+        <w:rPr>
+          <w:b/>
+          <w:bCs/>
+        </w:rPr>
+        <w:t xml:space="preserve">Sept. 2023</w:t>
+      </w:r>
+      <w:r>
+        <w:t xml:space="preserve"> </w:t>
+      </w:r>
+      <w:r>
+        <w:t xml:space="preserve">DGfE-BNE-Kommissionstagung 2023</w:t>
+      </w:r>
+      <w:r>
+        <w:t xml:space="preserve"> </w:t>
+      </w:r>
+      <w:r>
+        <w:rPr>
+          <w:i/>
+          <w:iCs/>
+        </w:rPr>
+        <w:t xml:space="preserve">„Kontroversen und Debatten im Kontext von Bildung für nachhaltige Entwicklung“</w:t>
       </w:r>
       <w:r>
         <w:t xml:space="preserve"> </w:t>
@@ -3374,39 +3462,33 @@
           <w:b/>
           <w:bCs/>
         </w:rPr>
-        <w:t xml:space="preserve">Vortragsreihe</w:t>
-      </w:r>
-      <w:r>
-        <w:t xml:space="preserve"> </w:t>
-      </w:r>
-      <w:r>
-        <w:t xml:space="preserve">(</w:t>
-      </w:r>
-      <w:r>
-        <w:rPr>
-          <w:i/>
-          <w:iCs/>
-        </w:rPr>
-        <w:t xml:space="preserve">2021–2022</w:t>
-      </w:r>
-      <w:r>
-        <w:t xml:space="preserve">)</w:t>
-      </w:r>
-      <w:r>
-        <w:t xml:space="preserve"> </w:t>
-      </w:r>
-      <w:r>
-        <w:t xml:space="preserve">Planetary Thinking (interdisziplinäre Arbeitsgruppe, Goethe-Universität)</w:t>
-      </w:r>
-      <w:r>
-        <w:t xml:space="preserve"> </w:t>
-      </w:r>
-      <w:r>
-        <w:rPr>
-          <w:i/>
-          <w:iCs/>
-        </w:rPr>
-        <w:t xml:space="preserve">Mitglied des Organisationsteams, eigener Vortrag (02/2022)</w:t>
+        <w:t xml:space="preserve">18.–20.09.2024, Bamberg</w:t>
+      </w:r>
+      <w:r>
+        <w:t xml:space="preserve"> </w:t>
+      </w:r>
+      <w:r>
+        <w:t xml:space="preserve">Tagung/Konferenz</w:t>
+      </w:r>
+      <w:r>
+        <w:t xml:space="preserve"> </w:t>
+      </w:r>
+      <w:r>
+        <w:rPr>
+          <w:i/>
+          <w:iCs/>
+        </w:rPr>
+        <w:t xml:space="preserve">Areas of tension between education for sustainable development and the increasing differentiation of the field</w:t>
+      </w:r>
+      <w:r>
+        <w:t xml:space="preserve"> </w:t>
+      </w:r>
+      <w:r>
+        <w:rPr>
+          <w:i/>
+          <w:iCs/>
+        </w:rPr>
+        <w:t xml:space="preserve">Mitglied des Organisationsteams (mit J. Costa, A.-K. Holfelder, J. Hufnagl, M. Osterrieder, A. Scheunpflug, M. Singer-Brodowski, D. Taube)</w:t>
       </w:r>
     </w:p>
     <w:p>
@@ -3421,39 +3503,33 @@
           <w:b/>
           <w:bCs/>
         </w:rPr>
+        <w:t xml:space="preserve">14.–15.11.2024, Nürnberg</w:t>
+      </w:r>
+      <w:r>
+        <w:t xml:space="preserve"> </w:t>
+      </w:r>
+      <w:r>
         <w:t xml:space="preserve">Workshop</w:t>
       </w:r>
       <w:r>
         <w:t xml:space="preserve"> </w:t>
       </w:r>
       <w:r>
-        <w:t xml:space="preserve">(</w:t>
-      </w:r>
-      <w:r>
-        <w:rPr>
-          <w:i/>
-          <w:iCs/>
-        </w:rPr>
-        <w:t xml:space="preserve">07/2021</w:t>
-      </w:r>
-      <w:r>
-        <w:t xml:space="preserve">)</w:t>
-      </w:r>
-      <w:r>
-        <w:t xml:space="preserve"> </w:t>
-      </w:r>
-      <w:r>
-        <w:t xml:space="preserve">Planetary Boundaries – between Facts and Norms (mit Forschungskolleg Humanwissenschaften, Bad Homburg)</w:t>
-      </w:r>
-      <w:r>
-        <w:t xml:space="preserve"> </w:t>
-      </w:r>
-      <w:r>
-        <w:rPr>
-          <w:i/>
-          <w:iCs/>
-        </w:rPr>
-        <w:t xml:space="preserve">Mitglied des Organisationsteams</w:t>
+        <w:rPr>
+          <w:i/>
+          <w:iCs/>
+        </w:rPr>
+        <w:t xml:space="preserve">DGfE Dialogue Workshop: „Sustainability and planetary futures as a transformation challenge for educational science“</w:t>
+      </w:r>
+      <w:r>
+        <w:t xml:space="preserve"> </w:t>
+      </w:r>
+      <w:r>
+        <w:rPr>
+          <w:i/>
+          <w:iCs/>
+        </w:rPr>
+        <w:t xml:space="preserve">Mitglied des Organisationsteams (mit J. Costa, M. Singer-Brodowski, Ch. Wulf, U. Stenger, L. Klepacki, N. Grünberger, J. Engel)</w:t>
       </w:r>
     </w:p>
     <w:p>
@@ -3468,39 +3544,33 @@
           <w:b/>
           <w:bCs/>
         </w:rPr>
-        <w:t xml:space="preserve">DGfE-BNE-Kommissionstagung 2022</w:t>
-      </w:r>
-      <w:r>
-        <w:t xml:space="preserve"> </w:t>
-      </w:r>
-      <w:r>
-        <w:t xml:space="preserve">(</w:t>
-      </w:r>
-      <w:r>
-        <w:rPr>
-          <w:i/>
-          <w:iCs/>
-        </w:rPr>
-        <w:t xml:space="preserve">Sept. 2022</w:t>
-      </w:r>
-      <w:r>
-        <w:t xml:space="preserve">)</w:t>
-      </w:r>
-      <w:r>
-        <w:t xml:space="preserve"> </w:t>
-      </w:r>
-      <w:r>
-        <w:t xml:space="preserve">„Ökologische, gesellschaftliche und individuelle Umbrüche und ihre Bedeutung für BNE“</w:t>
-      </w:r>
-      <w:r>
-        <w:t xml:space="preserve"> </w:t>
-      </w:r>
-      <w:r>
-        <w:rPr>
-          <w:i/>
-          <w:iCs/>
-        </w:rPr>
-        <w:t xml:space="preserve">Organisation, Durchführung</w:t>
+        <w:t xml:space="preserve">20.–21.03.2025, Berlin (TU)</w:t>
+      </w:r>
+      <w:r>
+        <w:t xml:space="preserve"> </w:t>
+      </w:r>
+      <w:r>
+        <w:t xml:space="preserve">Tagung/Konferenz</w:t>
+      </w:r>
+      <w:r>
+        <w:t xml:space="preserve"> </w:t>
+      </w:r>
+      <w:r>
+        <w:rPr>
+          <w:i/>
+          <w:iCs/>
+        </w:rPr>
+        <w:t xml:space="preserve">Transnationalization of social and ecological inequalities and their relevance to educational science</w:t>
+      </w:r>
+      <w:r>
+        <w:t xml:space="preserve"> </w:t>
+      </w:r>
+      <w:r>
+        <w:rPr>
+          <w:i/>
+          <w:iCs/>
+        </w:rPr>
+        <w:t xml:space="preserve">Mitglied des Organisationsteams (mit D. Amirpur, N. Bernhard, J. Costa, A. Dogmus, K. Falkenberg, S. Hartong, R. Nikolai, J. Panagiotopoulou, S. Ress, M. Singer-Brodowski)</w:t>
       </w:r>
     </w:p>
     <w:p>
@@ -3515,216 +3585,22 @@
           <w:b/>
           <w:bCs/>
         </w:rPr>
-        <w:t xml:space="preserve">DGfE-BNE-Kommissionstagung 2023</w:t>
-      </w:r>
-      <w:r>
-        <w:t xml:space="preserve"> </w:t>
-      </w:r>
-      <w:r>
-        <w:t xml:space="preserve">(</w:t>
-      </w:r>
-      <w:r>
-        <w:rPr>
-          <w:i/>
-          <w:iCs/>
-        </w:rPr>
-        <w:t xml:space="preserve">Sept. 2023</w:t>
-      </w:r>
-      <w:r>
-        <w:t xml:space="preserve">)</w:t>
-      </w:r>
-      <w:r>
-        <w:t xml:space="preserve"> </w:t>
-      </w:r>
-      <w:r>
-        <w:t xml:space="preserve">„Kontroversen und Debatten im Kontext von Bildung für nachhaltige Entwicklung“</w:t>
-      </w:r>
-      <w:r>
-        <w:t xml:space="preserve"> </w:t>
-      </w:r>
-      <w:r>
-        <w:rPr>
-          <w:i/>
-          <w:iCs/>
-        </w:rPr>
-        <w:t xml:space="preserve">Mitglied des Organisationsteams, inkl. Begutachtung der Einreichungen</w:t>
-      </w:r>
-    </w:p>
-    <w:p>
-      <w:pPr>
-        <w:numPr>
-          <w:ilvl w:val="0"/>
-          <w:numId w:val="1041"/>
-        </w:numPr>
-      </w:pPr>
-      <w:r>
-        <w:rPr>
-          <w:b/>
-          <w:bCs/>
-        </w:rPr>
+        <w:t xml:space="preserve">29.09.–01.10.2025, Köln</w:t>
+      </w:r>
+      <w:r>
+        <w:t xml:space="preserve"> </w:t>
+      </w:r>
+      <w:r>
         <w:t xml:space="preserve">Tagung/Konferenz</w:t>
       </w:r>
       <w:r>
         <w:t xml:space="preserve"> </w:t>
       </w:r>
       <w:r>
-        <w:t xml:space="preserve">(</w:t>
-      </w:r>
-      <w:r>
-        <w:rPr>
-          <w:i/>
-          <w:iCs/>
-        </w:rPr>
-        <w:t xml:space="preserve">18.–20.09.2024, Bamberg</w:t>
-      </w:r>
-      <w:r>
-        <w:t xml:space="preserve">)</w:t>
-      </w:r>
-      <w:r>
-        <w:t xml:space="preserve"> </w:t>
-      </w:r>
-      <w:r>
-        <w:t xml:space="preserve">Areas of tension between education for sustainable development and the increasing differentiation of the field</w:t>
-      </w:r>
-      <w:r>
-        <w:t xml:space="preserve"> </w:t>
-      </w:r>
-      <w:r>
-        <w:rPr>
-          <w:i/>
-          <w:iCs/>
-        </w:rPr>
-        <w:t xml:space="preserve">Mitglied des Organisationsteams (mit J. Costa, A.-K. Holfelder, J. Hufnagl, M. Osterrieder, A. Scheunpflug, M. Singer-Brodowski, D. Taube)</w:t>
-      </w:r>
-    </w:p>
-    <w:p>
-      <w:pPr>
-        <w:numPr>
-          <w:ilvl w:val="0"/>
-          <w:numId w:val="1041"/>
-        </w:numPr>
-      </w:pPr>
-      <w:r>
-        <w:rPr>
-          <w:b/>
-          <w:bCs/>
-        </w:rPr>
-        <w:t xml:space="preserve">Workshop</w:t>
-      </w:r>
-      <w:r>
-        <w:t xml:space="preserve"> </w:t>
-      </w:r>
-      <w:r>
-        <w:t xml:space="preserve">(</w:t>
-      </w:r>
-      <w:r>
-        <w:rPr>
-          <w:i/>
-          <w:iCs/>
-        </w:rPr>
-        <w:t xml:space="preserve">14.–15.11.2024, Nürnberg</w:t>
-      </w:r>
-      <w:r>
-        <w:t xml:space="preserve">)</w:t>
-      </w:r>
-      <w:r>
-        <w:t xml:space="preserve"> </w:t>
-      </w:r>
-      <w:r>
-        <w:t xml:space="preserve">DGfE Dialogue Workshop: „Sustainability and planetary futures as a transformation challenge for educational science“</w:t>
-      </w:r>
-      <w:r>
-        <w:t xml:space="preserve"> </w:t>
-      </w:r>
-      <w:r>
-        <w:rPr>
-          <w:i/>
-          <w:iCs/>
-        </w:rPr>
-        <w:t xml:space="preserve">Mitglied des Organisationsteams (mit J. Costa, M. Singer-Brodowski, Ch. Wulf, U. Stenger, L. Klepacki, N. Grünberger, J. Engel)</w:t>
-      </w:r>
-    </w:p>
-    <w:p>
-      <w:pPr>
-        <w:numPr>
-          <w:ilvl w:val="0"/>
-          <w:numId w:val="1041"/>
-        </w:numPr>
-      </w:pPr>
-      <w:r>
-        <w:rPr>
-          <w:b/>
-          <w:bCs/>
-        </w:rPr>
-        <w:t xml:space="preserve">Tagung/Konferenz</w:t>
-      </w:r>
-      <w:r>
-        <w:t xml:space="preserve"> </w:t>
-      </w:r>
-      <w:r>
-        <w:t xml:space="preserve">(</w:t>
-      </w:r>
-      <w:r>
-        <w:rPr>
-          <w:i/>
-          <w:iCs/>
-        </w:rPr>
-        <w:t xml:space="preserve">20.–21.03.2025, Berlin (TU)</w:t>
-      </w:r>
-      <w:r>
-        <w:t xml:space="preserve">)</w:t>
-      </w:r>
-      <w:r>
-        <w:t xml:space="preserve"> </w:t>
-      </w:r>
-      <w:r>
-        <w:t xml:space="preserve">Transnationalization of social and ecological inequalities and their relevance to educational science</w:t>
-      </w:r>
-      <w:r>
-        <w:t xml:space="preserve"> </w:t>
-      </w:r>
-      <w:r>
-        <w:rPr>
-          <w:i/>
-          <w:iCs/>
-        </w:rPr>
-        <w:t xml:space="preserve">Mitglied des Organisationsteams (mit D. Amirpur, N. Bernhard, J. Costa, A. Dogmus, K. Falkenberg, S. Hartong, R. Nikolai, J. Panagiotopoulou, S. Ress, M. Singer-Brodowski)</w:t>
-      </w:r>
-    </w:p>
-    <w:p>
-      <w:pPr>
-        <w:numPr>
-          <w:ilvl w:val="0"/>
-          <w:numId w:val="1041"/>
-        </w:numPr>
-      </w:pPr>
-      <w:r>
-        <w:rPr>
-          <w:b/>
-          <w:bCs/>
-        </w:rPr>
-        <w:t xml:space="preserve">Tagung/Konferenz</w:t>
-      </w:r>
-      <w:r>
-        <w:t xml:space="preserve"> </w:t>
-      </w:r>
-      <w:r>
-        <w:t xml:space="preserve">(</w:t>
-      </w:r>
-      <w:r>
-        <w:rPr>
-          <w:i/>
-          <w:iCs/>
-        </w:rPr>
-        <w:t xml:space="preserve">29.09.–01.10.2025, Köln</w:t>
-      </w:r>
-      <w:r>
-        <w:t xml:space="preserve">)</w:t>
-      </w:r>
-      <w:r>
-        <w:t xml:space="preserve"> </w:t>
-      </w:r>
-      <w:r>
+        <w:rPr>
+          <w:i/>
+          <w:iCs/>
+        </w:rPr>
         <w:t xml:space="preserve">Erziehungswissenschaft und Nachhaltigkeit – Widerstände bearbeiten. Zukünfte gestalten. Auftakttagung der DGfE-AG „Nachhaltigkeit bzw. Nicht-Nachhaltigkeit und planetare Zukünfte“</w:t>
       </w:r>
       <w:r>
@@ -3775,24 +3651,14 @@
           <w:b/>
           <w:bCs/>
         </w:rPr>
+        <w:t xml:space="preserve">2018</w:t>
+      </w:r>
+      <w:r>
+        <w:t xml:space="preserve"> </w:t>
+      </w:r>
+      <w:r>
         <w:t xml:space="preserve">Journal of Decolonising Disciplines.</w:t>
       </w:r>
-      <w:r>
-        <w:t xml:space="preserve"> </w:t>
-      </w:r>
-      <w:r>
-        <w:t xml:space="preserve">(</w:t>
-      </w:r>
-      <w:r>
-        <w:rPr>
-          <w:i/>
-          <w:iCs/>
-        </w:rPr>
-        <w:t xml:space="preserve">2018</w:t>
-      </w:r>
-      <w:r>
-        <w:t xml:space="preserve">)</w:t>
-      </w:r>
     </w:p>
     <w:p>
       <w:pPr>
@@ -3821,24 +3687,14 @@
           <w:b/>
           <w:bCs/>
         </w:rPr>
+        <w:t xml:space="preserve">2016</w:t>
+      </w:r>
+      <w:r>
+        <w:t xml:space="preserve"> </w:t>
+      </w:r>
+      <w:r>
         <w:t xml:space="preserve">Journal of Didactics of Philosophy.</w:t>
       </w:r>
-      <w:r>
-        <w:t xml:space="preserve"> </w:t>
-      </w:r>
-      <w:r>
-        <w:t xml:space="preserve">(</w:t>
-      </w:r>
-      <w:r>
-        <w:rPr>
-          <w:i/>
-          <w:iCs/>
-        </w:rPr>
-        <w:t xml:space="preserve">2016</w:t>
-      </w:r>
-      <w:r>
-        <w:t xml:space="preserve">)</w:t>
-      </w:r>
     </w:p>
     <w:p>
       <w:pPr>
@@ -3852,24 +3708,14 @@
           <w:b/>
           <w:bCs/>
         </w:rPr>
+        <w:t xml:space="preserve">seit 11/2025</w:t>
+      </w:r>
+      <w:r>
+        <w:t xml:space="preserve"> </w:t>
+      </w:r>
+      <w:r>
         <w:t xml:space="preserve">Educations (openscience.fr/Educations).</w:t>
       </w:r>
-      <w:r>
-        <w:t xml:space="preserve"> </w:t>
-      </w:r>
-      <w:r>
-        <w:t xml:space="preserve">(</w:t>
-      </w:r>
-      <w:r>
-        <w:rPr>
-          <w:i/>
-          <w:iCs/>
-        </w:rPr>
-        <w:t xml:space="preserve">seit 11/2025</w:t>
-      </w:r>
-      <w:r>
-        <w:t xml:space="preserve">)</w:t>
-      </w:r>
     </w:p>
     <w:p>
       <w:pPr>
@@ -3898,29 +3744,54 @@
           <w:b/>
           <w:bCs/>
         </w:rPr>
+        <w:t xml:space="preserve">seit 04/2024</w:t>
+      </w:r>
+      <w:r>
+        <w:t xml:space="preserve"> </w:t>
+      </w:r>
+      <w:r>
         <w:t xml:space="preserve">Editor – datum &amp; diskurs</w:t>
       </w:r>
       <w:r>
         <w:t xml:space="preserve"> </w:t>
       </w:r>
       <w:r>
-        <w:t xml:space="preserve">(</w:t>
-      </w:r>
-      <w:r>
-        <w:rPr>
-          <w:i/>
-          <w:iCs/>
+        <w:rPr>
+          <w:i/>
+          <w:iCs/>
+        </w:rPr>
+        <w:t xml:space="preserve">Zeitschrift für Komplementär-, Sekundär- und Reanalysen im Feld der qualitativen Schul- und Unterrichtsforschung.</w:t>
+      </w:r>
+    </w:p>
+    <w:p>
+      <w:pPr>
+        <w:numPr>
+          <w:ilvl w:val="0"/>
+          <w:numId w:val="1042"/>
+        </w:numPr>
+      </w:pPr>
+      <w:r>
+        <w:rPr>
+          <w:b/>
+          <w:bCs/>
         </w:rPr>
         <w:t xml:space="preserve">seit 04/2024</w:t>
       </w:r>
       <w:r>
-        <w:t xml:space="preserve">)</w:t>
-      </w:r>
-      <w:r>
-        <w:t xml:space="preserve"> </w:t>
-      </w:r>
-      <w:r>
-        <w:t xml:space="preserve">Zeitschrift für Komplementär-, Sekundär- und Reanalysen im Feld der qualitativen Schul- und Unterrichtsforschung.</w:t>
+        <w:t xml:space="preserve"> </w:t>
+      </w:r>
+      <w:r>
+        <w:t xml:space="preserve">Editor</w:t>
+      </w:r>
+      <w:r>
+        <w:t xml:space="preserve"> </w:t>
+      </w:r>
+      <w:r>
+        <w:rPr>
+          <w:i/>
+          <w:iCs/>
+        </w:rPr>
+        <w:t xml:space="preserve">Wissenschaftliche Beiträge zur Philosophiedidaktik und Bildungsphilosophie (Scientific Contributions to Philosophy Didactics and Educational Philosophy).</w:t>
       </w:r>
     </w:p>
     <w:p>
@@ -3935,29 +3806,95 @@
           <w:b/>
           <w:bCs/>
         </w:rPr>
-        <w:t xml:space="preserve">Editor</w:t>
-      </w:r>
-      <w:r>
-        <w:t xml:space="preserve"> </w:t>
-      </w:r>
-      <w:r>
-        <w:t xml:space="preserve">(</w:t>
-      </w:r>
-      <w:r>
-        <w:rPr>
-          <w:i/>
-          <w:iCs/>
-        </w:rPr>
-        <w:t xml:space="preserve">seit 04/2024</w:t>
-      </w:r>
-      <w:r>
-        <w:t xml:space="preserve">)</w:t>
-      </w:r>
-      <w:r>
-        <w:t xml:space="preserve"> </w:t>
-      </w:r>
-      <w:r>
-        <w:t xml:space="preserve">Wissenschaftliche Beiträge zur Philosophiedidaktik und Bildungsphilosophie (Scientific Contributions to Philosophy Didactics and Educational Philosophy).</w:t>
+        <w:t xml:space="preserve">Gutachtertätigkeiten für Zeitschriften [double-blind peer-reviewed]</w:t>
+      </w:r>
+    </w:p>
+    <w:p>
+      <w:pPr>
+        <w:numPr>
+          <w:ilvl w:val="1"/>
+          <w:numId w:val="1043"/>
+        </w:numPr>
+      </w:pPr>
+      <w:r>
+        <w:t xml:space="preserve">Childhood Vulnerability Journal</w:t>
+      </w:r>
+    </w:p>
+    <w:p>
+      <w:pPr>
+        <w:numPr>
+          <w:ilvl w:val="1"/>
+          <w:numId w:val="1043"/>
+        </w:numPr>
+      </w:pPr>
+      <w:r>
+        <w:t xml:space="preserve">Diskurs Kindheits- und Jugendforschung / Discourse. Journal of Childhood and Adolescence Research</w:t>
+      </w:r>
+    </w:p>
+    <w:p>
+      <w:pPr>
+        <w:numPr>
+          <w:ilvl w:val="1"/>
+          <w:numId w:val="1043"/>
+        </w:numPr>
+      </w:pPr>
+      <w:r>
+        <w:t xml:space="preserve">Environmental Education Research</w:t>
+      </w:r>
+    </w:p>
+    <w:p>
+      <w:pPr>
+        <w:numPr>
+          <w:ilvl w:val="1"/>
+          <w:numId w:val="1043"/>
+        </w:numPr>
+      </w:pPr>
+      <w:r>
+        <w:t xml:space="preserve">Herausforderung Lehrer*innenbildung – Zeitschrift zur Konzeption, Gestaltung und Diskussion</w:t>
+      </w:r>
+    </w:p>
+    <w:p>
+      <w:pPr>
+        <w:numPr>
+          <w:ilvl w:val="1"/>
+          <w:numId w:val="1043"/>
+        </w:numPr>
+      </w:pPr>
+      <w:r>
+        <w:t xml:space="preserve">Journal of Didactics of Philosophy</w:t>
+      </w:r>
+    </w:p>
+    <w:p>
+      <w:pPr>
+        <w:numPr>
+          <w:ilvl w:val="1"/>
+          <w:numId w:val="1043"/>
+        </w:numPr>
+      </w:pPr>
+      <w:r>
+        <w:t xml:space="preserve">Qualifizierung für Inklusion. Zeitschrift zur Forschung über Aus-, Fort- und Weiterbildung pädagogischer Fachkräfte</w:t>
+      </w:r>
+    </w:p>
+    <w:p>
+      <w:pPr>
+        <w:numPr>
+          <w:ilvl w:val="1"/>
+          <w:numId w:val="1043"/>
+        </w:numPr>
+      </w:pPr>
+      <w:r>
+        <w:t xml:space="preserve">Zeitschrift für Medienpädagogik</w:t>
+      </w:r>
+    </w:p>
+    <w:p>
+      <w:pPr>
+        <w:numPr>
+          <w:ilvl w:val="1"/>
+          <w:numId w:val="1043"/>
+        </w:numPr>
+      </w:pPr>
+      <w:r>
+        <w:t xml:space="preserve">Zeitschrift für Pädagogik</w:t>
       </w:r>
     </w:p>
     <w:p>
@@ -3972,95 +3909,7 @@
           <w:b/>
           <w:bCs/>
         </w:rPr>
-        <w:t xml:space="preserve">Gutachtertätigkeiten für Zeitschriften [double-blind peer-reviewed]</w:t>
-      </w:r>
-    </w:p>
-    <w:p>
-      <w:pPr>
-        <w:numPr>
-          <w:ilvl w:val="1"/>
-          <w:numId w:val="1043"/>
-        </w:numPr>
-      </w:pPr>
-      <w:r>
-        <w:t xml:space="preserve">Childhood Vulnerability Journal</w:t>
-      </w:r>
-    </w:p>
-    <w:p>
-      <w:pPr>
-        <w:numPr>
-          <w:ilvl w:val="1"/>
-          <w:numId w:val="1043"/>
-        </w:numPr>
-      </w:pPr>
-      <w:r>
-        <w:t xml:space="preserve">Diskurs Kindheits- und Jugendforschung / Discourse. Journal of Childhood and Adolescence Research</w:t>
-      </w:r>
-    </w:p>
-    <w:p>
-      <w:pPr>
-        <w:numPr>
-          <w:ilvl w:val="1"/>
-          <w:numId w:val="1043"/>
-        </w:numPr>
-      </w:pPr>
-      <w:r>
-        <w:t xml:space="preserve">Environmental Education Research</w:t>
-      </w:r>
-    </w:p>
-    <w:p>
-      <w:pPr>
-        <w:numPr>
-          <w:ilvl w:val="1"/>
-          <w:numId w:val="1043"/>
-        </w:numPr>
-      </w:pPr>
-      <w:r>
-        <w:t xml:space="preserve">Herausforderung Lehrer*innenbildung – Zeitschrift zur Konzeption, Gestaltung und Diskussion</w:t>
-      </w:r>
-    </w:p>
-    <w:p>
-      <w:pPr>
-        <w:numPr>
-          <w:ilvl w:val="1"/>
-          <w:numId w:val="1043"/>
-        </w:numPr>
-      </w:pPr>
-      <w:r>
-        <w:t xml:space="preserve">Journal of Didactics of Philosophy</w:t>
-      </w:r>
-    </w:p>
-    <w:p>
-      <w:pPr>
-        <w:numPr>
-          <w:ilvl w:val="1"/>
-          <w:numId w:val="1043"/>
-        </w:numPr>
-      </w:pPr>
-      <w:r>
-        <w:t xml:space="preserve">Qualifizierung für Inklusion. Zeitschrift zur Forschung über Aus-, Fort- und Weiterbildung pädagogischer Fachkräfte</w:t>
-      </w:r>
-    </w:p>
-    <w:p>
-      <w:pPr>
-        <w:numPr>
-          <w:ilvl w:val="1"/>
-          <w:numId w:val="1043"/>
-        </w:numPr>
-      </w:pPr>
-      <w:r>
-        <w:t xml:space="preserve">Zeitschrift für Medienpädagogik</w:t>
-      </w:r>
-    </w:p>
-    <w:p>
-      <w:pPr>
-        <w:numPr>
-          <w:ilvl w:val="1"/>
-          <w:numId w:val="1043"/>
-        </w:numPr>
-      </w:pPr>
-      <w:r>
-        <w:t xml:space="preserve">Zeitschrift für Pädagogik</w:t>
+        <w:t xml:space="preserve">Weitere Gutachtertätigkeiten für Zeitschriften</w:t>
       </w:r>
     </w:p>
     <w:p>
@@ -4075,7 +3924,13 @@
           <w:b/>
           <w:bCs/>
         </w:rPr>
-        <w:t xml:space="preserve">Weitere Gutachtertätigkeiten für Zeitschriften</w:t>
+        <w:t xml:space="preserve">04–04/2024</w:t>
+      </w:r>
+      <w:r>
+        <w:t xml:space="preserve"> </w:t>
+      </w:r>
+      <w:r>
+        <w:t xml:space="preserve">The Journal of Environmental Education.</w:t>
       </w:r>
     </w:p>
     <w:p>
@@ -4090,23 +3945,13 @@
           <w:b/>
           <w:bCs/>
         </w:rPr>
-        <w:t xml:space="preserve">The Journal of Environmental Education.</w:t>
-      </w:r>
-      <w:r>
-        <w:t xml:space="preserve"> </w:t>
-      </w:r>
-      <w:r>
-        <w:t xml:space="preserve">(</w:t>
-      </w:r>
-      <w:r>
-        <w:rPr>
-          <w:i/>
-          <w:iCs/>
-        </w:rPr>
-        <w:t xml:space="preserve">04–04/2024</w:t>
-      </w:r>
-      <w:r>
-        <w:t xml:space="preserve">)</w:t>
+        <w:t xml:space="preserve">11–12/2024</w:t>
+      </w:r>
+      <w:r>
+        <w:t xml:space="preserve"> </w:t>
+      </w:r>
+      <w:r>
+        <w:t xml:space="preserve">Journal for Educational Science.</w:t>
       </w:r>
     </w:p>
     <w:p>
@@ -4121,23 +3966,13 @@
           <w:b/>
           <w:bCs/>
         </w:rPr>
-        <w:t xml:space="preserve">Journal for Educational Science.</w:t>
-      </w:r>
-      <w:r>
-        <w:t xml:space="preserve"> </w:t>
-      </w:r>
-      <w:r>
-        <w:t xml:space="preserve">(</w:t>
-      </w:r>
-      <w:r>
-        <w:rPr>
-          <w:i/>
-          <w:iCs/>
-        </w:rPr>
-        <w:t xml:space="preserve">11–12/2024</w:t>
-      </w:r>
-      <w:r>
-        <w:t xml:space="preserve">)</w:t>
+        <w:t xml:space="preserve">04/2025</w:t>
+      </w:r>
+      <w:r>
+        <w:t xml:space="preserve"> </w:t>
+      </w:r>
+      <w:r>
+        <w:t xml:space="preserve">Discover Education.</w:t>
       </w:r>
     </w:p>
     <w:p>
@@ -4152,23 +3987,23 @@
           <w:b/>
           <w:bCs/>
         </w:rPr>
-        <w:t xml:space="preserve">Discover Education.</w:t>
-      </w:r>
-      <w:r>
-        <w:t xml:space="preserve"> </w:t>
-      </w:r>
-      <w:r>
-        <w:t xml:space="preserve">(</w:t>
-      </w:r>
-      <w:r>
-        <w:rPr>
-          <w:i/>
-          <w:iCs/>
-        </w:rPr>
-        <w:t xml:space="preserve">04/2025</w:t>
-      </w:r>
-      <w:r>
-        <w:t xml:space="preserve">)</w:t>
+        <w:t xml:space="preserve">11/2025</w:t>
+      </w:r>
+      <w:r>
+        <w:t xml:space="preserve"> </w:t>
+      </w:r>
+      <w:r>
+        <w:t xml:space="preserve">ZEP</w:t>
+      </w:r>
+      <w:r>
+        <w:t xml:space="preserve"> </w:t>
+      </w:r>
+      <w:r>
+        <w:rPr>
+          <w:i/>
+          <w:iCs/>
+        </w:rPr>
+        <w:t xml:space="preserve">Zeitschrift für internationale Bildungsforschung und Entwicklungspädagogik.</w:t>
       </w:r>
     </w:p>
     <w:p>
@@ -4183,29 +4018,13 @@
           <w:b/>
           <w:bCs/>
         </w:rPr>
-        <w:t xml:space="preserve">ZEP</w:t>
-      </w:r>
-      <w:r>
-        <w:t xml:space="preserve"> </w:t>
-      </w:r>
-      <w:r>
-        <w:t xml:space="preserve">(</w:t>
-      </w:r>
-      <w:r>
-        <w:rPr>
-          <w:i/>
-          <w:iCs/>
-        </w:rPr>
-        <w:t xml:space="preserve">11/2025</w:t>
-      </w:r>
-      <w:r>
-        <w:t xml:space="preserve">)</w:t>
-      </w:r>
-      <w:r>
-        <w:t xml:space="preserve"> </w:t>
-      </w:r>
-      <w:r>
-        <w:t xml:space="preserve">Zeitschrift für internationale Bildungsforschung und Entwicklungspädagogik.</w:t>
+        <w:t xml:space="preserve">11–12/2025</w:t>
+      </w:r>
+      <w:r>
+        <w:t xml:space="preserve"> </w:t>
+      </w:r>
+      <w:r>
+        <w:t xml:space="preserve">Foundations of Science.</w:t>
       </w:r>
     </w:p>
     <w:p>
@@ -4220,23 +4039,13 @@
           <w:b/>
           <w:bCs/>
         </w:rPr>
-        <w:t xml:space="preserve">Foundations of Science.</w:t>
-      </w:r>
-      <w:r>
-        <w:t xml:space="preserve"> </w:t>
-      </w:r>
-      <w:r>
-        <w:t xml:space="preserve">(</w:t>
-      </w:r>
-      <w:r>
-        <w:rPr>
-          <w:i/>
-          <w:iCs/>
-        </w:rPr>
-        <w:t xml:space="preserve">11–12/2025</w:t>
-      </w:r>
-      <w:r>
-        <w:t xml:space="preserve">)</w:t>
+        <w:t xml:space="preserve">01/2026</w:t>
+      </w:r>
+      <w:r>
+        <w:t xml:space="preserve"> </w:t>
+      </w:r>
+      <w:r>
+        <w:t xml:space="preserve">Discover Sustainability.</w:t>
       </w:r>
     </w:p>
     <w:p>
@@ -4251,23 +4060,410 @@
           <w:b/>
           <w:bCs/>
         </w:rPr>
+        <w:t xml:space="preserve">02–03/2026</w:t>
+      </w:r>
+      <w:r>
+        <w:t xml:space="preserve"> </w:t>
+      </w:r>
+      <w:r>
         <w:t xml:space="preserve">Discover Sustainability.</w:t>
       </w:r>
-      <w:r>
-        <w:t xml:space="preserve"> </w:t>
-      </w:r>
-      <w:r>
-        <w:t xml:space="preserve">(</w:t>
-      </w:r>
-      <w:r>
-        <w:rPr>
-          <w:i/>
-          <w:iCs/>
+    </w:p>
+    <w:p>
+      <w:pPr>
+        <w:numPr>
+          <w:ilvl w:val="0"/>
+          <w:numId w:val="1042"/>
+        </w:numPr>
+      </w:pPr>
+      <w:r>
+        <w:rPr>
+          <w:b/>
+          <w:bCs/>
+        </w:rPr>
+        <w:t xml:space="preserve">02–05/2026</w:t>
+      </w:r>
+      <w:r>
+        <w:t xml:space="preserve"> </w:t>
+      </w:r>
+      <w:r>
+        <w:t xml:space="preserve">Journal of Curriculum Studies.</w:t>
+      </w:r>
+    </w:p>
+    <w:p>
+      <w:pPr>
+        <w:numPr>
+          <w:ilvl w:val="0"/>
+          <w:numId w:val="1042"/>
+        </w:numPr>
+      </w:pPr>
+      <w:r>
+        <w:rPr>
+          <w:b/>
+          <w:bCs/>
+        </w:rPr>
+        <w:t xml:space="preserve">03/2026</w:t>
+      </w:r>
+      <w:r>
+        <w:t xml:space="preserve"> </w:t>
+      </w:r>
+      <w:r>
+        <w:t xml:space="preserve">Journal of Didactics of Philosophy.</w:t>
+      </w:r>
+    </w:p>
+    <w:p>
+      <w:pPr>
+        <w:numPr>
+          <w:ilvl w:val="0"/>
+          <w:numId w:val="1042"/>
+        </w:numPr>
+      </w:pPr>
+      <w:r>
+        <w:rPr>
+          <w:b/>
+          <w:bCs/>
+        </w:rPr>
+        <w:t xml:space="preserve">03/2026</w:t>
+      </w:r>
+      <w:r>
+        <w:t xml:space="preserve"> </w:t>
+      </w:r>
+      <w:r>
+        <w:rPr>
+          <w:i/>
+          <w:iCs/>
+        </w:rPr>
+        <w:t xml:space="preserve">Ludwigsburg Contributions to Media Education (LBzM).</w:t>
+      </w:r>
+    </w:p>
+    <w:p>
+      <w:pPr>
+        <w:numPr>
+          <w:ilvl w:val="0"/>
+          <w:numId w:val="1042"/>
+        </w:numPr>
+      </w:pPr>
+      <w:r>
+        <w:rPr>
+          <w:b/>
+          <w:bCs/>
+        </w:rPr>
+        <w:t xml:space="preserve">05/2026</w:t>
+      </w:r>
+      <w:r>
+        <w:t xml:space="preserve"> </w:t>
+      </w:r>
+      <w:r>
+        <w:t xml:space="preserve">Education Sciences.</w:t>
+      </w:r>
+    </w:p>
+    <w:p>
+      <w:pPr>
+        <w:numPr>
+          <w:ilvl w:val="0"/>
+          <w:numId w:val="1042"/>
+        </w:numPr>
+      </w:pPr>
+      <w:r>
+        <w:rPr>
+          <w:b/>
+          <w:bCs/>
+        </w:rPr>
+        <w:t xml:space="preserve">05/2026</w:t>
+      </w:r>
+      <w:r>
+        <w:t xml:space="preserve"> </w:t>
+      </w:r>
+      <w:r>
+        <w:t xml:space="preserve">Sustainability.</w:t>
+      </w:r>
+    </w:p>
+    <w:p>
+      <w:pPr>
+        <w:numPr>
+          <w:ilvl w:val="0"/>
+          <w:numId w:val="1042"/>
+        </w:numPr>
+      </w:pPr>
+      <w:r>
+        <w:rPr>
+          <w:b/>
+          <w:bCs/>
+        </w:rPr>
+        <w:t xml:space="preserve">05/2026–04/2027</w:t>
+      </w:r>
+      <w:r>
+        <w:t xml:space="preserve"> </w:t>
+      </w:r>
+      <w:r>
+        <w:t xml:space="preserve">Sustainability, Education Sciences.</w:t>
+      </w:r>
+    </w:p>
+    <w:p>
+      <w:pPr>
+        <w:numPr>
+          <w:ilvl w:val="0"/>
+          <w:numId w:val="1042"/>
+        </w:numPr>
+      </w:pPr>
+      <w:r>
+        <w:rPr>
+          <w:b/>
+          <w:bCs/>
+        </w:rPr>
+        <w:t xml:space="preserve">05–06/2026</w:t>
+      </w:r>
+      <w:r>
+        <w:t xml:space="preserve"> </w:t>
+      </w:r>
+      <w:r>
+        <w:t xml:space="preserve">Frontiers in Sociology.</w:t>
+      </w:r>
+    </w:p>
+    <w:p>
+      <w:pPr>
+        <w:numPr>
+          <w:ilvl w:val="0"/>
+          <w:numId w:val="1042"/>
+        </w:numPr>
+      </w:pPr>
+      <w:r>
+        <w:rPr>
+          <w:b/>
+          <w:bCs/>
+        </w:rPr>
+        <w:t xml:space="preserve">06/2026</w:t>
+      </w:r>
+      <w:r>
+        <w:t xml:space="preserve"> </w:t>
+      </w:r>
+      <w:r>
+        <w:t xml:space="preserve">Sustainability.</w:t>
+      </w:r>
+    </w:p>
+    <w:p>
+      <w:pPr>
+        <w:numPr>
+          <w:ilvl w:val="0"/>
+          <w:numId w:val="1042"/>
+        </w:numPr>
+      </w:pPr>
+      <w:r>
+        <w:rPr>
+          <w:b/>
+          <w:bCs/>
+        </w:rPr>
+        <w:t xml:space="preserve">06/2026</w:t>
+      </w:r>
+      <w:r>
+        <w:t xml:space="preserve"> </w:t>
+      </w:r>
+      <w:r>
+        <w:t xml:space="preserve">Revue Education.</w:t>
+      </w:r>
+    </w:p>
+    <w:p>
+      <w:pPr>
+        <w:numPr>
+          <w:ilvl w:val="0"/>
+          <w:numId w:val="1042"/>
+        </w:numPr>
+      </w:pPr>
+      <w:r>
+        <w:rPr>
+          <w:b/>
+          <w:bCs/>
+        </w:rPr>
+        <w:t xml:space="preserve">Gutachtertätigkeiten für Sammelwerke und Handbücher</w:t>
+      </w:r>
+    </w:p>
+    <w:p>
+      <w:pPr>
+        <w:numPr>
+          <w:ilvl w:val="0"/>
+          <w:numId w:val="1042"/>
+        </w:numPr>
+      </w:pPr>
+      <w:r>
+        <w:rPr>
+          <w:b/>
+          <w:bCs/>
+        </w:rPr>
+        <w:t xml:space="preserve">02–04/2025</w:t>
+      </w:r>
+      <w:r>
+        <w:t xml:space="preserve"> </w:t>
+      </w:r>
+      <w:r>
+        <w:rPr>
+          <w:i/>
+          <w:iCs/>
+        </w:rPr>
+        <w:t xml:space="preserve">Nachhaltige Transformation der Wirtschaft (Hrsg.: B. Weber/S. von Lingen/H. Hantke).</w:t>
+      </w:r>
+    </w:p>
+    <w:p>
+      <w:pPr>
+        <w:numPr>
+          <w:ilvl w:val="0"/>
+          <w:numId w:val="1042"/>
+        </w:numPr>
+      </w:pPr>
+      <w:r>
+        <w:rPr>
+          <w:b/>
+          <w:bCs/>
+        </w:rPr>
+        <w:t xml:space="preserve">02–04/2025</w:t>
+      </w:r>
+      <w:r>
+        <w:t xml:space="preserve"> </w:t>
+      </w:r>
+      <w:r>
+        <w:rPr>
+          <w:i/>
+          <w:iCs/>
+        </w:rPr>
+        <w:t xml:space="preserve">Handbuch Bildung für nachhaltige Entwicklung (Hrsg.: F. Bertschy/M. Rieckmann/M. Singer-Brodowski).</w:t>
+      </w:r>
+    </w:p>
+    <w:p>
+      <w:pPr>
+        <w:numPr>
+          <w:ilvl w:val="0"/>
+          <w:numId w:val="1042"/>
+        </w:numPr>
+      </w:pPr>
+      <w:r>
+        <w:rPr>
+          <w:b/>
+          <w:bCs/>
+        </w:rPr>
+        <w:t xml:space="preserve">Funktionen bei Konferenzen und Tagungen</w:t>
+      </w:r>
+    </w:p>
+    <w:p>
+      <w:pPr>
+        <w:numPr>
+          <w:ilvl w:val="0"/>
+          <w:numId w:val="1042"/>
+        </w:numPr>
+      </w:pPr>
+      <w:r>
+        <w:rPr>
+          <w:b/>
+          <w:bCs/>
+        </w:rPr>
+        <w:t xml:space="preserve">05–07/2025</w:t>
+      </w:r>
+      <w:r>
+        <w:t xml:space="preserve"> </w:t>
+      </w:r>
+      <w:r>
+        <w:t xml:space="preserve">Reviewer</w:t>
+      </w:r>
+      <w:r>
+        <w:t xml:space="preserve"> </w:t>
+      </w:r>
+      <w:r>
+        <w:rPr>
+          <w:i/>
+          <w:iCs/>
+        </w:rPr>
+        <w:t xml:space="preserve">DGfE-Kongress 2026 „Brüche“.</w:t>
+      </w:r>
+    </w:p>
+    <w:p>
+      <w:pPr>
+        <w:numPr>
+          <w:ilvl w:val="0"/>
+          <w:numId w:val="1042"/>
+        </w:numPr>
+      </w:pPr>
+      <w:r>
+        <w:rPr>
+          <w:b/>
+          <w:bCs/>
+        </w:rPr>
+        <w:t xml:space="preserve">09/2025</w:t>
+      </w:r>
+      <w:r>
+        <w:t xml:space="preserve"> </w:t>
+      </w:r>
+      <w:r>
+        <w:t xml:space="preserve">Moderation</w:t>
+      </w:r>
+      <w:r>
+        <w:t xml:space="preserve"> </w:t>
+      </w:r>
+      <w:r>
+        <w:rPr>
+          <w:i/>
+          <w:iCs/>
+        </w:rPr>
+        <w:t xml:space="preserve">ECER 2025.</w:t>
+      </w:r>
+    </w:p>
+    <w:p>
+      <w:pPr>
+        <w:numPr>
+          <w:ilvl w:val="0"/>
+          <w:numId w:val="1042"/>
+        </w:numPr>
+      </w:pPr>
+      <w:r>
+        <w:rPr>
+          <w:b/>
+          <w:bCs/>
+        </w:rPr>
+        <w:t xml:space="preserve">12/2025</w:t>
+      </w:r>
+      <w:r>
+        <w:t xml:space="preserve"> </w:t>
+      </w:r>
+      <w:r>
+        <w:t xml:space="preserve">Reviewer</w:t>
+      </w:r>
+      <w:r>
+        <w:t xml:space="preserve"> </w:t>
+      </w:r>
+      <w:r>
+        <w:rPr>
+          <w:i/>
+          <w:iCs/>
+        </w:rPr>
+        <w:t xml:space="preserve">DGfE-Kongress 2026 „Brüche“.</w:t>
+      </w:r>
+    </w:p>
+    <w:p>
+      <w:pPr>
+        <w:numPr>
+          <w:ilvl w:val="0"/>
+          <w:numId w:val="1042"/>
+        </w:numPr>
+      </w:pPr>
+      <w:r>
+        <w:rPr>
+          <w:b/>
+          <w:bCs/>
         </w:rPr>
         <w:t xml:space="preserve">01/2026</w:t>
       </w:r>
       <w:r>
-        <w:t xml:space="preserve">)</w:t>
+        <w:t xml:space="preserve"> </w:t>
+      </w:r>
+      <w:r>
+        <w:t xml:space="preserve">Reviewer</w:t>
+      </w:r>
+      <w:r>
+        <w:t xml:space="preserve"> </w:t>
+      </w:r>
+      <w:r>
+        <w:rPr>
+          <w:i/>
+          <w:iCs/>
+        </w:rPr>
+        <w:t xml:space="preserve">ECER.</w:t>
       </w:r>
     </w:p>
     <w:p>
@@ -4282,23 +4478,23 @@
           <w:b/>
           <w:bCs/>
         </w:rPr>
-        <w:t xml:space="preserve">Discover Sustainability.</w:t>
-      </w:r>
-      <w:r>
-        <w:t xml:space="preserve"> </w:t>
-      </w:r>
-      <w:r>
-        <w:t xml:space="preserve">(</w:t>
-      </w:r>
-      <w:r>
-        <w:rPr>
-          <w:i/>
-          <w:iCs/>
-        </w:rPr>
-        <w:t xml:space="preserve">02–03/2026</w:t>
-      </w:r>
-      <w:r>
-        <w:t xml:space="preserve">)</w:t>
+        <w:t xml:space="preserve">03/2026</w:t>
+      </w:r>
+      <w:r>
+        <w:t xml:space="preserve"> </w:t>
+      </w:r>
+      <w:r>
+        <w:t xml:space="preserve">Reviewer</w:t>
+      </w:r>
+      <w:r>
+        <w:t xml:space="preserve"> </w:t>
+      </w:r>
+      <w:r>
+        <w:rPr>
+          <w:i/>
+          <w:iCs/>
+        </w:rPr>
+        <w:t xml:space="preserve">ÖFEB-Kongress 2026 „Education in Times of Glocalization“.</w:t>
       </w:r>
     </w:p>
     <w:p>
@@ -4313,23 +4509,7 @@
           <w:b/>
           <w:bCs/>
         </w:rPr>
-        <w:t xml:space="preserve">Journal of Curriculum Studies.</w:t>
-      </w:r>
-      <w:r>
-        <w:t xml:space="preserve"> </w:t>
-      </w:r>
-      <w:r>
-        <w:t xml:space="preserve">(</w:t>
-      </w:r>
-      <w:r>
-        <w:rPr>
-          <w:i/>
-          <w:iCs/>
-        </w:rPr>
-        <w:t xml:space="preserve">02–05/2026</w:t>
-      </w:r>
-      <w:r>
-        <w:t xml:space="preserve">)</w:t>
+        <w:t xml:space="preserve">Funktionen in Gremien und Arbeitsgruppen</w:t>
       </w:r>
     </w:p>
     <w:p>
@@ -4344,23 +4524,17 @@
           <w:b/>
           <w:bCs/>
         </w:rPr>
-        <w:t xml:space="preserve">Journal of Didactics of Philosophy.</w:t>
-      </w:r>
-      <w:r>
-        <w:t xml:space="preserve"> </w:t>
-      </w:r>
-      <w:r>
-        <w:t xml:space="preserve">(</w:t>
-      </w:r>
-      <w:r>
-        <w:rPr>
-          <w:i/>
-          <w:iCs/>
-        </w:rPr>
-        <w:t xml:space="preserve">03/2026</w:t>
-      </w:r>
-      <w:r>
-        <w:t xml:space="preserve">)</w:t>
+        <w:t xml:space="preserve">04/2024–03/2025</w:t>
+      </w:r>
+      <w:r>
+        <w:t xml:space="preserve"> </w:t>
+      </w:r>
+      <w:r>
+        <w:rPr>
+          <w:i/>
+          <w:iCs/>
+        </w:rPr>
+        <w:t xml:space="preserve">Vorsitzender (Chair) der DGfE-Kommission Bildung für nachhaltige Entwicklung.</w:t>
       </w:r>
     </w:p>
     <w:p>
@@ -4372,16 +4546,20 @@
       </w:pPr>
       <w:r>
         <w:rPr>
-          <w:i/>
-          <w:iCs/>
-        </w:rPr>
-        <w:t xml:space="preserve">03/2026</w:t>
-      </w:r>
-      <w:r>
-        <w:t xml:space="preserve"> </w:t>
-      </w:r>
-      <w:r>
-        <w:t xml:space="preserve">Ludwigsburg Contributions to Media Education (LBzM).</w:t>
+          <w:b/>
+          <w:bCs/>
+        </w:rPr>
+        <w:t xml:space="preserve">04/2024–03/2027</w:t>
+      </w:r>
+      <w:r>
+        <w:t xml:space="preserve"> </w:t>
+      </w:r>
+      <w:r>
+        <w:rPr>
+          <w:i/>
+          <w:iCs/>
+        </w:rPr>
+        <w:t xml:space="preserve">Mitglied des Vorstands der Sektion Interkulturelle und International Vergleichende Erziehungswissenschaft (DGfE).</w:t>
       </w:r>
     </w:p>
     <w:p>
@@ -4396,23 +4574,17 @@
           <w:b/>
           <w:bCs/>
         </w:rPr>
-        <w:t xml:space="preserve">Education Sciences.</w:t>
-      </w:r>
-      <w:r>
-        <w:t xml:space="preserve"> </w:t>
-      </w:r>
-      <w:r>
-        <w:t xml:space="preserve">(</w:t>
-      </w:r>
-      <w:r>
-        <w:rPr>
-          <w:i/>
-          <w:iCs/>
-        </w:rPr>
-        <w:t xml:space="preserve">05/2026</w:t>
-      </w:r>
-      <w:r>
-        <w:t xml:space="preserve">)</w:t>
+        <w:t xml:space="preserve">04/2024–11/2025</w:t>
+      </w:r>
+      <w:r>
+        <w:t xml:space="preserve"> </w:t>
+      </w:r>
+      <w:r>
+        <w:rPr>
+          <w:i/>
+          <w:iCs/>
+        </w:rPr>
+        <w:t xml:space="preserve">Mitglied des Scientific Advisory Board, Projekt ENCOMPASS.</w:t>
       </w:r>
     </w:p>
     <w:p>
@@ -4427,23 +4599,17 @@
           <w:b/>
           <w:bCs/>
         </w:rPr>
-        <w:t xml:space="preserve">Sustainability.</w:t>
-      </w:r>
-      <w:r>
-        <w:t xml:space="preserve"> </w:t>
-      </w:r>
-      <w:r>
-        <w:t xml:space="preserve">(</w:t>
-      </w:r>
-      <w:r>
-        <w:rPr>
-          <w:i/>
-          <w:iCs/>
-        </w:rPr>
-        <w:t xml:space="preserve">05/2026</w:t>
-      </w:r>
-      <w:r>
-        <w:t xml:space="preserve">)</w:t>
+        <w:t xml:space="preserve">seit 06/2025</w:t>
+      </w:r>
+      <w:r>
+        <w:t xml:space="preserve"> </w:t>
+      </w:r>
+      <w:r>
+        <w:rPr>
+          <w:i/>
+          <w:iCs/>
+        </w:rPr>
+        <w:t xml:space="preserve">Mitglied der AG „Gemeinsames Masterstudium der AAU und Universität Leoben zum Thema ‘Circular Engineering‘ / ‘Circular Business‘“.</w:t>
       </w:r>
     </w:p>
     <w:p>
@@ -4458,492 +4624,16 @@
           <w:b/>
           <w:bCs/>
         </w:rPr>
-        <w:t xml:space="preserve">Sustainability, Education Sciences.</w:t>
-      </w:r>
-      <w:r>
-        <w:t xml:space="preserve"> </w:t>
-      </w:r>
-      <w:r>
-        <w:t xml:space="preserve">(</w:t>
-      </w:r>
-      <w:r>
-        <w:rPr>
-          <w:i/>
-          <w:iCs/>
-        </w:rPr>
-        <w:t xml:space="preserve">05/2026–04/2027</w:t>
-      </w:r>
-      <w:r>
-        <w:t xml:space="preserve">)</w:t>
-      </w:r>
-    </w:p>
-    <w:p>
-      <w:pPr>
-        <w:numPr>
-          <w:ilvl w:val="0"/>
-          <w:numId w:val="1042"/>
-        </w:numPr>
-      </w:pPr>
-      <w:r>
-        <w:rPr>
-          <w:b/>
-          <w:bCs/>
-        </w:rPr>
-        <w:t xml:space="preserve">Frontiers in Sociology.</w:t>
-      </w:r>
-      <w:r>
-        <w:t xml:space="preserve"> </w:t>
-      </w:r>
-      <w:r>
-        <w:t xml:space="preserve">(</w:t>
-      </w:r>
-      <w:r>
-        <w:rPr>
-          <w:i/>
-          <w:iCs/>
-        </w:rPr>
-        <w:t xml:space="preserve">05–06/2026</w:t>
-      </w:r>
-      <w:r>
-        <w:t xml:space="preserve">)</w:t>
-      </w:r>
-    </w:p>
-    <w:p>
-      <w:pPr>
-        <w:numPr>
-          <w:ilvl w:val="0"/>
-          <w:numId w:val="1042"/>
-        </w:numPr>
-      </w:pPr>
-      <w:r>
-        <w:rPr>
-          <w:b/>
-          <w:bCs/>
-        </w:rPr>
-        <w:t xml:space="preserve">Sustainability.</w:t>
-      </w:r>
-      <w:r>
-        <w:t xml:space="preserve"> </w:t>
-      </w:r>
-      <w:r>
-        <w:t xml:space="preserve">(</w:t>
-      </w:r>
-      <w:r>
-        <w:rPr>
-          <w:i/>
-          <w:iCs/>
-        </w:rPr>
-        <w:t xml:space="preserve">06/2026</w:t>
-      </w:r>
-      <w:r>
-        <w:t xml:space="preserve">)</w:t>
-      </w:r>
-    </w:p>
-    <w:p>
-      <w:pPr>
-        <w:numPr>
-          <w:ilvl w:val="0"/>
-          <w:numId w:val="1042"/>
-        </w:numPr>
-      </w:pPr>
-      <w:r>
-        <w:rPr>
-          <w:b/>
-          <w:bCs/>
-        </w:rPr>
-        <w:t xml:space="preserve">Revue Education.</w:t>
-      </w:r>
-      <w:r>
-        <w:t xml:space="preserve"> </w:t>
-      </w:r>
-      <w:r>
-        <w:t xml:space="preserve">(</w:t>
-      </w:r>
-      <w:r>
-        <w:rPr>
-          <w:i/>
-          <w:iCs/>
-        </w:rPr>
-        <w:t xml:space="preserve">06/2026</w:t>
-      </w:r>
-      <w:r>
-        <w:t xml:space="preserve">)</w:t>
-      </w:r>
-    </w:p>
-    <w:p>
-      <w:pPr>
-        <w:numPr>
-          <w:ilvl w:val="0"/>
-          <w:numId w:val="1042"/>
-        </w:numPr>
-      </w:pPr>
-      <w:r>
-        <w:rPr>
-          <w:b/>
-          <w:bCs/>
-        </w:rPr>
-        <w:t xml:space="preserve">Gutachtertätigkeiten für Sammelwerke und Handbücher</w:t>
-      </w:r>
-    </w:p>
-    <w:p>
-      <w:pPr>
-        <w:numPr>
-          <w:ilvl w:val="0"/>
-          <w:numId w:val="1042"/>
-        </w:numPr>
-      </w:pPr>
-      <w:r>
-        <w:rPr>
-          <w:i/>
-          <w:iCs/>
-        </w:rPr>
-        <w:t xml:space="preserve">02–04/2025</w:t>
-      </w:r>
-      <w:r>
-        <w:t xml:space="preserve"> </w:t>
-      </w:r>
-      <w:r>
-        <w:t xml:space="preserve">Nachhaltige Transformation der Wirtschaft (Hrsg.: B. Weber/S. von Lingen/H. Hantke).</w:t>
-      </w:r>
-    </w:p>
-    <w:p>
-      <w:pPr>
-        <w:numPr>
-          <w:ilvl w:val="0"/>
-          <w:numId w:val="1042"/>
-        </w:numPr>
-      </w:pPr>
-      <w:r>
-        <w:rPr>
-          <w:i/>
-          <w:iCs/>
-        </w:rPr>
-        <w:t xml:space="preserve">02–04/2025</w:t>
-      </w:r>
-      <w:r>
-        <w:t xml:space="preserve"> </w:t>
-      </w:r>
-      <w:r>
-        <w:t xml:space="preserve">Handbuch Bildung für nachhaltige Entwicklung (Hrsg.: F. Bertschy/M. Rieckmann/M. Singer-Brodowski).</w:t>
-      </w:r>
-    </w:p>
-    <w:p>
-      <w:pPr>
-        <w:numPr>
-          <w:ilvl w:val="0"/>
-          <w:numId w:val="1042"/>
-        </w:numPr>
-      </w:pPr>
-      <w:r>
-        <w:rPr>
-          <w:b/>
-          <w:bCs/>
-        </w:rPr>
-        <w:t xml:space="preserve">Funktionen bei Konferenzen und Tagungen</w:t>
-      </w:r>
-    </w:p>
-    <w:p>
-      <w:pPr>
-        <w:numPr>
-          <w:ilvl w:val="0"/>
-          <w:numId w:val="1042"/>
-        </w:numPr>
-      </w:pPr>
-      <w:r>
-        <w:rPr>
-          <w:b/>
-          <w:bCs/>
-        </w:rPr>
-        <w:t xml:space="preserve">Reviewer</w:t>
-      </w:r>
-      <w:r>
-        <w:t xml:space="preserve"> </w:t>
-      </w:r>
-      <w:r>
-        <w:t xml:space="preserve">(</w:t>
-      </w:r>
-      <w:r>
-        <w:rPr>
-          <w:i/>
-          <w:iCs/>
-        </w:rPr>
-        <w:t xml:space="preserve">05–07/2025</w:t>
-      </w:r>
-      <w:r>
-        <w:t xml:space="preserve">)</w:t>
-      </w:r>
-      <w:r>
-        <w:t xml:space="preserve"> </w:t>
-      </w:r>
-      <w:r>
-        <w:t xml:space="preserve">DGfE-Kongress 2026 „Brüche“.</w:t>
-      </w:r>
-    </w:p>
-    <w:p>
-      <w:pPr>
-        <w:numPr>
-          <w:ilvl w:val="0"/>
-          <w:numId w:val="1042"/>
-        </w:numPr>
-      </w:pPr>
-      <w:r>
-        <w:rPr>
-          <w:b/>
-          <w:bCs/>
-        </w:rPr>
-        <w:t xml:space="preserve">Moderation</w:t>
-      </w:r>
-      <w:r>
-        <w:t xml:space="preserve"> </w:t>
-      </w:r>
-      <w:r>
-        <w:t xml:space="preserve">(</w:t>
-      </w:r>
-      <w:r>
-        <w:rPr>
-          <w:i/>
-          <w:iCs/>
-        </w:rPr>
-        <w:t xml:space="preserve">09/2025</w:t>
-      </w:r>
-      <w:r>
-        <w:t xml:space="preserve">)</w:t>
-      </w:r>
-      <w:r>
-        <w:t xml:space="preserve"> </w:t>
-      </w:r>
-      <w:r>
-        <w:t xml:space="preserve">ECER 2025.</w:t>
-      </w:r>
-    </w:p>
-    <w:p>
-      <w:pPr>
-        <w:numPr>
-          <w:ilvl w:val="0"/>
-          <w:numId w:val="1042"/>
-        </w:numPr>
-      </w:pPr>
-      <w:r>
-        <w:rPr>
-          <w:b/>
-          <w:bCs/>
-        </w:rPr>
-        <w:t xml:space="preserve">Reviewer</w:t>
-      </w:r>
-      <w:r>
-        <w:t xml:space="preserve"> </w:t>
-      </w:r>
-      <w:r>
-        <w:t xml:space="preserve">(</w:t>
-      </w:r>
-      <w:r>
-        <w:rPr>
-          <w:i/>
-          <w:iCs/>
-        </w:rPr>
-        <w:t xml:space="preserve">12/2025</w:t>
-      </w:r>
-      <w:r>
-        <w:t xml:space="preserve">)</w:t>
-      </w:r>
-      <w:r>
-        <w:t xml:space="preserve"> </w:t>
-      </w:r>
-      <w:r>
-        <w:t xml:space="preserve">DGfE-Kongress 2026 „Brüche“.</w:t>
-      </w:r>
-    </w:p>
-    <w:p>
-      <w:pPr>
-        <w:numPr>
-          <w:ilvl w:val="0"/>
-          <w:numId w:val="1042"/>
-        </w:numPr>
-      </w:pPr>
-      <w:r>
-        <w:rPr>
-          <w:b/>
-          <w:bCs/>
-        </w:rPr>
-        <w:t xml:space="preserve">Reviewer</w:t>
-      </w:r>
-      <w:r>
-        <w:t xml:space="preserve"> </w:t>
-      </w:r>
-      <w:r>
-        <w:t xml:space="preserve">(</w:t>
-      </w:r>
-      <w:r>
-        <w:rPr>
-          <w:i/>
-          <w:iCs/>
-        </w:rPr>
-        <w:t xml:space="preserve">01/2026</w:t>
-      </w:r>
-      <w:r>
-        <w:t xml:space="preserve">)</w:t>
-      </w:r>
-      <w:r>
-        <w:t xml:space="preserve"> </w:t>
-      </w:r>
-      <w:r>
-        <w:t xml:space="preserve">ECER.</w:t>
-      </w:r>
-    </w:p>
-    <w:p>
-      <w:pPr>
-        <w:numPr>
-          <w:ilvl w:val="0"/>
-          <w:numId w:val="1042"/>
-        </w:numPr>
-      </w:pPr>
-      <w:r>
-        <w:rPr>
-          <w:b/>
-          <w:bCs/>
-        </w:rPr>
-        <w:t xml:space="preserve">Reviewer</w:t>
-      </w:r>
-      <w:r>
-        <w:t xml:space="preserve"> </w:t>
-      </w:r>
-      <w:r>
-        <w:t xml:space="preserve">(</w:t>
-      </w:r>
-      <w:r>
-        <w:rPr>
-          <w:i/>
-          <w:iCs/>
-        </w:rPr>
-        <w:t xml:space="preserve">03/2026</w:t>
-      </w:r>
-      <w:r>
-        <w:t xml:space="preserve">)</w:t>
-      </w:r>
-      <w:r>
-        <w:t xml:space="preserve"> </w:t>
-      </w:r>
-      <w:r>
-        <w:t xml:space="preserve">ÖFEB-Kongress 2026 „Education in Times of Glocalization“.</w:t>
-      </w:r>
-    </w:p>
-    <w:p>
-      <w:pPr>
-        <w:numPr>
-          <w:ilvl w:val="0"/>
-          <w:numId w:val="1042"/>
-        </w:numPr>
-      </w:pPr>
-      <w:r>
-        <w:rPr>
-          <w:b/>
-          <w:bCs/>
-        </w:rPr>
-        <w:t xml:space="preserve">Funktionen in Gremien und Arbeitsgruppen</w:t>
-      </w:r>
-    </w:p>
-    <w:p>
-      <w:pPr>
-        <w:numPr>
-          <w:ilvl w:val="0"/>
-          <w:numId w:val="1042"/>
-        </w:numPr>
-      </w:pPr>
-      <w:r>
-        <w:rPr>
-          <w:i/>
-          <w:iCs/>
-        </w:rPr>
-        <w:t xml:space="preserve">04/2024–03/2025</w:t>
-      </w:r>
-      <w:r>
-        <w:t xml:space="preserve"> </w:t>
-      </w:r>
-      <w:r>
-        <w:t xml:space="preserve">Vorsitzender (Chair) der DGfE-Kommission Bildung für nachhaltige Entwicklung.</w:t>
-      </w:r>
-    </w:p>
-    <w:p>
-      <w:pPr>
-        <w:numPr>
-          <w:ilvl w:val="0"/>
-          <w:numId w:val="1042"/>
-        </w:numPr>
-      </w:pPr>
-      <w:r>
-        <w:rPr>
-          <w:i/>
-          <w:iCs/>
-        </w:rPr>
-        <w:t xml:space="preserve">04/2024–03/2027</w:t>
-      </w:r>
-      <w:r>
-        <w:t xml:space="preserve"> </w:t>
-      </w:r>
-      <w:r>
-        <w:t xml:space="preserve">Mitglied des Vorstands der Sektion Interkulturelle und International Vergleichende Erziehungswissenschaft (DGfE).</w:t>
-      </w:r>
-    </w:p>
-    <w:p>
-      <w:pPr>
-        <w:numPr>
-          <w:ilvl w:val="0"/>
-          <w:numId w:val="1042"/>
-        </w:numPr>
-      </w:pPr>
-      <w:r>
-        <w:rPr>
-          <w:i/>
-          <w:iCs/>
-        </w:rPr>
-        <w:t xml:space="preserve">04/2024–11/2025</w:t>
-      </w:r>
-      <w:r>
-        <w:t xml:space="preserve"> </w:t>
-      </w:r>
-      <w:r>
-        <w:t xml:space="preserve">Mitglied des Scientific Advisory Board, Projekt ENCOMPASS.</w:t>
-      </w:r>
-    </w:p>
-    <w:p>
-      <w:pPr>
-        <w:numPr>
-          <w:ilvl w:val="0"/>
-          <w:numId w:val="1042"/>
-        </w:numPr>
-      </w:pPr>
-      <w:r>
-        <w:rPr>
-          <w:i/>
-          <w:iCs/>
-        </w:rPr>
-        <w:t xml:space="preserve">seit 06/2025</w:t>
-      </w:r>
-      <w:r>
-        <w:t xml:space="preserve"> </w:t>
-      </w:r>
-      <w:r>
-        <w:t xml:space="preserve">Mitglied der AG „Gemeinsames Masterstudium der AAU und Universität Leoben zum Thema ‘Circular Engineering‘ / ‘Circular Business‘“.</w:t>
-      </w:r>
-    </w:p>
-    <w:p>
-      <w:pPr>
-        <w:numPr>
-          <w:ilvl w:val="0"/>
-          <w:numId w:val="1042"/>
-        </w:numPr>
-      </w:pPr>
-      <w:r>
-        <w:rPr>
-          <w:i/>
-          <w:iCs/>
-        </w:rPr>
         <w:t xml:space="preserve">seit 04/2026</w:t>
       </w:r>
       <w:r>
         <w:t xml:space="preserve"> </w:t>
       </w:r>
       <w:r>
+        <w:rPr>
+          <w:i/>
+          <w:iCs/>
+        </w:rPr>
         <w:t xml:space="preserve">Reviewer, Arbeitsgruppe Wissenschaftliche Integrität (AAU).</w:t>
       </w:r>
     </w:p>
@@ -5006,28 +4696,22 @@
           <w:b/>
           <w:bCs/>
         </w:rPr>
+        <w:t xml:space="preserve">* 2016–2017</w:t>
+      </w:r>
+      <w:r>
+        <w:t xml:space="preserve"> </w:t>
+      </w:r>
+      <w:r>
         <w:t xml:space="preserve">Pilotstudie: Forschungskapazitäten für die qualitative Forschung durch Kollaboration und semantische Auszeichnung</w:t>
       </w:r>
       <w:r>
         <w:t xml:space="preserve"> </w:t>
       </w:r>
       <w:r>
-        <w:t xml:space="preserve">(</w:t>
-      </w:r>
-      <w:r>
-        <w:rPr>
-          <w:i/>
-          <w:iCs/>
-        </w:rPr>
-        <w:t xml:space="preserve">* 2016–2017</w:t>
-      </w:r>
-      <w:r>
-        <w:t xml:space="preserve">)</w:t>
-      </w:r>
-      <w:r>
-        <w:t xml:space="preserve"> </w:t>
-      </w:r>
-      <w:r>
+        <w:rPr>
+          <w:i/>
+          <w:iCs/>
+        </w:rPr>
         <w:t xml:space="preserve">BMBF</w:t>
       </w:r>
       <w:r>
@@ -5053,28 +4737,22 @@
           <w:b/>
           <w:bCs/>
         </w:rPr>
+        <w:t xml:space="preserve">2017</w:t>
+      </w:r>
+      <w:r>
+        <w:t xml:space="preserve"> </w:t>
+      </w:r>
+      <w:r>
         <w:t xml:space="preserve">QSL-Förderfonds Lehre – VFU für Obj. Hermeneutik</w:t>
       </w:r>
       <w:r>
         <w:t xml:space="preserve"> </w:t>
       </w:r>
       <w:r>
-        <w:t xml:space="preserve">(</w:t>
-      </w:r>
-      <w:r>
-        <w:rPr>
-          <w:i/>
-          <w:iCs/>
-        </w:rPr>
-        <w:t xml:space="preserve">2017</w:t>
-      </w:r>
-      <w:r>
-        <w:t xml:space="preserve">)</w:t>
-      </w:r>
-      <w:r>
-        <w:t xml:space="preserve"> </w:t>
-      </w:r>
-      <w:r>
+        <w:rPr>
+          <w:i/>
+          <w:iCs/>
+        </w:rPr>
         <w:t xml:space="preserve">Universität Frankfurt</w:t>
       </w:r>
       <w:r>
@@ -5100,28 +4778,63 @@
           <w:b/>
           <w:bCs/>
         </w:rPr>
+        <w:t xml:space="preserve">2018</w:t>
+      </w:r>
+      <w:r>
+        <w:t xml:space="preserve"> </w:t>
+      </w:r>
+      <w:r>
         <w:t xml:space="preserve">Projekt aKodi – Studierenden- und handlungsorientierte Lehre im Kontext der Digitalisierung</w:t>
       </w:r>
       <w:r>
         <w:t xml:space="preserve"> </w:t>
       </w:r>
       <w:r>
-        <w:t xml:space="preserve">(</w:t>
-      </w:r>
-      <w:r>
-        <w:rPr>
-          <w:i/>
-          <w:iCs/>
+        <w:rPr>
+          <w:i/>
+          <w:iCs/>
+        </w:rPr>
+        <w:t xml:space="preserve">Universität Frankfurt</w:t>
+      </w:r>
+      <w:r>
+        <w:t xml:space="preserve"> </w:t>
+      </w:r>
+      <w:r>
+        <w:rPr>
+          <w:i/>
+          <w:iCs/>
+        </w:rPr>
+        <w:t xml:space="preserve">1.680 €</w:t>
+      </w:r>
+    </w:p>
+    <w:p>
+      <w:pPr>
+        <w:numPr>
+          <w:ilvl w:val="0"/>
+          <w:numId w:val="1045"/>
+        </w:numPr>
+      </w:pPr>
+      <w:r>
+        <w:rPr>
+          <w:b/>
+          <w:bCs/>
         </w:rPr>
         <w:t xml:space="preserve">2018</w:t>
       </w:r>
       <w:r>
-        <w:t xml:space="preserve">)</w:t>
-      </w:r>
-      <w:r>
-        <w:t xml:space="preserve"> </w:t>
-      </w:r>
-      <w:r>
+        <w:t xml:space="preserve"> </w:t>
+      </w:r>
+      <w:r>
+        <w:t xml:space="preserve">QSL-Förderfonds Lehre – Ringvorlesung „Bildung für nachhaltige Entwicklung“</w:t>
+      </w:r>
+      <w:r>
+        <w:t xml:space="preserve"> </w:t>
+      </w:r>
+      <w:r>
+        <w:rPr>
+          <w:i/>
+          <w:iCs/>
+        </w:rPr>
         <w:t xml:space="preserve">Universität Frankfurt</w:t>
       </w:r>
       <w:r>
@@ -5132,7 +4845,7 @@
           <w:i/>
           <w:iCs/>
         </w:rPr>
-        <w:t xml:space="preserve">1.680 €</w:t>
+        <w:t xml:space="preserve">4.930 €</w:t>
       </w:r>
     </w:p>
     <w:p>
@@ -5147,28 +4860,22 @@
           <w:b/>
           <w:bCs/>
         </w:rPr>
-        <w:t xml:space="preserve">QSL-Förderfonds Lehre – Ringvorlesung „Bildung für nachhaltige Entwicklung“</w:t>
-      </w:r>
-      <w:r>
-        <w:t xml:space="preserve"> </w:t>
-      </w:r>
-      <w:r>
-        <w:t xml:space="preserve">(</w:t>
-      </w:r>
-      <w:r>
-        <w:rPr>
-          <w:i/>
-          <w:iCs/>
-        </w:rPr>
-        <w:t xml:space="preserve">2018</w:t>
-      </w:r>
-      <w:r>
-        <w:t xml:space="preserve">)</w:t>
-      </w:r>
-      <w:r>
-        <w:t xml:space="preserve"> </w:t>
-      </w:r>
-      <w:r>
+        <w:t xml:space="preserve">2019</w:t>
+      </w:r>
+      <w:r>
+        <w:t xml:space="preserve"> </w:t>
+      </w:r>
+      <w:r>
+        <w:t xml:space="preserve">Bildung für nachhaltige Entwicklung durch die und an der Goethe-Universität</w:t>
+      </w:r>
+      <w:r>
+        <w:t xml:space="preserve"> </w:t>
+      </w:r>
+      <w:r>
+        <w:rPr>
+          <w:i/>
+          <w:iCs/>
+        </w:rPr>
         <w:t xml:space="preserve">Universität Frankfurt</w:t>
       </w:r>
       <w:r>
@@ -5179,7 +4886,7 @@
           <w:i/>
           <w:iCs/>
         </w:rPr>
-        <w:t xml:space="preserve">4.930 €</w:t>
+        <w:t xml:space="preserve">15.670 €</w:t>
       </w:r>
     </w:p>
     <w:p>
@@ -5194,39 +4901,33 @@
           <w:b/>
           <w:bCs/>
         </w:rPr>
-        <w:t xml:space="preserve">Bildung für nachhaltige Entwicklung durch die und an der Goethe-Universität</w:t>
-      </w:r>
-      <w:r>
-        <w:t xml:space="preserve"> </w:t>
-      </w:r>
-      <w:r>
-        <w:t xml:space="preserve">(</w:t>
-      </w:r>
-      <w:r>
-        <w:rPr>
-          <w:i/>
-          <w:iCs/>
-        </w:rPr>
-        <w:t xml:space="preserve">2019</w:t>
-      </w:r>
-      <w:r>
-        <w:t xml:space="preserve">)</w:t>
-      </w:r>
-      <w:r>
-        <w:t xml:space="preserve"> </w:t>
-      </w:r>
-      <w:r>
-        <w:t xml:space="preserve">Universität Frankfurt</w:t>
-      </w:r>
-      <w:r>
-        <w:t xml:space="preserve"> </w:t>
-      </w:r>
-      <w:r>
-        <w:rPr>
-          <w:i/>
-          <w:iCs/>
-        </w:rPr>
-        <w:t xml:space="preserve">15.670 €</w:t>
+        <w:t xml:space="preserve">2020</w:t>
+      </w:r>
+      <w:r>
+        <w:t xml:space="preserve"> </w:t>
+      </w:r>
+      <w:r>
+        <w:t xml:space="preserve">„Konjunkturpaket als Motor für eine sozial-ökologische Transformation?“</w:t>
+      </w:r>
+      <w:r>
+        <w:t xml:space="preserve"> </w:t>
+      </w:r>
+      <w:r>
+        <w:rPr>
+          <w:i/>
+          <w:iCs/>
+        </w:rPr>
+        <w:t xml:space="preserve">Grade Sustain, Universität Frankfurt</w:t>
+      </w:r>
+      <w:r>
+        <w:t xml:space="preserve"> </w:t>
+      </w:r>
+      <w:r>
+        <w:rPr>
+          <w:i/>
+          <w:iCs/>
+        </w:rPr>
+        <w:t xml:space="preserve">2.844 €</w:t>
       </w:r>
     </w:p>
     <w:p>
@@ -5241,39 +4942,33 @@
           <w:b/>
           <w:bCs/>
         </w:rPr>
-        <w:t xml:space="preserve">„Konjunkturpaket als Motor für eine sozial-ökologische Transformation?“</w:t>
-      </w:r>
-      <w:r>
-        <w:t xml:space="preserve"> </w:t>
-      </w:r>
-      <w:r>
-        <w:t xml:space="preserve">(</w:t>
-      </w:r>
-      <w:r>
-        <w:rPr>
-          <w:i/>
-          <w:iCs/>
-        </w:rPr>
         <w:t xml:space="preserve">2020</w:t>
       </w:r>
       <w:r>
-        <w:t xml:space="preserve">)</w:t>
-      </w:r>
-      <w:r>
-        <w:t xml:space="preserve"> </w:t>
-      </w:r>
-      <w:r>
-        <w:t xml:space="preserve">Grade Sustain, Universität Frankfurt</w:t>
-      </w:r>
-      <w:r>
-        <w:t xml:space="preserve"> </w:t>
-      </w:r>
-      <w:r>
-        <w:rPr>
-          <w:i/>
-          <w:iCs/>
-        </w:rPr>
-        <w:t xml:space="preserve">2.844 €</w:t>
+        <w:t xml:space="preserve"> </w:t>
+      </w:r>
+      <w:r>
+        <w:t xml:space="preserve">„Empowering for the Transition Towards a Climate Neutral, Sustainable Europe by Reasons“</w:t>
+      </w:r>
+      <w:r>
+        <w:t xml:space="preserve"> </w:t>
+      </w:r>
+      <w:r>
+        <w:rPr>
+          <w:i/>
+          <w:iCs/>
+        </w:rPr>
+        <w:t xml:space="preserve">Förderfonds Aufbau koordinierter Programme, Universität Frankfurt</w:t>
+      </w:r>
+      <w:r>
+        <w:t xml:space="preserve"> </w:t>
+      </w:r>
+      <w:r>
+        <w:rPr>
+          <w:i/>
+          <w:iCs/>
+        </w:rPr>
+        <w:t xml:space="preserve">4.996 €</w:t>
       </w:r>
     </w:p>
     <w:p>
@@ -5288,39 +4983,33 @@
           <w:b/>
           <w:bCs/>
         </w:rPr>
-        <w:t xml:space="preserve">„Empowering for the Transition Towards a Climate Neutral, Sustainable Europe by Reasons“</w:t>
-      </w:r>
-      <w:r>
-        <w:t xml:space="preserve"> </w:t>
-      </w:r>
-      <w:r>
-        <w:t xml:space="preserve">(</w:t>
-      </w:r>
-      <w:r>
-        <w:rPr>
-          <w:i/>
-          <w:iCs/>
-        </w:rPr>
-        <w:t xml:space="preserve">2020</w:t>
-      </w:r>
-      <w:r>
-        <w:t xml:space="preserve">)</w:t>
-      </w:r>
-      <w:r>
-        <w:t xml:space="preserve"> </w:t>
-      </w:r>
-      <w:r>
-        <w:t xml:space="preserve">Förderfonds Aufbau koordinierter Programme, Universität Frankfurt</w:t>
-      </w:r>
-      <w:r>
-        <w:t xml:space="preserve"> </w:t>
-      </w:r>
-      <w:r>
-        <w:rPr>
-          <w:i/>
-          <w:iCs/>
-        </w:rPr>
-        <w:t xml:space="preserve">4.996 €</w:t>
+        <w:t xml:space="preserve">* 2021</w:t>
+      </w:r>
+      <w:r>
+        <w:t xml:space="preserve"> </w:t>
+      </w:r>
+      <w:r>
+        <w:t xml:space="preserve">Learning Democracy in Europe</w:t>
+      </w:r>
+      <w:r>
+        <w:t xml:space="preserve"> </w:t>
+      </w:r>
+      <w:r>
+        <w:rPr>
+          <w:i/>
+          <w:iCs/>
+        </w:rPr>
+        <w:t xml:space="preserve">BMBF</w:t>
+      </w:r>
+      <w:r>
+        <w:t xml:space="preserve"> </w:t>
+      </w:r>
+      <w:r>
+        <w:rPr>
+          <w:i/>
+          <w:iCs/>
+        </w:rPr>
+        <w:t xml:space="preserve">44.923,66 €</w:t>
       </w:r>
     </w:p>
     <w:p>
@@ -5335,39 +5024,33 @@
           <w:b/>
           <w:bCs/>
         </w:rPr>
-        <w:t xml:space="preserve">Learning Democracy in Europe</w:t>
-      </w:r>
-      <w:r>
-        <w:t xml:space="preserve"> </w:t>
-      </w:r>
-      <w:r>
-        <w:t xml:space="preserve">(</w:t>
-      </w:r>
-      <w:r>
-        <w:rPr>
-          <w:i/>
-          <w:iCs/>
-        </w:rPr>
-        <w:t xml:space="preserve">* 2021</w:t>
-      </w:r>
-      <w:r>
-        <w:t xml:space="preserve">)</w:t>
-      </w:r>
-      <w:r>
-        <w:t xml:space="preserve"> </w:t>
-      </w:r>
-      <w:r>
-        <w:t xml:space="preserve">BMBF</w:t>
-      </w:r>
-      <w:r>
-        <w:t xml:space="preserve"> </w:t>
-      </w:r>
-      <w:r>
-        <w:rPr>
-          <w:i/>
-          <w:iCs/>
-        </w:rPr>
-        <w:t xml:space="preserve">44.923,66 €</w:t>
+        <w:t xml:space="preserve">2021</w:t>
+      </w:r>
+      <w:r>
+        <w:t xml:space="preserve"> </w:t>
+      </w:r>
+      <w:r>
+        <w:t xml:space="preserve">„Sustainable Europe by Education of Deliberation“ (SEED)</w:t>
+      </w:r>
+      <w:r>
+        <w:t xml:space="preserve"> </w:t>
+      </w:r>
+      <w:r>
+        <w:rPr>
+          <w:i/>
+          <w:iCs/>
+        </w:rPr>
+        <w:t xml:space="preserve">European Union</w:t>
+      </w:r>
+      <w:r>
+        <w:t xml:space="preserve"> </w:t>
+      </w:r>
+      <w:r>
+        <w:rPr>
+          <w:i/>
+          <w:iCs/>
+        </w:rPr>
+        <w:t xml:space="preserve">4.851.498,38 €</w:t>
       </w:r>
     </w:p>
     <w:p>
@@ -5382,39 +5065,33 @@
           <w:b/>
           <w:bCs/>
         </w:rPr>
-        <w:t xml:space="preserve">„Sustainable Europe by Education of Deliberation“ (SEED)</w:t>
-      </w:r>
-      <w:r>
-        <w:t xml:space="preserve"> </w:t>
-      </w:r>
-      <w:r>
-        <w:t xml:space="preserve">(</w:t>
-      </w:r>
-      <w:r>
-        <w:rPr>
-          <w:i/>
-          <w:iCs/>
-        </w:rPr>
-        <w:t xml:space="preserve">2021</w:t>
-      </w:r>
-      <w:r>
-        <w:t xml:space="preserve">)</w:t>
-      </w:r>
-      <w:r>
-        <w:t xml:space="preserve"> </w:t>
-      </w:r>
-      <w:r>
-        <w:t xml:space="preserve">European Union</w:t>
-      </w:r>
-      <w:r>
-        <w:t xml:space="preserve"> </w:t>
-      </w:r>
-      <w:r>
-        <w:rPr>
-          <w:i/>
-          <w:iCs/>
-        </w:rPr>
-        <w:t xml:space="preserve">4.851.498,38 €</w:t>
+        <w:t xml:space="preserve">2022</w:t>
+      </w:r>
+      <w:r>
+        <w:t xml:space="preserve"> </w:t>
+      </w:r>
+      <w:r>
+        <w:t xml:space="preserve">DGfE-BNE-Kommissionstagung 2022</w:t>
+      </w:r>
+      <w:r>
+        <w:t xml:space="preserve"> </w:t>
+      </w:r>
+      <w:r>
+        <w:rPr>
+          <w:i/>
+          <w:iCs/>
+        </w:rPr>
+        <w:t xml:space="preserve">Goethe-Universität GRADE SUSTAIN</w:t>
+      </w:r>
+      <w:r>
+        <w:t xml:space="preserve"> </w:t>
+      </w:r>
+      <w:r>
+        <w:rPr>
+          <w:i/>
+          <w:iCs/>
+        </w:rPr>
+        <w:t xml:space="preserve">5.000,00 €</w:t>
       </w:r>
     </w:p>
     <w:p>
@@ -5429,39 +5106,74 @@
           <w:b/>
           <w:bCs/>
         </w:rPr>
+        <w:t xml:space="preserve">2022</w:t>
+      </w:r>
+      <w:r>
+        <w:t xml:space="preserve"> </w:t>
+      </w:r>
+      <w:r>
         <w:t xml:space="preserve">DGfE-BNE-Kommissionstagung 2022</w:t>
       </w:r>
       <w:r>
         <w:t xml:space="preserve"> </w:t>
       </w:r>
       <w:r>
-        <w:t xml:space="preserve">(</w:t>
-      </w:r>
-      <w:r>
-        <w:rPr>
-          <w:i/>
-          <w:iCs/>
+        <w:rPr>
+          <w:i/>
+          <w:iCs/>
+        </w:rPr>
+        <w:t xml:space="preserve">FB Erziehungswissenschaften, Goethe-Universität</w:t>
+      </w:r>
+      <w:r>
+        <w:t xml:space="preserve"> </w:t>
+      </w:r>
+      <w:r>
+        <w:rPr>
+          <w:i/>
+          <w:iCs/>
+        </w:rPr>
+        <w:t xml:space="preserve">1.500,00 €</w:t>
+      </w:r>
+    </w:p>
+    <w:p>
+      <w:pPr>
+        <w:numPr>
+          <w:ilvl w:val="0"/>
+          <w:numId w:val="1045"/>
+        </w:numPr>
+      </w:pPr>
+      <w:r>
+        <w:rPr>
+          <w:b/>
+          <w:bCs/>
         </w:rPr>
         <w:t xml:space="preserve">2022</w:t>
       </w:r>
       <w:r>
-        <w:t xml:space="preserve">)</w:t>
-      </w:r>
-      <w:r>
-        <w:t xml:space="preserve"> </w:t>
-      </w:r>
-      <w:r>
-        <w:t xml:space="preserve">Goethe-Universität GRADE SUSTAIN</w:t>
-      </w:r>
-      <w:r>
-        <w:t xml:space="preserve"> </w:t>
-      </w:r>
-      <w:r>
-        <w:rPr>
-          <w:i/>
-          <w:iCs/>
-        </w:rPr>
-        <w:t xml:space="preserve">5.000,00 €</w:t>
+        <w:t xml:space="preserve"> </w:t>
+      </w:r>
+      <w:r>
+        <w:t xml:space="preserve">Transformationspfade und wissenschaftstheoretische Reflexionen</w:t>
+      </w:r>
+      <w:r>
+        <w:t xml:space="preserve"> </w:t>
+      </w:r>
+      <w:r>
+        <w:rPr>
+          <w:i/>
+          <w:iCs/>
+        </w:rPr>
+        <w:t xml:space="preserve">RobustNature SynergyFund, Goethe-Universität</w:t>
+      </w:r>
+      <w:r>
+        <w:t xml:space="preserve"> </w:t>
+      </w:r>
+      <w:r>
+        <w:rPr>
+          <w:i/>
+          <w:iCs/>
+        </w:rPr>
+        <w:t xml:space="preserve">26.764 €</w:t>
       </w:r>
     </w:p>
     <w:p>
@@ -5476,39 +5188,33 @@
           <w:b/>
           <w:bCs/>
         </w:rPr>
-        <w:t xml:space="preserve">DGfE-BNE-Kommissionstagung 2022</w:t>
-      </w:r>
-      <w:r>
-        <w:t xml:space="preserve"> </w:t>
-      </w:r>
-      <w:r>
-        <w:t xml:space="preserve">(</w:t>
-      </w:r>
-      <w:r>
-        <w:rPr>
-          <w:i/>
-          <w:iCs/>
-        </w:rPr>
-        <w:t xml:space="preserve">2022</w:t>
-      </w:r>
-      <w:r>
-        <w:t xml:space="preserve">)</w:t>
-      </w:r>
-      <w:r>
-        <w:t xml:space="preserve"> </w:t>
-      </w:r>
-      <w:r>
-        <w:t xml:space="preserve">FB Erziehungswissenschaften, Goethe-Universität</w:t>
-      </w:r>
-      <w:r>
-        <w:t xml:space="preserve"> </w:t>
-      </w:r>
-      <w:r>
-        <w:rPr>
-          <w:i/>
-          <w:iCs/>
-        </w:rPr>
-        <w:t xml:space="preserve">1.500,00 €</w:t>
+        <w:t xml:space="preserve">2023</w:t>
+      </w:r>
+      <w:r>
+        <w:t xml:space="preserve"> </w:t>
+      </w:r>
+      <w:r>
+        <w:t xml:space="preserve">Goethe Teaches Sustainability</w:t>
+      </w:r>
+      <w:r>
+        <w:t xml:space="preserve"> </w:t>
+      </w:r>
+      <w:r>
+        <w:rPr>
+          <w:i/>
+          <w:iCs/>
+        </w:rPr>
+        <w:t xml:space="preserve">Goethe-Universität</w:t>
+      </w:r>
+      <w:r>
+        <w:t xml:space="preserve"> </w:t>
+      </w:r>
+      <w:r>
+        <w:rPr>
+          <w:i/>
+          <w:iCs/>
+        </w:rPr>
+        <w:t xml:space="preserve">146.511,84 €</w:t>
       </w:r>
     </w:p>
     <w:p>
@@ -5523,122 +5229,22 @@
           <w:b/>
           <w:bCs/>
         </w:rPr>
-        <w:t xml:space="preserve">Transformationspfade und wissenschaftstheoretische Reflexionen</w:t>
-      </w:r>
-      <w:r>
-        <w:t xml:space="preserve"> </w:t>
-      </w:r>
-      <w:r>
-        <w:t xml:space="preserve">(</w:t>
-      </w:r>
-      <w:r>
-        <w:rPr>
-          <w:i/>
-          <w:iCs/>
-        </w:rPr>
-        <w:t xml:space="preserve">2022</w:t>
-      </w:r>
-      <w:r>
-        <w:t xml:space="preserve">)</w:t>
-      </w:r>
-      <w:r>
-        <w:t xml:space="preserve"> </w:t>
-      </w:r>
-      <w:r>
-        <w:t xml:space="preserve">RobustNature SynergyFund, Goethe-Universität</w:t>
-      </w:r>
-      <w:r>
-        <w:t xml:space="preserve"> </w:t>
-      </w:r>
-      <w:r>
-        <w:rPr>
-          <w:i/>
-          <w:iCs/>
-        </w:rPr>
-        <w:t xml:space="preserve">26.764 €</w:t>
-      </w:r>
-    </w:p>
-    <w:p>
-      <w:pPr>
-        <w:numPr>
-          <w:ilvl w:val="0"/>
-          <w:numId w:val="1045"/>
-        </w:numPr>
-      </w:pPr>
-      <w:r>
-        <w:rPr>
-          <w:b/>
-          <w:bCs/>
-        </w:rPr>
-        <w:t xml:space="preserve">Goethe Teaches Sustainability</w:t>
-      </w:r>
-      <w:r>
-        <w:t xml:space="preserve"> </w:t>
-      </w:r>
-      <w:r>
-        <w:t xml:space="preserve">(</w:t>
-      </w:r>
-      <w:r>
-        <w:rPr>
-          <w:i/>
-          <w:iCs/>
-        </w:rPr>
         <w:t xml:space="preserve">2023</w:t>
       </w:r>
       <w:r>
-        <w:t xml:space="preserve">)</w:t>
-      </w:r>
-      <w:r>
-        <w:t xml:space="preserve"> </w:t>
-      </w:r>
-      <w:r>
-        <w:t xml:space="preserve">Goethe-Universität</w:t>
-      </w:r>
-      <w:r>
-        <w:t xml:space="preserve"> </w:t>
-      </w:r>
-      <w:r>
-        <w:rPr>
-          <w:i/>
-          <w:iCs/>
-        </w:rPr>
-        <w:t xml:space="preserve">146.511,84 €</w:t>
-      </w:r>
-    </w:p>
-    <w:p>
-      <w:pPr>
-        <w:numPr>
-          <w:ilvl w:val="0"/>
-          <w:numId w:val="1045"/>
-        </w:numPr>
-      </w:pPr>
-      <w:r>
-        <w:rPr>
-          <w:b/>
-          <w:bCs/>
-        </w:rPr>
+        <w:t xml:space="preserve"> </w:t>
+      </w:r>
+      <w:r>
         <w:t xml:space="preserve">Zur wissenschaftstheoretisch-reflektierten Systematisierung von BNE</w:t>
       </w:r>
       <w:r>
         <w:t xml:space="preserve"> </w:t>
       </w:r>
       <w:r>
-        <w:t xml:space="preserve">(</w:t>
-      </w:r>
-      <w:r>
-        <w:rPr>
-          <w:i/>
-          <w:iCs/>
-        </w:rPr>
-        <w:t xml:space="preserve">2023</w:t>
-      </w:r>
-      <w:r>
-        <w:t xml:space="preserve">)</w:t>
-      </w:r>
-      <w:r>
-        <w:t xml:space="preserve"> </w:t>
-      </w:r>
-      <w:r>
+        <w:rPr>
+          <w:i/>
+          <w:iCs/>
+        </w:rPr>
         <w:t xml:space="preserve">DFG</w:t>
       </w:r>
       <w:r>
@@ -5671,8 +5277,8 @@
       </w:pPr>
       <w:r>
         <w:rPr>
-          <w:i/>
-          <w:iCs/>
+          <w:b/>
+          <w:bCs/>
         </w:rPr>
         <w:t xml:space="preserve">seit 03/2021</w:t>
       </w:r>
@@ -5680,6 +5286,10 @@
         <w:t xml:space="preserve"> </w:t>
       </w:r>
       <w:r>
+        <w:rPr>
+          <w:i/>
+          <w:iCs/>
+        </w:rPr>
         <w:t xml:space="preserve">Vorstandsmitglied der Kommission Bildung für eine nachhaltige Entwicklung in der Deutschen Gesellschaft für Erziehungswissenschaft.</w:t>
       </w:r>
     </w:p>
@@ -5692,8 +5302,8 @@
       </w:pPr>
       <w:r>
         <w:rPr>
-          <w:i/>
-          <w:iCs/>
+          <w:b/>
+          <w:bCs/>
         </w:rPr>
         <w:t xml:space="preserve">seit 2018</w:t>
       </w:r>
@@ -5701,6 +5311,10 @@
         <w:t xml:space="preserve"> </w:t>
       </w:r>
       <w:r>
+        <w:rPr>
+          <w:i/>
+          <w:iCs/>
+        </w:rPr>
         <w:t xml:space="preserve">Mitglied der Arbeitsgruppe „Internationalisierung“ am Fachbereich Erziehungswissenschaften der Goethe-Universität Frankfurt am Main.</w:t>
       </w:r>
     </w:p>
@@ -5713,8 +5327,8 @@
       </w:pPr>
       <w:r>
         <w:rPr>
-          <w:i/>
-          <w:iCs/>
+          <w:b/>
+          <w:bCs/>
         </w:rPr>
         <w:t xml:space="preserve">2020–2023</w:t>
       </w:r>
@@ -5722,6 +5336,10 @@
         <w:t xml:space="preserve"> </w:t>
       </w:r>
       <w:r>
+        <w:rPr>
+          <w:i/>
+          <w:iCs/>
+        </w:rPr>
         <w:t xml:space="preserve">Mitglied der vom Senat der Goethe-Universität eingesetzten Arbeitsgruppe „Nachhaltigkeit in und an der Goethe-Universität“.</w:t>
       </w:r>
     </w:p>
@@ -5734,8 +5352,8 @@
       </w:pPr>
       <w:r>
         <w:rPr>
-          <w:i/>
-          <w:iCs/>
+          <w:b/>
+          <w:bCs/>
         </w:rPr>
         <w:t xml:space="preserve">seit 2016</w:t>
       </w:r>
@@ -5743,6 +5361,10 @@
         <w:t xml:space="preserve"> </w:t>
       </w:r>
       <w:r>
+        <w:rPr>
+          <w:i/>
+          <w:iCs/>
+        </w:rPr>
         <w:t xml:space="preserve">Stellvertretender Vorsitzender der Ethikkommission des Fachbereichs Erziehungswissenschaften der Goethe-Universität Frankfurt am Main (04/2020–03/2021 kommissarische Leitung).</w:t>
       </w:r>
     </w:p>
@@ -5755,8 +5377,8 @@
       </w:pPr>
       <w:r>
         <w:rPr>
-          <w:i/>
-          <w:iCs/>
+          <w:b/>
+          <w:bCs/>
         </w:rPr>
         <w:t xml:space="preserve">2017–2019</w:t>
       </w:r>
@@ -5764,6 +5386,10 @@
         <w:t xml:space="preserve"> </w:t>
       </w:r>
       <w:r>
+        <w:rPr>
+          <w:i/>
+          <w:iCs/>
+        </w:rPr>
         <w:t xml:space="preserve">Gewähltes Mitglied der Mittelbauvertretung am Fachbereich Erziehungswissenschaften der Goethe-Universität Frankfurt am Main.</w:t>
       </w:r>
     </w:p>
@@ -5776,8 +5402,8 @@
       </w:pPr>
       <w:r>
         <w:rPr>
-          <w:i/>
-          <w:iCs/>
+          <w:b/>
+          <w:bCs/>
         </w:rPr>
         <w:t xml:space="preserve">2016–2017</w:t>
       </w:r>
@@ -5785,6 +5411,10 @@
         <w:t xml:space="preserve"> </w:t>
       </w:r>
       <w:r>
+        <w:rPr>
+          <w:i/>
+          <w:iCs/>
+        </w:rPr>
         <w:t xml:space="preserve">Mitarbeiter in einer Berufungskommission an der Goethe-Universität Frankfurt.</w:t>
       </w:r>
     </w:p>
@@ -5797,8 +5427,8 @@
       </w:pPr>
       <w:r>
         <w:rPr>
-          <w:i/>
-          <w:iCs/>
+          <w:b/>
+          <w:bCs/>
         </w:rPr>
         <w:t xml:space="preserve">2010–2012</w:t>
       </w:r>
@@ -5806,6 +5436,10 @@
         <w:t xml:space="preserve"> </w:t>
       </w:r>
       <w:r>
+        <w:rPr>
+          <w:i/>
+          <w:iCs/>
+        </w:rPr>
         <w:t xml:space="preserve">Mitglied des Seminarrates am Studienseminar Offenbach.</w:t>
       </w:r>
     </w:p>
@@ -5821,24 +5455,14 @@
           <w:b/>
           <w:bCs/>
         </w:rPr>
+        <w:t xml:space="preserve">2007–2009</w:t>
+      </w:r>
+      <w:r>
+        <w:t xml:space="preserve"> </w:t>
+      </w:r>
+      <w:r>
         <w:t xml:space="preserve">Mitglied des L-Netzes der Universität Frankfurt.</w:t>
       </w:r>
-      <w:r>
-        <w:t xml:space="preserve"> </w:t>
-      </w:r>
-      <w:r>
-        <w:t xml:space="preserve">(</w:t>
-      </w:r>
-      <w:r>
-        <w:rPr>
-          <w:i/>
-          <w:iCs/>
-        </w:rPr>
-        <w:t xml:space="preserve">2007–2009</w:t>
-      </w:r>
-      <w:r>
-        <w:t xml:space="preserve">)</w:t>
-      </w:r>
     </w:p>
     <w:p>
       <w:pPr>
@@ -5849,8 +5473,8 @@
       </w:pPr>
       <w:r>
         <w:rPr>
-          <w:i/>
-          <w:iCs/>
+          <w:b/>
+          <w:bCs/>
         </w:rPr>
         <w:t xml:space="preserve">2003–2005</w:t>
       </w:r>
@@ -5858,6 +5482,10 @@
         <w:t xml:space="preserve"> </w:t>
       </w:r>
       <w:r>
+        <w:rPr>
+          <w:i/>
+          <w:iCs/>
+        </w:rPr>
         <w:t xml:space="preserve">Mitglied der Fachschaft Erziehungswissenschaften der Universität Frankfurt.</w:t>
       </w:r>
     </w:p>
@@ -5880,8 +5508,8 @@
       </w:pPr>
       <w:r>
         <w:rPr>
-          <w:i/>
-          <w:iCs/>
+          <w:b/>
+          <w:bCs/>
         </w:rPr>
         <w:t xml:space="preserve">2014</w:t>
       </w:r>
@@ -5889,6 +5517,10 @@
         <w:t xml:space="preserve"> </w:t>
       </w:r>
       <w:r>
+        <w:rPr>
+          <w:i/>
+          <w:iCs/>
+        </w:rPr>
         <w:t xml:space="preserve">Doktorandenkolloquium Österreichische Gesellschaft für Philosophie, Innsbruck (Österreich).</w:t>
       </w:r>
     </w:p>
@@ -5904,24 +5536,14 @@
           <w:b/>
           <w:bCs/>
         </w:rPr>
+        <w:t xml:space="preserve">2016</w:t>
+      </w:r>
+      <w:r>
+        <w:t xml:space="preserve"> </w:t>
+      </w:r>
+      <w:r>
         <w:t xml:space="preserve">Vortragsreise nach Brasilien (DAAD gefördert).</w:t>
       </w:r>
-      <w:r>
-        <w:t xml:space="preserve"> </w:t>
-      </w:r>
-      <w:r>
-        <w:t xml:space="preserve">(</w:t>
-      </w:r>
-      <w:r>
-        <w:rPr>
-          <w:i/>
-          <w:iCs/>
-        </w:rPr>
-        <w:t xml:space="preserve">2016</w:t>
-      </w:r>
-      <w:r>
-        <w:t xml:space="preserve">)</w:t>
-      </w:r>
     </w:p>
     <w:p>
       <w:pPr>
@@ -5932,8 +5554,8 @@
       </w:pPr>
       <w:r>
         <w:rPr>
-          <w:i/>
-          <w:iCs/>
+          <w:b/>
+          <w:bCs/>
         </w:rPr>
         <w:t xml:space="preserve">2018</w:t>
       </w:r>
@@ -5941,6 +5563,10 @@
         <w:t xml:space="preserve"> </w:t>
       </w:r>
       <w:r>
+        <w:rPr>
+          <w:i/>
+          <w:iCs/>
+        </w:rPr>
         <w:t xml:space="preserve">Austauschdozent PH Bern (Swiss European Mobility Programme), Schweiz, im November 2018.</w:t>
       </w:r>
     </w:p>
@@ -5953,8 +5579,8 @@
       </w:pPr>
       <w:r>
         <w:rPr>
-          <w:i/>
-          <w:iCs/>
+          <w:b/>
+          <w:bCs/>
         </w:rPr>
         <w:t xml:space="preserve">2019</w:t>
       </w:r>
@@ -5962,6 +5588,10 @@
         <w:t xml:space="preserve"> </w:t>
       </w:r>
       <w:r>
+        <w:rPr>
+          <w:i/>
+          <w:iCs/>
+        </w:rPr>
         <w:t xml:space="preserve">Austauschdozent Alpen-Adria-Universität Klagenfurt (ERASMUS+-Programm), Österreich, im März 2019.</w:t>
       </w:r>
     </w:p>

</xml_diff>

<commit_message>
Match PDF look: serif font + small-caps header/headings, regular dates
Switch the Word body font to Times New Roman (a serif, available on every Word
install) to mirror the PDF's Computer Modern; render the name and section
headings in small caps; and drop the bold from dates, matching the PDF.

Co-Authored-By: Claude Opus 4.8 <noreply@anthropic.com>
</commit_message>
<xml_diff>
--- a/Helge_Kminek_Lebenslauf.docx
+++ b/Helge_Kminek_Lebenslauf.docx
@@ -9,8 +9,8 @@
       </w:pPr>
       <w:r>
         <w:rPr>
-          <w:b/>
-          <w:sz w:val="40"/>
+          <w:smallCaps/>
+          <w:sz w:val="44"/>
         </w:rPr>
         <w:t>Dr. Helge Kminek</w:t>
       </w:r>
@@ -23,7 +23,7 @@
       <w:r>
         <w:rPr>
           <w:i/>
-          <w:sz w:val="20"/>
+          <w:sz w:val="22"/>
         </w:rPr>
         <w:t>Lebenslauf</w:t>
       </w:r>
@@ -36,7 +36,7 @@
       <w:r>
         <w:rPr>
           <w:i w:val="0"/>
-          <w:sz w:val="20"/>
+          <w:sz w:val="22"/>
         </w:rPr>
         <w:t>AAU Klagenfurt, Sterneckstraße 15, A-9020 Klagenfurt   |   Mathildenstraße 5, 55116 Mainz</w:t>
       </w:r>
@@ -49,7 +49,7 @@
       <w:r>
         <w:rPr>
           <w:i w:val="0"/>
-          <w:sz w:val="20"/>
+          <w:sz w:val="22"/>
         </w:rPr>
         <w:t>HelgeKminek@posteo.de   |   Helge.Kminek@aau.at</w:t>
       </w:r>
@@ -62,7 +62,7 @@
       <w:r>
         <w:rPr>
           <w:i w:val="0"/>
-          <w:sz w:val="20"/>
+          <w:sz w:val="22"/>
         </w:rPr>
         <w:t>Geboren am 10.02.1980, Offenbach am Main</w:t>
       </w:r>
@@ -76,10 +76,10 @@
       </w:pPr>
       <w:r>
         <w:rPr>
-          <w:b/>
-          <w:sz w:val="22"/>
-        </w:rPr>
-        <w:t>QUALIFIKATIONEN</w:t>
+          <w:smallCaps/>
+          <w:sz w:val="26"/>
+        </w:rPr>
+        <w:t>Qualifikationen</w:t>
       </w:r>
     </w:p>
     <w:tbl>
@@ -113,7 +113,7 @@
             <w:r>
               <w:rPr>
                 <w:i/>
-                <w:sz w:val="20"/>
+                <w:sz w:val="21"/>
               </w:rPr>
               <w:t>Promotion: „Philosophie und Philosophieren im Unterricht. Empirische Erschließung einer widersprüchlichen Praxis.“ Goethe-Universität Frankfurt am Main.</w:t>
             </w:r>
@@ -131,8 +131,7 @@
             </w:pPr>
             <w:r>
               <w:rPr>
-                <w:b/>
-                <w:sz w:val="20"/>
+                <w:sz w:val="22"/>
               </w:rPr>
               <w:t>05/2017</w:t>
             </w:r>
@@ -181,7 +180,7 @@
             <w:r>
               <w:rPr>
                 <w:i/>
-                <w:sz w:val="20"/>
+                <w:sz w:val="21"/>
               </w:rPr>
               <w:t>Staatsexamen für das Lehramt an Gymnasien mit den Fächern: Politik und Wirtschaft, Philosophie und Ethik, Goethe-Universität Frankfurt am Main.</w:t>
             </w:r>
@@ -199,8 +198,7 @@
             </w:pPr>
             <w:r>
               <w:rPr>
-                <w:b/>
-                <w:sz w:val="20"/>
+                <w:sz w:val="22"/>
               </w:rPr>
               <w:t>04/2010</w:t>
             </w:r>
@@ -249,7 +247,7 @@
             <w:r>
               <w:rPr>
                 <w:i/>
-                <w:sz w:val="20"/>
+                <w:sz w:val="21"/>
               </w:rPr>
               <w:t>Diplom in Pädagogik, Goethe-Universität Frankfurt am Main.</w:t>
             </w:r>
@@ -267,8 +265,7 @@
             </w:pPr>
             <w:r>
               <w:rPr>
-                <w:b/>
-                <w:sz w:val="20"/>
+                <w:sz w:val="22"/>
               </w:rPr>
               <w:t>10/2006</w:t>
             </w:r>
@@ -317,7 +314,7 @@
             <w:r>
               <w:rPr>
                 <w:b/>
-                <w:sz w:val="21"/>
+                <w:sz w:val="22"/>
               </w:rPr>
               <w:t>Abitur, Goethe Gymnasium Neu-Isenburg.</w:t>
             </w:r>
@@ -335,8 +332,7 @@
             </w:pPr>
             <w:r>
               <w:rPr>
-                <w:b/>
-                <w:sz w:val="20"/>
+                <w:sz w:val="22"/>
               </w:rPr>
               <w:t>06/1999</w:t>
             </w:r>
@@ -363,10 +359,10 @@
       </w:pPr>
       <w:r>
         <w:rPr>
-          <w:b/>
-          <w:sz w:val="22"/>
-        </w:rPr>
-        <w:t>BERUFLICHE LAUFBAHN</w:t>
+          <w:smallCaps/>
+          <w:sz w:val="26"/>
+        </w:rPr>
+        <w:t>Berufliche Laufbahn</w:t>
       </w:r>
     </w:p>
     <w:tbl>
@@ -400,7 +396,7 @@
             <w:r>
               <w:rPr>
                 <w:b/>
-                <w:sz w:val="21"/>
+                <w:sz w:val="22"/>
               </w:rPr>
               <w:t>Alpen-Adria-Universität Klagenfurt, Institut für Unterrichts- und Schulentwicklung</w:t>
             </w:r>
@@ -412,7 +408,7 @@
             <w:r>
               <w:rPr>
                 <w:i/>
-                <w:sz w:val="20"/>
+                <w:sz w:val="21"/>
               </w:rPr>
               <w:t>Senior Scientist</w:t>
             </w:r>
@@ -430,8 +426,7 @@
             </w:pPr>
             <w:r>
               <w:rPr>
-                <w:b/>
-                <w:sz w:val="20"/>
+                <w:sz w:val="22"/>
               </w:rPr>
               <w:t>seit 04/2024</w:t>
             </w:r>
@@ -480,7 +475,7 @@
             <w:r>
               <w:rPr>
                 <w:b/>
-                <w:sz w:val="21"/>
+                <w:sz w:val="22"/>
               </w:rPr>
               <w:t>Goethe-Universität, Fachbereich Erziehungswissenschaften</w:t>
             </w:r>
@@ -492,7 +487,7 @@
             <w:r>
               <w:rPr>
                 <w:i/>
-                <w:sz w:val="20"/>
+                <w:sz w:val="21"/>
               </w:rPr>
               <w:t>Wissenschaftlicher Mitarbeiter</w:t>
             </w:r>
@@ -510,8 +505,7 @@
             </w:pPr>
             <w:r>
               <w:rPr>
-                <w:b/>
-                <w:sz w:val="20"/>
+                <w:sz w:val="22"/>
               </w:rPr>
               <w:t>04/2021–03/2024</w:t>
             </w:r>
@@ -560,7 +554,7 @@
             <w:r>
               <w:rPr>
                 <w:b/>
-                <w:sz w:val="21"/>
+                <w:sz w:val="22"/>
               </w:rPr>
               <w:t>Goethe-Universität, Fachbereich Erziehungswissenschaften</w:t>
             </w:r>
@@ -572,7 +566,7 @@
             <w:r>
               <w:rPr>
                 <w:i/>
-                <w:sz w:val="20"/>
+                <w:sz w:val="21"/>
               </w:rPr>
               <w:t>Vertretung der W3-Professur „Sozialpädagogik und Familienforschung“</w:t>
             </w:r>
@@ -590,8 +584,7 @@
             </w:pPr>
             <w:r>
               <w:rPr>
-                <w:b/>
-                <w:sz w:val="20"/>
+                <w:sz w:val="22"/>
               </w:rPr>
               <w:t>10/2019–03/2021</w:t>
             </w:r>
@@ -640,7 +633,7 @@
             <w:r>
               <w:rPr>
                 <w:b/>
-                <w:sz w:val="21"/>
+                <w:sz w:val="22"/>
               </w:rPr>
               <w:t>Goethe-Universität, Fachbereich Erziehungswissenschaften</w:t>
             </w:r>
@@ -652,7 +645,7 @@
             <w:r>
               <w:rPr>
                 <w:i/>
-                <w:sz w:val="20"/>
+                <w:sz w:val="21"/>
               </w:rPr>
               <w:t>Wissenschaftlicher Mitarbeiter</w:t>
             </w:r>
@@ -670,8 +663,7 @@
             </w:pPr>
             <w:r>
               <w:rPr>
-                <w:b/>
-                <w:sz w:val="20"/>
+                <w:sz w:val="22"/>
               </w:rPr>
               <w:t>10/2013–09/2019</w:t>
             </w:r>
@@ -720,7 +712,7 @@
             <w:r>
               <w:rPr>
                 <w:b/>
-                <w:sz w:val="21"/>
+                <w:sz w:val="22"/>
               </w:rPr>
               <w:t>Goethe-Universität, Fachbereich Erziehungswissenschaften</w:t>
             </w:r>
@@ -732,7 +724,7 @@
             <w:r>
               <w:rPr>
                 <w:i/>
-                <w:sz w:val="20"/>
+                <w:sz w:val="21"/>
               </w:rPr>
               <w:t>Wissenschaftliche Hilfskraft</w:t>
             </w:r>
@@ -750,8 +742,7 @@
             </w:pPr>
             <w:r>
               <w:rPr>
-                <w:b/>
-                <w:sz w:val="20"/>
+                <w:sz w:val="22"/>
               </w:rPr>
               <w:t>2012–2013</w:t>
             </w:r>
@@ -800,7 +791,7 @@
             <w:r>
               <w:rPr>
                 <w:b/>
-                <w:sz w:val="21"/>
+                <w:sz w:val="22"/>
               </w:rPr>
               <w:t>Studienseminar Offenbach, Stadthof 13, 63065 Offenbach</w:t>
             </w:r>
@@ -812,7 +803,7 @@
             <w:r>
               <w:rPr>
                 <w:i/>
-                <w:sz w:val="20"/>
+                <w:sz w:val="21"/>
               </w:rPr>
               <w:t>Studienreferendar für das Lehramt an Gymnasien</w:t>
             </w:r>
@@ -830,8 +821,7 @@
             </w:pPr>
             <w:r>
               <w:rPr>
-                <w:b/>
-                <w:sz w:val="20"/>
+                <w:sz w:val="22"/>
               </w:rPr>
               <w:t>2010–2012</w:t>
             </w:r>
@@ -880,7 +870,7 @@
             <w:r>
               <w:rPr>
                 <w:b/>
-                <w:sz w:val="21"/>
+                <w:sz w:val="22"/>
               </w:rPr>
               <w:t>Goethe-Universität, Zentrum für Lehrerbildung</w:t>
             </w:r>
@@ -892,7 +882,7 @@
             <w:r>
               <w:rPr>
                 <w:i/>
-                <w:sz w:val="20"/>
+                <w:sz w:val="21"/>
               </w:rPr>
               <w:t>Wissenschaftliche Hilfskraft</w:t>
             </w:r>
@@ -910,8 +900,7 @@
             </w:pPr>
             <w:r>
               <w:rPr>
-                <w:b/>
-                <w:sz w:val="20"/>
+                <w:sz w:val="22"/>
               </w:rPr>
               <w:t>2009–2010</w:t>
             </w:r>
@@ -960,7 +949,7 @@
             <w:r>
               <w:rPr>
                 <w:b/>
-                <w:sz w:val="21"/>
+                <w:sz w:val="22"/>
               </w:rPr>
               <w:t>Verein für Psychotherapie, Beratung und Heilpädagogik, Alexanderstr. 29, 60489 Frankfurt</w:t>
             </w:r>
@@ -972,7 +961,7 @@
             <w:r>
               <w:rPr>
                 <w:i/>
-                <w:sz w:val="20"/>
+                <w:sz w:val="21"/>
               </w:rPr>
               <w:t>Pädagogischer Mitarbeiter</w:t>
             </w:r>
@@ -990,8 +979,7 @@
             </w:pPr>
             <w:r>
               <w:rPr>
-                <w:b/>
-                <w:sz w:val="20"/>
+                <w:sz w:val="22"/>
               </w:rPr>
               <w:t>2002–2010</w:t>
             </w:r>
@@ -1040,7 +1028,7 @@
             <w:r>
               <w:rPr>
                 <w:b/>
-                <w:sz w:val="21"/>
+                <w:sz w:val="22"/>
               </w:rPr>
               <w:t>Heilpädagogisches Institut Vincenzhaus, Schule für Erziehungshilfe und Kranke, Vincenzstr. 29, 65719 Hofheim</w:t>
             </w:r>
@@ -1052,7 +1040,7 @@
             <w:r>
               <w:rPr>
                 <w:i/>
-                <w:sz w:val="20"/>
+                <w:sz w:val="21"/>
               </w:rPr>
               <w:t>Zivildienst und Pädagogischer Mitarbeiter</w:t>
             </w:r>
@@ -1070,8 +1058,7 @@
             </w:pPr>
             <w:r>
               <w:rPr>
-                <w:b/>
-                <w:sz w:val="20"/>
+                <w:sz w:val="22"/>
               </w:rPr>
               <w:t>1999–2002</w:t>
             </w:r>
@@ -1098,10 +1085,10 @@
       </w:pPr>
       <w:r>
         <w:rPr>
-          <w:b/>
-          <w:sz w:val="22"/>
-        </w:rPr>
-        <w:t>VERZEICHNIS DER LEHRVERANSTALTUNGEN</w:t>
+          <w:smallCaps/>
+          <w:sz w:val="26"/>
+        </w:rPr>
+        <w:t>Verzeichnis der Lehrveranstaltungen</w:t>
       </w:r>
     </w:p>
     <w:p>
@@ -2413,7 +2400,7 @@
             <w:r>
               <w:rPr>
                 <w:i/>
-                <w:sz w:val="20"/>
+                <w:sz w:val="21"/>
               </w:rPr>
               <w:t>Praktikumsbegleitendes Seminar. Universität Flensburg, Philosophisches Seminar.</w:t>
             </w:r>
@@ -2431,8 +2418,7 @@
             </w:pPr>
             <w:r>
               <w:rPr>
-                <w:b/>
-                <w:sz w:val="20"/>
+                <w:sz w:val="22"/>
               </w:rPr>
               <w:t>Herbstsem. 2017</w:t>
             </w:r>
@@ -2481,7 +2467,7 @@
             <w:r>
               <w:rPr>
                 <w:i/>
-                <w:sz w:val="20"/>
+                <w:sz w:val="21"/>
               </w:rPr>
               <w:t>Übergang in eine transformierte Gesellschaft in und durch Bildung für nachhaltige Entwicklung in Schule und Unterricht. Universität Flensburg, Institut für Erziehungswissenschaften.</w:t>
             </w:r>
@@ -2499,8 +2485,7 @@
             </w:pPr>
             <w:r>
               <w:rPr>
-                <w:b/>
-                <w:sz w:val="20"/>
+                <w:sz w:val="22"/>
               </w:rPr>
               <w:t>Frühjahrssem. 2019</w:t>
             </w:r>
@@ -2549,7 +2534,7 @@
             <w:r>
               <w:rPr>
                 <w:i/>
-                <w:sz w:val="20"/>
+                <w:sz w:val="21"/>
               </w:rPr>
               <w:t>Erziehung zur Mündigkeit. Universität Flensburg, Institut für Erziehungswissenschaften; Bildung für nachhaltige Entwicklung. Universität Klagenfurt (Österreich); Unterricht beobachten, rekonstruieren, initiieren. Universität Mainz.</w:t>
             </w:r>
@@ -2567,8 +2552,7 @@
             </w:pPr>
             <w:r>
               <w:rPr>
-                <w:b/>
-                <w:sz w:val="20"/>
+                <w:sz w:val="22"/>
               </w:rPr>
               <w:t>Sommersem. 2019</w:t>
             </w:r>
@@ -2623,10 +2607,10 @@
       </w:pPr>
       <w:r>
         <w:rPr>
-          <w:b/>
-          <w:sz w:val="22"/>
-        </w:rPr>
-        <w:t>PUBLIKATIONSVERZEICHNIS</w:t>
+          <w:smallCaps/>
+          <w:sz w:val="26"/>
+        </w:rPr>
+        <w:t>Publikationsverzeichnis</w:t>
       </w:r>
     </w:p>
     <w:p>
@@ -3901,10 +3885,10 @@
       </w:pPr>
       <w:r>
         <w:rPr>
-          <w:b/>
-          <w:sz w:val="22"/>
-        </w:rPr>
-        <w:t>VORTRÄGE</w:t>
+          <w:smallCaps/>
+          <w:sz w:val="26"/>
+        </w:rPr>
+        <w:t>Vorträge</w:t>
       </w:r>
     </w:p>
     <w:p>
@@ -4810,10 +4794,10 @@
       </w:pPr>
       <w:r>
         <w:rPr>
-          <w:b/>
-          <w:sz w:val="22"/>
-        </w:rPr>
-        <w:t>VERANSTALTUNGEN – ORGANISATION UND MITWIRKUNG</w:t>
+          <w:smallCaps/>
+          <w:sz w:val="26"/>
+        </w:rPr>
+        <w:t>Veranstaltungen – Organisation und Mitwirkung</w:t>
       </w:r>
     </w:p>
     <w:tbl>
@@ -4847,7 +4831,7 @@
             <w:r>
               <w:rPr>
                 <w:b/>
-                <w:sz w:val="21"/>
+                <w:sz w:val="22"/>
               </w:rPr>
               <w:t>Kolloquium</w:t>
             </w:r>
@@ -4859,7 +4843,7 @@
             <w:r>
               <w:rPr>
                 <w:i/>
-                <w:sz w:val="20"/>
+                <w:sz w:val="21"/>
               </w:rPr>
               <w:t>Kolloquium der Fachdidaktiken der Goethe-Universität Frankfurt am Main (halbjährlich)</w:t>
             </w:r>
@@ -4877,8 +4861,7 @@
             </w:pPr>
             <w:r>
               <w:rPr>
-                <w:b/>
-                <w:sz w:val="20"/>
+                <w:sz w:val="22"/>
               </w:rPr>
               <w:t>2013–2015, Frankfurt</w:t>
             </w:r>
@@ -4891,7 +4874,7 @@
             <w:r>
               <w:rPr>
                 <w:i/>
-                <w:sz w:val="20"/>
+                <w:sz w:val="21"/>
               </w:rPr>
               <w:t>Organisation, Durchführung, eigener Vortrag</w:t>
             </w:r>
@@ -4940,7 +4923,7 @@
             <w:r>
               <w:rPr>
                 <w:b/>
-                <w:sz w:val="21"/>
+                <w:sz w:val="22"/>
               </w:rPr>
               <w:t>Arbeitstagung</w:t>
             </w:r>
@@ -4952,7 +4935,7 @@
             <w:r>
               <w:rPr>
                 <w:i/>
-                <w:sz w:val="20"/>
+                <w:sz w:val="21"/>
               </w:rPr>
               <w:t>1.–5. Arbeitstagung für Doktorand_innen und Habilitand_innen der Philosophiedidaktik (jährlich)</w:t>
             </w:r>
@@ -4970,8 +4953,7 @@
             </w:pPr>
             <w:r>
               <w:rPr>
-                <w:b/>
-                <w:sz w:val="20"/>
+                <w:sz w:val="22"/>
               </w:rPr>
               <w:t>2014–2018, Frankfurt</w:t>
             </w:r>
@@ -4984,7 +4966,7 @@
             <w:r>
               <w:rPr>
                 <w:i/>
-                <w:sz w:val="20"/>
+                <w:sz w:val="21"/>
               </w:rPr>
               <w:t>Organisation, Durchführung, eigener Vortrag</w:t>
             </w:r>
@@ -5033,7 +5015,7 @@
             <w:r>
               <w:rPr>
                 <w:b/>
-                <w:sz w:val="21"/>
+                <w:sz w:val="22"/>
               </w:rPr>
               <w:t>Int. Arbeitstagung Philosophiedidaktik</w:t>
             </w:r>
@@ -5045,7 +5027,7 @@
             <w:r>
               <w:rPr>
                 <w:i/>
-                <w:sz w:val="20"/>
+                <w:sz w:val="21"/>
               </w:rPr>
               <w:t>1. Internationale Arbeitstagung der Philosophiedidaktik: Zwischen Präskription und Deskription</w:t>
             </w:r>
@@ -5063,8 +5045,7 @@
             </w:pPr>
             <w:r>
               <w:rPr>
-                <w:b/>
-                <w:sz w:val="20"/>
+                <w:sz w:val="22"/>
               </w:rPr>
               <w:t>Juni 2016</w:t>
             </w:r>
@@ -5077,7 +5058,7 @@
             <w:r>
               <w:rPr>
                 <w:i/>
-                <w:sz w:val="20"/>
+                <w:sz w:val="21"/>
               </w:rPr>
               <w:t>Organisation, Durchführung, eigener Vortrag</w:t>
             </w:r>
@@ -5126,7 +5107,7 @@
             <w:r>
               <w:rPr>
                 <w:b/>
-                <w:sz w:val="21"/>
+                <w:sz w:val="22"/>
               </w:rPr>
               <w:t>Kommissionstagung Grundschulforschung (DGfE)</w:t>
             </w:r>
@@ -5138,7 +5119,7 @@
             <w:r>
               <w:rPr>
                 <w:i/>
-                <w:sz w:val="20"/>
+                <w:sz w:val="21"/>
               </w:rPr>
               <w:t>Grundschulforschungstagung 2018: Diversität und soziale Ungleichheit</w:t>
             </w:r>
@@ -5156,8 +5137,7 @@
             </w:pPr>
             <w:r>
               <w:rPr>
-                <w:b/>
-                <w:sz w:val="20"/>
+                <w:sz w:val="22"/>
               </w:rPr>
               <w:t>Sept. 2018</w:t>
             </w:r>
@@ -5170,7 +5150,7 @@
             <w:r>
               <w:rPr>
                 <w:i/>
-                <w:sz w:val="20"/>
+                <w:sz w:val="21"/>
               </w:rPr>
               <w:t>Gutachtertätigkeit</w:t>
             </w:r>
@@ -5219,7 +5199,7 @@
             <w:r>
               <w:rPr>
                 <w:b/>
-                <w:sz w:val="21"/>
+                <w:sz w:val="22"/>
               </w:rPr>
               <w:t>Kommissionstagung Schulforschung u. Didaktik (DGfE)</w:t>
             </w:r>
@@ -5231,7 +5211,7 @@
             <w:r>
               <w:rPr>
                 <w:i/>
-                <w:sz w:val="20"/>
+                <w:sz w:val="21"/>
               </w:rPr>
               <w:t>Transnationale Perspektiven auf Schule und Bildung</w:t>
             </w:r>
@@ -5249,8 +5229,7 @@
             </w:pPr>
             <w:r>
               <w:rPr>
-                <w:b/>
-                <w:sz w:val="20"/>
+                <w:sz w:val="22"/>
               </w:rPr>
               <w:t>Sept. 2018</w:t>
             </w:r>
@@ -5263,7 +5242,7 @@
             <w:r>
               <w:rPr>
                 <w:i/>
-                <w:sz w:val="20"/>
+                <w:sz w:val="21"/>
               </w:rPr>
               <w:t>Mitglied des Organisationsteams, inkl. Begutachtung der Einreichungen</w:t>
             </w:r>
@@ -5312,7 +5291,7 @@
             <w:r>
               <w:rPr>
                 <w:b/>
-                <w:sz w:val="21"/>
+                <w:sz w:val="22"/>
               </w:rPr>
               <w:t>Arbeitstagung</w:t>
             </w:r>
@@ -5324,7 +5303,7 @@
             <w:r>
               <w:rPr>
                 <w:i/>
-                <w:sz w:val="20"/>
+                <w:sz w:val="21"/>
               </w:rPr>
               <w:t>11. Tagung der AG Kasuistik in der Lehrer_innenbildung (SIG der DGfE)</w:t>
             </w:r>
@@ -5342,8 +5321,7 @@
             </w:pPr>
             <w:r>
               <w:rPr>
-                <w:b/>
-                <w:sz w:val="20"/>
+                <w:sz w:val="22"/>
               </w:rPr>
               <w:t>Herbst 2019, Universität Mainz</w:t>
             </w:r>
@@ -5356,7 +5334,7 @@
             <w:r>
               <w:rPr>
                 <w:i/>
-                <w:sz w:val="20"/>
+                <w:sz w:val="21"/>
               </w:rPr>
               <w:t>Mitglied des Organisationsteams, inkl. Begutachtung der Einreichungen</w:t>
             </w:r>
@@ -5405,7 +5383,7 @@
             <w:r>
               <w:rPr>
                 <w:b/>
-                <w:sz w:val="21"/>
+                <w:sz w:val="22"/>
               </w:rPr>
               <w:t>Vortragsreihe</w:t>
             </w:r>
@@ -5417,7 +5395,7 @@
             <w:r>
               <w:rPr>
                 <w:i/>
-                <w:sz w:val="20"/>
+                <w:sz w:val="21"/>
               </w:rPr>
               <w:t>Planetary Thinking (interdisziplinäre Arbeitsgruppe, Goethe-Universität)</w:t>
             </w:r>
@@ -5435,8 +5413,7 @@
             </w:pPr>
             <w:r>
               <w:rPr>
-                <w:b/>
-                <w:sz w:val="20"/>
+                <w:sz w:val="22"/>
               </w:rPr>
               <w:t>2021–2022</w:t>
             </w:r>
@@ -5449,7 +5426,7 @@
             <w:r>
               <w:rPr>
                 <w:i/>
-                <w:sz w:val="20"/>
+                <w:sz w:val="21"/>
               </w:rPr>
               <w:t>Mitglied des Organisationsteams, eigener Vortrag (02/2022)</w:t>
             </w:r>
@@ -5498,7 +5475,7 @@
             <w:r>
               <w:rPr>
                 <w:b/>
-                <w:sz w:val="21"/>
+                <w:sz w:val="22"/>
               </w:rPr>
               <w:t>Workshop</w:t>
             </w:r>
@@ -5510,7 +5487,7 @@
             <w:r>
               <w:rPr>
                 <w:i/>
-                <w:sz w:val="20"/>
+                <w:sz w:val="21"/>
               </w:rPr>
               <w:t>Planetary Boundaries – between Facts and Norms (mit Forschungskolleg Humanwissenschaften, Bad Homburg)</w:t>
             </w:r>
@@ -5528,8 +5505,7 @@
             </w:pPr>
             <w:r>
               <w:rPr>
-                <w:b/>
-                <w:sz w:val="20"/>
+                <w:sz w:val="22"/>
               </w:rPr>
               <w:t>07/2021</w:t>
             </w:r>
@@ -5542,7 +5518,7 @@
             <w:r>
               <w:rPr>
                 <w:i/>
-                <w:sz w:val="20"/>
+                <w:sz w:val="21"/>
               </w:rPr>
               <w:t>Mitglied des Organisationsteams</w:t>
             </w:r>
@@ -5591,7 +5567,7 @@
             <w:r>
               <w:rPr>
                 <w:b/>
-                <w:sz w:val="21"/>
+                <w:sz w:val="22"/>
               </w:rPr>
               <w:t>DGfE-BNE-Kommissionstagung 2022</w:t>
             </w:r>
@@ -5603,7 +5579,7 @@
             <w:r>
               <w:rPr>
                 <w:i/>
-                <w:sz w:val="20"/>
+                <w:sz w:val="21"/>
               </w:rPr>
               <w:t>„Ökologische, gesellschaftliche und individuelle Umbrüche und ihre Bedeutung für BNE“</w:t>
             </w:r>
@@ -5621,8 +5597,7 @@
             </w:pPr>
             <w:r>
               <w:rPr>
-                <w:b/>
-                <w:sz w:val="20"/>
+                <w:sz w:val="22"/>
               </w:rPr>
               <w:t>Sept. 2022</w:t>
             </w:r>
@@ -5635,7 +5610,7 @@
             <w:r>
               <w:rPr>
                 <w:i/>
-                <w:sz w:val="20"/>
+                <w:sz w:val="21"/>
               </w:rPr>
               <w:t>Organisation, Durchführung</w:t>
             </w:r>
@@ -5684,7 +5659,7 @@
             <w:r>
               <w:rPr>
                 <w:b/>
-                <w:sz w:val="21"/>
+                <w:sz w:val="22"/>
               </w:rPr>
               <w:t>DGfE-BNE-Kommissionstagung 2023</w:t>
             </w:r>
@@ -5696,7 +5671,7 @@
             <w:r>
               <w:rPr>
                 <w:i/>
-                <w:sz w:val="20"/>
+                <w:sz w:val="21"/>
               </w:rPr>
               <w:t>„Kontroversen und Debatten im Kontext von Bildung für nachhaltige Entwicklung“</w:t>
             </w:r>
@@ -5714,8 +5689,7 @@
             </w:pPr>
             <w:r>
               <w:rPr>
-                <w:b/>
-                <w:sz w:val="20"/>
+                <w:sz w:val="22"/>
               </w:rPr>
               <w:t>Sept. 2023</w:t>
             </w:r>
@@ -5728,7 +5702,7 @@
             <w:r>
               <w:rPr>
                 <w:i/>
-                <w:sz w:val="20"/>
+                <w:sz w:val="21"/>
               </w:rPr>
               <w:t>Mitglied des Organisationsteams, inkl. Begutachtung der Einreichungen</w:t>
             </w:r>
@@ -5777,7 +5751,7 @@
             <w:r>
               <w:rPr>
                 <w:b/>
-                <w:sz w:val="21"/>
+                <w:sz w:val="22"/>
               </w:rPr>
               <w:t>Tagung/Konferenz</w:t>
             </w:r>
@@ -5789,7 +5763,7 @@
             <w:r>
               <w:rPr>
                 <w:i/>
-                <w:sz w:val="20"/>
+                <w:sz w:val="21"/>
               </w:rPr>
               <w:t>Areas of tension between education for sustainable development and the increasing differentiation of the field</w:t>
             </w:r>
@@ -5807,8 +5781,7 @@
             </w:pPr>
             <w:r>
               <w:rPr>
-                <w:b/>
-                <w:sz w:val="20"/>
+                <w:sz w:val="22"/>
               </w:rPr>
               <w:t>18.–20.09.2024, Bamberg</w:t>
             </w:r>
@@ -5821,7 +5794,7 @@
             <w:r>
               <w:rPr>
                 <w:i/>
-                <w:sz w:val="20"/>
+                <w:sz w:val="21"/>
               </w:rPr>
               <w:t>Mitglied des Organisationsteams (mit J. Costa, A.-K. Holfelder, J. Hufnagl, M. Osterrieder, A. Scheunpflug, M. Singer-Brodowski, D. Taube)</w:t>
             </w:r>
@@ -5870,7 +5843,7 @@
             <w:r>
               <w:rPr>
                 <w:b/>
-                <w:sz w:val="21"/>
+                <w:sz w:val="22"/>
               </w:rPr>
               <w:t>Workshop</w:t>
             </w:r>
@@ -5882,7 +5855,7 @@
             <w:r>
               <w:rPr>
                 <w:i/>
-                <w:sz w:val="20"/>
+                <w:sz w:val="21"/>
               </w:rPr>
               <w:t>DGfE Dialogue Workshop: „Sustainability and planetary futures as a transformation challenge for educational science“</w:t>
             </w:r>
@@ -5900,8 +5873,7 @@
             </w:pPr>
             <w:r>
               <w:rPr>
-                <w:b/>
-                <w:sz w:val="20"/>
+                <w:sz w:val="22"/>
               </w:rPr>
               <w:t>14.–15.11.2024, Nürnberg</w:t>
             </w:r>
@@ -5914,7 +5886,7 @@
             <w:r>
               <w:rPr>
                 <w:i/>
-                <w:sz w:val="20"/>
+                <w:sz w:val="21"/>
               </w:rPr>
               <w:t>Mitglied des Organisationsteams (mit J. Costa, M. Singer-Brodowski, Ch. Wulf, U. Stenger, L. Klepacki, N. Grünberger, J. Engel)</w:t>
             </w:r>
@@ -5963,7 +5935,7 @@
             <w:r>
               <w:rPr>
                 <w:b/>
-                <w:sz w:val="21"/>
+                <w:sz w:val="22"/>
               </w:rPr>
               <w:t>Tagung/Konferenz</w:t>
             </w:r>
@@ -5975,7 +5947,7 @@
             <w:r>
               <w:rPr>
                 <w:i/>
-                <w:sz w:val="20"/>
+                <w:sz w:val="21"/>
               </w:rPr>
               <w:t>Transnationalization of social and ecological inequalities and their relevance to educational science</w:t>
             </w:r>
@@ -5993,8 +5965,7 @@
             </w:pPr>
             <w:r>
               <w:rPr>
-                <w:b/>
-                <w:sz w:val="20"/>
+                <w:sz w:val="22"/>
               </w:rPr>
               <w:t>20.–21.03.2025, Berlin (TU)</w:t>
             </w:r>
@@ -6007,7 +5978,7 @@
             <w:r>
               <w:rPr>
                 <w:i/>
-                <w:sz w:val="20"/>
+                <w:sz w:val="21"/>
               </w:rPr>
               <w:t>Mitglied des Organisationsteams (mit D. Amirpur, N. Bernhard, J. Costa, A. Dogmus, K. Falkenberg, S. Hartong, R. Nikolai, J. Panagiotopoulou, S. Ress, M. Singer-Brodowski)</w:t>
             </w:r>
@@ -6056,7 +6027,7 @@
             <w:r>
               <w:rPr>
                 <w:b/>
-                <w:sz w:val="21"/>
+                <w:sz w:val="22"/>
               </w:rPr>
               <w:t>Tagung/Konferenz</w:t>
             </w:r>
@@ -6068,7 +6039,7 @@
             <w:r>
               <w:rPr>
                 <w:i/>
-                <w:sz w:val="20"/>
+                <w:sz w:val="21"/>
               </w:rPr>
               <w:t>Erziehungswissenschaft und Nachhaltigkeit – Widerstände bearbeiten. Zukünfte gestalten. Auftakttagung der DGfE-AG „Nachhaltigkeit bzw. Nicht-Nachhaltigkeit und planetare Zukünfte“</w:t>
             </w:r>
@@ -6086,8 +6057,7 @@
             </w:pPr>
             <w:r>
               <w:rPr>
-                <w:b/>
-                <w:sz w:val="20"/>
+                <w:sz w:val="22"/>
               </w:rPr>
               <w:t>29.09.–01.10.2025, Köln</w:t>
             </w:r>
@@ -6100,7 +6070,7 @@
             <w:r>
               <w:rPr>
                 <w:i/>
-                <w:sz w:val="20"/>
+                <w:sz w:val="21"/>
               </w:rPr>
               <w:t>Mitglied des Organisationsteams (mit M. Singer-Brodowski, U. Stenger, Ch. Wulf, O. Bilgi, J. Dinkelaker, J. Elven, S. Gaubitz, L. Klepacki, T. Klepacki, S. Ress, O. Sanders)</w:t>
             </w:r>
@@ -6127,10 +6097,10 @@
       </w:pPr>
       <w:r>
         <w:rPr>
-          <w:b/>
-          <w:sz w:val="22"/>
-        </w:rPr>
-        <w:t>FUNKTIONEN UND GUTACHTERTÄTIGKEITEN</w:t>
+          <w:smallCaps/>
+          <w:sz w:val="26"/>
+        </w:rPr>
+        <w:t>Funktionen und Gutachtertätigkeiten</w:t>
       </w:r>
     </w:p>
     <w:p>
@@ -6177,7 +6147,7 @@
             <w:r>
               <w:rPr>
                 <w:b/>
-                <w:sz w:val="21"/>
+                <w:sz w:val="22"/>
               </w:rPr>
               <w:t>Journal of Decolonising Disciplines.</w:t>
             </w:r>
@@ -6195,8 +6165,7 @@
             </w:pPr>
             <w:r>
               <w:rPr>
-                <w:b/>
-                <w:sz w:val="20"/>
+                <w:sz w:val="22"/>
               </w:rPr>
               <w:t>2018</w:t>
             </w:r>
@@ -6258,7 +6227,7 @@
             <w:r>
               <w:rPr>
                 <w:b/>
-                <w:sz w:val="21"/>
+                <w:sz w:val="22"/>
               </w:rPr>
               <w:t>Journal of Didactics of Philosophy.</w:t>
             </w:r>
@@ -6276,8 +6245,7 @@
             </w:pPr>
             <w:r>
               <w:rPr>
-                <w:b/>
-                <w:sz w:val="20"/>
+                <w:sz w:val="22"/>
               </w:rPr>
               <w:t>2016</w:t>
             </w:r>
@@ -6326,7 +6294,7 @@
             <w:r>
               <w:rPr>
                 <w:b/>
-                <w:sz w:val="21"/>
+                <w:sz w:val="22"/>
               </w:rPr>
               <w:t>Educations (openscience.fr/Educations).</w:t>
             </w:r>
@@ -6344,8 +6312,7 @@
             </w:pPr>
             <w:r>
               <w:rPr>
-                <w:b/>
-                <w:sz w:val="20"/>
+                <w:sz w:val="22"/>
               </w:rPr>
               <w:t>seit 11/2025</w:t>
             </w:r>
@@ -6407,7 +6374,7 @@
             <w:r>
               <w:rPr>
                 <w:b/>
-                <w:sz w:val="21"/>
+                <w:sz w:val="22"/>
               </w:rPr>
               <w:t>Editor – datum &amp; diskurs</w:t>
             </w:r>
@@ -6419,7 +6386,7 @@
             <w:r>
               <w:rPr>
                 <w:i/>
-                <w:sz w:val="20"/>
+                <w:sz w:val="21"/>
               </w:rPr>
               <w:t>Zeitschrift für Komplementär-, Sekundär- und Reanalysen im Feld der qualitativen Schul- und Unterrichtsforschung.</w:t>
             </w:r>
@@ -6437,8 +6404,7 @@
             </w:pPr>
             <w:r>
               <w:rPr>
-                <w:b/>
-                <w:sz w:val="20"/>
+                <w:sz w:val="22"/>
               </w:rPr>
               <w:t>seit 04/2024</w:t>
             </w:r>
@@ -6487,7 +6453,7 @@
             <w:r>
               <w:rPr>
                 <w:b/>
-                <w:sz w:val="21"/>
+                <w:sz w:val="22"/>
               </w:rPr>
               <w:t>Editor</w:t>
             </w:r>
@@ -6499,7 +6465,7 @@
             <w:r>
               <w:rPr>
                 <w:i/>
-                <w:sz w:val="20"/>
+                <w:sz w:val="21"/>
               </w:rPr>
               <w:t>Wissenschaftliche Beiträge zur Philosophiedidaktik und Bildungsphilosophie (Scientific Contributions to Philosophy Didactics and Educational Philosophy).</w:t>
             </w:r>
@@ -6517,8 +6483,7 @@
             </w:pPr>
             <w:r>
               <w:rPr>
-                <w:b/>
-                <w:sz w:val="20"/>
+                <w:sz w:val="22"/>
               </w:rPr>
               <w:t>seit 04/2024</w:t>
             </w:r>
@@ -6713,7 +6678,7 @@
             <w:r>
               <w:rPr>
                 <w:b/>
-                <w:sz w:val="21"/>
+                <w:sz w:val="22"/>
               </w:rPr>
               <w:t>The Journal of Environmental Education.</w:t>
             </w:r>
@@ -6731,8 +6696,7 @@
             </w:pPr>
             <w:r>
               <w:rPr>
-                <w:b/>
-                <w:sz w:val="20"/>
+                <w:sz w:val="22"/>
               </w:rPr>
               <w:t>04–04/2024</w:t>
             </w:r>
@@ -6781,7 +6745,7 @@
             <w:r>
               <w:rPr>
                 <w:b/>
-                <w:sz w:val="21"/>
+                <w:sz w:val="22"/>
               </w:rPr>
               <w:t>Journal for Educational Science.</w:t>
             </w:r>
@@ -6799,8 +6763,7 @@
             </w:pPr>
             <w:r>
               <w:rPr>
-                <w:b/>
-                <w:sz w:val="20"/>
+                <w:sz w:val="22"/>
               </w:rPr>
               <w:t>11–12/2024</w:t>
             </w:r>
@@ -6849,7 +6812,7 @@
             <w:r>
               <w:rPr>
                 <w:b/>
-                <w:sz w:val="21"/>
+                <w:sz w:val="22"/>
               </w:rPr>
               <w:t>Discover Education.</w:t>
             </w:r>
@@ -6867,8 +6830,7 @@
             </w:pPr>
             <w:r>
               <w:rPr>
-                <w:b/>
-                <w:sz w:val="20"/>
+                <w:sz w:val="22"/>
               </w:rPr>
               <w:t>04/2025</w:t>
             </w:r>
@@ -6917,7 +6879,7 @@
             <w:r>
               <w:rPr>
                 <w:b/>
-                <w:sz w:val="21"/>
+                <w:sz w:val="22"/>
               </w:rPr>
               <w:t>ZEP</w:t>
             </w:r>
@@ -6929,7 +6891,7 @@
             <w:r>
               <w:rPr>
                 <w:i/>
-                <w:sz w:val="20"/>
+                <w:sz w:val="21"/>
               </w:rPr>
               <w:t>Zeitschrift für internationale Bildungsforschung und Entwicklungspädagogik.</w:t>
             </w:r>
@@ -6947,8 +6909,7 @@
             </w:pPr>
             <w:r>
               <w:rPr>
-                <w:b/>
-                <w:sz w:val="20"/>
+                <w:sz w:val="22"/>
               </w:rPr>
               <w:t>11/2025</w:t>
             </w:r>
@@ -6997,7 +6958,7 @@
             <w:r>
               <w:rPr>
                 <w:b/>
-                <w:sz w:val="21"/>
+                <w:sz w:val="22"/>
               </w:rPr>
               <w:t>Foundations of Science.</w:t>
             </w:r>
@@ -7015,8 +6976,7 @@
             </w:pPr>
             <w:r>
               <w:rPr>
-                <w:b/>
-                <w:sz w:val="20"/>
+                <w:sz w:val="22"/>
               </w:rPr>
               <w:t>11–12/2025</w:t>
             </w:r>
@@ -7065,7 +7025,7 @@
             <w:r>
               <w:rPr>
                 <w:b/>
-                <w:sz w:val="21"/>
+                <w:sz w:val="22"/>
               </w:rPr>
               <w:t>Discover Sustainability.</w:t>
             </w:r>
@@ -7083,8 +7043,7 @@
             </w:pPr>
             <w:r>
               <w:rPr>
-                <w:b/>
-                <w:sz w:val="20"/>
+                <w:sz w:val="22"/>
               </w:rPr>
               <w:t>01/2026</w:t>
             </w:r>
@@ -7133,7 +7092,7 @@
             <w:r>
               <w:rPr>
                 <w:b/>
-                <w:sz w:val="21"/>
+                <w:sz w:val="22"/>
               </w:rPr>
               <w:t>Discover Sustainability.</w:t>
             </w:r>
@@ -7151,8 +7110,7 @@
             </w:pPr>
             <w:r>
               <w:rPr>
-                <w:b/>
-                <w:sz w:val="20"/>
+                <w:sz w:val="22"/>
               </w:rPr>
               <w:t>02–03/2026</w:t>
             </w:r>
@@ -7201,7 +7159,7 @@
             <w:r>
               <w:rPr>
                 <w:b/>
-                <w:sz w:val="21"/>
+                <w:sz w:val="22"/>
               </w:rPr>
               <w:t>Journal of Curriculum Studies.</w:t>
             </w:r>
@@ -7219,8 +7177,7 @@
             </w:pPr>
             <w:r>
               <w:rPr>
-                <w:b/>
-                <w:sz w:val="20"/>
+                <w:sz w:val="22"/>
               </w:rPr>
               <w:t>02–05/2026</w:t>
             </w:r>
@@ -7269,7 +7226,7 @@
             <w:r>
               <w:rPr>
                 <w:b/>
-                <w:sz w:val="21"/>
+                <w:sz w:val="22"/>
               </w:rPr>
               <w:t>Journal of Didactics of Philosophy.</w:t>
             </w:r>
@@ -7287,8 +7244,7 @@
             </w:pPr>
             <w:r>
               <w:rPr>
-                <w:b/>
-                <w:sz w:val="20"/>
+                <w:sz w:val="22"/>
               </w:rPr>
               <w:t>03/2026</w:t>
             </w:r>
@@ -7337,7 +7293,7 @@
             <w:r>
               <w:rPr>
                 <w:i/>
-                <w:sz w:val="20"/>
+                <w:sz w:val="21"/>
               </w:rPr>
               <w:t>Ludwigsburg Contributions to Media Education (LBzM).</w:t>
             </w:r>
@@ -7355,8 +7311,7 @@
             </w:pPr>
             <w:r>
               <w:rPr>
-                <w:b/>
-                <w:sz w:val="20"/>
+                <w:sz w:val="22"/>
               </w:rPr>
               <w:t>03/2026</w:t>
             </w:r>
@@ -7405,7 +7360,7 @@
             <w:r>
               <w:rPr>
                 <w:b/>
-                <w:sz w:val="21"/>
+                <w:sz w:val="22"/>
               </w:rPr>
               <w:t>Education Sciences.</w:t>
             </w:r>
@@ -7423,8 +7378,7 @@
             </w:pPr>
             <w:r>
               <w:rPr>
-                <w:b/>
-                <w:sz w:val="20"/>
+                <w:sz w:val="22"/>
               </w:rPr>
               <w:t>05/2026</w:t>
             </w:r>
@@ -7473,7 +7427,7 @@
             <w:r>
               <w:rPr>
                 <w:b/>
-                <w:sz w:val="21"/>
+                <w:sz w:val="22"/>
               </w:rPr>
               <w:t>Sustainability.</w:t>
             </w:r>
@@ -7491,8 +7445,7 @@
             </w:pPr>
             <w:r>
               <w:rPr>
-                <w:b/>
-                <w:sz w:val="20"/>
+                <w:sz w:val="22"/>
               </w:rPr>
               <w:t>05/2026</w:t>
             </w:r>
@@ -7541,7 +7494,7 @@
             <w:r>
               <w:rPr>
                 <w:b/>
-                <w:sz w:val="21"/>
+                <w:sz w:val="22"/>
               </w:rPr>
               <w:t>Sustainability, Education Sciences.</w:t>
             </w:r>
@@ -7559,8 +7512,7 @@
             </w:pPr>
             <w:r>
               <w:rPr>
-                <w:b/>
-                <w:sz w:val="20"/>
+                <w:sz w:val="22"/>
               </w:rPr>
               <w:t>05/2026–04/2027</w:t>
             </w:r>
@@ -7609,7 +7561,7 @@
             <w:r>
               <w:rPr>
                 <w:b/>
-                <w:sz w:val="21"/>
+                <w:sz w:val="22"/>
               </w:rPr>
               <w:t>Frontiers in Sociology.</w:t>
             </w:r>
@@ -7627,8 +7579,7 @@
             </w:pPr>
             <w:r>
               <w:rPr>
-                <w:b/>
-                <w:sz w:val="20"/>
+                <w:sz w:val="22"/>
               </w:rPr>
               <w:t>05–06/2026</w:t>
             </w:r>
@@ -7677,7 +7628,7 @@
             <w:r>
               <w:rPr>
                 <w:b/>
-                <w:sz w:val="21"/>
+                <w:sz w:val="22"/>
               </w:rPr>
               <w:t>Sustainability.</w:t>
             </w:r>
@@ -7695,8 +7646,7 @@
             </w:pPr>
             <w:r>
               <w:rPr>
-                <w:b/>
-                <w:sz w:val="20"/>
+                <w:sz w:val="22"/>
               </w:rPr>
               <w:t>06/2026</w:t>
             </w:r>
@@ -7745,7 +7695,7 @@
             <w:r>
               <w:rPr>
                 <w:b/>
-                <w:sz w:val="21"/>
+                <w:sz w:val="22"/>
               </w:rPr>
               <w:t>Revue Education.</w:t>
             </w:r>
@@ -7763,8 +7713,7 @@
             </w:pPr>
             <w:r>
               <w:rPr>
-                <w:b/>
-                <w:sz w:val="20"/>
+                <w:sz w:val="22"/>
               </w:rPr>
               <w:t>06/2026</w:t>
             </w:r>
@@ -7826,7 +7775,7 @@
             <w:r>
               <w:rPr>
                 <w:i/>
-                <w:sz w:val="20"/>
+                <w:sz w:val="21"/>
               </w:rPr>
               <w:t>Nachhaltige Transformation der Wirtschaft (Hrsg.: B. Weber/S. von Lingen/H. Hantke).</w:t>
             </w:r>
@@ -7844,8 +7793,7 @@
             </w:pPr>
             <w:r>
               <w:rPr>
-                <w:b/>
-                <w:sz w:val="20"/>
+                <w:sz w:val="22"/>
               </w:rPr>
               <w:t>02–04/2025</w:t>
             </w:r>
@@ -7894,7 +7842,7 @@
             <w:r>
               <w:rPr>
                 <w:i/>
-                <w:sz w:val="20"/>
+                <w:sz w:val="21"/>
               </w:rPr>
               <w:t>Handbuch Bildung für nachhaltige Entwicklung (Hrsg.: F. Bertschy/M. Rieckmann/M. Singer-Brodowski).</w:t>
             </w:r>
@@ -7912,8 +7860,7 @@
             </w:pPr>
             <w:r>
               <w:rPr>
-                <w:b/>
-                <w:sz w:val="20"/>
+                <w:sz w:val="22"/>
               </w:rPr>
               <w:t>02–04/2025</w:t>
             </w:r>
@@ -7975,7 +7922,7 @@
             <w:r>
               <w:rPr>
                 <w:b/>
-                <w:sz w:val="21"/>
+                <w:sz w:val="22"/>
               </w:rPr>
               <w:t>Reviewer</w:t>
             </w:r>
@@ -7987,7 +7934,7 @@
             <w:r>
               <w:rPr>
                 <w:i/>
-                <w:sz w:val="20"/>
+                <w:sz w:val="21"/>
               </w:rPr>
               <w:t>DGfE-Kongress 2026 „Brüche“.</w:t>
             </w:r>
@@ -8005,8 +7952,7 @@
             </w:pPr>
             <w:r>
               <w:rPr>
-                <w:b/>
-                <w:sz w:val="20"/>
+                <w:sz w:val="22"/>
               </w:rPr>
               <w:t>05–07/2025</w:t>
             </w:r>
@@ -8055,7 +8001,7 @@
             <w:r>
               <w:rPr>
                 <w:b/>
-                <w:sz w:val="21"/>
+                <w:sz w:val="22"/>
               </w:rPr>
               <w:t>Moderation</w:t>
             </w:r>
@@ -8067,7 +8013,7 @@
             <w:r>
               <w:rPr>
                 <w:i/>
-                <w:sz w:val="20"/>
+                <w:sz w:val="21"/>
               </w:rPr>
               <w:t>ECER 2025.</w:t>
             </w:r>
@@ -8085,8 +8031,7 @@
             </w:pPr>
             <w:r>
               <w:rPr>
-                <w:b/>
-                <w:sz w:val="20"/>
+                <w:sz w:val="22"/>
               </w:rPr>
               <w:t>09/2025</w:t>
             </w:r>
@@ -8135,7 +8080,7 @@
             <w:r>
               <w:rPr>
                 <w:b/>
-                <w:sz w:val="21"/>
+                <w:sz w:val="22"/>
               </w:rPr>
               <w:t>Reviewer</w:t>
             </w:r>
@@ -8147,7 +8092,7 @@
             <w:r>
               <w:rPr>
                 <w:i/>
-                <w:sz w:val="20"/>
+                <w:sz w:val="21"/>
               </w:rPr>
               <w:t>DGfE-Kongress 2026 „Brüche“.</w:t>
             </w:r>
@@ -8165,8 +8110,7 @@
             </w:pPr>
             <w:r>
               <w:rPr>
-                <w:b/>
-                <w:sz w:val="20"/>
+                <w:sz w:val="22"/>
               </w:rPr>
               <w:t>12/2025</w:t>
             </w:r>
@@ -8215,7 +8159,7 @@
             <w:r>
               <w:rPr>
                 <w:b/>
-                <w:sz w:val="21"/>
+                <w:sz w:val="22"/>
               </w:rPr>
               <w:t>Reviewer</w:t>
             </w:r>
@@ -8227,7 +8171,7 @@
             <w:r>
               <w:rPr>
                 <w:i/>
-                <w:sz w:val="20"/>
+                <w:sz w:val="21"/>
               </w:rPr>
               <w:t>ECER.</w:t>
             </w:r>
@@ -8245,8 +8189,7 @@
             </w:pPr>
             <w:r>
               <w:rPr>
-                <w:b/>
-                <w:sz w:val="20"/>
+                <w:sz w:val="22"/>
               </w:rPr>
               <w:t>01/2026</w:t>
             </w:r>
@@ -8295,7 +8238,7 @@
             <w:r>
               <w:rPr>
                 <w:b/>
-                <w:sz w:val="21"/>
+                <w:sz w:val="22"/>
               </w:rPr>
               <w:t>Reviewer</w:t>
             </w:r>
@@ -8307,7 +8250,7 @@
             <w:r>
               <w:rPr>
                 <w:i/>
-                <w:sz w:val="20"/>
+                <w:sz w:val="21"/>
               </w:rPr>
               <w:t>ÖFEB-Kongress 2026 „Education in Times of Glocalization“.</w:t>
             </w:r>
@@ -8325,8 +8268,7 @@
             </w:pPr>
             <w:r>
               <w:rPr>
-                <w:b/>
-                <w:sz w:val="20"/>
+                <w:sz w:val="22"/>
               </w:rPr>
               <w:t>03/2026</w:t>
             </w:r>
@@ -8388,7 +8330,7 @@
             <w:r>
               <w:rPr>
                 <w:i/>
-                <w:sz w:val="20"/>
+                <w:sz w:val="21"/>
               </w:rPr>
               <w:t>Vorsitzender (Chair) der DGfE-Kommission Bildung für nachhaltige Entwicklung.</w:t>
             </w:r>
@@ -8406,8 +8348,7 @@
             </w:pPr>
             <w:r>
               <w:rPr>
-                <w:b/>
-                <w:sz w:val="20"/>
+                <w:sz w:val="22"/>
               </w:rPr>
               <w:t>04/2024–03/2025</w:t>
             </w:r>
@@ -8456,7 +8397,7 @@
             <w:r>
               <w:rPr>
                 <w:i/>
-                <w:sz w:val="20"/>
+                <w:sz w:val="21"/>
               </w:rPr>
               <w:t>Mitglied des Vorstands der Sektion Interkulturelle und International Vergleichende Erziehungswissenschaft (DGfE).</w:t>
             </w:r>
@@ -8474,8 +8415,7 @@
             </w:pPr>
             <w:r>
               <w:rPr>
-                <w:b/>
-                <w:sz w:val="20"/>
+                <w:sz w:val="22"/>
               </w:rPr>
               <w:t>04/2024–03/2027</w:t>
             </w:r>
@@ -8524,7 +8464,7 @@
             <w:r>
               <w:rPr>
                 <w:i/>
-                <w:sz w:val="20"/>
+                <w:sz w:val="21"/>
               </w:rPr>
               <w:t>Mitglied des Scientific Advisory Board, Projekt ENCOMPASS.</w:t>
             </w:r>
@@ -8542,8 +8482,7 @@
             </w:pPr>
             <w:r>
               <w:rPr>
-                <w:b/>
-                <w:sz w:val="20"/>
+                <w:sz w:val="22"/>
               </w:rPr>
               <w:t>04/2024–11/2025</w:t>
             </w:r>
@@ -8592,7 +8531,7 @@
             <w:r>
               <w:rPr>
                 <w:i/>
-                <w:sz w:val="20"/>
+                <w:sz w:val="21"/>
               </w:rPr>
               <w:t>Mitglied der AG „Gemeinsames Masterstudium der AAU und Universität Leoben zum Thema ‘Circular Engineering‘ / ‘Circular Business‘“.</w:t>
             </w:r>
@@ -8610,8 +8549,7 @@
             </w:pPr>
             <w:r>
               <w:rPr>
-                <w:b/>
-                <w:sz w:val="20"/>
+                <w:sz w:val="22"/>
               </w:rPr>
               <w:t>seit 06/2025</w:t>
             </w:r>
@@ -8660,7 +8598,7 @@
             <w:r>
               <w:rPr>
                 <w:i/>
-                <w:sz w:val="20"/>
+                <w:sz w:val="21"/>
               </w:rPr>
               <w:t>Reviewer, Arbeitsgruppe Wissenschaftliche Integrität (AAU).</w:t>
             </w:r>
@@ -8678,8 +8616,7 @@
             </w:pPr>
             <w:r>
               <w:rPr>
-                <w:b/>
-                <w:sz w:val="20"/>
+                <w:sz w:val="22"/>
               </w:rPr>
               <w:t>seit 04/2026</w:t>
             </w:r>
@@ -8749,10 +8686,10 @@
       </w:pPr>
       <w:r>
         <w:rPr>
-          <w:b/>
-          <w:sz w:val="22"/>
-        </w:rPr>
-        <w:t>EINGEWORBENE DRITT- UND FÖRDERMITTEL</w:t>
+          <w:smallCaps/>
+          <w:sz w:val="26"/>
+        </w:rPr>
+        <w:t>Eingeworbene Dritt- und Fördermittel</w:t>
       </w:r>
     </w:p>
     <w:p>
@@ -8801,7 +8738,7 @@
             <w:r>
               <w:rPr>
                 <w:b/>
-                <w:sz w:val="21"/>
+                <w:sz w:val="22"/>
               </w:rPr>
               <w:t>Pilotstudie: Forschungskapazitäten für die qualitative Forschung durch Kollaboration und semantische Auszeichnung</w:t>
             </w:r>
@@ -8813,7 +8750,7 @@
             <w:r>
               <w:rPr>
                 <w:i/>
-                <w:sz w:val="20"/>
+                <w:sz w:val="21"/>
               </w:rPr>
               <w:t>BMBF</w:t>
             </w:r>
@@ -8831,8 +8768,7 @@
             </w:pPr>
             <w:r>
               <w:rPr>
-                <w:b/>
-                <w:sz w:val="20"/>
+                <w:sz w:val="22"/>
               </w:rPr>
               <w:t>* 2016–2017</w:t>
             </w:r>
@@ -8845,7 +8781,7 @@
             <w:r>
               <w:rPr>
                 <w:i/>
-                <w:sz w:val="20"/>
+                <w:sz w:val="21"/>
               </w:rPr>
               <w:t>30.000 €</w:t>
             </w:r>
@@ -8894,7 +8830,7 @@
             <w:r>
               <w:rPr>
                 <w:b/>
-                <w:sz w:val="21"/>
+                <w:sz w:val="22"/>
               </w:rPr>
               <w:t>QSL-Förderfonds Lehre – VFU für Obj. Hermeneutik</w:t>
             </w:r>
@@ -8906,7 +8842,7 @@
             <w:r>
               <w:rPr>
                 <w:i/>
-                <w:sz w:val="20"/>
+                <w:sz w:val="21"/>
               </w:rPr>
               <w:t>Universität Frankfurt</w:t>
             </w:r>
@@ -8924,8 +8860,7 @@
             </w:pPr>
             <w:r>
               <w:rPr>
-                <w:b/>
-                <w:sz w:val="20"/>
+                <w:sz w:val="22"/>
               </w:rPr>
               <w:t>2017</w:t>
             </w:r>
@@ -8938,7 +8873,7 @@
             <w:r>
               <w:rPr>
                 <w:i/>
-                <w:sz w:val="20"/>
+                <w:sz w:val="21"/>
               </w:rPr>
               <w:t>1.680 €</w:t>
             </w:r>
@@ -8987,7 +8922,7 @@
             <w:r>
               <w:rPr>
                 <w:b/>
-                <w:sz w:val="21"/>
+                <w:sz w:val="22"/>
               </w:rPr>
               <w:t>Projekt aKodi – Studierenden- und handlungsorientierte Lehre im Kontext der Digitalisierung</w:t>
             </w:r>
@@ -8999,7 +8934,7 @@
             <w:r>
               <w:rPr>
                 <w:i/>
-                <w:sz w:val="20"/>
+                <w:sz w:val="21"/>
               </w:rPr>
               <w:t>Universität Frankfurt</w:t>
             </w:r>
@@ -9017,8 +8952,7 @@
             </w:pPr>
             <w:r>
               <w:rPr>
-                <w:b/>
-                <w:sz w:val="20"/>
+                <w:sz w:val="22"/>
               </w:rPr>
               <w:t>2018</w:t>
             </w:r>
@@ -9031,7 +8965,7 @@
             <w:r>
               <w:rPr>
                 <w:i/>
-                <w:sz w:val="20"/>
+                <w:sz w:val="21"/>
               </w:rPr>
               <w:t>1.680 €</w:t>
             </w:r>
@@ -9080,7 +9014,7 @@
             <w:r>
               <w:rPr>
                 <w:b/>
-                <w:sz w:val="21"/>
+                <w:sz w:val="22"/>
               </w:rPr>
               <w:t>QSL-Förderfonds Lehre – Ringvorlesung „Bildung für nachhaltige Entwicklung“</w:t>
             </w:r>
@@ -9092,7 +9026,7 @@
             <w:r>
               <w:rPr>
                 <w:i/>
-                <w:sz w:val="20"/>
+                <w:sz w:val="21"/>
               </w:rPr>
               <w:t>Universität Frankfurt</w:t>
             </w:r>
@@ -9110,8 +9044,7 @@
             </w:pPr>
             <w:r>
               <w:rPr>
-                <w:b/>
-                <w:sz w:val="20"/>
+                <w:sz w:val="22"/>
               </w:rPr>
               <w:t>2018</w:t>
             </w:r>
@@ -9124,7 +9057,7 @@
             <w:r>
               <w:rPr>
                 <w:i/>
-                <w:sz w:val="20"/>
+                <w:sz w:val="21"/>
               </w:rPr>
               <w:t>4.930 €</w:t>
             </w:r>
@@ -9173,7 +9106,7 @@
             <w:r>
               <w:rPr>
                 <w:b/>
-                <w:sz w:val="21"/>
+                <w:sz w:val="22"/>
               </w:rPr>
               <w:t>Bildung für nachhaltige Entwicklung durch die und an der Goethe-Universität</w:t>
             </w:r>
@@ -9185,7 +9118,7 @@
             <w:r>
               <w:rPr>
                 <w:i/>
-                <w:sz w:val="20"/>
+                <w:sz w:val="21"/>
               </w:rPr>
               <w:t>Universität Frankfurt</w:t>
             </w:r>
@@ -9203,8 +9136,7 @@
             </w:pPr>
             <w:r>
               <w:rPr>
-                <w:b/>
-                <w:sz w:val="20"/>
+                <w:sz w:val="22"/>
               </w:rPr>
               <w:t>2019</w:t>
             </w:r>
@@ -9217,7 +9149,7 @@
             <w:r>
               <w:rPr>
                 <w:i/>
-                <w:sz w:val="20"/>
+                <w:sz w:val="21"/>
               </w:rPr>
               <w:t>15.670 €</w:t>
             </w:r>
@@ -9266,7 +9198,7 @@
             <w:r>
               <w:rPr>
                 <w:b/>
-                <w:sz w:val="21"/>
+                <w:sz w:val="22"/>
               </w:rPr>
               <w:t>„Konjunkturpaket als Motor für eine sozial-ökologische Transformation?“</w:t>
             </w:r>
@@ -9278,7 +9210,7 @@
             <w:r>
               <w:rPr>
                 <w:i/>
-                <w:sz w:val="20"/>
+                <w:sz w:val="21"/>
               </w:rPr>
               <w:t>Grade Sustain, Universität Frankfurt</w:t>
             </w:r>
@@ -9296,8 +9228,7 @@
             </w:pPr>
             <w:r>
               <w:rPr>
-                <w:b/>
-                <w:sz w:val="20"/>
+                <w:sz w:val="22"/>
               </w:rPr>
               <w:t>2020</w:t>
             </w:r>
@@ -9310,7 +9241,7 @@
             <w:r>
               <w:rPr>
                 <w:i/>
-                <w:sz w:val="20"/>
+                <w:sz w:val="21"/>
               </w:rPr>
               <w:t>2.844 €</w:t>
             </w:r>
@@ -9359,7 +9290,7 @@
             <w:r>
               <w:rPr>
                 <w:b/>
-                <w:sz w:val="21"/>
+                <w:sz w:val="22"/>
               </w:rPr>
               <w:t>„Empowering for the Transition Towards a Climate Neutral, Sustainable Europe by Reasons“</w:t>
             </w:r>
@@ -9371,7 +9302,7 @@
             <w:r>
               <w:rPr>
                 <w:i/>
-                <w:sz w:val="20"/>
+                <w:sz w:val="21"/>
               </w:rPr>
               <w:t>Förderfonds Aufbau koordinierter Programme, Universität Frankfurt</w:t>
             </w:r>
@@ -9389,8 +9320,7 @@
             </w:pPr>
             <w:r>
               <w:rPr>
-                <w:b/>
-                <w:sz w:val="20"/>
+                <w:sz w:val="22"/>
               </w:rPr>
               <w:t>2020</w:t>
             </w:r>
@@ -9403,7 +9333,7 @@
             <w:r>
               <w:rPr>
                 <w:i/>
-                <w:sz w:val="20"/>
+                <w:sz w:val="21"/>
               </w:rPr>
               <w:t>4.996 €</w:t>
             </w:r>
@@ -9452,7 +9382,7 @@
             <w:r>
               <w:rPr>
                 <w:b/>
-                <w:sz w:val="21"/>
+                <w:sz w:val="22"/>
               </w:rPr>
               <w:t>Learning Democracy in Europe</w:t>
             </w:r>
@@ -9464,7 +9394,7 @@
             <w:r>
               <w:rPr>
                 <w:i/>
-                <w:sz w:val="20"/>
+                <w:sz w:val="21"/>
               </w:rPr>
               <w:t>BMBF</w:t>
             </w:r>
@@ -9482,8 +9412,7 @@
             </w:pPr>
             <w:r>
               <w:rPr>
-                <w:b/>
-                <w:sz w:val="20"/>
+                <w:sz w:val="22"/>
               </w:rPr>
               <w:t>* 2021</w:t>
             </w:r>
@@ -9496,7 +9425,7 @@
             <w:r>
               <w:rPr>
                 <w:i/>
-                <w:sz w:val="20"/>
+                <w:sz w:val="21"/>
               </w:rPr>
               <w:t>44.923,66 €</w:t>
             </w:r>
@@ -9545,7 +9474,7 @@
             <w:r>
               <w:rPr>
                 <w:b/>
-                <w:sz w:val="21"/>
+                <w:sz w:val="22"/>
               </w:rPr>
               <w:t>„Sustainable Europe by Education of Deliberation“ (SEED)</w:t>
             </w:r>
@@ -9557,7 +9486,7 @@
             <w:r>
               <w:rPr>
                 <w:i/>
-                <w:sz w:val="20"/>
+                <w:sz w:val="21"/>
               </w:rPr>
               <w:t>European Union</w:t>
             </w:r>
@@ -9575,8 +9504,7 @@
             </w:pPr>
             <w:r>
               <w:rPr>
-                <w:b/>
-                <w:sz w:val="20"/>
+                <w:sz w:val="22"/>
               </w:rPr>
               <w:t>2021</w:t>
             </w:r>
@@ -9589,7 +9517,7 @@
             <w:r>
               <w:rPr>
                 <w:i/>
-                <w:sz w:val="20"/>
+                <w:sz w:val="21"/>
               </w:rPr>
               <w:t>4.851.498,38 €</w:t>
             </w:r>
@@ -9638,7 +9566,7 @@
             <w:r>
               <w:rPr>
                 <w:b/>
-                <w:sz w:val="21"/>
+                <w:sz w:val="22"/>
               </w:rPr>
               <w:t>DGfE-BNE-Kommissionstagung 2022</w:t>
             </w:r>
@@ -9650,7 +9578,7 @@
             <w:r>
               <w:rPr>
                 <w:i/>
-                <w:sz w:val="20"/>
+                <w:sz w:val="21"/>
               </w:rPr>
               <w:t>Goethe-Universität GRADE SUSTAIN</w:t>
             </w:r>
@@ -9668,8 +9596,7 @@
             </w:pPr>
             <w:r>
               <w:rPr>
-                <w:b/>
-                <w:sz w:val="20"/>
+                <w:sz w:val="22"/>
               </w:rPr>
               <w:t>2022</w:t>
             </w:r>
@@ -9682,7 +9609,7 @@
             <w:r>
               <w:rPr>
                 <w:i/>
-                <w:sz w:val="20"/>
+                <w:sz w:val="21"/>
               </w:rPr>
               <w:t>5.000,00 €</w:t>
             </w:r>
@@ -9731,7 +9658,7 @@
             <w:r>
               <w:rPr>
                 <w:b/>
-                <w:sz w:val="21"/>
+                <w:sz w:val="22"/>
               </w:rPr>
               <w:t>DGfE-BNE-Kommissionstagung 2022</w:t>
             </w:r>
@@ -9743,7 +9670,7 @@
             <w:r>
               <w:rPr>
                 <w:i/>
-                <w:sz w:val="20"/>
+                <w:sz w:val="21"/>
               </w:rPr>
               <w:t>FB Erziehungswissenschaften, Goethe-Universität</w:t>
             </w:r>
@@ -9761,8 +9688,7 @@
             </w:pPr>
             <w:r>
               <w:rPr>
-                <w:b/>
-                <w:sz w:val="20"/>
+                <w:sz w:val="22"/>
               </w:rPr>
               <w:t>2022</w:t>
             </w:r>
@@ -9775,7 +9701,7 @@
             <w:r>
               <w:rPr>
                 <w:i/>
-                <w:sz w:val="20"/>
+                <w:sz w:val="21"/>
               </w:rPr>
               <w:t>1.500,00 €</w:t>
             </w:r>
@@ -9824,7 +9750,7 @@
             <w:r>
               <w:rPr>
                 <w:b/>
-                <w:sz w:val="21"/>
+                <w:sz w:val="22"/>
               </w:rPr>
               <w:t>Transformationspfade und wissenschaftstheoretische Reflexionen</w:t>
             </w:r>
@@ -9836,7 +9762,7 @@
             <w:r>
               <w:rPr>
                 <w:i/>
-                <w:sz w:val="20"/>
+                <w:sz w:val="21"/>
               </w:rPr>
               <w:t>RobustNature SynergyFund, Goethe-Universität</w:t>
             </w:r>
@@ -9854,8 +9780,7 @@
             </w:pPr>
             <w:r>
               <w:rPr>
-                <w:b/>
-                <w:sz w:val="20"/>
+                <w:sz w:val="22"/>
               </w:rPr>
               <w:t>2022</w:t>
             </w:r>
@@ -9868,7 +9793,7 @@
             <w:r>
               <w:rPr>
                 <w:i/>
-                <w:sz w:val="20"/>
+                <w:sz w:val="21"/>
               </w:rPr>
               <w:t>26.764 €</w:t>
             </w:r>
@@ -9917,7 +9842,7 @@
             <w:r>
               <w:rPr>
                 <w:b/>
-                <w:sz w:val="21"/>
+                <w:sz w:val="22"/>
               </w:rPr>
               <w:t>Goethe Teaches Sustainability</w:t>
             </w:r>
@@ -9929,7 +9854,7 @@
             <w:r>
               <w:rPr>
                 <w:i/>
-                <w:sz w:val="20"/>
+                <w:sz w:val="21"/>
               </w:rPr>
               <w:t>Goethe-Universität</w:t>
             </w:r>
@@ -9947,8 +9872,7 @@
             </w:pPr>
             <w:r>
               <w:rPr>
-                <w:b/>
-                <w:sz w:val="20"/>
+                <w:sz w:val="22"/>
               </w:rPr>
               <w:t>2023</w:t>
             </w:r>
@@ -9961,7 +9885,7 @@
             <w:r>
               <w:rPr>
                 <w:i/>
-                <w:sz w:val="20"/>
+                <w:sz w:val="21"/>
               </w:rPr>
               <w:t>146.511,84 €</w:t>
             </w:r>
@@ -10010,7 +9934,7 @@
             <w:r>
               <w:rPr>
                 <w:b/>
-                <w:sz w:val="21"/>
+                <w:sz w:val="22"/>
               </w:rPr>
               <w:t>Zur wissenschaftstheoretisch-reflektierten Systematisierung von BNE</w:t>
             </w:r>
@@ -10022,7 +9946,7 @@
             <w:r>
               <w:rPr>
                 <w:i/>
-                <w:sz w:val="20"/>
+                <w:sz w:val="21"/>
               </w:rPr>
               <w:t>DFG</w:t>
             </w:r>
@@ -10040,8 +9964,7 @@
             </w:pPr>
             <w:r>
               <w:rPr>
-                <w:b/>
-                <w:sz w:val="20"/>
+                <w:sz w:val="22"/>
               </w:rPr>
               <w:t>2023</w:t>
             </w:r>
@@ -10054,7 +9977,7 @@
             <w:r>
               <w:rPr>
                 <w:i/>
-                <w:sz w:val="20"/>
+                <w:sz w:val="21"/>
               </w:rPr>
               <w:t>ca. 50.000 € (in Vorbereitung)</w:t>
             </w:r>
@@ -10081,10 +10004,10 @@
       </w:pPr>
       <w:r>
         <w:rPr>
-          <w:b/>
-          <w:sz w:val="22"/>
-        </w:rPr>
-        <w:t>GREMIENARBEIT</w:t>
+          <w:smallCaps/>
+          <w:sz w:val="26"/>
+        </w:rPr>
+        <w:t>Gremienarbeit</w:t>
       </w:r>
     </w:p>
     <w:tbl>
@@ -10118,7 +10041,7 @@
             <w:r>
               <w:rPr>
                 <w:i/>
-                <w:sz w:val="20"/>
+                <w:sz w:val="21"/>
               </w:rPr>
               <w:t>Vorstandsmitglied der Kommission Bildung für eine nachhaltige Entwicklung in der Deutschen Gesellschaft für Erziehungswissenschaft.</w:t>
             </w:r>
@@ -10136,8 +10059,7 @@
             </w:pPr>
             <w:r>
               <w:rPr>
-                <w:b/>
-                <w:sz w:val="20"/>
+                <w:sz w:val="22"/>
               </w:rPr>
               <w:t>seit 03/2021</w:t>
             </w:r>
@@ -10186,7 +10108,7 @@
             <w:r>
               <w:rPr>
                 <w:i/>
-                <w:sz w:val="20"/>
+                <w:sz w:val="21"/>
               </w:rPr>
               <w:t>Mitglied der Arbeitsgruppe „Internationalisierung“ am Fachbereich Erziehungswissenschaften der Goethe-Universität Frankfurt am Main.</w:t>
             </w:r>
@@ -10204,8 +10126,7 @@
             </w:pPr>
             <w:r>
               <w:rPr>
-                <w:b/>
-                <w:sz w:val="20"/>
+                <w:sz w:val="22"/>
               </w:rPr>
               <w:t>seit 2018</w:t>
             </w:r>
@@ -10254,7 +10175,7 @@
             <w:r>
               <w:rPr>
                 <w:i/>
-                <w:sz w:val="20"/>
+                <w:sz w:val="21"/>
               </w:rPr>
               <w:t>Mitglied der vom Senat der Goethe-Universität eingesetzten Arbeitsgruppe „Nachhaltigkeit in und an der Goethe-Universität“.</w:t>
             </w:r>
@@ -10272,8 +10193,7 @@
             </w:pPr>
             <w:r>
               <w:rPr>
-                <w:b/>
-                <w:sz w:val="20"/>
+                <w:sz w:val="22"/>
               </w:rPr>
               <w:t>2020–2023</w:t>
             </w:r>
@@ -10322,7 +10242,7 @@
             <w:r>
               <w:rPr>
                 <w:i/>
-                <w:sz w:val="20"/>
+                <w:sz w:val="21"/>
               </w:rPr>
               <w:t>Stellvertretender Vorsitzender der Ethikkommission des Fachbereichs Erziehungswissenschaften der Goethe-Universität Frankfurt am Main (04/2020–03/2021 kommissarische Leitung).</w:t>
             </w:r>
@@ -10340,8 +10260,7 @@
             </w:pPr>
             <w:r>
               <w:rPr>
-                <w:b/>
-                <w:sz w:val="20"/>
+                <w:sz w:val="22"/>
               </w:rPr>
               <w:t>seit 2016</w:t>
             </w:r>
@@ -10390,7 +10309,7 @@
             <w:r>
               <w:rPr>
                 <w:i/>
-                <w:sz w:val="20"/>
+                <w:sz w:val="21"/>
               </w:rPr>
               <w:t>Gewähltes Mitglied der Mittelbauvertretung am Fachbereich Erziehungswissenschaften der Goethe-Universität Frankfurt am Main.</w:t>
             </w:r>
@@ -10408,8 +10327,7 @@
             </w:pPr>
             <w:r>
               <w:rPr>
-                <w:b/>
-                <w:sz w:val="20"/>
+                <w:sz w:val="22"/>
               </w:rPr>
               <w:t>2017–2019</w:t>
             </w:r>
@@ -10458,7 +10376,7 @@
             <w:r>
               <w:rPr>
                 <w:i/>
-                <w:sz w:val="20"/>
+                <w:sz w:val="21"/>
               </w:rPr>
               <w:t>Mitarbeiter in einer Berufungskommission an der Goethe-Universität Frankfurt.</w:t>
             </w:r>
@@ -10476,8 +10394,7 @@
             </w:pPr>
             <w:r>
               <w:rPr>
-                <w:b/>
-                <w:sz w:val="20"/>
+                <w:sz w:val="22"/>
               </w:rPr>
               <w:t>2016–2017</w:t>
             </w:r>
@@ -10526,7 +10443,7 @@
             <w:r>
               <w:rPr>
                 <w:i/>
-                <w:sz w:val="20"/>
+                <w:sz w:val="21"/>
               </w:rPr>
               <w:t>Mitglied des Seminarrates am Studienseminar Offenbach.</w:t>
             </w:r>
@@ -10544,8 +10461,7 @@
             </w:pPr>
             <w:r>
               <w:rPr>
-                <w:b/>
-                <w:sz w:val="20"/>
+                <w:sz w:val="22"/>
               </w:rPr>
               <w:t>2010–2012</w:t>
             </w:r>
@@ -10594,7 +10510,7 @@
             <w:r>
               <w:rPr>
                 <w:b/>
-                <w:sz w:val="21"/>
+                <w:sz w:val="22"/>
               </w:rPr>
               <w:t>Mitglied des L-Netzes der Universität Frankfurt.</w:t>
             </w:r>
@@ -10612,8 +10528,7 @@
             </w:pPr>
             <w:r>
               <w:rPr>
-                <w:b/>
-                <w:sz w:val="20"/>
+                <w:sz w:val="22"/>
               </w:rPr>
               <w:t>2007–2009</w:t>
             </w:r>
@@ -10662,7 +10577,7 @@
             <w:r>
               <w:rPr>
                 <w:i/>
-                <w:sz w:val="20"/>
+                <w:sz w:val="21"/>
               </w:rPr>
               <w:t>Mitglied der Fachschaft Erziehungswissenschaften der Universität Frankfurt.</w:t>
             </w:r>
@@ -10680,8 +10595,7 @@
             </w:pPr>
             <w:r>
               <w:rPr>
-                <w:b/>
-                <w:sz w:val="20"/>
+                <w:sz w:val="22"/>
               </w:rPr>
               <w:t>2003–2005</w:t>
             </w:r>
@@ -10708,10 +10622,10 @@
       </w:pPr>
       <w:r>
         <w:rPr>
-          <w:b/>
-          <w:sz w:val="22"/>
-        </w:rPr>
-        <w:t>FELLOWSHIPS</w:t>
+          <w:smallCaps/>
+          <w:sz w:val="26"/>
+        </w:rPr>
+        <w:t>Fellowships</w:t>
       </w:r>
     </w:p>
     <w:tbl>
@@ -10745,7 +10659,7 @@
             <w:r>
               <w:rPr>
                 <w:i/>
-                <w:sz w:val="20"/>
+                <w:sz w:val="21"/>
               </w:rPr>
               <w:t>Doktorandenkolloquium Österreichische Gesellschaft für Philosophie, Innsbruck (Österreich).</w:t>
             </w:r>
@@ -10763,8 +10677,7 @@
             </w:pPr>
             <w:r>
               <w:rPr>
-                <w:b/>
-                <w:sz w:val="20"/>
+                <w:sz w:val="22"/>
               </w:rPr>
               <w:t>2014</w:t>
             </w:r>
@@ -10813,7 +10726,7 @@
             <w:r>
               <w:rPr>
                 <w:b/>
-                <w:sz w:val="21"/>
+                <w:sz w:val="22"/>
               </w:rPr>
               <w:t>Vortragsreise nach Brasilien (DAAD gefördert).</w:t>
             </w:r>
@@ -10831,8 +10744,7 @@
             </w:pPr>
             <w:r>
               <w:rPr>
-                <w:b/>
-                <w:sz w:val="20"/>
+                <w:sz w:val="22"/>
               </w:rPr>
               <w:t>2016</w:t>
             </w:r>
@@ -10881,7 +10793,7 @@
             <w:r>
               <w:rPr>
                 <w:i/>
-                <w:sz w:val="20"/>
+                <w:sz w:val="21"/>
               </w:rPr>
               <w:t>Austauschdozent PH Bern (Swiss European Mobility Programme), Schweiz, im November 2018.</w:t>
             </w:r>
@@ -10899,8 +10811,7 @@
             </w:pPr>
             <w:r>
               <w:rPr>
-                <w:b/>
-                <w:sz w:val="20"/>
+                <w:sz w:val="22"/>
               </w:rPr>
               <w:t>2018</w:t>
             </w:r>
@@ -10949,7 +10860,7 @@
             <w:r>
               <w:rPr>
                 <w:i/>
-                <w:sz w:val="20"/>
+                <w:sz w:val="21"/>
               </w:rPr>
               <w:t>Austauschdozent Alpen-Adria-Universität Klagenfurt (ERASMUS+-Programm), Österreich, im März 2019.</w:t>
             </w:r>
@@ -10967,8 +10878,7 @@
             </w:pPr>
             <w:r>
               <w:rPr>
-                <w:b/>
-                <w:sz w:val="20"/>
+                <w:sz w:val="22"/>
               </w:rPr>
               <w:t>2019</w:t>
             </w:r>
@@ -10995,10 +10905,10 @@
       </w:pPr>
       <w:r>
         <w:rPr>
-          <w:b/>
-          <w:sz w:val="22"/>
-        </w:rPr>
-        <w:t>MITGLIEDSCHAFTEN UND AUSSERUNIVERSITÄRES ENGAGEMENT</w:t>
+          <w:smallCaps/>
+          <w:sz w:val="26"/>
+        </w:rPr>
+        <w:t>Mitgliedschaften und außeruniversitäres Engagement</w:t>
       </w:r>
     </w:p>
     <w:p>
@@ -11480,8 +11390,8 @@
     <w:qFormat/>
     <w:rsid w:val="00FC693F"/>
     <w:rPr>
-      <w:rFonts w:ascii="Calibri" w:hAnsi="Calibri"/>
-      <w:sz w:val="20"/>
+      <w:rFonts w:ascii="Times New Roman" w:hAnsi="Times New Roman" w:cs="Times New Roman"/>
+      <w:sz w:val="22"/>
     </w:rPr>
   </w:style>
   <w:style w:type="paragraph" w:styleId="Header">

</xml_diff>

<commit_message>
Keep CV entries together across page breaks
Set cantSplit on each entry's table row and keep_with_next on section and
sub-section headings, so an entry's title/date/role and a heading never get
stranded or split at a page boundary.

Co-Authored-By: Claude Opus 4.8 <noreply@anthropic.com>
</commit_message>
<xml_diff>
--- a/Helge_Kminek_Lebenslauf.docx
+++ b/Helge_Kminek_Lebenslauf.docx
@@ -69,6 +69,7 @@
     </w:p>
     <w:p>
       <w:pPr>
+        <w:keepNext/>
         <w:spacing w:before="240" w:after="80"/>
         <w:pBdr>
           <w:bottom w:val="single" w:sz="6" w:space="1" w:color="000000"/>
@@ -101,6 +102,9 @@
         <w:gridCol w:w="4896"/>
       </w:tblGrid>
       <w:tr>
+        <w:trPr>
+          <w:cantSplit/>
+        </w:trPr>
         <w:tc>
           <w:tcPr>
             <w:tcW w:type="dxa" w:w="7056"/>
@@ -168,6 +172,9 @@
         <w:gridCol w:w="4896"/>
       </w:tblGrid>
       <w:tr>
+        <w:trPr>
+          <w:cantSplit/>
+        </w:trPr>
         <w:tc>
           <w:tcPr>
             <w:tcW w:type="dxa" w:w="7056"/>
@@ -235,6 +242,9 @@
         <w:gridCol w:w="4896"/>
       </w:tblGrid>
       <w:tr>
+        <w:trPr>
+          <w:cantSplit/>
+        </w:trPr>
         <w:tc>
           <w:tcPr>
             <w:tcW w:type="dxa" w:w="7056"/>
@@ -302,6 +312,9 @@
         <w:gridCol w:w="4896"/>
       </w:tblGrid>
       <w:tr>
+        <w:trPr>
+          <w:cantSplit/>
+        </w:trPr>
         <w:tc>
           <w:tcPr>
             <w:tcW w:type="dxa" w:w="7056"/>
@@ -352,6 +365,7 @@
     </w:p>
     <w:p>
       <w:pPr>
+        <w:keepNext/>
         <w:spacing w:before="240" w:after="80"/>
         <w:pBdr>
           <w:bottom w:val="single" w:sz="6" w:space="1" w:color="000000"/>
@@ -384,6 +398,9 @@
         <w:gridCol w:w="4896"/>
       </w:tblGrid>
       <w:tr>
+        <w:trPr>
+          <w:cantSplit/>
+        </w:trPr>
         <w:tc>
           <w:tcPr>
             <w:tcW w:type="dxa" w:w="7056"/>
@@ -463,6 +480,9 @@
         <w:gridCol w:w="4896"/>
       </w:tblGrid>
       <w:tr>
+        <w:trPr>
+          <w:cantSplit/>
+        </w:trPr>
         <w:tc>
           <w:tcPr>
             <w:tcW w:type="dxa" w:w="7056"/>
@@ -542,6 +562,9 @@
         <w:gridCol w:w="4896"/>
       </w:tblGrid>
       <w:tr>
+        <w:trPr>
+          <w:cantSplit/>
+        </w:trPr>
         <w:tc>
           <w:tcPr>
             <w:tcW w:type="dxa" w:w="7056"/>
@@ -621,6 +644,9 @@
         <w:gridCol w:w="4896"/>
       </w:tblGrid>
       <w:tr>
+        <w:trPr>
+          <w:cantSplit/>
+        </w:trPr>
         <w:tc>
           <w:tcPr>
             <w:tcW w:type="dxa" w:w="7056"/>
@@ -700,6 +726,9 @@
         <w:gridCol w:w="4896"/>
       </w:tblGrid>
       <w:tr>
+        <w:trPr>
+          <w:cantSplit/>
+        </w:trPr>
         <w:tc>
           <w:tcPr>
             <w:tcW w:type="dxa" w:w="7056"/>
@@ -779,6 +808,9 @@
         <w:gridCol w:w="4896"/>
       </w:tblGrid>
       <w:tr>
+        <w:trPr>
+          <w:cantSplit/>
+        </w:trPr>
         <w:tc>
           <w:tcPr>
             <w:tcW w:type="dxa" w:w="7056"/>
@@ -858,6 +890,9 @@
         <w:gridCol w:w="4896"/>
       </w:tblGrid>
       <w:tr>
+        <w:trPr>
+          <w:cantSplit/>
+        </w:trPr>
         <w:tc>
           <w:tcPr>
             <w:tcW w:type="dxa" w:w="7056"/>
@@ -937,6 +972,9 @@
         <w:gridCol w:w="4896"/>
       </w:tblGrid>
       <w:tr>
+        <w:trPr>
+          <w:cantSplit/>
+        </w:trPr>
         <w:tc>
           <w:tcPr>
             <w:tcW w:type="dxa" w:w="7056"/>
@@ -1016,6 +1054,9 @@
         <w:gridCol w:w="4896"/>
       </w:tblGrid>
       <w:tr>
+        <w:trPr>
+          <w:cantSplit/>
+        </w:trPr>
         <w:tc>
           <w:tcPr>
             <w:tcW w:type="dxa" w:w="7056"/>
@@ -1078,6 +1119,7 @@
     </w:p>
     <w:p>
       <w:pPr>
+        <w:keepNext/>
         <w:spacing w:before="240" w:after="80"/>
         <w:pBdr>
           <w:bottom w:val="single" w:sz="6" w:space="1" w:color="000000"/>
@@ -1093,6 +1135,7 @@
     </w:p>
     <w:p>
       <w:pPr>
+        <w:keepNext/>
         <w:spacing w:before="120" w:after="40"/>
       </w:pPr>
       <w:r>
@@ -1121,6 +1164,7 @@
     </w:p>
     <w:p>
       <w:pPr>
+        <w:keepNext/>
         <w:spacing w:before="120" w:after="40"/>
       </w:pPr>
       <w:r>
@@ -1164,6 +1208,7 @@
     </w:p>
     <w:p>
       <w:pPr>
+        <w:keepNext/>
         <w:spacing w:before="120" w:after="40"/>
       </w:pPr>
       <w:r>
@@ -1177,6 +1222,7 @@
     </w:p>
     <w:p>
       <w:pPr>
+        <w:keepNext/>
         <w:spacing w:before="120" w:after="40"/>
       </w:pPr>
       <w:r>
@@ -1220,6 +1266,7 @@
     </w:p>
     <w:p>
       <w:pPr>
+        <w:keepNext/>
         <w:spacing w:before="120" w:after="40"/>
       </w:pPr>
       <w:r>
@@ -1263,6 +1310,7 @@
     </w:p>
     <w:p>
       <w:pPr>
+        <w:keepNext/>
         <w:spacing w:before="120" w:after="40"/>
       </w:pPr>
       <w:r>
@@ -1291,6 +1339,7 @@
     </w:p>
     <w:p>
       <w:pPr>
+        <w:keepNext/>
         <w:spacing w:before="120" w:after="40"/>
       </w:pPr>
       <w:r>
@@ -1319,6 +1368,7 @@
     </w:p>
     <w:p>
       <w:pPr>
+        <w:keepNext/>
         <w:spacing w:before="120" w:after="40"/>
       </w:pPr>
       <w:r>
@@ -1362,6 +1412,7 @@
     </w:p>
     <w:p>
       <w:pPr>
+        <w:keepNext/>
         <w:spacing w:before="120" w:after="40"/>
       </w:pPr>
       <w:r>
@@ -1435,6 +1486,7 @@
     </w:p>
     <w:p>
       <w:pPr>
+        <w:keepNext/>
         <w:spacing w:before="120" w:after="40"/>
       </w:pPr>
       <w:r>
@@ -1516,6 +1568,7 @@
     </w:p>
     <w:p>
       <w:pPr>
+        <w:keepNext/>
         <w:spacing w:before="120" w:after="40"/>
       </w:pPr>
       <w:r>
@@ -1589,6 +1642,7 @@
     </w:p>
     <w:p>
       <w:pPr>
+        <w:keepNext/>
         <w:spacing w:before="120" w:after="40"/>
       </w:pPr>
       <w:r>
@@ -1677,6 +1731,7 @@
     </w:p>
     <w:p>
       <w:pPr>
+        <w:keepNext/>
         <w:spacing w:before="120" w:after="40"/>
       </w:pPr>
       <w:r>
@@ -1720,6 +1775,7 @@
     </w:p>
     <w:p>
       <w:pPr>
+        <w:keepNext/>
         <w:spacing w:before="120" w:after="40"/>
       </w:pPr>
       <w:r>
@@ -1808,6 +1864,7 @@
     </w:p>
     <w:p>
       <w:pPr>
+        <w:keepNext/>
         <w:spacing w:before="120" w:after="40"/>
       </w:pPr>
       <w:r>
@@ -1881,6 +1938,7 @@
     </w:p>
     <w:p>
       <w:pPr>
+        <w:keepNext/>
         <w:spacing w:before="120" w:after="40"/>
       </w:pPr>
       <w:r>
@@ -1954,6 +2012,7 @@
     </w:p>
     <w:p>
       <w:pPr>
+        <w:keepNext/>
         <w:spacing w:before="120" w:after="40"/>
       </w:pPr>
       <w:r>
@@ -2027,6 +2086,7 @@
     </w:p>
     <w:p>
       <w:pPr>
+        <w:keepNext/>
         <w:spacing w:before="120" w:after="40"/>
       </w:pPr>
       <w:r>
@@ -2100,6 +2160,7 @@
     </w:p>
     <w:p>
       <w:pPr>
+        <w:keepNext/>
         <w:spacing w:before="120" w:after="40"/>
       </w:pPr>
       <w:r>
@@ -2143,6 +2204,7 @@
     </w:p>
     <w:p>
       <w:pPr>
+        <w:keepNext/>
         <w:spacing w:before="120" w:after="40"/>
       </w:pPr>
       <w:r>
@@ -2186,6 +2248,7 @@
     </w:p>
     <w:p>
       <w:pPr>
+        <w:keepNext/>
         <w:spacing w:before="120" w:after="40"/>
       </w:pPr>
       <w:r>
@@ -2229,6 +2292,7 @@
     </w:p>
     <w:p>
       <w:pPr>
+        <w:keepNext/>
         <w:spacing w:before="120" w:after="40"/>
       </w:pPr>
       <w:r>
@@ -2272,6 +2336,7 @@
     </w:p>
     <w:p>
       <w:pPr>
+        <w:keepNext/>
         <w:spacing w:before="120" w:after="40"/>
       </w:pPr>
       <w:r>
@@ -2315,6 +2380,7 @@
     </w:p>
     <w:p>
       <w:pPr>
+        <w:keepNext/>
         <w:spacing w:before="120" w:after="40"/>
       </w:pPr>
       <w:r>
@@ -2358,6 +2424,7 @@
     </w:p>
     <w:p>
       <w:pPr>
+        <w:keepNext/>
         <w:spacing w:before="120" w:after="40"/>
       </w:pPr>
       <w:r>
@@ -2388,6 +2455,9 @@
         <w:gridCol w:w="4896"/>
       </w:tblGrid>
       <w:tr>
+        <w:trPr>
+          <w:cantSplit/>
+        </w:trPr>
         <w:tc>
           <w:tcPr>
             <w:tcW w:type="dxa" w:w="7056"/>
@@ -2455,6 +2525,9 @@
         <w:gridCol w:w="4896"/>
       </w:tblGrid>
       <w:tr>
+        <w:trPr>
+          <w:cantSplit/>
+        </w:trPr>
         <w:tc>
           <w:tcPr>
             <w:tcW w:type="dxa" w:w="7056"/>
@@ -2522,6 +2595,9 @@
         <w:gridCol w:w="4896"/>
       </w:tblGrid>
       <w:tr>
+        <w:trPr>
+          <w:cantSplit/>
+        </w:trPr>
         <w:tc>
           <w:tcPr>
             <w:tcW w:type="dxa" w:w="7056"/>
@@ -2572,6 +2648,7 @@
     </w:p>
     <w:p>
       <w:pPr>
+        <w:keepNext/>
         <w:spacing w:before="120" w:after="40"/>
       </w:pPr>
       <w:r>
@@ -2600,6 +2677,7 @@
     </w:p>
     <w:p>
       <w:pPr>
+        <w:keepNext/>
         <w:spacing w:before="240" w:after="80"/>
         <w:pBdr>
           <w:bottom w:val="single" w:sz="6" w:space="1" w:color="000000"/>
@@ -2671,6 +2749,7 @@
     </w:p>
     <w:p>
       <w:pPr>
+        <w:keepNext/>
         <w:spacing w:before="120" w:after="40"/>
       </w:pPr>
       <w:r>
@@ -2819,6 +2898,7 @@
     </w:p>
     <w:p>
       <w:pPr>
+        <w:keepNext/>
         <w:spacing w:before="120" w:after="40"/>
       </w:pPr>
       <w:r>
@@ -2847,6 +2927,7 @@
     </w:p>
     <w:p>
       <w:pPr>
+        <w:keepNext/>
         <w:spacing w:before="120" w:after="40"/>
       </w:pPr>
       <w:r>
@@ -3878,6 +3959,7 @@
     </w:p>
     <w:p>
       <w:pPr>
+        <w:keepNext/>
         <w:spacing w:before="240" w:after="80"/>
         <w:pBdr>
           <w:bottom w:val="single" w:sz="6" w:space="1" w:color="000000"/>
@@ -4343,6 +4425,7 @@
     </w:p>
     <w:p>
       <w:pPr>
+        <w:keepNext/>
         <w:spacing w:before="120" w:after="40"/>
       </w:pPr>
       <w:r>
@@ -4787,6 +4870,7 @@
     </w:p>
     <w:p>
       <w:pPr>
+        <w:keepNext/>
         <w:spacing w:before="240" w:after="80"/>
         <w:pBdr>
           <w:bottom w:val="single" w:sz="6" w:space="1" w:color="000000"/>
@@ -4819,6 +4903,9 @@
         <w:gridCol w:w="4896"/>
       </w:tblGrid>
       <w:tr>
+        <w:trPr>
+          <w:cantSplit/>
+        </w:trPr>
         <w:tc>
           <w:tcPr>
             <w:tcW w:type="dxa" w:w="7056"/>
@@ -4911,6 +4998,9 @@
         <w:gridCol w:w="4896"/>
       </w:tblGrid>
       <w:tr>
+        <w:trPr>
+          <w:cantSplit/>
+        </w:trPr>
         <w:tc>
           <w:tcPr>
             <w:tcW w:type="dxa" w:w="7056"/>
@@ -5003,6 +5093,9 @@
         <w:gridCol w:w="4896"/>
       </w:tblGrid>
       <w:tr>
+        <w:trPr>
+          <w:cantSplit/>
+        </w:trPr>
         <w:tc>
           <w:tcPr>
             <w:tcW w:type="dxa" w:w="7056"/>
@@ -5095,6 +5188,9 @@
         <w:gridCol w:w="4896"/>
       </w:tblGrid>
       <w:tr>
+        <w:trPr>
+          <w:cantSplit/>
+        </w:trPr>
         <w:tc>
           <w:tcPr>
             <w:tcW w:type="dxa" w:w="7056"/>
@@ -5187,6 +5283,9 @@
         <w:gridCol w:w="4896"/>
       </w:tblGrid>
       <w:tr>
+        <w:trPr>
+          <w:cantSplit/>
+        </w:trPr>
         <w:tc>
           <w:tcPr>
             <w:tcW w:type="dxa" w:w="7056"/>
@@ -5279,6 +5378,9 @@
         <w:gridCol w:w="4896"/>
       </w:tblGrid>
       <w:tr>
+        <w:trPr>
+          <w:cantSplit/>
+        </w:trPr>
         <w:tc>
           <w:tcPr>
             <w:tcW w:type="dxa" w:w="7056"/>
@@ -5371,6 +5473,9 @@
         <w:gridCol w:w="4896"/>
       </w:tblGrid>
       <w:tr>
+        <w:trPr>
+          <w:cantSplit/>
+        </w:trPr>
         <w:tc>
           <w:tcPr>
             <w:tcW w:type="dxa" w:w="7056"/>
@@ -5463,6 +5568,9 @@
         <w:gridCol w:w="4896"/>
       </w:tblGrid>
       <w:tr>
+        <w:trPr>
+          <w:cantSplit/>
+        </w:trPr>
         <w:tc>
           <w:tcPr>
             <w:tcW w:type="dxa" w:w="7056"/>
@@ -5555,6 +5663,9 @@
         <w:gridCol w:w="4896"/>
       </w:tblGrid>
       <w:tr>
+        <w:trPr>
+          <w:cantSplit/>
+        </w:trPr>
         <w:tc>
           <w:tcPr>
             <w:tcW w:type="dxa" w:w="7056"/>
@@ -5647,6 +5758,9 @@
         <w:gridCol w:w="4896"/>
       </w:tblGrid>
       <w:tr>
+        <w:trPr>
+          <w:cantSplit/>
+        </w:trPr>
         <w:tc>
           <w:tcPr>
             <w:tcW w:type="dxa" w:w="7056"/>
@@ -5739,6 +5853,9 @@
         <w:gridCol w:w="4896"/>
       </w:tblGrid>
       <w:tr>
+        <w:trPr>
+          <w:cantSplit/>
+        </w:trPr>
         <w:tc>
           <w:tcPr>
             <w:tcW w:type="dxa" w:w="7056"/>
@@ -5831,6 +5948,9 @@
         <w:gridCol w:w="4896"/>
       </w:tblGrid>
       <w:tr>
+        <w:trPr>
+          <w:cantSplit/>
+        </w:trPr>
         <w:tc>
           <w:tcPr>
             <w:tcW w:type="dxa" w:w="7056"/>
@@ -5923,6 +6043,9 @@
         <w:gridCol w:w="4896"/>
       </w:tblGrid>
       <w:tr>
+        <w:trPr>
+          <w:cantSplit/>
+        </w:trPr>
         <w:tc>
           <w:tcPr>
             <w:tcW w:type="dxa" w:w="7056"/>
@@ -6015,6 +6138,9 @@
         <w:gridCol w:w="4896"/>
       </w:tblGrid>
       <w:tr>
+        <w:trPr>
+          <w:cantSplit/>
+        </w:trPr>
         <w:tc>
           <w:tcPr>
             <w:tcW w:type="dxa" w:w="7056"/>
@@ -6090,6 +6216,7 @@
     </w:p>
     <w:p>
       <w:pPr>
+        <w:keepNext/>
         <w:spacing w:before="240" w:after="80"/>
         <w:pBdr>
           <w:bottom w:val="single" w:sz="6" w:space="1" w:color="000000"/>
@@ -6135,6 +6262,9 @@
         <w:gridCol w:w="4896"/>
       </w:tblGrid>
       <w:tr>
+        <w:trPr>
+          <w:cantSplit/>
+        </w:trPr>
         <w:tc>
           <w:tcPr>
             <w:tcW w:type="dxa" w:w="7056"/>
@@ -6215,6 +6345,9 @@
         <w:gridCol w:w="4896"/>
       </w:tblGrid>
       <w:tr>
+        <w:trPr>
+          <w:cantSplit/>
+        </w:trPr>
         <w:tc>
           <w:tcPr>
             <w:tcW w:type="dxa" w:w="7056"/>
@@ -6282,6 +6415,9 @@
         <w:gridCol w:w="4896"/>
       </w:tblGrid>
       <w:tr>
+        <w:trPr>
+          <w:cantSplit/>
+        </w:trPr>
         <w:tc>
           <w:tcPr>
             <w:tcW w:type="dxa" w:w="7056"/>
@@ -6362,6 +6498,9 @@
         <w:gridCol w:w="4896"/>
       </w:tblGrid>
       <w:tr>
+        <w:trPr>
+          <w:cantSplit/>
+        </w:trPr>
         <w:tc>
           <w:tcPr>
             <w:tcW w:type="dxa" w:w="7056"/>
@@ -6441,6 +6580,9 @@
         <w:gridCol w:w="4896"/>
       </w:tblGrid>
       <w:tr>
+        <w:trPr>
+          <w:cantSplit/>
+        </w:trPr>
         <w:tc>
           <w:tcPr>
             <w:tcW w:type="dxa" w:w="7056"/>
@@ -6666,6 +6808,9 @@
         <w:gridCol w:w="4896"/>
       </w:tblGrid>
       <w:tr>
+        <w:trPr>
+          <w:cantSplit/>
+        </w:trPr>
         <w:tc>
           <w:tcPr>
             <w:tcW w:type="dxa" w:w="7056"/>
@@ -6733,6 +6878,9 @@
         <w:gridCol w:w="4896"/>
       </w:tblGrid>
       <w:tr>
+        <w:trPr>
+          <w:cantSplit/>
+        </w:trPr>
         <w:tc>
           <w:tcPr>
             <w:tcW w:type="dxa" w:w="7056"/>
@@ -6800,6 +6948,9 @@
         <w:gridCol w:w="4896"/>
       </w:tblGrid>
       <w:tr>
+        <w:trPr>
+          <w:cantSplit/>
+        </w:trPr>
         <w:tc>
           <w:tcPr>
             <w:tcW w:type="dxa" w:w="7056"/>
@@ -6867,6 +7018,9 @@
         <w:gridCol w:w="4896"/>
       </w:tblGrid>
       <w:tr>
+        <w:trPr>
+          <w:cantSplit/>
+        </w:trPr>
         <w:tc>
           <w:tcPr>
             <w:tcW w:type="dxa" w:w="7056"/>
@@ -6946,6 +7100,9 @@
         <w:gridCol w:w="4896"/>
       </w:tblGrid>
       <w:tr>
+        <w:trPr>
+          <w:cantSplit/>
+        </w:trPr>
         <w:tc>
           <w:tcPr>
             <w:tcW w:type="dxa" w:w="7056"/>
@@ -7013,6 +7170,9 @@
         <w:gridCol w:w="4896"/>
       </w:tblGrid>
       <w:tr>
+        <w:trPr>
+          <w:cantSplit/>
+        </w:trPr>
         <w:tc>
           <w:tcPr>
             <w:tcW w:type="dxa" w:w="7056"/>
@@ -7080,6 +7240,9 @@
         <w:gridCol w:w="4896"/>
       </w:tblGrid>
       <w:tr>
+        <w:trPr>
+          <w:cantSplit/>
+        </w:trPr>
         <w:tc>
           <w:tcPr>
             <w:tcW w:type="dxa" w:w="7056"/>
@@ -7147,6 +7310,9 @@
         <w:gridCol w:w="4896"/>
       </w:tblGrid>
       <w:tr>
+        <w:trPr>
+          <w:cantSplit/>
+        </w:trPr>
         <w:tc>
           <w:tcPr>
             <w:tcW w:type="dxa" w:w="7056"/>
@@ -7214,6 +7380,9 @@
         <w:gridCol w:w="4896"/>
       </w:tblGrid>
       <w:tr>
+        <w:trPr>
+          <w:cantSplit/>
+        </w:trPr>
         <w:tc>
           <w:tcPr>
             <w:tcW w:type="dxa" w:w="7056"/>
@@ -7281,6 +7450,9 @@
         <w:gridCol w:w="4896"/>
       </w:tblGrid>
       <w:tr>
+        <w:trPr>
+          <w:cantSplit/>
+        </w:trPr>
         <w:tc>
           <w:tcPr>
             <w:tcW w:type="dxa" w:w="7056"/>
@@ -7348,6 +7520,9 @@
         <w:gridCol w:w="4896"/>
       </w:tblGrid>
       <w:tr>
+        <w:trPr>
+          <w:cantSplit/>
+        </w:trPr>
         <w:tc>
           <w:tcPr>
             <w:tcW w:type="dxa" w:w="7056"/>
@@ -7415,6 +7590,9 @@
         <w:gridCol w:w="4896"/>
       </w:tblGrid>
       <w:tr>
+        <w:trPr>
+          <w:cantSplit/>
+        </w:trPr>
         <w:tc>
           <w:tcPr>
             <w:tcW w:type="dxa" w:w="7056"/>
@@ -7482,6 +7660,9 @@
         <w:gridCol w:w="4896"/>
       </w:tblGrid>
       <w:tr>
+        <w:trPr>
+          <w:cantSplit/>
+        </w:trPr>
         <w:tc>
           <w:tcPr>
             <w:tcW w:type="dxa" w:w="7056"/>
@@ -7549,6 +7730,9 @@
         <w:gridCol w:w="4896"/>
       </w:tblGrid>
       <w:tr>
+        <w:trPr>
+          <w:cantSplit/>
+        </w:trPr>
         <w:tc>
           <w:tcPr>
             <w:tcW w:type="dxa" w:w="7056"/>
@@ -7616,6 +7800,9 @@
         <w:gridCol w:w="4896"/>
       </w:tblGrid>
       <w:tr>
+        <w:trPr>
+          <w:cantSplit/>
+        </w:trPr>
         <w:tc>
           <w:tcPr>
             <w:tcW w:type="dxa" w:w="7056"/>
@@ -7683,6 +7870,9 @@
         <w:gridCol w:w="4896"/>
       </w:tblGrid>
       <w:tr>
+        <w:trPr>
+          <w:cantSplit/>
+        </w:trPr>
         <w:tc>
           <w:tcPr>
             <w:tcW w:type="dxa" w:w="7056"/>
@@ -7763,6 +7953,9 @@
         <w:gridCol w:w="4896"/>
       </w:tblGrid>
       <w:tr>
+        <w:trPr>
+          <w:cantSplit/>
+        </w:trPr>
         <w:tc>
           <w:tcPr>
             <w:tcW w:type="dxa" w:w="7056"/>
@@ -7830,6 +8023,9 @@
         <w:gridCol w:w="4896"/>
       </w:tblGrid>
       <w:tr>
+        <w:trPr>
+          <w:cantSplit/>
+        </w:trPr>
         <w:tc>
           <w:tcPr>
             <w:tcW w:type="dxa" w:w="7056"/>
@@ -7910,6 +8106,9 @@
         <w:gridCol w:w="4896"/>
       </w:tblGrid>
       <w:tr>
+        <w:trPr>
+          <w:cantSplit/>
+        </w:trPr>
         <w:tc>
           <w:tcPr>
             <w:tcW w:type="dxa" w:w="7056"/>
@@ -7989,6 +8188,9 @@
         <w:gridCol w:w="4896"/>
       </w:tblGrid>
       <w:tr>
+        <w:trPr>
+          <w:cantSplit/>
+        </w:trPr>
         <w:tc>
           <w:tcPr>
             <w:tcW w:type="dxa" w:w="7056"/>
@@ -8068,6 +8270,9 @@
         <w:gridCol w:w="4896"/>
       </w:tblGrid>
       <w:tr>
+        <w:trPr>
+          <w:cantSplit/>
+        </w:trPr>
         <w:tc>
           <w:tcPr>
             <w:tcW w:type="dxa" w:w="7056"/>
@@ -8147,6 +8352,9 @@
         <w:gridCol w:w="4896"/>
       </w:tblGrid>
       <w:tr>
+        <w:trPr>
+          <w:cantSplit/>
+        </w:trPr>
         <w:tc>
           <w:tcPr>
             <w:tcW w:type="dxa" w:w="7056"/>
@@ -8226,6 +8434,9 @@
         <w:gridCol w:w="4896"/>
       </w:tblGrid>
       <w:tr>
+        <w:trPr>
+          <w:cantSplit/>
+        </w:trPr>
         <w:tc>
           <w:tcPr>
             <w:tcW w:type="dxa" w:w="7056"/>
@@ -8318,6 +8529,9 @@
         <w:gridCol w:w="4896"/>
       </w:tblGrid>
       <w:tr>
+        <w:trPr>
+          <w:cantSplit/>
+        </w:trPr>
         <w:tc>
           <w:tcPr>
             <w:tcW w:type="dxa" w:w="7056"/>
@@ -8385,6 +8599,9 @@
         <w:gridCol w:w="4896"/>
       </w:tblGrid>
       <w:tr>
+        <w:trPr>
+          <w:cantSplit/>
+        </w:trPr>
         <w:tc>
           <w:tcPr>
             <w:tcW w:type="dxa" w:w="7056"/>
@@ -8452,6 +8669,9 @@
         <w:gridCol w:w="4896"/>
       </w:tblGrid>
       <w:tr>
+        <w:trPr>
+          <w:cantSplit/>
+        </w:trPr>
         <w:tc>
           <w:tcPr>
             <w:tcW w:type="dxa" w:w="7056"/>
@@ -8519,6 +8739,9 @@
         <w:gridCol w:w="4896"/>
       </w:tblGrid>
       <w:tr>
+        <w:trPr>
+          <w:cantSplit/>
+        </w:trPr>
         <w:tc>
           <w:tcPr>
             <w:tcW w:type="dxa" w:w="7056"/>
@@ -8586,6 +8809,9 @@
         <w:gridCol w:w="4896"/>
       </w:tblGrid>
       <w:tr>
+        <w:trPr>
+          <w:cantSplit/>
+        </w:trPr>
         <w:tc>
           <w:tcPr>
             <w:tcW w:type="dxa" w:w="7056"/>
@@ -8679,6 +8905,7 @@
     </w:p>
     <w:p>
       <w:pPr>
+        <w:keepNext/>
         <w:spacing w:before="240" w:after="80"/>
         <w:pBdr>
           <w:bottom w:val="single" w:sz="6" w:space="1" w:color="000000"/>
@@ -8726,6 +8953,9 @@
         <w:gridCol w:w="4896"/>
       </w:tblGrid>
       <w:tr>
+        <w:trPr>
+          <w:cantSplit/>
+        </w:trPr>
         <w:tc>
           <w:tcPr>
             <w:tcW w:type="dxa" w:w="7056"/>
@@ -8818,6 +9048,9 @@
         <w:gridCol w:w="4896"/>
       </w:tblGrid>
       <w:tr>
+        <w:trPr>
+          <w:cantSplit/>
+        </w:trPr>
         <w:tc>
           <w:tcPr>
             <w:tcW w:type="dxa" w:w="7056"/>
@@ -8910,6 +9143,9 @@
         <w:gridCol w:w="4896"/>
       </w:tblGrid>
       <w:tr>
+        <w:trPr>
+          <w:cantSplit/>
+        </w:trPr>
         <w:tc>
           <w:tcPr>
             <w:tcW w:type="dxa" w:w="7056"/>
@@ -9002,6 +9238,9 @@
         <w:gridCol w:w="4896"/>
       </w:tblGrid>
       <w:tr>
+        <w:trPr>
+          <w:cantSplit/>
+        </w:trPr>
         <w:tc>
           <w:tcPr>
             <w:tcW w:type="dxa" w:w="7056"/>
@@ -9094,6 +9333,9 @@
         <w:gridCol w:w="4896"/>
       </w:tblGrid>
       <w:tr>
+        <w:trPr>
+          <w:cantSplit/>
+        </w:trPr>
         <w:tc>
           <w:tcPr>
             <w:tcW w:type="dxa" w:w="7056"/>
@@ -9186,6 +9428,9 @@
         <w:gridCol w:w="4896"/>
       </w:tblGrid>
       <w:tr>
+        <w:trPr>
+          <w:cantSplit/>
+        </w:trPr>
         <w:tc>
           <w:tcPr>
             <w:tcW w:type="dxa" w:w="7056"/>
@@ -9278,6 +9523,9 @@
         <w:gridCol w:w="4896"/>
       </w:tblGrid>
       <w:tr>
+        <w:trPr>
+          <w:cantSplit/>
+        </w:trPr>
         <w:tc>
           <w:tcPr>
             <w:tcW w:type="dxa" w:w="7056"/>
@@ -9370,6 +9618,9 @@
         <w:gridCol w:w="4896"/>
       </w:tblGrid>
       <w:tr>
+        <w:trPr>
+          <w:cantSplit/>
+        </w:trPr>
         <w:tc>
           <w:tcPr>
             <w:tcW w:type="dxa" w:w="7056"/>
@@ -9462,6 +9713,9 @@
         <w:gridCol w:w="4896"/>
       </w:tblGrid>
       <w:tr>
+        <w:trPr>
+          <w:cantSplit/>
+        </w:trPr>
         <w:tc>
           <w:tcPr>
             <w:tcW w:type="dxa" w:w="7056"/>
@@ -9554,6 +9808,9 @@
         <w:gridCol w:w="4896"/>
       </w:tblGrid>
       <w:tr>
+        <w:trPr>
+          <w:cantSplit/>
+        </w:trPr>
         <w:tc>
           <w:tcPr>
             <w:tcW w:type="dxa" w:w="7056"/>
@@ -9646,6 +9903,9 @@
         <w:gridCol w:w="4896"/>
       </w:tblGrid>
       <w:tr>
+        <w:trPr>
+          <w:cantSplit/>
+        </w:trPr>
         <w:tc>
           <w:tcPr>
             <w:tcW w:type="dxa" w:w="7056"/>
@@ -9738,6 +9998,9 @@
         <w:gridCol w:w="4896"/>
       </w:tblGrid>
       <w:tr>
+        <w:trPr>
+          <w:cantSplit/>
+        </w:trPr>
         <w:tc>
           <w:tcPr>
             <w:tcW w:type="dxa" w:w="7056"/>
@@ -9830,6 +10093,9 @@
         <w:gridCol w:w="4896"/>
       </w:tblGrid>
       <w:tr>
+        <w:trPr>
+          <w:cantSplit/>
+        </w:trPr>
         <w:tc>
           <w:tcPr>
             <w:tcW w:type="dxa" w:w="7056"/>
@@ -9922,6 +10188,9 @@
         <w:gridCol w:w="4896"/>
       </w:tblGrid>
       <w:tr>
+        <w:trPr>
+          <w:cantSplit/>
+        </w:trPr>
         <w:tc>
           <w:tcPr>
             <w:tcW w:type="dxa" w:w="7056"/>
@@ -9997,6 +10266,7 @@
     </w:p>
     <w:p>
       <w:pPr>
+        <w:keepNext/>
         <w:spacing w:before="240" w:after="80"/>
         <w:pBdr>
           <w:bottom w:val="single" w:sz="6" w:space="1" w:color="000000"/>
@@ -10029,6 +10299,9 @@
         <w:gridCol w:w="4896"/>
       </w:tblGrid>
       <w:tr>
+        <w:trPr>
+          <w:cantSplit/>
+        </w:trPr>
         <w:tc>
           <w:tcPr>
             <w:tcW w:type="dxa" w:w="7056"/>
@@ -10096,6 +10369,9 @@
         <w:gridCol w:w="4896"/>
       </w:tblGrid>
       <w:tr>
+        <w:trPr>
+          <w:cantSplit/>
+        </w:trPr>
         <w:tc>
           <w:tcPr>
             <w:tcW w:type="dxa" w:w="7056"/>
@@ -10163,6 +10439,9 @@
         <w:gridCol w:w="4896"/>
       </w:tblGrid>
       <w:tr>
+        <w:trPr>
+          <w:cantSplit/>
+        </w:trPr>
         <w:tc>
           <w:tcPr>
             <w:tcW w:type="dxa" w:w="7056"/>
@@ -10230,6 +10509,9 @@
         <w:gridCol w:w="4896"/>
       </w:tblGrid>
       <w:tr>
+        <w:trPr>
+          <w:cantSplit/>
+        </w:trPr>
         <w:tc>
           <w:tcPr>
             <w:tcW w:type="dxa" w:w="7056"/>
@@ -10297,6 +10579,9 @@
         <w:gridCol w:w="4896"/>
       </w:tblGrid>
       <w:tr>
+        <w:trPr>
+          <w:cantSplit/>
+        </w:trPr>
         <w:tc>
           <w:tcPr>
             <w:tcW w:type="dxa" w:w="7056"/>
@@ -10364,6 +10649,9 @@
         <w:gridCol w:w="4896"/>
       </w:tblGrid>
       <w:tr>
+        <w:trPr>
+          <w:cantSplit/>
+        </w:trPr>
         <w:tc>
           <w:tcPr>
             <w:tcW w:type="dxa" w:w="7056"/>
@@ -10431,6 +10719,9 @@
         <w:gridCol w:w="4896"/>
       </w:tblGrid>
       <w:tr>
+        <w:trPr>
+          <w:cantSplit/>
+        </w:trPr>
         <w:tc>
           <w:tcPr>
             <w:tcW w:type="dxa" w:w="7056"/>
@@ -10498,6 +10789,9 @@
         <w:gridCol w:w="4896"/>
       </w:tblGrid>
       <w:tr>
+        <w:trPr>
+          <w:cantSplit/>
+        </w:trPr>
         <w:tc>
           <w:tcPr>
             <w:tcW w:type="dxa" w:w="7056"/>
@@ -10565,6 +10859,9 @@
         <w:gridCol w:w="4896"/>
       </w:tblGrid>
       <w:tr>
+        <w:trPr>
+          <w:cantSplit/>
+        </w:trPr>
         <w:tc>
           <w:tcPr>
             <w:tcW w:type="dxa" w:w="7056"/>
@@ -10615,6 +10912,7 @@
     </w:p>
     <w:p>
       <w:pPr>
+        <w:keepNext/>
         <w:spacing w:before="240" w:after="80"/>
         <w:pBdr>
           <w:bottom w:val="single" w:sz="6" w:space="1" w:color="000000"/>
@@ -10647,6 +10945,9 @@
         <w:gridCol w:w="4896"/>
       </w:tblGrid>
       <w:tr>
+        <w:trPr>
+          <w:cantSplit/>
+        </w:trPr>
         <w:tc>
           <w:tcPr>
             <w:tcW w:type="dxa" w:w="7056"/>
@@ -10714,6 +11015,9 @@
         <w:gridCol w:w="4896"/>
       </w:tblGrid>
       <w:tr>
+        <w:trPr>
+          <w:cantSplit/>
+        </w:trPr>
         <w:tc>
           <w:tcPr>
             <w:tcW w:type="dxa" w:w="7056"/>
@@ -10781,6 +11085,9 @@
         <w:gridCol w:w="4896"/>
       </w:tblGrid>
       <w:tr>
+        <w:trPr>
+          <w:cantSplit/>
+        </w:trPr>
         <w:tc>
           <w:tcPr>
             <w:tcW w:type="dxa" w:w="7056"/>
@@ -10848,6 +11155,9 @@
         <w:gridCol w:w="4896"/>
       </w:tblGrid>
       <w:tr>
+        <w:trPr>
+          <w:cantSplit/>
+        </w:trPr>
         <w:tc>
           <w:tcPr>
             <w:tcW w:type="dxa" w:w="7056"/>
@@ -10898,6 +11208,7 @@
     </w:p>
     <w:p>
       <w:pPr>
+        <w:keepNext/>
         <w:spacing w:before="240" w:after="80"/>
         <w:pBdr>
           <w:bottom w:val="single" w:sz="6" w:space="1" w:color="000000"/>

</xml_diff>

<commit_message>
Tighten Word layout: force fixed column widths, widen text column, smaller gaps
Institution names were wrapping to two lines because python-docx cell widths
are ignored without a fixed table layout. Set an explicit fixed grid (5.5in /
1.6in), widen the page text area (0.7in margins), and reduce the inter-entry
gap and section spacing. Long titles now fit on one line and the first page is
much more compact, closer to the PDF.

Co-Authored-By: Claude Opus 4.8 <noreply@anthropic.com>
</commit_message>
<xml_diff>
--- a/Helge_Kminek_Lebenslauf.docx
+++ b/Helge_Kminek_Lebenslauf.docx
@@ -70,7 +70,7 @@
     <w:p>
       <w:pPr>
         <w:keepNext/>
-        <w:spacing w:before="240" w:after="80"/>
+        <w:spacing w:before="160" w:after="60"/>
         <w:pBdr>
           <w:bottom w:val="single" w:sz="6" w:space="1" w:color="000000"/>
         </w:pBdr>
@@ -96,10 +96,12 @@
           <w:insideH w:val="none"/>
           <w:insideV w:val="none"/>
         </w:tblBorders>
+        <w:tblLayout w:type="fixed"/>
+        <w:tblW w:w="10224" w:type="dxa"/>
       </w:tblPr>
       <w:tblGrid>
-        <w:gridCol w:w="4896"/>
-        <w:gridCol w:w="4896"/>
+        <w:gridCol w:w="7920"/>
+        <w:gridCol w:w="2304"/>
       </w:tblGrid>
       <w:tr>
         <w:trPr>
@@ -107,7 +109,7 @@
         </w:trPr>
         <w:tc>
           <w:tcPr>
-            <w:tcW w:type="dxa" w:w="7056"/>
+            <w:tcW w:type="dxa" w:w="7920"/>
             <w:vAlign w:val="top"/>
           </w:tcPr>
           <w:p>
@@ -125,7 +127,7 @@
         </w:tc>
         <w:tc>
           <w:tcPr>
-            <w:tcW w:type="dxa" w:w="2880"/>
+            <w:tcW w:type="dxa" w:w="2304"/>
             <w:vAlign w:val="top"/>
           </w:tcPr>
           <w:p>
@@ -149,7 +151,7 @@
       </w:pPr>
       <w:r>
         <w:rPr>
-          <w:sz w:val="12"/>
+          <w:sz w:val="6"/>
         </w:rPr>
       </w:r>
     </w:p>
@@ -166,10 +168,12 @@
           <w:insideH w:val="none"/>
           <w:insideV w:val="none"/>
         </w:tblBorders>
+        <w:tblLayout w:type="fixed"/>
+        <w:tblW w:w="10224" w:type="dxa"/>
       </w:tblPr>
       <w:tblGrid>
-        <w:gridCol w:w="4896"/>
-        <w:gridCol w:w="4896"/>
+        <w:gridCol w:w="7920"/>
+        <w:gridCol w:w="2304"/>
       </w:tblGrid>
       <w:tr>
         <w:trPr>
@@ -177,7 +181,7 @@
         </w:trPr>
         <w:tc>
           <w:tcPr>
-            <w:tcW w:type="dxa" w:w="7056"/>
+            <w:tcW w:type="dxa" w:w="7920"/>
             <w:vAlign w:val="top"/>
           </w:tcPr>
           <w:p>
@@ -195,7 +199,7 @@
         </w:tc>
         <w:tc>
           <w:tcPr>
-            <w:tcW w:type="dxa" w:w="2880"/>
+            <w:tcW w:type="dxa" w:w="2304"/>
             <w:vAlign w:val="top"/>
           </w:tcPr>
           <w:p>
@@ -219,7 +223,7 @@
       </w:pPr>
       <w:r>
         <w:rPr>
-          <w:sz w:val="12"/>
+          <w:sz w:val="6"/>
         </w:rPr>
       </w:r>
     </w:p>
@@ -236,10 +240,12 @@
           <w:insideH w:val="none"/>
           <w:insideV w:val="none"/>
         </w:tblBorders>
+        <w:tblLayout w:type="fixed"/>
+        <w:tblW w:w="10224" w:type="dxa"/>
       </w:tblPr>
       <w:tblGrid>
-        <w:gridCol w:w="4896"/>
-        <w:gridCol w:w="4896"/>
+        <w:gridCol w:w="7920"/>
+        <w:gridCol w:w="2304"/>
       </w:tblGrid>
       <w:tr>
         <w:trPr>
@@ -247,7 +253,7 @@
         </w:trPr>
         <w:tc>
           <w:tcPr>
-            <w:tcW w:type="dxa" w:w="7056"/>
+            <w:tcW w:type="dxa" w:w="7920"/>
             <w:vAlign w:val="top"/>
           </w:tcPr>
           <w:p>
@@ -265,7 +271,7 @@
         </w:tc>
         <w:tc>
           <w:tcPr>
-            <w:tcW w:type="dxa" w:w="2880"/>
+            <w:tcW w:type="dxa" w:w="2304"/>
             <w:vAlign w:val="top"/>
           </w:tcPr>
           <w:p>
@@ -289,7 +295,7 @@
       </w:pPr>
       <w:r>
         <w:rPr>
-          <w:sz w:val="12"/>
+          <w:sz w:val="6"/>
         </w:rPr>
       </w:r>
     </w:p>
@@ -306,10 +312,12 @@
           <w:insideH w:val="none"/>
           <w:insideV w:val="none"/>
         </w:tblBorders>
+        <w:tblLayout w:type="fixed"/>
+        <w:tblW w:w="10224" w:type="dxa"/>
       </w:tblPr>
       <w:tblGrid>
-        <w:gridCol w:w="4896"/>
-        <w:gridCol w:w="4896"/>
+        <w:gridCol w:w="7920"/>
+        <w:gridCol w:w="2304"/>
       </w:tblGrid>
       <w:tr>
         <w:trPr>
@@ -317,7 +325,7 @@
         </w:trPr>
         <w:tc>
           <w:tcPr>
-            <w:tcW w:type="dxa" w:w="7056"/>
+            <w:tcW w:type="dxa" w:w="7920"/>
             <w:vAlign w:val="top"/>
           </w:tcPr>
           <w:p>
@@ -335,7 +343,7 @@
         </w:tc>
         <w:tc>
           <w:tcPr>
-            <w:tcW w:type="dxa" w:w="2880"/>
+            <w:tcW w:type="dxa" w:w="2304"/>
             <w:vAlign w:val="top"/>
           </w:tcPr>
           <w:p>
@@ -359,14 +367,14 @@
       </w:pPr>
       <w:r>
         <w:rPr>
-          <w:sz w:val="12"/>
+          <w:sz w:val="6"/>
         </w:rPr>
       </w:r>
     </w:p>
     <w:p>
       <w:pPr>
         <w:keepNext/>
-        <w:spacing w:before="240" w:after="80"/>
+        <w:spacing w:before="160" w:after="60"/>
         <w:pBdr>
           <w:bottom w:val="single" w:sz="6" w:space="1" w:color="000000"/>
         </w:pBdr>
@@ -392,10 +400,12 @@
           <w:insideH w:val="none"/>
           <w:insideV w:val="none"/>
         </w:tblBorders>
+        <w:tblLayout w:type="fixed"/>
+        <w:tblW w:w="10224" w:type="dxa"/>
       </w:tblPr>
       <w:tblGrid>
-        <w:gridCol w:w="4896"/>
-        <w:gridCol w:w="4896"/>
+        <w:gridCol w:w="7920"/>
+        <w:gridCol w:w="2304"/>
       </w:tblGrid>
       <w:tr>
         <w:trPr>
@@ -403,7 +413,7 @@
         </w:trPr>
         <w:tc>
           <w:tcPr>
-            <w:tcW w:type="dxa" w:w="7056"/>
+            <w:tcW w:type="dxa" w:w="7920"/>
             <w:vAlign w:val="top"/>
           </w:tcPr>
           <w:p>
@@ -433,7 +443,7 @@
         </w:tc>
         <w:tc>
           <w:tcPr>
-            <w:tcW w:type="dxa" w:w="2880"/>
+            <w:tcW w:type="dxa" w:w="2304"/>
             <w:vAlign w:val="top"/>
           </w:tcPr>
           <w:p>
@@ -457,7 +467,7 @@
       </w:pPr>
       <w:r>
         <w:rPr>
-          <w:sz w:val="12"/>
+          <w:sz w:val="6"/>
         </w:rPr>
       </w:r>
     </w:p>
@@ -474,10 +484,12 @@
           <w:insideH w:val="none"/>
           <w:insideV w:val="none"/>
         </w:tblBorders>
+        <w:tblLayout w:type="fixed"/>
+        <w:tblW w:w="10224" w:type="dxa"/>
       </w:tblPr>
       <w:tblGrid>
-        <w:gridCol w:w="4896"/>
-        <w:gridCol w:w="4896"/>
+        <w:gridCol w:w="7920"/>
+        <w:gridCol w:w="2304"/>
       </w:tblGrid>
       <w:tr>
         <w:trPr>
@@ -485,7 +497,7 @@
         </w:trPr>
         <w:tc>
           <w:tcPr>
-            <w:tcW w:type="dxa" w:w="7056"/>
+            <w:tcW w:type="dxa" w:w="7920"/>
             <w:vAlign w:val="top"/>
           </w:tcPr>
           <w:p>
@@ -515,7 +527,7 @@
         </w:tc>
         <w:tc>
           <w:tcPr>
-            <w:tcW w:type="dxa" w:w="2880"/>
+            <w:tcW w:type="dxa" w:w="2304"/>
             <w:vAlign w:val="top"/>
           </w:tcPr>
           <w:p>
@@ -539,7 +551,7 @@
       </w:pPr>
       <w:r>
         <w:rPr>
-          <w:sz w:val="12"/>
+          <w:sz w:val="6"/>
         </w:rPr>
       </w:r>
     </w:p>
@@ -556,10 +568,12 @@
           <w:insideH w:val="none"/>
           <w:insideV w:val="none"/>
         </w:tblBorders>
+        <w:tblLayout w:type="fixed"/>
+        <w:tblW w:w="10224" w:type="dxa"/>
       </w:tblPr>
       <w:tblGrid>
-        <w:gridCol w:w="4896"/>
-        <w:gridCol w:w="4896"/>
+        <w:gridCol w:w="7920"/>
+        <w:gridCol w:w="2304"/>
       </w:tblGrid>
       <w:tr>
         <w:trPr>
@@ -567,7 +581,7 @@
         </w:trPr>
         <w:tc>
           <w:tcPr>
-            <w:tcW w:type="dxa" w:w="7056"/>
+            <w:tcW w:type="dxa" w:w="7920"/>
             <w:vAlign w:val="top"/>
           </w:tcPr>
           <w:p>
@@ -597,7 +611,7 @@
         </w:tc>
         <w:tc>
           <w:tcPr>
-            <w:tcW w:type="dxa" w:w="2880"/>
+            <w:tcW w:type="dxa" w:w="2304"/>
             <w:vAlign w:val="top"/>
           </w:tcPr>
           <w:p>
@@ -621,7 +635,7 @@
       </w:pPr>
       <w:r>
         <w:rPr>
-          <w:sz w:val="12"/>
+          <w:sz w:val="6"/>
         </w:rPr>
       </w:r>
     </w:p>
@@ -638,10 +652,12 @@
           <w:insideH w:val="none"/>
           <w:insideV w:val="none"/>
         </w:tblBorders>
+        <w:tblLayout w:type="fixed"/>
+        <w:tblW w:w="10224" w:type="dxa"/>
       </w:tblPr>
       <w:tblGrid>
-        <w:gridCol w:w="4896"/>
-        <w:gridCol w:w="4896"/>
+        <w:gridCol w:w="7920"/>
+        <w:gridCol w:w="2304"/>
       </w:tblGrid>
       <w:tr>
         <w:trPr>
@@ -649,7 +665,7 @@
         </w:trPr>
         <w:tc>
           <w:tcPr>
-            <w:tcW w:type="dxa" w:w="7056"/>
+            <w:tcW w:type="dxa" w:w="7920"/>
             <w:vAlign w:val="top"/>
           </w:tcPr>
           <w:p>
@@ -679,7 +695,7 @@
         </w:tc>
         <w:tc>
           <w:tcPr>
-            <w:tcW w:type="dxa" w:w="2880"/>
+            <w:tcW w:type="dxa" w:w="2304"/>
             <w:vAlign w:val="top"/>
           </w:tcPr>
           <w:p>
@@ -703,7 +719,7 @@
       </w:pPr>
       <w:r>
         <w:rPr>
-          <w:sz w:val="12"/>
+          <w:sz w:val="6"/>
         </w:rPr>
       </w:r>
     </w:p>
@@ -720,10 +736,12 @@
           <w:insideH w:val="none"/>
           <w:insideV w:val="none"/>
         </w:tblBorders>
+        <w:tblLayout w:type="fixed"/>
+        <w:tblW w:w="10224" w:type="dxa"/>
       </w:tblPr>
       <w:tblGrid>
-        <w:gridCol w:w="4896"/>
-        <w:gridCol w:w="4896"/>
+        <w:gridCol w:w="7920"/>
+        <w:gridCol w:w="2304"/>
       </w:tblGrid>
       <w:tr>
         <w:trPr>
@@ -731,7 +749,7 @@
         </w:trPr>
         <w:tc>
           <w:tcPr>
-            <w:tcW w:type="dxa" w:w="7056"/>
+            <w:tcW w:type="dxa" w:w="7920"/>
             <w:vAlign w:val="top"/>
           </w:tcPr>
           <w:p>
@@ -761,7 +779,7 @@
         </w:tc>
         <w:tc>
           <w:tcPr>
-            <w:tcW w:type="dxa" w:w="2880"/>
+            <w:tcW w:type="dxa" w:w="2304"/>
             <w:vAlign w:val="top"/>
           </w:tcPr>
           <w:p>
@@ -785,7 +803,7 @@
       </w:pPr>
       <w:r>
         <w:rPr>
-          <w:sz w:val="12"/>
+          <w:sz w:val="6"/>
         </w:rPr>
       </w:r>
     </w:p>
@@ -802,10 +820,12 @@
           <w:insideH w:val="none"/>
           <w:insideV w:val="none"/>
         </w:tblBorders>
+        <w:tblLayout w:type="fixed"/>
+        <w:tblW w:w="10224" w:type="dxa"/>
       </w:tblPr>
       <w:tblGrid>
-        <w:gridCol w:w="4896"/>
-        <w:gridCol w:w="4896"/>
+        <w:gridCol w:w="7920"/>
+        <w:gridCol w:w="2304"/>
       </w:tblGrid>
       <w:tr>
         <w:trPr>
@@ -813,7 +833,7 @@
         </w:trPr>
         <w:tc>
           <w:tcPr>
-            <w:tcW w:type="dxa" w:w="7056"/>
+            <w:tcW w:type="dxa" w:w="7920"/>
             <w:vAlign w:val="top"/>
           </w:tcPr>
           <w:p>
@@ -843,7 +863,7 @@
         </w:tc>
         <w:tc>
           <w:tcPr>
-            <w:tcW w:type="dxa" w:w="2880"/>
+            <w:tcW w:type="dxa" w:w="2304"/>
             <w:vAlign w:val="top"/>
           </w:tcPr>
           <w:p>
@@ -867,7 +887,7 @@
       </w:pPr>
       <w:r>
         <w:rPr>
-          <w:sz w:val="12"/>
+          <w:sz w:val="6"/>
         </w:rPr>
       </w:r>
     </w:p>
@@ -884,10 +904,12 @@
           <w:insideH w:val="none"/>
           <w:insideV w:val="none"/>
         </w:tblBorders>
+        <w:tblLayout w:type="fixed"/>
+        <w:tblW w:w="10224" w:type="dxa"/>
       </w:tblPr>
       <w:tblGrid>
-        <w:gridCol w:w="4896"/>
-        <w:gridCol w:w="4896"/>
+        <w:gridCol w:w="7920"/>
+        <w:gridCol w:w="2304"/>
       </w:tblGrid>
       <w:tr>
         <w:trPr>
@@ -895,7 +917,7 @@
         </w:trPr>
         <w:tc>
           <w:tcPr>
-            <w:tcW w:type="dxa" w:w="7056"/>
+            <w:tcW w:type="dxa" w:w="7920"/>
             <w:vAlign w:val="top"/>
           </w:tcPr>
           <w:p>
@@ -925,7 +947,7 @@
         </w:tc>
         <w:tc>
           <w:tcPr>
-            <w:tcW w:type="dxa" w:w="2880"/>
+            <w:tcW w:type="dxa" w:w="2304"/>
             <w:vAlign w:val="top"/>
           </w:tcPr>
           <w:p>
@@ -949,7 +971,7 @@
       </w:pPr>
       <w:r>
         <w:rPr>
-          <w:sz w:val="12"/>
+          <w:sz w:val="6"/>
         </w:rPr>
       </w:r>
     </w:p>
@@ -966,10 +988,12 @@
           <w:insideH w:val="none"/>
           <w:insideV w:val="none"/>
         </w:tblBorders>
+        <w:tblLayout w:type="fixed"/>
+        <w:tblW w:w="10224" w:type="dxa"/>
       </w:tblPr>
       <w:tblGrid>
-        <w:gridCol w:w="4896"/>
-        <w:gridCol w:w="4896"/>
+        <w:gridCol w:w="7920"/>
+        <w:gridCol w:w="2304"/>
       </w:tblGrid>
       <w:tr>
         <w:trPr>
@@ -977,7 +1001,7 @@
         </w:trPr>
         <w:tc>
           <w:tcPr>
-            <w:tcW w:type="dxa" w:w="7056"/>
+            <w:tcW w:type="dxa" w:w="7920"/>
             <w:vAlign w:val="top"/>
           </w:tcPr>
           <w:p>
@@ -1007,7 +1031,7 @@
         </w:tc>
         <w:tc>
           <w:tcPr>
-            <w:tcW w:type="dxa" w:w="2880"/>
+            <w:tcW w:type="dxa" w:w="2304"/>
             <w:vAlign w:val="top"/>
           </w:tcPr>
           <w:p>
@@ -1031,7 +1055,7 @@
       </w:pPr>
       <w:r>
         <w:rPr>
-          <w:sz w:val="12"/>
+          <w:sz w:val="6"/>
         </w:rPr>
       </w:r>
     </w:p>
@@ -1048,10 +1072,12 @@
           <w:insideH w:val="none"/>
           <w:insideV w:val="none"/>
         </w:tblBorders>
+        <w:tblLayout w:type="fixed"/>
+        <w:tblW w:w="10224" w:type="dxa"/>
       </w:tblPr>
       <w:tblGrid>
-        <w:gridCol w:w="4896"/>
-        <w:gridCol w:w="4896"/>
+        <w:gridCol w:w="7920"/>
+        <w:gridCol w:w="2304"/>
       </w:tblGrid>
       <w:tr>
         <w:trPr>
@@ -1059,7 +1085,7 @@
         </w:trPr>
         <w:tc>
           <w:tcPr>
-            <w:tcW w:type="dxa" w:w="7056"/>
+            <w:tcW w:type="dxa" w:w="7920"/>
             <w:vAlign w:val="top"/>
           </w:tcPr>
           <w:p>
@@ -1089,7 +1115,7 @@
         </w:tc>
         <w:tc>
           <w:tcPr>
-            <w:tcW w:type="dxa" w:w="2880"/>
+            <w:tcW w:type="dxa" w:w="2304"/>
             <w:vAlign w:val="top"/>
           </w:tcPr>
           <w:p>
@@ -1113,14 +1139,14 @@
       </w:pPr>
       <w:r>
         <w:rPr>
-          <w:sz w:val="12"/>
+          <w:sz w:val="6"/>
         </w:rPr>
       </w:r>
     </w:p>
     <w:p>
       <w:pPr>
         <w:keepNext/>
-        <w:spacing w:before="240" w:after="80"/>
+        <w:spacing w:before="160" w:after="60"/>
         <w:pBdr>
           <w:bottom w:val="single" w:sz="6" w:space="1" w:color="000000"/>
         </w:pBdr>
@@ -2449,10 +2475,12 @@
           <w:insideH w:val="none"/>
           <w:insideV w:val="none"/>
         </w:tblBorders>
+        <w:tblLayout w:type="fixed"/>
+        <w:tblW w:w="10224" w:type="dxa"/>
       </w:tblPr>
       <w:tblGrid>
-        <w:gridCol w:w="4896"/>
-        <w:gridCol w:w="4896"/>
+        <w:gridCol w:w="7920"/>
+        <w:gridCol w:w="2304"/>
       </w:tblGrid>
       <w:tr>
         <w:trPr>
@@ -2460,7 +2488,7 @@
         </w:trPr>
         <w:tc>
           <w:tcPr>
-            <w:tcW w:type="dxa" w:w="7056"/>
+            <w:tcW w:type="dxa" w:w="7920"/>
             <w:vAlign w:val="top"/>
           </w:tcPr>
           <w:p>
@@ -2478,7 +2506,7 @@
         </w:tc>
         <w:tc>
           <w:tcPr>
-            <w:tcW w:type="dxa" w:w="2880"/>
+            <w:tcW w:type="dxa" w:w="2304"/>
             <w:vAlign w:val="top"/>
           </w:tcPr>
           <w:p>
@@ -2502,7 +2530,7 @@
       </w:pPr>
       <w:r>
         <w:rPr>
-          <w:sz w:val="12"/>
+          <w:sz w:val="6"/>
         </w:rPr>
       </w:r>
     </w:p>
@@ -2519,10 +2547,12 @@
           <w:insideH w:val="none"/>
           <w:insideV w:val="none"/>
         </w:tblBorders>
+        <w:tblLayout w:type="fixed"/>
+        <w:tblW w:w="10224" w:type="dxa"/>
       </w:tblPr>
       <w:tblGrid>
-        <w:gridCol w:w="4896"/>
-        <w:gridCol w:w="4896"/>
+        <w:gridCol w:w="7920"/>
+        <w:gridCol w:w="2304"/>
       </w:tblGrid>
       <w:tr>
         <w:trPr>
@@ -2530,7 +2560,7 @@
         </w:trPr>
         <w:tc>
           <w:tcPr>
-            <w:tcW w:type="dxa" w:w="7056"/>
+            <w:tcW w:type="dxa" w:w="7920"/>
             <w:vAlign w:val="top"/>
           </w:tcPr>
           <w:p>
@@ -2548,7 +2578,7 @@
         </w:tc>
         <w:tc>
           <w:tcPr>
-            <w:tcW w:type="dxa" w:w="2880"/>
+            <w:tcW w:type="dxa" w:w="2304"/>
             <w:vAlign w:val="top"/>
           </w:tcPr>
           <w:p>
@@ -2572,7 +2602,7 @@
       </w:pPr>
       <w:r>
         <w:rPr>
-          <w:sz w:val="12"/>
+          <w:sz w:val="6"/>
         </w:rPr>
       </w:r>
     </w:p>
@@ -2589,10 +2619,12 @@
           <w:insideH w:val="none"/>
           <w:insideV w:val="none"/>
         </w:tblBorders>
+        <w:tblLayout w:type="fixed"/>
+        <w:tblW w:w="10224" w:type="dxa"/>
       </w:tblPr>
       <w:tblGrid>
-        <w:gridCol w:w="4896"/>
-        <w:gridCol w:w="4896"/>
+        <w:gridCol w:w="7920"/>
+        <w:gridCol w:w="2304"/>
       </w:tblGrid>
       <w:tr>
         <w:trPr>
@@ -2600,7 +2632,7 @@
         </w:trPr>
         <w:tc>
           <w:tcPr>
-            <w:tcW w:type="dxa" w:w="7056"/>
+            <w:tcW w:type="dxa" w:w="7920"/>
             <w:vAlign w:val="top"/>
           </w:tcPr>
           <w:p>
@@ -2618,7 +2650,7 @@
         </w:tc>
         <w:tc>
           <w:tcPr>
-            <w:tcW w:type="dxa" w:w="2880"/>
+            <w:tcW w:type="dxa" w:w="2304"/>
             <w:vAlign w:val="top"/>
           </w:tcPr>
           <w:p>
@@ -2642,7 +2674,7 @@
       </w:pPr>
       <w:r>
         <w:rPr>
-          <w:sz w:val="12"/>
+          <w:sz w:val="6"/>
         </w:rPr>
       </w:r>
     </w:p>
@@ -2678,7 +2710,7 @@
     <w:p>
       <w:pPr>
         <w:keepNext/>
-        <w:spacing w:before="240" w:after="80"/>
+        <w:spacing w:before="160" w:after="60"/>
         <w:pBdr>
           <w:bottom w:val="single" w:sz="6" w:space="1" w:color="000000"/>
         </w:pBdr>
@@ -3960,7 +3992,7 @@
     <w:p>
       <w:pPr>
         <w:keepNext/>
-        <w:spacing w:before="240" w:after="80"/>
+        <w:spacing w:before="160" w:after="60"/>
         <w:pBdr>
           <w:bottom w:val="single" w:sz="6" w:space="1" w:color="000000"/>
         </w:pBdr>
@@ -4871,7 +4903,7 @@
     <w:p>
       <w:pPr>
         <w:keepNext/>
-        <w:spacing w:before="240" w:after="80"/>
+        <w:spacing w:before="160" w:after="60"/>
         <w:pBdr>
           <w:bottom w:val="single" w:sz="6" w:space="1" w:color="000000"/>
         </w:pBdr>
@@ -4897,10 +4929,12 @@
           <w:insideH w:val="none"/>
           <w:insideV w:val="none"/>
         </w:tblBorders>
+        <w:tblLayout w:type="fixed"/>
+        <w:tblW w:w="10224" w:type="dxa"/>
       </w:tblPr>
       <w:tblGrid>
-        <w:gridCol w:w="4896"/>
-        <w:gridCol w:w="4896"/>
+        <w:gridCol w:w="7920"/>
+        <w:gridCol w:w="2304"/>
       </w:tblGrid>
       <w:tr>
         <w:trPr>
@@ -4908,7 +4942,7 @@
         </w:trPr>
         <w:tc>
           <w:tcPr>
-            <w:tcW w:type="dxa" w:w="7056"/>
+            <w:tcW w:type="dxa" w:w="7920"/>
             <w:vAlign w:val="top"/>
           </w:tcPr>
           <w:p>
@@ -4938,7 +4972,7 @@
         </w:tc>
         <w:tc>
           <w:tcPr>
-            <w:tcW w:type="dxa" w:w="2880"/>
+            <w:tcW w:type="dxa" w:w="2304"/>
             <w:vAlign w:val="top"/>
           </w:tcPr>
           <w:p>
@@ -4975,7 +5009,7 @@
       </w:pPr>
       <w:r>
         <w:rPr>
-          <w:sz w:val="12"/>
+          <w:sz w:val="6"/>
         </w:rPr>
       </w:r>
     </w:p>
@@ -4992,10 +5026,12 @@
           <w:insideH w:val="none"/>
           <w:insideV w:val="none"/>
         </w:tblBorders>
+        <w:tblLayout w:type="fixed"/>
+        <w:tblW w:w="10224" w:type="dxa"/>
       </w:tblPr>
       <w:tblGrid>
-        <w:gridCol w:w="4896"/>
-        <w:gridCol w:w="4896"/>
+        <w:gridCol w:w="7920"/>
+        <w:gridCol w:w="2304"/>
       </w:tblGrid>
       <w:tr>
         <w:trPr>
@@ -5003,7 +5039,7 @@
         </w:trPr>
         <w:tc>
           <w:tcPr>
-            <w:tcW w:type="dxa" w:w="7056"/>
+            <w:tcW w:type="dxa" w:w="7920"/>
             <w:vAlign w:val="top"/>
           </w:tcPr>
           <w:p>
@@ -5033,7 +5069,7 @@
         </w:tc>
         <w:tc>
           <w:tcPr>
-            <w:tcW w:type="dxa" w:w="2880"/>
+            <w:tcW w:type="dxa" w:w="2304"/>
             <w:vAlign w:val="top"/>
           </w:tcPr>
           <w:p>
@@ -5070,7 +5106,7 @@
       </w:pPr>
       <w:r>
         <w:rPr>
-          <w:sz w:val="12"/>
+          <w:sz w:val="6"/>
         </w:rPr>
       </w:r>
     </w:p>
@@ -5087,10 +5123,12 @@
           <w:insideH w:val="none"/>
           <w:insideV w:val="none"/>
         </w:tblBorders>
+        <w:tblLayout w:type="fixed"/>
+        <w:tblW w:w="10224" w:type="dxa"/>
       </w:tblPr>
       <w:tblGrid>
-        <w:gridCol w:w="4896"/>
-        <w:gridCol w:w="4896"/>
+        <w:gridCol w:w="7920"/>
+        <w:gridCol w:w="2304"/>
       </w:tblGrid>
       <w:tr>
         <w:trPr>
@@ -5098,7 +5136,7 @@
         </w:trPr>
         <w:tc>
           <w:tcPr>
-            <w:tcW w:type="dxa" w:w="7056"/>
+            <w:tcW w:type="dxa" w:w="7920"/>
             <w:vAlign w:val="top"/>
           </w:tcPr>
           <w:p>
@@ -5128,7 +5166,7 @@
         </w:tc>
         <w:tc>
           <w:tcPr>
-            <w:tcW w:type="dxa" w:w="2880"/>
+            <w:tcW w:type="dxa" w:w="2304"/>
             <w:vAlign w:val="top"/>
           </w:tcPr>
           <w:p>
@@ -5165,7 +5203,7 @@
       </w:pPr>
       <w:r>
         <w:rPr>
-          <w:sz w:val="12"/>
+          <w:sz w:val="6"/>
         </w:rPr>
       </w:r>
     </w:p>
@@ -5182,10 +5220,12 @@
           <w:insideH w:val="none"/>
           <w:insideV w:val="none"/>
         </w:tblBorders>
+        <w:tblLayout w:type="fixed"/>
+        <w:tblW w:w="10224" w:type="dxa"/>
       </w:tblPr>
       <w:tblGrid>
-        <w:gridCol w:w="4896"/>
-        <w:gridCol w:w="4896"/>
+        <w:gridCol w:w="7920"/>
+        <w:gridCol w:w="2304"/>
       </w:tblGrid>
       <w:tr>
         <w:trPr>
@@ -5193,7 +5233,7 @@
         </w:trPr>
         <w:tc>
           <w:tcPr>
-            <w:tcW w:type="dxa" w:w="7056"/>
+            <w:tcW w:type="dxa" w:w="7920"/>
             <w:vAlign w:val="top"/>
           </w:tcPr>
           <w:p>
@@ -5223,7 +5263,7 @@
         </w:tc>
         <w:tc>
           <w:tcPr>
-            <w:tcW w:type="dxa" w:w="2880"/>
+            <w:tcW w:type="dxa" w:w="2304"/>
             <w:vAlign w:val="top"/>
           </w:tcPr>
           <w:p>
@@ -5260,7 +5300,7 @@
       </w:pPr>
       <w:r>
         <w:rPr>
-          <w:sz w:val="12"/>
+          <w:sz w:val="6"/>
         </w:rPr>
       </w:r>
     </w:p>
@@ -5277,10 +5317,12 @@
           <w:insideH w:val="none"/>
           <w:insideV w:val="none"/>
         </w:tblBorders>
+        <w:tblLayout w:type="fixed"/>
+        <w:tblW w:w="10224" w:type="dxa"/>
       </w:tblPr>
       <w:tblGrid>
-        <w:gridCol w:w="4896"/>
-        <w:gridCol w:w="4896"/>
+        <w:gridCol w:w="7920"/>
+        <w:gridCol w:w="2304"/>
       </w:tblGrid>
       <w:tr>
         <w:trPr>
@@ -5288,7 +5330,7 @@
         </w:trPr>
         <w:tc>
           <w:tcPr>
-            <w:tcW w:type="dxa" w:w="7056"/>
+            <w:tcW w:type="dxa" w:w="7920"/>
             <w:vAlign w:val="top"/>
           </w:tcPr>
           <w:p>
@@ -5318,7 +5360,7 @@
         </w:tc>
         <w:tc>
           <w:tcPr>
-            <w:tcW w:type="dxa" w:w="2880"/>
+            <w:tcW w:type="dxa" w:w="2304"/>
             <w:vAlign w:val="top"/>
           </w:tcPr>
           <w:p>
@@ -5355,7 +5397,7 @@
       </w:pPr>
       <w:r>
         <w:rPr>
-          <w:sz w:val="12"/>
+          <w:sz w:val="6"/>
         </w:rPr>
       </w:r>
     </w:p>
@@ -5372,10 +5414,12 @@
           <w:insideH w:val="none"/>
           <w:insideV w:val="none"/>
         </w:tblBorders>
+        <w:tblLayout w:type="fixed"/>
+        <w:tblW w:w="10224" w:type="dxa"/>
       </w:tblPr>
       <w:tblGrid>
-        <w:gridCol w:w="4896"/>
-        <w:gridCol w:w="4896"/>
+        <w:gridCol w:w="7920"/>
+        <w:gridCol w:w="2304"/>
       </w:tblGrid>
       <w:tr>
         <w:trPr>
@@ -5383,7 +5427,7 @@
         </w:trPr>
         <w:tc>
           <w:tcPr>
-            <w:tcW w:type="dxa" w:w="7056"/>
+            <w:tcW w:type="dxa" w:w="7920"/>
             <w:vAlign w:val="top"/>
           </w:tcPr>
           <w:p>
@@ -5413,7 +5457,7 @@
         </w:tc>
         <w:tc>
           <w:tcPr>
-            <w:tcW w:type="dxa" w:w="2880"/>
+            <w:tcW w:type="dxa" w:w="2304"/>
             <w:vAlign w:val="top"/>
           </w:tcPr>
           <w:p>
@@ -5450,7 +5494,7 @@
       </w:pPr>
       <w:r>
         <w:rPr>
-          <w:sz w:val="12"/>
+          <w:sz w:val="6"/>
         </w:rPr>
       </w:r>
     </w:p>
@@ -5467,10 +5511,12 @@
           <w:insideH w:val="none"/>
           <w:insideV w:val="none"/>
         </w:tblBorders>
+        <w:tblLayout w:type="fixed"/>
+        <w:tblW w:w="10224" w:type="dxa"/>
       </w:tblPr>
       <w:tblGrid>
-        <w:gridCol w:w="4896"/>
-        <w:gridCol w:w="4896"/>
+        <w:gridCol w:w="7920"/>
+        <w:gridCol w:w="2304"/>
       </w:tblGrid>
       <w:tr>
         <w:trPr>
@@ -5478,7 +5524,7 @@
         </w:trPr>
         <w:tc>
           <w:tcPr>
-            <w:tcW w:type="dxa" w:w="7056"/>
+            <w:tcW w:type="dxa" w:w="7920"/>
             <w:vAlign w:val="top"/>
           </w:tcPr>
           <w:p>
@@ -5508,7 +5554,7 @@
         </w:tc>
         <w:tc>
           <w:tcPr>
-            <w:tcW w:type="dxa" w:w="2880"/>
+            <w:tcW w:type="dxa" w:w="2304"/>
             <w:vAlign w:val="top"/>
           </w:tcPr>
           <w:p>
@@ -5545,7 +5591,7 @@
       </w:pPr>
       <w:r>
         <w:rPr>
-          <w:sz w:val="12"/>
+          <w:sz w:val="6"/>
         </w:rPr>
       </w:r>
     </w:p>
@@ -5562,10 +5608,12 @@
           <w:insideH w:val="none"/>
           <w:insideV w:val="none"/>
         </w:tblBorders>
+        <w:tblLayout w:type="fixed"/>
+        <w:tblW w:w="10224" w:type="dxa"/>
       </w:tblPr>
       <w:tblGrid>
-        <w:gridCol w:w="4896"/>
-        <w:gridCol w:w="4896"/>
+        <w:gridCol w:w="7920"/>
+        <w:gridCol w:w="2304"/>
       </w:tblGrid>
       <w:tr>
         <w:trPr>
@@ -5573,7 +5621,7 @@
         </w:trPr>
         <w:tc>
           <w:tcPr>
-            <w:tcW w:type="dxa" w:w="7056"/>
+            <w:tcW w:type="dxa" w:w="7920"/>
             <w:vAlign w:val="top"/>
           </w:tcPr>
           <w:p>
@@ -5603,7 +5651,7 @@
         </w:tc>
         <w:tc>
           <w:tcPr>
-            <w:tcW w:type="dxa" w:w="2880"/>
+            <w:tcW w:type="dxa" w:w="2304"/>
             <w:vAlign w:val="top"/>
           </w:tcPr>
           <w:p>
@@ -5640,7 +5688,7 @@
       </w:pPr>
       <w:r>
         <w:rPr>
-          <w:sz w:val="12"/>
+          <w:sz w:val="6"/>
         </w:rPr>
       </w:r>
     </w:p>
@@ -5657,10 +5705,12 @@
           <w:insideH w:val="none"/>
           <w:insideV w:val="none"/>
         </w:tblBorders>
+        <w:tblLayout w:type="fixed"/>
+        <w:tblW w:w="10224" w:type="dxa"/>
       </w:tblPr>
       <w:tblGrid>
-        <w:gridCol w:w="4896"/>
-        <w:gridCol w:w="4896"/>
+        <w:gridCol w:w="7920"/>
+        <w:gridCol w:w="2304"/>
       </w:tblGrid>
       <w:tr>
         <w:trPr>
@@ -5668,7 +5718,7 @@
         </w:trPr>
         <w:tc>
           <w:tcPr>
-            <w:tcW w:type="dxa" w:w="7056"/>
+            <w:tcW w:type="dxa" w:w="7920"/>
             <w:vAlign w:val="top"/>
           </w:tcPr>
           <w:p>
@@ -5698,7 +5748,7 @@
         </w:tc>
         <w:tc>
           <w:tcPr>
-            <w:tcW w:type="dxa" w:w="2880"/>
+            <w:tcW w:type="dxa" w:w="2304"/>
             <w:vAlign w:val="top"/>
           </w:tcPr>
           <w:p>
@@ -5735,7 +5785,7 @@
       </w:pPr>
       <w:r>
         <w:rPr>
-          <w:sz w:val="12"/>
+          <w:sz w:val="6"/>
         </w:rPr>
       </w:r>
     </w:p>
@@ -5752,10 +5802,12 @@
           <w:insideH w:val="none"/>
           <w:insideV w:val="none"/>
         </w:tblBorders>
+        <w:tblLayout w:type="fixed"/>
+        <w:tblW w:w="10224" w:type="dxa"/>
       </w:tblPr>
       <w:tblGrid>
-        <w:gridCol w:w="4896"/>
-        <w:gridCol w:w="4896"/>
+        <w:gridCol w:w="7920"/>
+        <w:gridCol w:w="2304"/>
       </w:tblGrid>
       <w:tr>
         <w:trPr>
@@ -5763,7 +5815,7 @@
         </w:trPr>
         <w:tc>
           <w:tcPr>
-            <w:tcW w:type="dxa" w:w="7056"/>
+            <w:tcW w:type="dxa" w:w="7920"/>
             <w:vAlign w:val="top"/>
           </w:tcPr>
           <w:p>
@@ -5793,7 +5845,7 @@
         </w:tc>
         <w:tc>
           <w:tcPr>
-            <w:tcW w:type="dxa" w:w="2880"/>
+            <w:tcW w:type="dxa" w:w="2304"/>
             <w:vAlign w:val="top"/>
           </w:tcPr>
           <w:p>
@@ -5830,7 +5882,7 @@
       </w:pPr>
       <w:r>
         <w:rPr>
-          <w:sz w:val="12"/>
+          <w:sz w:val="6"/>
         </w:rPr>
       </w:r>
     </w:p>
@@ -5847,10 +5899,12 @@
           <w:insideH w:val="none"/>
           <w:insideV w:val="none"/>
         </w:tblBorders>
+        <w:tblLayout w:type="fixed"/>
+        <w:tblW w:w="10224" w:type="dxa"/>
       </w:tblPr>
       <w:tblGrid>
-        <w:gridCol w:w="4896"/>
-        <w:gridCol w:w="4896"/>
+        <w:gridCol w:w="7920"/>
+        <w:gridCol w:w="2304"/>
       </w:tblGrid>
       <w:tr>
         <w:trPr>
@@ -5858,7 +5912,7 @@
         </w:trPr>
         <w:tc>
           <w:tcPr>
-            <w:tcW w:type="dxa" w:w="7056"/>
+            <w:tcW w:type="dxa" w:w="7920"/>
             <w:vAlign w:val="top"/>
           </w:tcPr>
           <w:p>
@@ -5888,7 +5942,7 @@
         </w:tc>
         <w:tc>
           <w:tcPr>
-            <w:tcW w:type="dxa" w:w="2880"/>
+            <w:tcW w:type="dxa" w:w="2304"/>
             <w:vAlign w:val="top"/>
           </w:tcPr>
           <w:p>
@@ -5925,7 +5979,7 @@
       </w:pPr>
       <w:r>
         <w:rPr>
-          <w:sz w:val="12"/>
+          <w:sz w:val="6"/>
         </w:rPr>
       </w:r>
     </w:p>
@@ -5942,10 +5996,12 @@
           <w:insideH w:val="none"/>
           <w:insideV w:val="none"/>
         </w:tblBorders>
+        <w:tblLayout w:type="fixed"/>
+        <w:tblW w:w="10224" w:type="dxa"/>
       </w:tblPr>
       <w:tblGrid>
-        <w:gridCol w:w="4896"/>
-        <w:gridCol w:w="4896"/>
+        <w:gridCol w:w="7920"/>
+        <w:gridCol w:w="2304"/>
       </w:tblGrid>
       <w:tr>
         <w:trPr>
@@ -5953,7 +6009,7 @@
         </w:trPr>
         <w:tc>
           <w:tcPr>
-            <w:tcW w:type="dxa" w:w="7056"/>
+            <w:tcW w:type="dxa" w:w="7920"/>
             <w:vAlign w:val="top"/>
           </w:tcPr>
           <w:p>
@@ -5983,7 +6039,7 @@
         </w:tc>
         <w:tc>
           <w:tcPr>
-            <w:tcW w:type="dxa" w:w="2880"/>
+            <w:tcW w:type="dxa" w:w="2304"/>
             <w:vAlign w:val="top"/>
           </w:tcPr>
           <w:p>
@@ -6020,7 +6076,7 @@
       </w:pPr>
       <w:r>
         <w:rPr>
-          <w:sz w:val="12"/>
+          <w:sz w:val="6"/>
         </w:rPr>
       </w:r>
     </w:p>
@@ -6037,10 +6093,12 @@
           <w:insideH w:val="none"/>
           <w:insideV w:val="none"/>
         </w:tblBorders>
+        <w:tblLayout w:type="fixed"/>
+        <w:tblW w:w="10224" w:type="dxa"/>
       </w:tblPr>
       <w:tblGrid>
-        <w:gridCol w:w="4896"/>
-        <w:gridCol w:w="4896"/>
+        <w:gridCol w:w="7920"/>
+        <w:gridCol w:w="2304"/>
       </w:tblGrid>
       <w:tr>
         <w:trPr>
@@ -6048,7 +6106,7 @@
         </w:trPr>
         <w:tc>
           <w:tcPr>
-            <w:tcW w:type="dxa" w:w="7056"/>
+            <w:tcW w:type="dxa" w:w="7920"/>
             <w:vAlign w:val="top"/>
           </w:tcPr>
           <w:p>
@@ -6078,7 +6136,7 @@
         </w:tc>
         <w:tc>
           <w:tcPr>
-            <w:tcW w:type="dxa" w:w="2880"/>
+            <w:tcW w:type="dxa" w:w="2304"/>
             <w:vAlign w:val="top"/>
           </w:tcPr>
           <w:p>
@@ -6115,7 +6173,7 @@
       </w:pPr>
       <w:r>
         <w:rPr>
-          <w:sz w:val="12"/>
+          <w:sz w:val="6"/>
         </w:rPr>
       </w:r>
     </w:p>
@@ -6132,10 +6190,12 @@
           <w:insideH w:val="none"/>
           <w:insideV w:val="none"/>
         </w:tblBorders>
+        <w:tblLayout w:type="fixed"/>
+        <w:tblW w:w="10224" w:type="dxa"/>
       </w:tblPr>
       <w:tblGrid>
-        <w:gridCol w:w="4896"/>
-        <w:gridCol w:w="4896"/>
+        <w:gridCol w:w="7920"/>
+        <w:gridCol w:w="2304"/>
       </w:tblGrid>
       <w:tr>
         <w:trPr>
@@ -6143,7 +6203,7 @@
         </w:trPr>
         <w:tc>
           <w:tcPr>
-            <w:tcW w:type="dxa" w:w="7056"/>
+            <w:tcW w:type="dxa" w:w="7920"/>
             <w:vAlign w:val="top"/>
           </w:tcPr>
           <w:p>
@@ -6173,7 +6233,7 @@
         </w:tc>
         <w:tc>
           <w:tcPr>
-            <w:tcW w:type="dxa" w:w="2880"/>
+            <w:tcW w:type="dxa" w:w="2304"/>
             <w:vAlign w:val="top"/>
           </w:tcPr>
           <w:p>
@@ -6210,14 +6270,14 @@
       </w:pPr>
       <w:r>
         <w:rPr>
-          <w:sz w:val="12"/>
+          <w:sz w:val="6"/>
         </w:rPr>
       </w:r>
     </w:p>
     <w:p>
       <w:pPr>
         <w:keepNext/>
-        <w:spacing w:before="240" w:after="80"/>
+        <w:spacing w:before="160" w:after="60"/>
         <w:pBdr>
           <w:bottom w:val="single" w:sz="6" w:space="1" w:color="000000"/>
         </w:pBdr>
@@ -6256,10 +6316,12 @@
           <w:insideH w:val="none"/>
           <w:insideV w:val="none"/>
         </w:tblBorders>
+        <w:tblLayout w:type="fixed"/>
+        <w:tblW w:w="10224" w:type="dxa"/>
       </w:tblPr>
       <w:tblGrid>
-        <w:gridCol w:w="4896"/>
-        <w:gridCol w:w="4896"/>
+        <w:gridCol w:w="7920"/>
+        <w:gridCol w:w="2304"/>
       </w:tblGrid>
       <w:tr>
         <w:trPr>
@@ -6267,7 +6329,7 @@
         </w:trPr>
         <w:tc>
           <w:tcPr>
-            <w:tcW w:type="dxa" w:w="7056"/>
+            <w:tcW w:type="dxa" w:w="7920"/>
             <w:vAlign w:val="top"/>
           </w:tcPr>
           <w:p>
@@ -6285,7 +6347,7 @@
         </w:tc>
         <w:tc>
           <w:tcPr>
-            <w:tcW w:type="dxa" w:w="2880"/>
+            <w:tcW w:type="dxa" w:w="2304"/>
             <w:vAlign w:val="top"/>
           </w:tcPr>
           <w:p>
@@ -6309,7 +6371,7 @@
       </w:pPr>
       <w:r>
         <w:rPr>
-          <w:sz w:val="12"/>
+          <w:sz w:val="6"/>
         </w:rPr>
       </w:r>
     </w:p>
@@ -6339,10 +6401,12 @@
           <w:insideH w:val="none"/>
           <w:insideV w:val="none"/>
         </w:tblBorders>
+        <w:tblLayout w:type="fixed"/>
+        <w:tblW w:w="10224" w:type="dxa"/>
       </w:tblPr>
       <w:tblGrid>
-        <w:gridCol w:w="4896"/>
-        <w:gridCol w:w="4896"/>
+        <w:gridCol w:w="7920"/>
+        <w:gridCol w:w="2304"/>
       </w:tblGrid>
       <w:tr>
         <w:trPr>
@@ -6350,7 +6414,7 @@
         </w:trPr>
         <w:tc>
           <w:tcPr>
-            <w:tcW w:type="dxa" w:w="7056"/>
+            <w:tcW w:type="dxa" w:w="7920"/>
             <w:vAlign w:val="top"/>
           </w:tcPr>
           <w:p>
@@ -6368,7 +6432,7 @@
         </w:tc>
         <w:tc>
           <w:tcPr>
-            <w:tcW w:type="dxa" w:w="2880"/>
+            <w:tcW w:type="dxa" w:w="2304"/>
             <w:vAlign w:val="top"/>
           </w:tcPr>
           <w:p>
@@ -6392,7 +6456,7 @@
       </w:pPr>
       <w:r>
         <w:rPr>
-          <w:sz w:val="12"/>
+          <w:sz w:val="6"/>
         </w:rPr>
       </w:r>
     </w:p>
@@ -6409,10 +6473,12 @@
           <w:insideH w:val="none"/>
           <w:insideV w:val="none"/>
         </w:tblBorders>
+        <w:tblLayout w:type="fixed"/>
+        <w:tblW w:w="10224" w:type="dxa"/>
       </w:tblPr>
       <w:tblGrid>
-        <w:gridCol w:w="4896"/>
-        <w:gridCol w:w="4896"/>
+        <w:gridCol w:w="7920"/>
+        <w:gridCol w:w="2304"/>
       </w:tblGrid>
       <w:tr>
         <w:trPr>
@@ -6420,7 +6486,7 @@
         </w:trPr>
         <w:tc>
           <w:tcPr>
-            <w:tcW w:type="dxa" w:w="7056"/>
+            <w:tcW w:type="dxa" w:w="7920"/>
             <w:vAlign w:val="top"/>
           </w:tcPr>
           <w:p>
@@ -6438,7 +6504,7 @@
         </w:tc>
         <w:tc>
           <w:tcPr>
-            <w:tcW w:type="dxa" w:w="2880"/>
+            <w:tcW w:type="dxa" w:w="2304"/>
             <w:vAlign w:val="top"/>
           </w:tcPr>
           <w:p>
@@ -6462,7 +6528,7 @@
       </w:pPr>
       <w:r>
         <w:rPr>
-          <w:sz w:val="12"/>
+          <w:sz w:val="6"/>
         </w:rPr>
       </w:r>
     </w:p>
@@ -6492,10 +6558,12 @@
           <w:insideH w:val="none"/>
           <w:insideV w:val="none"/>
         </w:tblBorders>
+        <w:tblLayout w:type="fixed"/>
+        <w:tblW w:w="10224" w:type="dxa"/>
       </w:tblPr>
       <w:tblGrid>
-        <w:gridCol w:w="4896"/>
-        <w:gridCol w:w="4896"/>
+        <w:gridCol w:w="7920"/>
+        <w:gridCol w:w="2304"/>
       </w:tblGrid>
       <w:tr>
         <w:trPr>
@@ -6503,7 +6571,7 @@
         </w:trPr>
         <w:tc>
           <w:tcPr>
-            <w:tcW w:type="dxa" w:w="7056"/>
+            <w:tcW w:type="dxa" w:w="7920"/>
             <w:vAlign w:val="top"/>
           </w:tcPr>
           <w:p>
@@ -6533,7 +6601,7 @@
         </w:tc>
         <w:tc>
           <w:tcPr>
-            <w:tcW w:type="dxa" w:w="2880"/>
+            <w:tcW w:type="dxa" w:w="2304"/>
             <w:vAlign w:val="top"/>
           </w:tcPr>
           <w:p>
@@ -6557,7 +6625,7 @@
       </w:pPr>
       <w:r>
         <w:rPr>
-          <w:sz w:val="12"/>
+          <w:sz w:val="6"/>
         </w:rPr>
       </w:r>
     </w:p>
@@ -6574,10 +6642,12 @@
           <w:insideH w:val="none"/>
           <w:insideV w:val="none"/>
         </w:tblBorders>
+        <w:tblLayout w:type="fixed"/>
+        <w:tblW w:w="10224" w:type="dxa"/>
       </w:tblPr>
       <w:tblGrid>
-        <w:gridCol w:w="4896"/>
-        <w:gridCol w:w="4896"/>
+        <w:gridCol w:w="7920"/>
+        <w:gridCol w:w="2304"/>
       </w:tblGrid>
       <w:tr>
         <w:trPr>
@@ -6585,7 +6655,7 @@
         </w:trPr>
         <w:tc>
           <w:tcPr>
-            <w:tcW w:type="dxa" w:w="7056"/>
+            <w:tcW w:type="dxa" w:w="7920"/>
             <w:vAlign w:val="top"/>
           </w:tcPr>
           <w:p>
@@ -6615,7 +6685,7 @@
         </w:tc>
         <w:tc>
           <w:tcPr>
-            <w:tcW w:type="dxa" w:w="2880"/>
+            <w:tcW w:type="dxa" w:w="2304"/>
             <w:vAlign w:val="top"/>
           </w:tcPr>
           <w:p>
@@ -6639,7 +6709,7 @@
       </w:pPr>
       <w:r>
         <w:rPr>
-          <w:sz w:val="12"/>
+          <w:sz w:val="6"/>
         </w:rPr>
       </w:r>
     </w:p>
@@ -6802,10 +6872,12 @@
           <w:insideH w:val="none"/>
           <w:insideV w:val="none"/>
         </w:tblBorders>
+        <w:tblLayout w:type="fixed"/>
+        <w:tblW w:w="10224" w:type="dxa"/>
       </w:tblPr>
       <w:tblGrid>
-        <w:gridCol w:w="4896"/>
-        <w:gridCol w:w="4896"/>
+        <w:gridCol w:w="7920"/>
+        <w:gridCol w:w="2304"/>
       </w:tblGrid>
       <w:tr>
         <w:trPr>
@@ -6813,7 +6885,7 @@
         </w:trPr>
         <w:tc>
           <w:tcPr>
-            <w:tcW w:type="dxa" w:w="7056"/>
+            <w:tcW w:type="dxa" w:w="7920"/>
             <w:vAlign w:val="top"/>
           </w:tcPr>
           <w:p>
@@ -6831,7 +6903,7 @@
         </w:tc>
         <w:tc>
           <w:tcPr>
-            <w:tcW w:type="dxa" w:w="2880"/>
+            <w:tcW w:type="dxa" w:w="2304"/>
             <w:vAlign w:val="top"/>
           </w:tcPr>
           <w:p>
@@ -6855,7 +6927,7 @@
       </w:pPr>
       <w:r>
         <w:rPr>
-          <w:sz w:val="12"/>
+          <w:sz w:val="6"/>
         </w:rPr>
       </w:r>
     </w:p>
@@ -6872,10 +6944,12 @@
           <w:insideH w:val="none"/>
           <w:insideV w:val="none"/>
         </w:tblBorders>
+        <w:tblLayout w:type="fixed"/>
+        <w:tblW w:w="10224" w:type="dxa"/>
       </w:tblPr>
       <w:tblGrid>
-        <w:gridCol w:w="4896"/>
-        <w:gridCol w:w="4896"/>
+        <w:gridCol w:w="7920"/>
+        <w:gridCol w:w="2304"/>
       </w:tblGrid>
       <w:tr>
         <w:trPr>
@@ -6883,7 +6957,7 @@
         </w:trPr>
         <w:tc>
           <w:tcPr>
-            <w:tcW w:type="dxa" w:w="7056"/>
+            <w:tcW w:type="dxa" w:w="7920"/>
             <w:vAlign w:val="top"/>
           </w:tcPr>
           <w:p>
@@ -6901,7 +6975,7 @@
         </w:tc>
         <w:tc>
           <w:tcPr>
-            <w:tcW w:type="dxa" w:w="2880"/>
+            <w:tcW w:type="dxa" w:w="2304"/>
             <w:vAlign w:val="top"/>
           </w:tcPr>
           <w:p>
@@ -6925,7 +6999,7 @@
       </w:pPr>
       <w:r>
         <w:rPr>
-          <w:sz w:val="12"/>
+          <w:sz w:val="6"/>
         </w:rPr>
       </w:r>
     </w:p>
@@ -6942,10 +7016,12 @@
           <w:insideH w:val="none"/>
           <w:insideV w:val="none"/>
         </w:tblBorders>
+        <w:tblLayout w:type="fixed"/>
+        <w:tblW w:w="10224" w:type="dxa"/>
       </w:tblPr>
       <w:tblGrid>
-        <w:gridCol w:w="4896"/>
-        <w:gridCol w:w="4896"/>
+        <w:gridCol w:w="7920"/>
+        <w:gridCol w:w="2304"/>
       </w:tblGrid>
       <w:tr>
         <w:trPr>
@@ -6953,7 +7029,7 @@
         </w:trPr>
         <w:tc>
           <w:tcPr>
-            <w:tcW w:type="dxa" w:w="7056"/>
+            <w:tcW w:type="dxa" w:w="7920"/>
             <w:vAlign w:val="top"/>
           </w:tcPr>
           <w:p>
@@ -6971,7 +7047,7 @@
         </w:tc>
         <w:tc>
           <w:tcPr>
-            <w:tcW w:type="dxa" w:w="2880"/>
+            <w:tcW w:type="dxa" w:w="2304"/>
             <w:vAlign w:val="top"/>
           </w:tcPr>
           <w:p>
@@ -6995,7 +7071,7 @@
       </w:pPr>
       <w:r>
         <w:rPr>
-          <w:sz w:val="12"/>
+          <w:sz w:val="6"/>
         </w:rPr>
       </w:r>
     </w:p>
@@ -7012,10 +7088,12 @@
           <w:insideH w:val="none"/>
           <w:insideV w:val="none"/>
         </w:tblBorders>
+        <w:tblLayout w:type="fixed"/>
+        <w:tblW w:w="10224" w:type="dxa"/>
       </w:tblPr>
       <w:tblGrid>
-        <w:gridCol w:w="4896"/>
-        <w:gridCol w:w="4896"/>
+        <w:gridCol w:w="7920"/>
+        <w:gridCol w:w="2304"/>
       </w:tblGrid>
       <w:tr>
         <w:trPr>
@@ -7023,7 +7101,7 @@
         </w:trPr>
         <w:tc>
           <w:tcPr>
-            <w:tcW w:type="dxa" w:w="7056"/>
+            <w:tcW w:type="dxa" w:w="7920"/>
             <w:vAlign w:val="top"/>
           </w:tcPr>
           <w:p>
@@ -7053,7 +7131,7 @@
         </w:tc>
         <w:tc>
           <w:tcPr>
-            <w:tcW w:type="dxa" w:w="2880"/>
+            <w:tcW w:type="dxa" w:w="2304"/>
             <w:vAlign w:val="top"/>
           </w:tcPr>
           <w:p>
@@ -7077,7 +7155,7 @@
       </w:pPr>
       <w:r>
         <w:rPr>
-          <w:sz w:val="12"/>
+          <w:sz w:val="6"/>
         </w:rPr>
       </w:r>
     </w:p>
@@ -7094,10 +7172,12 @@
           <w:insideH w:val="none"/>
           <w:insideV w:val="none"/>
         </w:tblBorders>
+        <w:tblLayout w:type="fixed"/>
+        <w:tblW w:w="10224" w:type="dxa"/>
       </w:tblPr>
       <w:tblGrid>
-        <w:gridCol w:w="4896"/>
-        <w:gridCol w:w="4896"/>
+        <w:gridCol w:w="7920"/>
+        <w:gridCol w:w="2304"/>
       </w:tblGrid>
       <w:tr>
         <w:trPr>
@@ -7105,7 +7185,7 @@
         </w:trPr>
         <w:tc>
           <w:tcPr>
-            <w:tcW w:type="dxa" w:w="7056"/>
+            <w:tcW w:type="dxa" w:w="7920"/>
             <w:vAlign w:val="top"/>
           </w:tcPr>
           <w:p>
@@ -7123,7 +7203,7 @@
         </w:tc>
         <w:tc>
           <w:tcPr>
-            <w:tcW w:type="dxa" w:w="2880"/>
+            <w:tcW w:type="dxa" w:w="2304"/>
             <w:vAlign w:val="top"/>
           </w:tcPr>
           <w:p>
@@ -7147,7 +7227,7 @@
       </w:pPr>
       <w:r>
         <w:rPr>
-          <w:sz w:val="12"/>
+          <w:sz w:val="6"/>
         </w:rPr>
       </w:r>
     </w:p>
@@ -7164,10 +7244,12 @@
           <w:insideH w:val="none"/>
           <w:insideV w:val="none"/>
         </w:tblBorders>
+        <w:tblLayout w:type="fixed"/>
+        <w:tblW w:w="10224" w:type="dxa"/>
       </w:tblPr>
       <w:tblGrid>
-        <w:gridCol w:w="4896"/>
-        <w:gridCol w:w="4896"/>
+        <w:gridCol w:w="7920"/>
+        <w:gridCol w:w="2304"/>
       </w:tblGrid>
       <w:tr>
         <w:trPr>
@@ -7175,7 +7257,7 @@
         </w:trPr>
         <w:tc>
           <w:tcPr>
-            <w:tcW w:type="dxa" w:w="7056"/>
+            <w:tcW w:type="dxa" w:w="7920"/>
             <w:vAlign w:val="top"/>
           </w:tcPr>
           <w:p>
@@ -7193,7 +7275,7 @@
         </w:tc>
         <w:tc>
           <w:tcPr>
-            <w:tcW w:type="dxa" w:w="2880"/>
+            <w:tcW w:type="dxa" w:w="2304"/>
             <w:vAlign w:val="top"/>
           </w:tcPr>
           <w:p>
@@ -7217,7 +7299,7 @@
       </w:pPr>
       <w:r>
         <w:rPr>
-          <w:sz w:val="12"/>
+          <w:sz w:val="6"/>
         </w:rPr>
       </w:r>
     </w:p>
@@ -7234,10 +7316,12 @@
           <w:insideH w:val="none"/>
           <w:insideV w:val="none"/>
         </w:tblBorders>
+        <w:tblLayout w:type="fixed"/>
+        <w:tblW w:w="10224" w:type="dxa"/>
       </w:tblPr>
       <w:tblGrid>
-        <w:gridCol w:w="4896"/>
-        <w:gridCol w:w="4896"/>
+        <w:gridCol w:w="7920"/>
+        <w:gridCol w:w="2304"/>
       </w:tblGrid>
       <w:tr>
         <w:trPr>
@@ -7245,7 +7329,7 @@
         </w:trPr>
         <w:tc>
           <w:tcPr>
-            <w:tcW w:type="dxa" w:w="7056"/>
+            <w:tcW w:type="dxa" w:w="7920"/>
             <w:vAlign w:val="top"/>
           </w:tcPr>
           <w:p>
@@ -7263,7 +7347,7 @@
         </w:tc>
         <w:tc>
           <w:tcPr>
-            <w:tcW w:type="dxa" w:w="2880"/>
+            <w:tcW w:type="dxa" w:w="2304"/>
             <w:vAlign w:val="top"/>
           </w:tcPr>
           <w:p>
@@ -7287,7 +7371,7 @@
       </w:pPr>
       <w:r>
         <w:rPr>
-          <w:sz w:val="12"/>
+          <w:sz w:val="6"/>
         </w:rPr>
       </w:r>
     </w:p>
@@ -7304,10 +7388,12 @@
           <w:insideH w:val="none"/>
           <w:insideV w:val="none"/>
         </w:tblBorders>
+        <w:tblLayout w:type="fixed"/>
+        <w:tblW w:w="10224" w:type="dxa"/>
       </w:tblPr>
       <w:tblGrid>
-        <w:gridCol w:w="4896"/>
-        <w:gridCol w:w="4896"/>
+        <w:gridCol w:w="7920"/>
+        <w:gridCol w:w="2304"/>
       </w:tblGrid>
       <w:tr>
         <w:trPr>
@@ -7315,7 +7401,7 @@
         </w:trPr>
         <w:tc>
           <w:tcPr>
-            <w:tcW w:type="dxa" w:w="7056"/>
+            <w:tcW w:type="dxa" w:w="7920"/>
             <w:vAlign w:val="top"/>
           </w:tcPr>
           <w:p>
@@ -7333,7 +7419,7 @@
         </w:tc>
         <w:tc>
           <w:tcPr>
-            <w:tcW w:type="dxa" w:w="2880"/>
+            <w:tcW w:type="dxa" w:w="2304"/>
             <w:vAlign w:val="top"/>
           </w:tcPr>
           <w:p>
@@ -7357,7 +7443,7 @@
       </w:pPr>
       <w:r>
         <w:rPr>
-          <w:sz w:val="12"/>
+          <w:sz w:val="6"/>
         </w:rPr>
       </w:r>
     </w:p>
@@ -7374,10 +7460,12 @@
           <w:insideH w:val="none"/>
           <w:insideV w:val="none"/>
         </w:tblBorders>
+        <w:tblLayout w:type="fixed"/>
+        <w:tblW w:w="10224" w:type="dxa"/>
       </w:tblPr>
       <w:tblGrid>
-        <w:gridCol w:w="4896"/>
-        <w:gridCol w:w="4896"/>
+        <w:gridCol w:w="7920"/>
+        <w:gridCol w:w="2304"/>
       </w:tblGrid>
       <w:tr>
         <w:trPr>
@@ -7385,7 +7473,7 @@
         </w:trPr>
         <w:tc>
           <w:tcPr>
-            <w:tcW w:type="dxa" w:w="7056"/>
+            <w:tcW w:type="dxa" w:w="7920"/>
             <w:vAlign w:val="top"/>
           </w:tcPr>
           <w:p>
@@ -7403,7 +7491,7 @@
         </w:tc>
         <w:tc>
           <w:tcPr>
-            <w:tcW w:type="dxa" w:w="2880"/>
+            <w:tcW w:type="dxa" w:w="2304"/>
             <w:vAlign w:val="top"/>
           </w:tcPr>
           <w:p>
@@ -7427,7 +7515,7 @@
       </w:pPr>
       <w:r>
         <w:rPr>
-          <w:sz w:val="12"/>
+          <w:sz w:val="6"/>
         </w:rPr>
       </w:r>
     </w:p>
@@ -7444,10 +7532,12 @@
           <w:insideH w:val="none"/>
           <w:insideV w:val="none"/>
         </w:tblBorders>
+        <w:tblLayout w:type="fixed"/>
+        <w:tblW w:w="10224" w:type="dxa"/>
       </w:tblPr>
       <w:tblGrid>
-        <w:gridCol w:w="4896"/>
-        <w:gridCol w:w="4896"/>
+        <w:gridCol w:w="7920"/>
+        <w:gridCol w:w="2304"/>
       </w:tblGrid>
       <w:tr>
         <w:trPr>
@@ -7455,7 +7545,7 @@
         </w:trPr>
         <w:tc>
           <w:tcPr>
-            <w:tcW w:type="dxa" w:w="7056"/>
+            <w:tcW w:type="dxa" w:w="7920"/>
             <w:vAlign w:val="top"/>
           </w:tcPr>
           <w:p>
@@ -7473,7 +7563,7 @@
         </w:tc>
         <w:tc>
           <w:tcPr>
-            <w:tcW w:type="dxa" w:w="2880"/>
+            <w:tcW w:type="dxa" w:w="2304"/>
             <w:vAlign w:val="top"/>
           </w:tcPr>
           <w:p>
@@ -7497,7 +7587,7 @@
       </w:pPr>
       <w:r>
         <w:rPr>
-          <w:sz w:val="12"/>
+          <w:sz w:val="6"/>
         </w:rPr>
       </w:r>
     </w:p>
@@ -7514,10 +7604,12 @@
           <w:insideH w:val="none"/>
           <w:insideV w:val="none"/>
         </w:tblBorders>
+        <w:tblLayout w:type="fixed"/>
+        <w:tblW w:w="10224" w:type="dxa"/>
       </w:tblPr>
       <w:tblGrid>
-        <w:gridCol w:w="4896"/>
-        <w:gridCol w:w="4896"/>
+        <w:gridCol w:w="7920"/>
+        <w:gridCol w:w="2304"/>
       </w:tblGrid>
       <w:tr>
         <w:trPr>
@@ -7525,7 +7617,7 @@
         </w:trPr>
         <w:tc>
           <w:tcPr>
-            <w:tcW w:type="dxa" w:w="7056"/>
+            <w:tcW w:type="dxa" w:w="7920"/>
             <w:vAlign w:val="top"/>
           </w:tcPr>
           <w:p>
@@ -7543,7 +7635,7 @@
         </w:tc>
         <w:tc>
           <w:tcPr>
-            <w:tcW w:type="dxa" w:w="2880"/>
+            <w:tcW w:type="dxa" w:w="2304"/>
             <w:vAlign w:val="top"/>
           </w:tcPr>
           <w:p>
@@ -7567,7 +7659,7 @@
       </w:pPr>
       <w:r>
         <w:rPr>
-          <w:sz w:val="12"/>
+          <w:sz w:val="6"/>
         </w:rPr>
       </w:r>
     </w:p>
@@ -7584,10 +7676,12 @@
           <w:insideH w:val="none"/>
           <w:insideV w:val="none"/>
         </w:tblBorders>
+        <w:tblLayout w:type="fixed"/>
+        <w:tblW w:w="10224" w:type="dxa"/>
       </w:tblPr>
       <w:tblGrid>
-        <w:gridCol w:w="4896"/>
-        <w:gridCol w:w="4896"/>
+        <w:gridCol w:w="7920"/>
+        <w:gridCol w:w="2304"/>
       </w:tblGrid>
       <w:tr>
         <w:trPr>
@@ -7595,7 +7689,7 @@
         </w:trPr>
         <w:tc>
           <w:tcPr>
-            <w:tcW w:type="dxa" w:w="7056"/>
+            <w:tcW w:type="dxa" w:w="7920"/>
             <w:vAlign w:val="top"/>
           </w:tcPr>
           <w:p>
@@ -7613,7 +7707,7 @@
         </w:tc>
         <w:tc>
           <w:tcPr>
-            <w:tcW w:type="dxa" w:w="2880"/>
+            <w:tcW w:type="dxa" w:w="2304"/>
             <w:vAlign w:val="top"/>
           </w:tcPr>
           <w:p>
@@ -7637,7 +7731,7 @@
       </w:pPr>
       <w:r>
         <w:rPr>
-          <w:sz w:val="12"/>
+          <w:sz w:val="6"/>
         </w:rPr>
       </w:r>
     </w:p>
@@ -7654,10 +7748,12 @@
           <w:insideH w:val="none"/>
           <w:insideV w:val="none"/>
         </w:tblBorders>
+        <w:tblLayout w:type="fixed"/>
+        <w:tblW w:w="10224" w:type="dxa"/>
       </w:tblPr>
       <w:tblGrid>
-        <w:gridCol w:w="4896"/>
-        <w:gridCol w:w="4896"/>
+        <w:gridCol w:w="7920"/>
+        <w:gridCol w:w="2304"/>
       </w:tblGrid>
       <w:tr>
         <w:trPr>
@@ -7665,7 +7761,7 @@
         </w:trPr>
         <w:tc>
           <w:tcPr>
-            <w:tcW w:type="dxa" w:w="7056"/>
+            <w:tcW w:type="dxa" w:w="7920"/>
             <w:vAlign w:val="top"/>
           </w:tcPr>
           <w:p>
@@ -7683,7 +7779,7 @@
         </w:tc>
         <w:tc>
           <w:tcPr>
-            <w:tcW w:type="dxa" w:w="2880"/>
+            <w:tcW w:type="dxa" w:w="2304"/>
             <w:vAlign w:val="top"/>
           </w:tcPr>
           <w:p>
@@ -7707,7 +7803,7 @@
       </w:pPr>
       <w:r>
         <w:rPr>
-          <w:sz w:val="12"/>
+          <w:sz w:val="6"/>
         </w:rPr>
       </w:r>
     </w:p>
@@ -7724,10 +7820,12 @@
           <w:insideH w:val="none"/>
           <w:insideV w:val="none"/>
         </w:tblBorders>
+        <w:tblLayout w:type="fixed"/>
+        <w:tblW w:w="10224" w:type="dxa"/>
       </w:tblPr>
       <w:tblGrid>
-        <w:gridCol w:w="4896"/>
-        <w:gridCol w:w="4896"/>
+        <w:gridCol w:w="7920"/>
+        <w:gridCol w:w="2304"/>
       </w:tblGrid>
       <w:tr>
         <w:trPr>
@@ -7735,7 +7833,7 @@
         </w:trPr>
         <w:tc>
           <w:tcPr>
-            <w:tcW w:type="dxa" w:w="7056"/>
+            <w:tcW w:type="dxa" w:w="7920"/>
             <w:vAlign w:val="top"/>
           </w:tcPr>
           <w:p>
@@ -7753,7 +7851,7 @@
         </w:tc>
         <w:tc>
           <w:tcPr>
-            <w:tcW w:type="dxa" w:w="2880"/>
+            <w:tcW w:type="dxa" w:w="2304"/>
             <w:vAlign w:val="top"/>
           </w:tcPr>
           <w:p>
@@ -7777,7 +7875,7 @@
       </w:pPr>
       <w:r>
         <w:rPr>
-          <w:sz w:val="12"/>
+          <w:sz w:val="6"/>
         </w:rPr>
       </w:r>
     </w:p>
@@ -7794,10 +7892,12 @@
           <w:insideH w:val="none"/>
           <w:insideV w:val="none"/>
         </w:tblBorders>
+        <w:tblLayout w:type="fixed"/>
+        <w:tblW w:w="10224" w:type="dxa"/>
       </w:tblPr>
       <w:tblGrid>
-        <w:gridCol w:w="4896"/>
-        <w:gridCol w:w="4896"/>
+        <w:gridCol w:w="7920"/>
+        <w:gridCol w:w="2304"/>
       </w:tblGrid>
       <w:tr>
         <w:trPr>
@@ -7805,7 +7905,7 @@
         </w:trPr>
         <w:tc>
           <w:tcPr>
-            <w:tcW w:type="dxa" w:w="7056"/>
+            <w:tcW w:type="dxa" w:w="7920"/>
             <w:vAlign w:val="top"/>
           </w:tcPr>
           <w:p>
@@ -7823,7 +7923,7 @@
         </w:tc>
         <w:tc>
           <w:tcPr>
-            <w:tcW w:type="dxa" w:w="2880"/>
+            <w:tcW w:type="dxa" w:w="2304"/>
             <w:vAlign w:val="top"/>
           </w:tcPr>
           <w:p>
@@ -7847,7 +7947,7 @@
       </w:pPr>
       <w:r>
         <w:rPr>
-          <w:sz w:val="12"/>
+          <w:sz w:val="6"/>
         </w:rPr>
       </w:r>
     </w:p>
@@ -7864,10 +7964,12 @@
           <w:insideH w:val="none"/>
           <w:insideV w:val="none"/>
         </w:tblBorders>
+        <w:tblLayout w:type="fixed"/>
+        <w:tblW w:w="10224" w:type="dxa"/>
       </w:tblPr>
       <w:tblGrid>
-        <w:gridCol w:w="4896"/>
-        <w:gridCol w:w="4896"/>
+        <w:gridCol w:w="7920"/>
+        <w:gridCol w:w="2304"/>
       </w:tblGrid>
       <w:tr>
         <w:trPr>
@@ -7875,7 +7977,7 @@
         </w:trPr>
         <w:tc>
           <w:tcPr>
-            <w:tcW w:type="dxa" w:w="7056"/>
+            <w:tcW w:type="dxa" w:w="7920"/>
             <w:vAlign w:val="top"/>
           </w:tcPr>
           <w:p>
@@ -7893,7 +7995,7 @@
         </w:tc>
         <w:tc>
           <w:tcPr>
-            <w:tcW w:type="dxa" w:w="2880"/>
+            <w:tcW w:type="dxa" w:w="2304"/>
             <w:vAlign w:val="top"/>
           </w:tcPr>
           <w:p>
@@ -7917,7 +8019,7 @@
       </w:pPr>
       <w:r>
         <w:rPr>
-          <w:sz w:val="12"/>
+          <w:sz w:val="6"/>
         </w:rPr>
       </w:r>
     </w:p>
@@ -7947,10 +8049,12 @@
           <w:insideH w:val="none"/>
           <w:insideV w:val="none"/>
         </w:tblBorders>
+        <w:tblLayout w:type="fixed"/>
+        <w:tblW w:w="10224" w:type="dxa"/>
       </w:tblPr>
       <w:tblGrid>
-        <w:gridCol w:w="4896"/>
-        <w:gridCol w:w="4896"/>
+        <w:gridCol w:w="7920"/>
+        <w:gridCol w:w="2304"/>
       </w:tblGrid>
       <w:tr>
         <w:trPr>
@@ -7958,7 +8062,7 @@
         </w:trPr>
         <w:tc>
           <w:tcPr>
-            <w:tcW w:type="dxa" w:w="7056"/>
+            <w:tcW w:type="dxa" w:w="7920"/>
             <w:vAlign w:val="top"/>
           </w:tcPr>
           <w:p>
@@ -7976,7 +8080,7 @@
         </w:tc>
         <w:tc>
           <w:tcPr>
-            <w:tcW w:type="dxa" w:w="2880"/>
+            <w:tcW w:type="dxa" w:w="2304"/>
             <w:vAlign w:val="top"/>
           </w:tcPr>
           <w:p>
@@ -8000,7 +8104,7 @@
       </w:pPr>
       <w:r>
         <w:rPr>
-          <w:sz w:val="12"/>
+          <w:sz w:val="6"/>
         </w:rPr>
       </w:r>
     </w:p>
@@ -8017,10 +8121,12 @@
           <w:insideH w:val="none"/>
           <w:insideV w:val="none"/>
         </w:tblBorders>
+        <w:tblLayout w:type="fixed"/>
+        <w:tblW w:w="10224" w:type="dxa"/>
       </w:tblPr>
       <w:tblGrid>
-        <w:gridCol w:w="4896"/>
-        <w:gridCol w:w="4896"/>
+        <w:gridCol w:w="7920"/>
+        <w:gridCol w:w="2304"/>
       </w:tblGrid>
       <w:tr>
         <w:trPr>
@@ -8028,7 +8134,7 @@
         </w:trPr>
         <w:tc>
           <w:tcPr>
-            <w:tcW w:type="dxa" w:w="7056"/>
+            <w:tcW w:type="dxa" w:w="7920"/>
             <w:vAlign w:val="top"/>
           </w:tcPr>
           <w:p>
@@ -8046,7 +8152,7 @@
         </w:tc>
         <w:tc>
           <w:tcPr>
-            <w:tcW w:type="dxa" w:w="2880"/>
+            <w:tcW w:type="dxa" w:w="2304"/>
             <w:vAlign w:val="top"/>
           </w:tcPr>
           <w:p>
@@ -8070,7 +8176,7 @@
       </w:pPr>
       <w:r>
         <w:rPr>
-          <w:sz w:val="12"/>
+          <w:sz w:val="6"/>
         </w:rPr>
       </w:r>
     </w:p>
@@ -8100,10 +8206,12 @@
           <w:insideH w:val="none"/>
           <w:insideV w:val="none"/>
         </w:tblBorders>
+        <w:tblLayout w:type="fixed"/>
+        <w:tblW w:w="10224" w:type="dxa"/>
       </w:tblPr>
       <w:tblGrid>
-        <w:gridCol w:w="4896"/>
-        <w:gridCol w:w="4896"/>
+        <w:gridCol w:w="7920"/>
+        <w:gridCol w:w="2304"/>
       </w:tblGrid>
       <w:tr>
         <w:trPr>
@@ -8111,7 +8219,7 @@
         </w:trPr>
         <w:tc>
           <w:tcPr>
-            <w:tcW w:type="dxa" w:w="7056"/>
+            <w:tcW w:type="dxa" w:w="7920"/>
             <w:vAlign w:val="top"/>
           </w:tcPr>
           <w:p>
@@ -8141,7 +8249,7 @@
         </w:tc>
         <w:tc>
           <w:tcPr>
-            <w:tcW w:type="dxa" w:w="2880"/>
+            <w:tcW w:type="dxa" w:w="2304"/>
             <w:vAlign w:val="top"/>
           </w:tcPr>
           <w:p>
@@ -8165,7 +8273,7 @@
       </w:pPr>
       <w:r>
         <w:rPr>
-          <w:sz w:val="12"/>
+          <w:sz w:val="6"/>
         </w:rPr>
       </w:r>
     </w:p>
@@ -8182,10 +8290,12 @@
           <w:insideH w:val="none"/>
           <w:insideV w:val="none"/>
         </w:tblBorders>
+        <w:tblLayout w:type="fixed"/>
+        <w:tblW w:w="10224" w:type="dxa"/>
       </w:tblPr>
       <w:tblGrid>
-        <w:gridCol w:w="4896"/>
-        <w:gridCol w:w="4896"/>
+        <w:gridCol w:w="7920"/>
+        <w:gridCol w:w="2304"/>
       </w:tblGrid>
       <w:tr>
         <w:trPr>
@@ -8193,7 +8303,7 @@
         </w:trPr>
         <w:tc>
           <w:tcPr>
-            <w:tcW w:type="dxa" w:w="7056"/>
+            <w:tcW w:type="dxa" w:w="7920"/>
             <w:vAlign w:val="top"/>
           </w:tcPr>
           <w:p>
@@ -8223,7 +8333,7 @@
         </w:tc>
         <w:tc>
           <w:tcPr>
-            <w:tcW w:type="dxa" w:w="2880"/>
+            <w:tcW w:type="dxa" w:w="2304"/>
             <w:vAlign w:val="top"/>
           </w:tcPr>
           <w:p>
@@ -8247,7 +8357,7 @@
       </w:pPr>
       <w:r>
         <w:rPr>
-          <w:sz w:val="12"/>
+          <w:sz w:val="6"/>
         </w:rPr>
       </w:r>
     </w:p>
@@ -8264,10 +8374,12 @@
           <w:insideH w:val="none"/>
           <w:insideV w:val="none"/>
         </w:tblBorders>
+        <w:tblLayout w:type="fixed"/>
+        <w:tblW w:w="10224" w:type="dxa"/>
       </w:tblPr>
       <w:tblGrid>
-        <w:gridCol w:w="4896"/>
-        <w:gridCol w:w="4896"/>
+        <w:gridCol w:w="7920"/>
+        <w:gridCol w:w="2304"/>
       </w:tblGrid>
       <w:tr>
         <w:trPr>
@@ -8275,7 +8387,7 @@
         </w:trPr>
         <w:tc>
           <w:tcPr>
-            <w:tcW w:type="dxa" w:w="7056"/>
+            <w:tcW w:type="dxa" w:w="7920"/>
             <w:vAlign w:val="top"/>
           </w:tcPr>
           <w:p>
@@ -8305,7 +8417,7 @@
         </w:tc>
         <w:tc>
           <w:tcPr>
-            <w:tcW w:type="dxa" w:w="2880"/>
+            <w:tcW w:type="dxa" w:w="2304"/>
             <w:vAlign w:val="top"/>
           </w:tcPr>
           <w:p>
@@ -8329,7 +8441,7 @@
       </w:pPr>
       <w:r>
         <w:rPr>
-          <w:sz w:val="12"/>
+          <w:sz w:val="6"/>
         </w:rPr>
       </w:r>
     </w:p>
@@ -8346,10 +8458,12 @@
           <w:insideH w:val="none"/>
           <w:insideV w:val="none"/>
         </w:tblBorders>
+        <w:tblLayout w:type="fixed"/>
+        <w:tblW w:w="10224" w:type="dxa"/>
       </w:tblPr>
       <w:tblGrid>
-        <w:gridCol w:w="4896"/>
-        <w:gridCol w:w="4896"/>
+        <w:gridCol w:w="7920"/>
+        <w:gridCol w:w="2304"/>
       </w:tblGrid>
       <w:tr>
         <w:trPr>
@@ -8357,7 +8471,7 @@
         </w:trPr>
         <w:tc>
           <w:tcPr>
-            <w:tcW w:type="dxa" w:w="7056"/>
+            <w:tcW w:type="dxa" w:w="7920"/>
             <w:vAlign w:val="top"/>
           </w:tcPr>
           <w:p>
@@ -8387,7 +8501,7 @@
         </w:tc>
         <w:tc>
           <w:tcPr>
-            <w:tcW w:type="dxa" w:w="2880"/>
+            <w:tcW w:type="dxa" w:w="2304"/>
             <w:vAlign w:val="top"/>
           </w:tcPr>
           <w:p>
@@ -8411,7 +8525,7 @@
       </w:pPr>
       <w:r>
         <w:rPr>
-          <w:sz w:val="12"/>
+          <w:sz w:val="6"/>
         </w:rPr>
       </w:r>
     </w:p>
@@ -8428,10 +8542,12 @@
           <w:insideH w:val="none"/>
           <w:insideV w:val="none"/>
         </w:tblBorders>
+        <w:tblLayout w:type="fixed"/>
+        <w:tblW w:w="10224" w:type="dxa"/>
       </w:tblPr>
       <w:tblGrid>
-        <w:gridCol w:w="4896"/>
-        <w:gridCol w:w="4896"/>
+        <w:gridCol w:w="7920"/>
+        <w:gridCol w:w="2304"/>
       </w:tblGrid>
       <w:tr>
         <w:trPr>
@@ -8439,7 +8555,7 @@
         </w:trPr>
         <w:tc>
           <w:tcPr>
-            <w:tcW w:type="dxa" w:w="7056"/>
+            <w:tcW w:type="dxa" w:w="7920"/>
             <w:vAlign w:val="top"/>
           </w:tcPr>
           <w:p>
@@ -8469,7 +8585,7 @@
         </w:tc>
         <w:tc>
           <w:tcPr>
-            <w:tcW w:type="dxa" w:w="2880"/>
+            <w:tcW w:type="dxa" w:w="2304"/>
             <w:vAlign w:val="top"/>
           </w:tcPr>
           <w:p>
@@ -8493,7 +8609,7 @@
       </w:pPr>
       <w:r>
         <w:rPr>
-          <w:sz w:val="12"/>
+          <w:sz w:val="6"/>
         </w:rPr>
       </w:r>
     </w:p>
@@ -8523,10 +8639,12 @@
           <w:insideH w:val="none"/>
           <w:insideV w:val="none"/>
         </w:tblBorders>
+        <w:tblLayout w:type="fixed"/>
+        <w:tblW w:w="10224" w:type="dxa"/>
       </w:tblPr>
       <w:tblGrid>
-        <w:gridCol w:w="4896"/>
-        <w:gridCol w:w="4896"/>
+        <w:gridCol w:w="7920"/>
+        <w:gridCol w:w="2304"/>
       </w:tblGrid>
       <w:tr>
         <w:trPr>
@@ -8534,7 +8652,7 @@
         </w:trPr>
         <w:tc>
           <w:tcPr>
-            <w:tcW w:type="dxa" w:w="7056"/>
+            <w:tcW w:type="dxa" w:w="7920"/>
             <w:vAlign w:val="top"/>
           </w:tcPr>
           <w:p>
@@ -8552,7 +8670,7 @@
         </w:tc>
         <w:tc>
           <w:tcPr>
-            <w:tcW w:type="dxa" w:w="2880"/>
+            <w:tcW w:type="dxa" w:w="2304"/>
             <w:vAlign w:val="top"/>
           </w:tcPr>
           <w:p>
@@ -8576,7 +8694,7 @@
       </w:pPr>
       <w:r>
         <w:rPr>
-          <w:sz w:val="12"/>
+          <w:sz w:val="6"/>
         </w:rPr>
       </w:r>
     </w:p>
@@ -8593,10 +8711,12 @@
           <w:insideH w:val="none"/>
           <w:insideV w:val="none"/>
         </w:tblBorders>
+        <w:tblLayout w:type="fixed"/>
+        <w:tblW w:w="10224" w:type="dxa"/>
       </w:tblPr>
       <w:tblGrid>
-        <w:gridCol w:w="4896"/>
-        <w:gridCol w:w="4896"/>
+        <w:gridCol w:w="7920"/>
+        <w:gridCol w:w="2304"/>
       </w:tblGrid>
       <w:tr>
         <w:trPr>
@@ -8604,7 +8724,7 @@
         </w:trPr>
         <w:tc>
           <w:tcPr>
-            <w:tcW w:type="dxa" w:w="7056"/>
+            <w:tcW w:type="dxa" w:w="7920"/>
             <w:vAlign w:val="top"/>
           </w:tcPr>
           <w:p>
@@ -8622,7 +8742,7 @@
         </w:tc>
         <w:tc>
           <w:tcPr>
-            <w:tcW w:type="dxa" w:w="2880"/>
+            <w:tcW w:type="dxa" w:w="2304"/>
             <w:vAlign w:val="top"/>
           </w:tcPr>
           <w:p>
@@ -8646,7 +8766,7 @@
       </w:pPr>
       <w:r>
         <w:rPr>
-          <w:sz w:val="12"/>
+          <w:sz w:val="6"/>
         </w:rPr>
       </w:r>
     </w:p>
@@ -8663,10 +8783,12 @@
           <w:insideH w:val="none"/>
           <w:insideV w:val="none"/>
         </w:tblBorders>
+        <w:tblLayout w:type="fixed"/>
+        <w:tblW w:w="10224" w:type="dxa"/>
       </w:tblPr>
       <w:tblGrid>
-        <w:gridCol w:w="4896"/>
-        <w:gridCol w:w="4896"/>
+        <w:gridCol w:w="7920"/>
+        <w:gridCol w:w="2304"/>
       </w:tblGrid>
       <w:tr>
         <w:trPr>
@@ -8674,7 +8796,7 @@
         </w:trPr>
         <w:tc>
           <w:tcPr>
-            <w:tcW w:type="dxa" w:w="7056"/>
+            <w:tcW w:type="dxa" w:w="7920"/>
             <w:vAlign w:val="top"/>
           </w:tcPr>
           <w:p>
@@ -8692,7 +8814,7 @@
         </w:tc>
         <w:tc>
           <w:tcPr>
-            <w:tcW w:type="dxa" w:w="2880"/>
+            <w:tcW w:type="dxa" w:w="2304"/>
             <w:vAlign w:val="top"/>
           </w:tcPr>
           <w:p>
@@ -8716,7 +8838,7 @@
       </w:pPr>
       <w:r>
         <w:rPr>
-          <w:sz w:val="12"/>
+          <w:sz w:val="6"/>
         </w:rPr>
       </w:r>
     </w:p>
@@ -8733,10 +8855,12 @@
           <w:insideH w:val="none"/>
           <w:insideV w:val="none"/>
         </w:tblBorders>
+        <w:tblLayout w:type="fixed"/>
+        <w:tblW w:w="10224" w:type="dxa"/>
       </w:tblPr>
       <w:tblGrid>
-        <w:gridCol w:w="4896"/>
-        <w:gridCol w:w="4896"/>
+        <w:gridCol w:w="7920"/>
+        <w:gridCol w:w="2304"/>
       </w:tblGrid>
       <w:tr>
         <w:trPr>
@@ -8744,7 +8868,7 @@
         </w:trPr>
         <w:tc>
           <w:tcPr>
-            <w:tcW w:type="dxa" w:w="7056"/>
+            <w:tcW w:type="dxa" w:w="7920"/>
             <w:vAlign w:val="top"/>
           </w:tcPr>
           <w:p>
@@ -8762,7 +8886,7 @@
         </w:tc>
         <w:tc>
           <w:tcPr>
-            <w:tcW w:type="dxa" w:w="2880"/>
+            <w:tcW w:type="dxa" w:w="2304"/>
             <w:vAlign w:val="top"/>
           </w:tcPr>
           <w:p>
@@ -8786,7 +8910,7 @@
       </w:pPr>
       <w:r>
         <w:rPr>
-          <w:sz w:val="12"/>
+          <w:sz w:val="6"/>
         </w:rPr>
       </w:r>
     </w:p>
@@ -8803,10 +8927,12 @@
           <w:insideH w:val="none"/>
           <w:insideV w:val="none"/>
         </w:tblBorders>
+        <w:tblLayout w:type="fixed"/>
+        <w:tblW w:w="10224" w:type="dxa"/>
       </w:tblPr>
       <w:tblGrid>
-        <w:gridCol w:w="4896"/>
-        <w:gridCol w:w="4896"/>
+        <w:gridCol w:w="7920"/>
+        <w:gridCol w:w="2304"/>
       </w:tblGrid>
       <w:tr>
         <w:trPr>
@@ -8814,7 +8940,7 @@
         </w:trPr>
         <w:tc>
           <w:tcPr>
-            <w:tcW w:type="dxa" w:w="7056"/>
+            <w:tcW w:type="dxa" w:w="7920"/>
             <w:vAlign w:val="top"/>
           </w:tcPr>
           <w:p>
@@ -8832,7 +8958,7 @@
         </w:tc>
         <w:tc>
           <w:tcPr>
-            <w:tcW w:type="dxa" w:w="2880"/>
+            <w:tcW w:type="dxa" w:w="2304"/>
             <w:vAlign w:val="top"/>
           </w:tcPr>
           <w:p>
@@ -8856,7 +8982,7 @@
       </w:pPr>
       <w:r>
         <w:rPr>
-          <w:sz w:val="12"/>
+          <w:sz w:val="6"/>
         </w:rPr>
       </w:r>
     </w:p>
@@ -8906,7 +9032,7 @@
     <w:p>
       <w:pPr>
         <w:keepNext/>
-        <w:spacing w:before="240" w:after="80"/>
+        <w:spacing w:before="160" w:after="60"/>
         <w:pBdr>
           <w:bottom w:val="single" w:sz="6" w:space="1" w:color="000000"/>
         </w:pBdr>
@@ -8947,10 +9073,12 @@
           <w:insideH w:val="none"/>
           <w:insideV w:val="none"/>
         </w:tblBorders>
+        <w:tblLayout w:type="fixed"/>
+        <w:tblW w:w="10224" w:type="dxa"/>
       </w:tblPr>
       <w:tblGrid>
-        <w:gridCol w:w="4896"/>
-        <w:gridCol w:w="4896"/>
+        <w:gridCol w:w="7920"/>
+        <w:gridCol w:w="2304"/>
       </w:tblGrid>
       <w:tr>
         <w:trPr>
@@ -8958,7 +9086,7 @@
         </w:trPr>
         <w:tc>
           <w:tcPr>
-            <w:tcW w:type="dxa" w:w="7056"/>
+            <w:tcW w:type="dxa" w:w="7920"/>
             <w:vAlign w:val="top"/>
           </w:tcPr>
           <w:p>
@@ -8988,7 +9116,7 @@
         </w:tc>
         <w:tc>
           <w:tcPr>
-            <w:tcW w:type="dxa" w:w="2880"/>
+            <w:tcW w:type="dxa" w:w="2304"/>
             <w:vAlign w:val="top"/>
           </w:tcPr>
           <w:p>
@@ -9025,7 +9153,7 @@
       </w:pPr>
       <w:r>
         <w:rPr>
-          <w:sz w:val="12"/>
+          <w:sz w:val="6"/>
         </w:rPr>
       </w:r>
     </w:p>
@@ -9042,10 +9170,12 @@
           <w:insideH w:val="none"/>
           <w:insideV w:val="none"/>
         </w:tblBorders>
+        <w:tblLayout w:type="fixed"/>
+        <w:tblW w:w="10224" w:type="dxa"/>
       </w:tblPr>
       <w:tblGrid>
-        <w:gridCol w:w="4896"/>
-        <w:gridCol w:w="4896"/>
+        <w:gridCol w:w="7920"/>
+        <w:gridCol w:w="2304"/>
       </w:tblGrid>
       <w:tr>
         <w:trPr>
@@ -9053,7 +9183,7 @@
         </w:trPr>
         <w:tc>
           <w:tcPr>
-            <w:tcW w:type="dxa" w:w="7056"/>
+            <w:tcW w:type="dxa" w:w="7920"/>
             <w:vAlign w:val="top"/>
           </w:tcPr>
           <w:p>
@@ -9083,7 +9213,7 @@
         </w:tc>
         <w:tc>
           <w:tcPr>
-            <w:tcW w:type="dxa" w:w="2880"/>
+            <w:tcW w:type="dxa" w:w="2304"/>
             <w:vAlign w:val="top"/>
           </w:tcPr>
           <w:p>
@@ -9120,7 +9250,7 @@
       </w:pPr>
       <w:r>
         <w:rPr>
-          <w:sz w:val="12"/>
+          <w:sz w:val="6"/>
         </w:rPr>
       </w:r>
     </w:p>
@@ -9137,10 +9267,12 @@
           <w:insideH w:val="none"/>
           <w:insideV w:val="none"/>
         </w:tblBorders>
+        <w:tblLayout w:type="fixed"/>
+        <w:tblW w:w="10224" w:type="dxa"/>
       </w:tblPr>
       <w:tblGrid>
-        <w:gridCol w:w="4896"/>
-        <w:gridCol w:w="4896"/>
+        <w:gridCol w:w="7920"/>
+        <w:gridCol w:w="2304"/>
       </w:tblGrid>
       <w:tr>
         <w:trPr>
@@ -9148,7 +9280,7 @@
         </w:trPr>
         <w:tc>
           <w:tcPr>
-            <w:tcW w:type="dxa" w:w="7056"/>
+            <w:tcW w:type="dxa" w:w="7920"/>
             <w:vAlign w:val="top"/>
           </w:tcPr>
           <w:p>
@@ -9178,7 +9310,7 @@
         </w:tc>
         <w:tc>
           <w:tcPr>
-            <w:tcW w:type="dxa" w:w="2880"/>
+            <w:tcW w:type="dxa" w:w="2304"/>
             <w:vAlign w:val="top"/>
           </w:tcPr>
           <w:p>
@@ -9215,7 +9347,7 @@
       </w:pPr>
       <w:r>
         <w:rPr>
-          <w:sz w:val="12"/>
+          <w:sz w:val="6"/>
         </w:rPr>
       </w:r>
     </w:p>
@@ -9232,10 +9364,12 @@
           <w:insideH w:val="none"/>
           <w:insideV w:val="none"/>
         </w:tblBorders>
+        <w:tblLayout w:type="fixed"/>
+        <w:tblW w:w="10224" w:type="dxa"/>
       </w:tblPr>
       <w:tblGrid>
-        <w:gridCol w:w="4896"/>
-        <w:gridCol w:w="4896"/>
+        <w:gridCol w:w="7920"/>
+        <w:gridCol w:w="2304"/>
       </w:tblGrid>
       <w:tr>
         <w:trPr>
@@ -9243,7 +9377,7 @@
         </w:trPr>
         <w:tc>
           <w:tcPr>
-            <w:tcW w:type="dxa" w:w="7056"/>
+            <w:tcW w:type="dxa" w:w="7920"/>
             <w:vAlign w:val="top"/>
           </w:tcPr>
           <w:p>
@@ -9273,7 +9407,7 @@
         </w:tc>
         <w:tc>
           <w:tcPr>
-            <w:tcW w:type="dxa" w:w="2880"/>
+            <w:tcW w:type="dxa" w:w="2304"/>
             <w:vAlign w:val="top"/>
           </w:tcPr>
           <w:p>
@@ -9310,7 +9444,7 @@
       </w:pPr>
       <w:r>
         <w:rPr>
-          <w:sz w:val="12"/>
+          <w:sz w:val="6"/>
         </w:rPr>
       </w:r>
     </w:p>
@@ -9327,10 +9461,12 @@
           <w:insideH w:val="none"/>
           <w:insideV w:val="none"/>
         </w:tblBorders>
+        <w:tblLayout w:type="fixed"/>
+        <w:tblW w:w="10224" w:type="dxa"/>
       </w:tblPr>
       <w:tblGrid>
-        <w:gridCol w:w="4896"/>
-        <w:gridCol w:w="4896"/>
+        <w:gridCol w:w="7920"/>
+        <w:gridCol w:w="2304"/>
       </w:tblGrid>
       <w:tr>
         <w:trPr>
@@ -9338,7 +9474,7 @@
         </w:trPr>
         <w:tc>
           <w:tcPr>
-            <w:tcW w:type="dxa" w:w="7056"/>
+            <w:tcW w:type="dxa" w:w="7920"/>
             <w:vAlign w:val="top"/>
           </w:tcPr>
           <w:p>
@@ -9368,7 +9504,7 @@
         </w:tc>
         <w:tc>
           <w:tcPr>
-            <w:tcW w:type="dxa" w:w="2880"/>
+            <w:tcW w:type="dxa" w:w="2304"/>
             <w:vAlign w:val="top"/>
           </w:tcPr>
           <w:p>
@@ -9405,7 +9541,7 @@
       </w:pPr>
       <w:r>
         <w:rPr>
-          <w:sz w:val="12"/>
+          <w:sz w:val="6"/>
         </w:rPr>
       </w:r>
     </w:p>
@@ -9422,10 +9558,12 @@
           <w:insideH w:val="none"/>
           <w:insideV w:val="none"/>
         </w:tblBorders>
+        <w:tblLayout w:type="fixed"/>
+        <w:tblW w:w="10224" w:type="dxa"/>
       </w:tblPr>
       <w:tblGrid>
-        <w:gridCol w:w="4896"/>
-        <w:gridCol w:w="4896"/>
+        <w:gridCol w:w="7920"/>
+        <w:gridCol w:w="2304"/>
       </w:tblGrid>
       <w:tr>
         <w:trPr>
@@ -9433,7 +9571,7 @@
         </w:trPr>
         <w:tc>
           <w:tcPr>
-            <w:tcW w:type="dxa" w:w="7056"/>
+            <w:tcW w:type="dxa" w:w="7920"/>
             <w:vAlign w:val="top"/>
           </w:tcPr>
           <w:p>
@@ -9463,7 +9601,7 @@
         </w:tc>
         <w:tc>
           <w:tcPr>
-            <w:tcW w:type="dxa" w:w="2880"/>
+            <w:tcW w:type="dxa" w:w="2304"/>
             <w:vAlign w:val="top"/>
           </w:tcPr>
           <w:p>
@@ -9500,7 +9638,7 @@
       </w:pPr>
       <w:r>
         <w:rPr>
-          <w:sz w:val="12"/>
+          <w:sz w:val="6"/>
         </w:rPr>
       </w:r>
     </w:p>
@@ -9517,10 +9655,12 @@
           <w:insideH w:val="none"/>
           <w:insideV w:val="none"/>
         </w:tblBorders>
+        <w:tblLayout w:type="fixed"/>
+        <w:tblW w:w="10224" w:type="dxa"/>
       </w:tblPr>
       <w:tblGrid>
-        <w:gridCol w:w="4896"/>
-        <w:gridCol w:w="4896"/>
+        <w:gridCol w:w="7920"/>
+        <w:gridCol w:w="2304"/>
       </w:tblGrid>
       <w:tr>
         <w:trPr>
@@ -9528,7 +9668,7 @@
         </w:trPr>
         <w:tc>
           <w:tcPr>
-            <w:tcW w:type="dxa" w:w="7056"/>
+            <w:tcW w:type="dxa" w:w="7920"/>
             <w:vAlign w:val="top"/>
           </w:tcPr>
           <w:p>
@@ -9558,7 +9698,7 @@
         </w:tc>
         <w:tc>
           <w:tcPr>
-            <w:tcW w:type="dxa" w:w="2880"/>
+            <w:tcW w:type="dxa" w:w="2304"/>
             <w:vAlign w:val="top"/>
           </w:tcPr>
           <w:p>
@@ -9595,7 +9735,7 @@
       </w:pPr>
       <w:r>
         <w:rPr>
-          <w:sz w:val="12"/>
+          <w:sz w:val="6"/>
         </w:rPr>
       </w:r>
     </w:p>
@@ -9612,10 +9752,12 @@
           <w:insideH w:val="none"/>
           <w:insideV w:val="none"/>
         </w:tblBorders>
+        <w:tblLayout w:type="fixed"/>
+        <w:tblW w:w="10224" w:type="dxa"/>
       </w:tblPr>
       <w:tblGrid>
-        <w:gridCol w:w="4896"/>
-        <w:gridCol w:w="4896"/>
+        <w:gridCol w:w="7920"/>
+        <w:gridCol w:w="2304"/>
       </w:tblGrid>
       <w:tr>
         <w:trPr>
@@ -9623,7 +9765,7 @@
         </w:trPr>
         <w:tc>
           <w:tcPr>
-            <w:tcW w:type="dxa" w:w="7056"/>
+            <w:tcW w:type="dxa" w:w="7920"/>
             <w:vAlign w:val="top"/>
           </w:tcPr>
           <w:p>
@@ -9653,7 +9795,7 @@
         </w:tc>
         <w:tc>
           <w:tcPr>
-            <w:tcW w:type="dxa" w:w="2880"/>
+            <w:tcW w:type="dxa" w:w="2304"/>
             <w:vAlign w:val="top"/>
           </w:tcPr>
           <w:p>
@@ -9690,7 +9832,7 @@
       </w:pPr>
       <w:r>
         <w:rPr>
-          <w:sz w:val="12"/>
+          <w:sz w:val="6"/>
         </w:rPr>
       </w:r>
     </w:p>
@@ -9707,10 +9849,12 @@
           <w:insideH w:val="none"/>
           <w:insideV w:val="none"/>
         </w:tblBorders>
+        <w:tblLayout w:type="fixed"/>
+        <w:tblW w:w="10224" w:type="dxa"/>
       </w:tblPr>
       <w:tblGrid>
-        <w:gridCol w:w="4896"/>
-        <w:gridCol w:w="4896"/>
+        <w:gridCol w:w="7920"/>
+        <w:gridCol w:w="2304"/>
       </w:tblGrid>
       <w:tr>
         <w:trPr>
@@ -9718,7 +9862,7 @@
         </w:trPr>
         <w:tc>
           <w:tcPr>
-            <w:tcW w:type="dxa" w:w="7056"/>
+            <w:tcW w:type="dxa" w:w="7920"/>
             <w:vAlign w:val="top"/>
           </w:tcPr>
           <w:p>
@@ -9748,7 +9892,7 @@
         </w:tc>
         <w:tc>
           <w:tcPr>
-            <w:tcW w:type="dxa" w:w="2880"/>
+            <w:tcW w:type="dxa" w:w="2304"/>
             <w:vAlign w:val="top"/>
           </w:tcPr>
           <w:p>
@@ -9785,7 +9929,7 @@
       </w:pPr>
       <w:r>
         <w:rPr>
-          <w:sz w:val="12"/>
+          <w:sz w:val="6"/>
         </w:rPr>
       </w:r>
     </w:p>
@@ -9802,10 +9946,12 @@
           <w:insideH w:val="none"/>
           <w:insideV w:val="none"/>
         </w:tblBorders>
+        <w:tblLayout w:type="fixed"/>
+        <w:tblW w:w="10224" w:type="dxa"/>
       </w:tblPr>
       <w:tblGrid>
-        <w:gridCol w:w="4896"/>
-        <w:gridCol w:w="4896"/>
+        <w:gridCol w:w="7920"/>
+        <w:gridCol w:w="2304"/>
       </w:tblGrid>
       <w:tr>
         <w:trPr>
@@ -9813,7 +9959,7 @@
         </w:trPr>
         <w:tc>
           <w:tcPr>
-            <w:tcW w:type="dxa" w:w="7056"/>
+            <w:tcW w:type="dxa" w:w="7920"/>
             <w:vAlign w:val="top"/>
           </w:tcPr>
           <w:p>
@@ -9843,7 +9989,7 @@
         </w:tc>
         <w:tc>
           <w:tcPr>
-            <w:tcW w:type="dxa" w:w="2880"/>
+            <w:tcW w:type="dxa" w:w="2304"/>
             <w:vAlign w:val="top"/>
           </w:tcPr>
           <w:p>
@@ -9880,7 +10026,7 @@
       </w:pPr>
       <w:r>
         <w:rPr>
-          <w:sz w:val="12"/>
+          <w:sz w:val="6"/>
         </w:rPr>
       </w:r>
     </w:p>
@@ -9897,10 +10043,12 @@
           <w:insideH w:val="none"/>
           <w:insideV w:val="none"/>
         </w:tblBorders>
+        <w:tblLayout w:type="fixed"/>
+        <w:tblW w:w="10224" w:type="dxa"/>
       </w:tblPr>
       <w:tblGrid>
-        <w:gridCol w:w="4896"/>
-        <w:gridCol w:w="4896"/>
+        <w:gridCol w:w="7920"/>
+        <w:gridCol w:w="2304"/>
       </w:tblGrid>
       <w:tr>
         <w:trPr>
@@ -9908,7 +10056,7 @@
         </w:trPr>
         <w:tc>
           <w:tcPr>
-            <w:tcW w:type="dxa" w:w="7056"/>
+            <w:tcW w:type="dxa" w:w="7920"/>
             <w:vAlign w:val="top"/>
           </w:tcPr>
           <w:p>
@@ -9938,7 +10086,7 @@
         </w:tc>
         <w:tc>
           <w:tcPr>
-            <w:tcW w:type="dxa" w:w="2880"/>
+            <w:tcW w:type="dxa" w:w="2304"/>
             <w:vAlign w:val="top"/>
           </w:tcPr>
           <w:p>
@@ -9975,7 +10123,7 @@
       </w:pPr>
       <w:r>
         <w:rPr>
-          <w:sz w:val="12"/>
+          <w:sz w:val="6"/>
         </w:rPr>
       </w:r>
     </w:p>
@@ -9992,10 +10140,12 @@
           <w:insideH w:val="none"/>
           <w:insideV w:val="none"/>
         </w:tblBorders>
+        <w:tblLayout w:type="fixed"/>
+        <w:tblW w:w="10224" w:type="dxa"/>
       </w:tblPr>
       <w:tblGrid>
-        <w:gridCol w:w="4896"/>
-        <w:gridCol w:w="4896"/>
+        <w:gridCol w:w="7920"/>
+        <w:gridCol w:w="2304"/>
       </w:tblGrid>
       <w:tr>
         <w:trPr>
@@ -10003,7 +10153,7 @@
         </w:trPr>
         <w:tc>
           <w:tcPr>
-            <w:tcW w:type="dxa" w:w="7056"/>
+            <w:tcW w:type="dxa" w:w="7920"/>
             <w:vAlign w:val="top"/>
           </w:tcPr>
           <w:p>
@@ -10033,7 +10183,7 @@
         </w:tc>
         <w:tc>
           <w:tcPr>
-            <w:tcW w:type="dxa" w:w="2880"/>
+            <w:tcW w:type="dxa" w:w="2304"/>
             <w:vAlign w:val="top"/>
           </w:tcPr>
           <w:p>
@@ -10070,7 +10220,7 @@
       </w:pPr>
       <w:r>
         <w:rPr>
-          <w:sz w:val="12"/>
+          <w:sz w:val="6"/>
         </w:rPr>
       </w:r>
     </w:p>
@@ -10087,10 +10237,12 @@
           <w:insideH w:val="none"/>
           <w:insideV w:val="none"/>
         </w:tblBorders>
+        <w:tblLayout w:type="fixed"/>
+        <w:tblW w:w="10224" w:type="dxa"/>
       </w:tblPr>
       <w:tblGrid>
-        <w:gridCol w:w="4896"/>
-        <w:gridCol w:w="4896"/>
+        <w:gridCol w:w="7920"/>
+        <w:gridCol w:w="2304"/>
       </w:tblGrid>
       <w:tr>
         <w:trPr>
@@ -10098,7 +10250,7 @@
         </w:trPr>
         <w:tc>
           <w:tcPr>
-            <w:tcW w:type="dxa" w:w="7056"/>
+            <w:tcW w:type="dxa" w:w="7920"/>
             <w:vAlign w:val="top"/>
           </w:tcPr>
           <w:p>
@@ -10128,7 +10280,7 @@
         </w:tc>
         <w:tc>
           <w:tcPr>
-            <w:tcW w:type="dxa" w:w="2880"/>
+            <w:tcW w:type="dxa" w:w="2304"/>
             <w:vAlign w:val="top"/>
           </w:tcPr>
           <w:p>
@@ -10165,7 +10317,7 @@
       </w:pPr>
       <w:r>
         <w:rPr>
-          <w:sz w:val="12"/>
+          <w:sz w:val="6"/>
         </w:rPr>
       </w:r>
     </w:p>
@@ -10182,10 +10334,12 @@
           <w:insideH w:val="none"/>
           <w:insideV w:val="none"/>
         </w:tblBorders>
+        <w:tblLayout w:type="fixed"/>
+        <w:tblW w:w="10224" w:type="dxa"/>
       </w:tblPr>
       <w:tblGrid>
-        <w:gridCol w:w="4896"/>
-        <w:gridCol w:w="4896"/>
+        <w:gridCol w:w="7920"/>
+        <w:gridCol w:w="2304"/>
       </w:tblGrid>
       <w:tr>
         <w:trPr>
@@ -10193,7 +10347,7 @@
         </w:trPr>
         <w:tc>
           <w:tcPr>
-            <w:tcW w:type="dxa" w:w="7056"/>
+            <w:tcW w:type="dxa" w:w="7920"/>
             <w:vAlign w:val="top"/>
           </w:tcPr>
           <w:p>
@@ -10223,7 +10377,7 @@
         </w:tc>
         <w:tc>
           <w:tcPr>
-            <w:tcW w:type="dxa" w:w="2880"/>
+            <w:tcW w:type="dxa" w:w="2304"/>
             <w:vAlign w:val="top"/>
           </w:tcPr>
           <w:p>
@@ -10260,14 +10414,14 @@
       </w:pPr>
       <w:r>
         <w:rPr>
-          <w:sz w:val="12"/>
+          <w:sz w:val="6"/>
         </w:rPr>
       </w:r>
     </w:p>
     <w:p>
       <w:pPr>
         <w:keepNext/>
-        <w:spacing w:before="240" w:after="80"/>
+        <w:spacing w:before="160" w:after="60"/>
         <w:pBdr>
           <w:bottom w:val="single" w:sz="6" w:space="1" w:color="000000"/>
         </w:pBdr>
@@ -10293,10 +10447,12 @@
           <w:insideH w:val="none"/>
           <w:insideV w:val="none"/>
         </w:tblBorders>
+        <w:tblLayout w:type="fixed"/>
+        <w:tblW w:w="10224" w:type="dxa"/>
       </w:tblPr>
       <w:tblGrid>
-        <w:gridCol w:w="4896"/>
-        <w:gridCol w:w="4896"/>
+        <w:gridCol w:w="7920"/>
+        <w:gridCol w:w="2304"/>
       </w:tblGrid>
       <w:tr>
         <w:trPr>
@@ -10304,7 +10460,7 @@
         </w:trPr>
         <w:tc>
           <w:tcPr>
-            <w:tcW w:type="dxa" w:w="7056"/>
+            <w:tcW w:type="dxa" w:w="7920"/>
             <w:vAlign w:val="top"/>
           </w:tcPr>
           <w:p>
@@ -10322,7 +10478,7 @@
         </w:tc>
         <w:tc>
           <w:tcPr>
-            <w:tcW w:type="dxa" w:w="2880"/>
+            <w:tcW w:type="dxa" w:w="2304"/>
             <w:vAlign w:val="top"/>
           </w:tcPr>
           <w:p>
@@ -10346,7 +10502,7 @@
       </w:pPr>
       <w:r>
         <w:rPr>
-          <w:sz w:val="12"/>
+          <w:sz w:val="6"/>
         </w:rPr>
       </w:r>
     </w:p>
@@ -10363,10 +10519,12 @@
           <w:insideH w:val="none"/>
           <w:insideV w:val="none"/>
         </w:tblBorders>
+        <w:tblLayout w:type="fixed"/>
+        <w:tblW w:w="10224" w:type="dxa"/>
       </w:tblPr>
       <w:tblGrid>
-        <w:gridCol w:w="4896"/>
-        <w:gridCol w:w="4896"/>
+        <w:gridCol w:w="7920"/>
+        <w:gridCol w:w="2304"/>
       </w:tblGrid>
       <w:tr>
         <w:trPr>
@@ -10374,7 +10532,7 @@
         </w:trPr>
         <w:tc>
           <w:tcPr>
-            <w:tcW w:type="dxa" w:w="7056"/>
+            <w:tcW w:type="dxa" w:w="7920"/>
             <w:vAlign w:val="top"/>
           </w:tcPr>
           <w:p>
@@ -10392,7 +10550,7 @@
         </w:tc>
         <w:tc>
           <w:tcPr>
-            <w:tcW w:type="dxa" w:w="2880"/>
+            <w:tcW w:type="dxa" w:w="2304"/>
             <w:vAlign w:val="top"/>
           </w:tcPr>
           <w:p>
@@ -10416,7 +10574,7 @@
       </w:pPr>
       <w:r>
         <w:rPr>
-          <w:sz w:val="12"/>
+          <w:sz w:val="6"/>
         </w:rPr>
       </w:r>
     </w:p>
@@ -10433,10 +10591,12 @@
           <w:insideH w:val="none"/>
           <w:insideV w:val="none"/>
         </w:tblBorders>
+        <w:tblLayout w:type="fixed"/>
+        <w:tblW w:w="10224" w:type="dxa"/>
       </w:tblPr>
       <w:tblGrid>
-        <w:gridCol w:w="4896"/>
-        <w:gridCol w:w="4896"/>
+        <w:gridCol w:w="7920"/>
+        <w:gridCol w:w="2304"/>
       </w:tblGrid>
       <w:tr>
         <w:trPr>
@@ -10444,7 +10604,7 @@
         </w:trPr>
         <w:tc>
           <w:tcPr>
-            <w:tcW w:type="dxa" w:w="7056"/>
+            <w:tcW w:type="dxa" w:w="7920"/>
             <w:vAlign w:val="top"/>
           </w:tcPr>
           <w:p>
@@ -10462,7 +10622,7 @@
         </w:tc>
         <w:tc>
           <w:tcPr>
-            <w:tcW w:type="dxa" w:w="2880"/>
+            <w:tcW w:type="dxa" w:w="2304"/>
             <w:vAlign w:val="top"/>
           </w:tcPr>
           <w:p>
@@ -10486,7 +10646,7 @@
       </w:pPr>
       <w:r>
         <w:rPr>
-          <w:sz w:val="12"/>
+          <w:sz w:val="6"/>
         </w:rPr>
       </w:r>
     </w:p>
@@ -10503,10 +10663,12 @@
           <w:insideH w:val="none"/>
           <w:insideV w:val="none"/>
         </w:tblBorders>
+        <w:tblLayout w:type="fixed"/>
+        <w:tblW w:w="10224" w:type="dxa"/>
       </w:tblPr>
       <w:tblGrid>
-        <w:gridCol w:w="4896"/>
-        <w:gridCol w:w="4896"/>
+        <w:gridCol w:w="7920"/>
+        <w:gridCol w:w="2304"/>
       </w:tblGrid>
       <w:tr>
         <w:trPr>
@@ -10514,7 +10676,7 @@
         </w:trPr>
         <w:tc>
           <w:tcPr>
-            <w:tcW w:type="dxa" w:w="7056"/>
+            <w:tcW w:type="dxa" w:w="7920"/>
             <w:vAlign w:val="top"/>
           </w:tcPr>
           <w:p>
@@ -10532,7 +10694,7 @@
         </w:tc>
         <w:tc>
           <w:tcPr>
-            <w:tcW w:type="dxa" w:w="2880"/>
+            <w:tcW w:type="dxa" w:w="2304"/>
             <w:vAlign w:val="top"/>
           </w:tcPr>
           <w:p>
@@ -10556,7 +10718,7 @@
       </w:pPr>
       <w:r>
         <w:rPr>
-          <w:sz w:val="12"/>
+          <w:sz w:val="6"/>
         </w:rPr>
       </w:r>
     </w:p>
@@ -10573,10 +10735,12 @@
           <w:insideH w:val="none"/>
           <w:insideV w:val="none"/>
         </w:tblBorders>
+        <w:tblLayout w:type="fixed"/>
+        <w:tblW w:w="10224" w:type="dxa"/>
       </w:tblPr>
       <w:tblGrid>
-        <w:gridCol w:w="4896"/>
-        <w:gridCol w:w="4896"/>
+        <w:gridCol w:w="7920"/>
+        <w:gridCol w:w="2304"/>
       </w:tblGrid>
       <w:tr>
         <w:trPr>
@@ -10584,7 +10748,7 @@
         </w:trPr>
         <w:tc>
           <w:tcPr>
-            <w:tcW w:type="dxa" w:w="7056"/>
+            <w:tcW w:type="dxa" w:w="7920"/>
             <w:vAlign w:val="top"/>
           </w:tcPr>
           <w:p>
@@ -10602,7 +10766,7 @@
         </w:tc>
         <w:tc>
           <w:tcPr>
-            <w:tcW w:type="dxa" w:w="2880"/>
+            <w:tcW w:type="dxa" w:w="2304"/>
             <w:vAlign w:val="top"/>
           </w:tcPr>
           <w:p>
@@ -10626,7 +10790,7 @@
       </w:pPr>
       <w:r>
         <w:rPr>
-          <w:sz w:val="12"/>
+          <w:sz w:val="6"/>
         </w:rPr>
       </w:r>
     </w:p>
@@ -10643,10 +10807,12 @@
           <w:insideH w:val="none"/>
           <w:insideV w:val="none"/>
         </w:tblBorders>
+        <w:tblLayout w:type="fixed"/>
+        <w:tblW w:w="10224" w:type="dxa"/>
       </w:tblPr>
       <w:tblGrid>
-        <w:gridCol w:w="4896"/>
-        <w:gridCol w:w="4896"/>
+        <w:gridCol w:w="7920"/>
+        <w:gridCol w:w="2304"/>
       </w:tblGrid>
       <w:tr>
         <w:trPr>
@@ -10654,7 +10820,7 @@
         </w:trPr>
         <w:tc>
           <w:tcPr>
-            <w:tcW w:type="dxa" w:w="7056"/>
+            <w:tcW w:type="dxa" w:w="7920"/>
             <w:vAlign w:val="top"/>
           </w:tcPr>
           <w:p>
@@ -10672,7 +10838,7 @@
         </w:tc>
         <w:tc>
           <w:tcPr>
-            <w:tcW w:type="dxa" w:w="2880"/>
+            <w:tcW w:type="dxa" w:w="2304"/>
             <w:vAlign w:val="top"/>
           </w:tcPr>
           <w:p>
@@ -10696,7 +10862,7 @@
       </w:pPr>
       <w:r>
         <w:rPr>
-          <w:sz w:val="12"/>
+          <w:sz w:val="6"/>
         </w:rPr>
       </w:r>
     </w:p>
@@ -10713,10 +10879,12 @@
           <w:insideH w:val="none"/>
           <w:insideV w:val="none"/>
         </w:tblBorders>
+        <w:tblLayout w:type="fixed"/>
+        <w:tblW w:w="10224" w:type="dxa"/>
       </w:tblPr>
       <w:tblGrid>
-        <w:gridCol w:w="4896"/>
-        <w:gridCol w:w="4896"/>
+        <w:gridCol w:w="7920"/>
+        <w:gridCol w:w="2304"/>
       </w:tblGrid>
       <w:tr>
         <w:trPr>
@@ -10724,7 +10892,7 @@
         </w:trPr>
         <w:tc>
           <w:tcPr>
-            <w:tcW w:type="dxa" w:w="7056"/>
+            <w:tcW w:type="dxa" w:w="7920"/>
             <w:vAlign w:val="top"/>
           </w:tcPr>
           <w:p>
@@ -10742,7 +10910,7 @@
         </w:tc>
         <w:tc>
           <w:tcPr>
-            <w:tcW w:type="dxa" w:w="2880"/>
+            <w:tcW w:type="dxa" w:w="2304"/>
             <w:vAlign w:val="top"/>
           </w:tcPr>
           <w:p>
@@ -10766,7 +10934,7 @@
       </w:pPr>
       <w:r>
         <w:rPr>
-          <w:sz w:val="12"/>
+          <w:sz w:val="6"/>
         </w:rPr>
       </w:r>
     </w:p>
@@ -10783,10 +10951,12 @@
           <w:insideH w:val="none"/>
           <w:insideV w:val="none"/>
         </w:tblBorders>
+        <w:tblLayout w:type="fixed"/>
+        <w:tblW w:w="10224" w:type="dxa"/>
       </w:tblPr>
       <w:tblGrid>
-        <w:gridCol w:w="4896"/>
-        <w:gridCol w:w="4896"/>
+        <w:gridCol w:w="7920"/>
+        <w:gridCol w:w="2304"/>
       </w:tblGrid>
       <w:tr>
         <w:trPr>
@@ -10794,7 +10964,7 @@
         </w:trPr>
         <w:tc>
           <w:tcPr>
-            <w:tcW w:type="dxa" w:w="7056"/>
+            <w:tcW w:type="dxa" w:w="7920"/>
             <w:vAlign w:val="top"/>
           </w:tcPr>
           <w:p>
@@ -10812,7 +10982,7 @@
         </w:tc>
         <w:tc>
           <w:tcPr>
-            <w:tcW w:type="dxa" w:w="2880"/>
+            <w:tcW w:type="dxa" w:w="2304"/>
             <w:vAlign w:val="top"/>
           </w:tcPr>
           <w:p>
@@ -10836,7 +11006,7 @@
       </w:pPr>
       <w:r>
         <w:rPr>
-          <w:sz w:val="12"/>
+          <w:sz w:val="6"/>
         </w:rPr>
       </w:r>
     </w:p>
@@ -10853,10 +11023,12 @@
           <w:insideH w:val="none"/>
           <w:insideV w:val="none"/>
         </w:tblBorders>
+        <w:tblLayout w:type="fixed"/>
+        <w:tblW w:w="10224" w:type="dxa"/>
       </w:tblPr>
       <w:tblGrid>
-        <w:gridCol w:w="4896"/>
-        <w:gridCol w:w="4896"/>
+        <w:gridCol w:w="7920"/>
+        <w:gridCol w:w="2304"/>
       </w:tblGrid>
       <w:tr>
         <w:trPr>
@@ -10864,7 +11036,7 @@
         </w:trPr>
         <w:tc>
           <w:tcPr>
-            <w:tcW w:type="dxa" w:w="7056"/>
+            <w:tcW w:type="dxa" w:w="7920"/>
             <w:vAlign w:val="top"/>
           </w:tcPr>
           <w:p>
@@ -10882,7 +11054,7 @@
         </w:tc>
         <w:tc>
           <w:tcPr>
-            <w:tcW w:type="dxa" w:w="2880"/>
+            <w:tcW w:type="dxa" w:w="2304"/>
             <w:vAlign w:val="top"/>
           </w:tcPr>
           <w:p>
@@ -10906,14 +11078,14 @@
       </w:pPr>
       <w:r>
         <w:rPr>
-          <w:sz w:val="12"/>
+          <w:sz w:val="6"/>
         </w:rPr>
       </w:r>
     </w:p>
     <w:p>
       <w:pPr>
         <w:keepNext/>
-        <w:spacing w:before="240" w:after="80"/>
+        <w:spacing w:before="160" w:after="60"/>
         <w:pBdr>
           <w:bottom w:val="single" w:sz="6" w:space="1" w:color="000000"/>
         </w:pBdr>
@@ -10939,10 +11111,12 @@
           <w:insideH w:val="none"/>
           <w:insideV w:val="none"/>
         </w:tblBorders>
+        <w:tblLayout w:type="fixed"/>
+        <w:tblW w:w="10224" w:type="dxa"/>
       </w:tblPr>
       <w:tblGrid>
-        <w:gridCol w:w="4896"/>
-        <w:gridCol w:w="4896"/>
+        <w:gridCol w:w="7920"/>
+        <w:gridCol w:w="2304"/>
       </w:tblGrid>
       <w:tr>
         <w:trPr>
@@ -10950,7 +11124,7 @@
         </w:trPr>
         <w:tc>
           <w:tcPr>
-            <w:tcW w:type="dxa" w:w="7056"/>
+            <w:tcW w:type="dxa" w:w="7920"/>
             <w:vAlign w:val="top"/>
           </w:tcPr>
           <w:p>
@@ -10968,7 +11142,7 @@
         </w:tc>
         <w:tc>
           <w:tcPr>
-            <w:tcW w:type="dxa" w:w="2880"/>
+            <w:tcW w:type="dxa" w:w="2304"/>
             <w:vAlign w:val="top"/>
           </w:tcPr>
           <w:p>
@@ -10992,7 +11166,7 @@
       </w:pPr>
       <w:r>
         <w:rPr>
-          <w:sz w:val="12"/>
+          <w:sz w:val="6"/>
         </w:rPr>
       </w:r>
     </w:p>
@@ -11009,10 +11183,12 @@
           <w:insideH w:val="none"/>
           <w:insideV w:val="none"/>
         </w:tblBorders>
+        <w:tblLayout w:type="fixed"/>
+        <w:tblW w:w="10224" w:type="dxa"/>
       </w:tblPr>
       <w:tblGrid>
-        <w:gridCol w:w="4896"/>
-        <w:gridCol w:w="4896"/>
+        <w:gridCol w:w="7920"/>
+        <w:gridCol w:w="2304"/>
       </w:tblGrid>
       <w:tr>
         <w:trPr>
@@ -11020,7 +11196,7 @@
         </w:trPr>
         <w:tc>
           <w:tcPr>
-            <w:tcW w:type="dxa" w:w="7056"/>
+            <w:tcW w:type="dxa" w:w="7920"/>
             <w:vAlign w:val="top"/>
           </w:tcPr>
           <w:p>
@@ -11038,7 +11214,7 @@
         </w:tc>
         <w:tc>
           <w:tcPr>
-            <w:tcW w:type="dxa" w:w="2880"/>
+            <w:tcW w:type="dxa" w:w="2304"/>
             <w:vAlign w:val="top"/>
           </w:tcPr>
           <w:p>
@@ -11062,7 +11238,7 @@
       </w:pPr>
       <w:r>
         <w:rPr>
-          <w:sz w:val="12"/>
+          <w:sz w:val="6"/>
         </w:rPr>
       </w:r>
     </w:p>
@@ -11079,10 +11255,12 @@
           <w:insideH w:val="none"/>
           <w:insideV w:val="none"/>
         </w:tblBorders>
+        <w:tblLayout w:type="fixed"/>
+        <w:tblW w:w="10224" w:type="dxa"/>
       </w:tblPr>
       <w:tblGrid>
-        <w:gridCol w:w="4896"/>
-        <w:gridCol w:w="4896"/>
+        <w:gridCol w:w="7920"/>
+        <w:gridCol w:w="2304"/>
       </w:tblGrid>
       <w:tr>
         <w:trPr>
@@ -11090,7 +11268,7 @@
         </w:trPr>
         <w:tc>
           <w:tcPr>
-            <w:tcW w:type="dxa" w:w="7056"/>
+            <w:tcW w:type="dxa" w:w="7920"/>
             <w:vAlign w:val="top"/>
           </w:tcPr>
           <w:p>
@@ -11108,7 +11286,7 @@
         </w:tc>
         <w:tc>
           <w:tcPr>
-            <w:tcW w:type="dxa" w:w="2880"/>
+            <w:tcW w:type="dxa" w:w="2304"/>
             <w:vAlign w:val="top"/>
           </w:tcPr>
           <w:p>
@@ -11132,7 +11310,7 @@
       </w:pPr>
       <w:r>
         <w:rPr>
-          <w:sz w:val="12"/>
+          <w:sz w:val="6"/>
         </w:rPr>
       </w:r>
     </w:p>
@@ -11149,10 +11327,12 @@
           <w:insideH w:val="none"/>
           <w:insideV w:val="none"/>
         </w:tblBorders>
+        <w:tblLayout w:type="fixed"/>
+        <w:tblW w:w="10224" w:type="dxa"/>
       </w:tblPr>
       <w:tblGrid>
-        <w:gridCol w:w="4896"/>
-        <w:gridCol w:w="4896"/>
+        <w:gridCol w:w="7920"/>
+        <w:gridCol w:w="2304"/>
       </w:tblGrid>
       <w:tr>
         <w:trPr>
@@ -11160,7 +11340,7 @@
         </w:trPr>
         <w:tc>
           <w:tcPr>
-            <w:tcW w:type="dxa" w:w="7056"/>
+            <w:tcW w:type="dxa" w:w="7920"/>
             <w:vAlign w:val="top"/>
           </w:tcPr>
           <w:p>
@@ -11178,7 +11358,7 @@
         </w:tc>
         <w:tc>
           <w:tcPr>
-            <w:tcW w:type="dxa" w:w="2880"/>
+            <w:tcW w:type="dxa" w:w="2304"/>
             <w:vAlign w:val="top"/>
           </w:tcPr>
           <w:p>
@@ -11202,14 +11382,14 @@
       </w:pPr>
       <w:r>
         <w:rPr>
-          <w:sz w:val="12"/>
+          <w:sz w:val="6"/>
         </w:rPr>
       </w:r>
     </w:p>
     <w:p>
       <w:pPr>
         <w:keepNext/>
-        <w:spacing w:before="240" w:after="80"/>
+        <w:spacing w:before="160" w:after="60"/>
         <w:pBdr>
           <w:bottom w:val="single" w:sz="6" w:space="1" w:color="000000"/>
         </w:pBdr>
@@ -11329,7 +11509,7 @@
     </w:p>
     <w:sectPr>
       <w:pgSz w:w="12240" w:h="15840"/>
-      <w:pgMar w:top="864" w:right="1224" w:bottom="864" w:left="1224" w:header="720" w:footer="720" w:gutter="0"/>
+      <w:pgMar w:top="864" w:right="1008" w:bottom="864" w:left="1008" w:header="720" w:footer="720" w:gutter="0"/>
       <w:cols w:space="720"/>
       <w:docGrid w:linePitch="360"/>
     </w:sectPr>

</xml_diff>

<commit_message>
Word: put long 4th-field text in the left column (fix ragged right-column wrap)
Entries like Veranstaltungen use field #4 for a long role sentence, which wrapped
into a ragged stack in the narrow right column. Render a long 4th field on the
wide left column (under the role); keep short ones (e.g. euro amounts) right-
aligned under the date.

Co-Authored-By: Claude Opus 4.8 <noreply@anthropic.com>
</commit_message>
<xml_diff>
--- a/Helge_Kminek_Lebenslauf.docx
+++ b/Helge_Kminek_Lebenslauf.docx
@@ -4969,6 +4969,18 @@
               <w:t>Kolloquium der Fachdidaktiken der Goethe-Universität Frankfurt am Main (halbjährlich)</w:t>
             </w:r>
           </w:p>
+          <w:p>
+            <w:pPr>
+              <w:spacing w:before="0" w:after="0"/>
+            </w:pPr>
+            <w:r>
+              <w:rPr>
+                <w:i/>
+                <w:sz w:val="21"/>
+              </w:rPr>
+              <w:t>Organisation, Durchführung, eigener Vortrag</w:t>
+            </w:r>
+          </w:p>
         </w:tc>
         <w:tc>
           <w:tcPr>
@@ -4985,19 +4997,6 @@
                 <w:sz w:val="22"/>
               </w:rPr>
               <w:t>2013–2015, Frankfurt</w:t>
-            </w:r>
-          </w:p>
-          <w:p>
-            <w:pPr>
-              <w:spacing w:before="0" w:after="0"/>
-              <w:jc w:val="right"/>
-            </w:pPr>
-            <w:r>
-              <w:rPr>
-                <w:i/>
-                <w:sz w:val="21"/>
-              </w:rPr>
-              <w:t>Organisation, Durchführung, eigener Vortrag</w:t>
             </w:r>
           </w:p>
         </w:tc>
@@ -5066,6 +5065,18 @@
               <w:t>1.–5. Arbeitstagung für Doktorand_innen und Habilitand_innen der Philosophiedidaktik (jährlich)</w:t>
             </w:r>
           </w:p>
+          <w:p>
+            <w:pPr>
+              <w:spacing w:before="0" w:after="0"/>
+            </w:pPr>
+            <w:r>
+              <w:rPr>
+                <w:i/>
+                <w:sz w:val="21"/>
+              </w:rPr>
+              <w:t>Organisation, Durchführung, eigener Vortrag</w:t>
+            </w:r>
+          </w:p>
         </w:tc>
         <w:tc>
           <w:tcPr>
@@ -5082,19 +5093,6 @@
                 <w:sz w:val="22"/>
               </w:rPr>
               <w:t>2014–2018, Frankfurt</w:t>
-            </w:r>
-          </w:p>
-          <w:p>
-            <w:pPr>
-              <w:spacing w:before="0" w:after="0"/>
-              <w:jc w:val="right"/>
-            </w:pPr>
-            <w:r>
-              <w:rPr>
-                <w:i/>
-                <w:sz w:val="21"/>
-              </w:rPr>
-              <w:t>Organisation, Durchführung, eigener Vortrag</w:t>
             </w:r>
           </w:p>
         </w:tc>
@@ -5163,6 +5161,18 @@
               <w:t>1. Internationale Arbeitstagung der Philosophiedidaktik: Zwischen Präskription und Deskription</w:t>
             </w:r>
           </w:p>
+          <w:p>
+            <w:pPr>
+              <w:spacing w:before="0" w:after="0"/>
+            </w:pPr>
+            <w:r>
+              <w:rPr>
+                <w:i/>
+                <w:sz w:val="21"/>
+              </w:rPr>
+              <w:t>Organisation, Durchführung, eigener Vortrag</w:t>
+            </w:r>
+          </w:p>
         </w:tc>
         <w:tc>
           <w:tcPr>
@@ -5179,19 +5189,6 @@
                 <w:sz w:val="22"/>
               </w:rPr>
               <w:t>Juni 2016</w:t>
-            </w:r>
-          </w:p>
-          <w:p>
-            <w:pPr>
-              <w:spacing w:before="0" w:after="0"/>
-              <w:jc w:val="right"/>
-            </w:pPr>
-            <w:r>
-              <w:rPr>
-                <w:i/>
-                <w:sz w:val="21"/>
-              </w:rPr>
-              <w:t>Organisation, Durchführung, eigener Vortrag</w:t>
             </w:r>
           </w:p>
         </w:tc>
@@ -5357,6 +5354,18 @@
               <w:t>Transnationale Perspektiven auf Schule und Bildung</w:t>
             </w:r>
           </w:p>
+          <w:p>
+            <w:pPr>
+              <w:spacing w:before="0" w:after="0"/>
+            </w:pPr>
+            <w:r>
+              <w:rPr>
+                <w:i/>
+                <w:sz w:val="21"/>
+              </w:rPr>
+              <w:t>Mitglied des Organisationsteams, inkl. Begutachtung der Einreichungen</w:t>
+            </w:r>
+          </w:p>
         </w:tc>
         <w:tc>
           <w:tcPr>
@@ -5373,19 +5382,6 @@
                 <w:sz w:val="22"/>
               </w:rPr>
               <w:t>Sept. 2018</w:t>
-            </w:r>
-          </w:p>
-          <w:p>
-            <w:pPr>
-              <w:spacing w:before="0" w:after="0"/>
-              <w:jc w:val="right"/>
-            </w:pPr>
-            <w:r>
-              <w:rPr>
-                <w:i/>
-                <w:sz w:val="21"/>
-              </w:rPr>
-              <w:t>Mitglied des Organisationsteams, inkl. Begutachtung der Einreichungen</w:t>
             </w:r>
           </w:p>
         </w:tc>
@@ -5454,6 +5450,18 @@
               <w:t>11. Tagung der AG Kasuistik in der Lehrer_innenbildung (SIG der DGfE)</w:t>
             </w:r>
           </w:p>
+          <w:p>
+            <w:pPr>
+              <w:spacing w:before="0" w:after="0"/>
+            </w:pPr>
+            <w:r>
+              <w:rPr>
+                <w:i/>
+                <w:sz w:val="21"/>
+              </w:rPr>
+              <w:t>Mitglied des Organisationsteams, inkl. Begutachtung der Einreichungen</w:t>
+            </w:r>
+          </w:p>
         </w:tc>
         <w:tc>
           <w:tcPr>
@@ -5470,19 +5478,6 @@
                 <w:sz w:val="22"/>
               </w:rPr>
               <w:t>Herbst 2019, Universität Mainz</w:t>
-            </w:r>
-          </w:p>
-          <w:p>
-            <w:pPr>
-              <w:spacing w:before="0" w:after="0"/>
-              <w:jc w:val="right"/>
-            </w:pPr>
-            <w:r>
-              <w:rPr>
-                <w:i/>
-                <w:sz w:val="21"/>
-              </w:rPr>
-              <w:t>Mitglied des Organisationsteams, inkl. Begutachtung der Einreichungen</w:t>
             </w:r>
           </w:p>
         </w:tc>
@@ -5551,6 +5546,18 @@
               <w:t>Planetary Thinking (interdisziplinäre Arbeitsgruppe, Goethe-Universität)</w:t>
             </w:r>
           </w:p>
+          <w:p>
+            <w:pPr>
+              <w:spacing w:before="0" w:after="0"/>
+            </w:pPr>
+            <w:r>
+              <w:rPr>
+                <w:i/>
+                <w:sz w:val="21"/>
+              </w:rPr>
+              <w:t>Mitglied des Organisationsteams, eigener Vortrag (02/2022)</w:t>
+            </w:r>
+          </w:p>
         </w:tc>
         <w:tc>
           <w:tcPr>
@@ -5567,19 +5574,6 @@
                 <w:sz w:val="22"/>
               </w:rPr>
               <w:t>2021–2022</w:t>
-            </w:r>
-          </w:p>
-          <w:p>
-            <w:pPr>
-              <w:spacing w:before="0" w:after="0"/>
-              <w:jc w:val="right"/>
-            </w:pPr>
-            <w:r>
-              <w:rPr>
-                <w:i/>
-                <w:sz w:val="21"/>
-              </w:rPr>
-              <w:t>Mitglied des Organisationsteams, eigener Vortrag (02/2022)</w:t>
             </w:r>
           </w:p>
         </w:tc>
@@ -5648,6 +5642,18 @@
               <w:t>Planetary Boundaries – between Facts and Norms (mit Forschungskolleg Humanwissenschaften, Bad Homburg)</w:t>
             </w:r>
           </w:p>
+          <w:p>
+            <w:pPr>
+              <w:spacing w:before="0" w:after="0"/>
+            </w:pPr>
+            <w:r>
+              <w:rPr>
+                <w:i/>
+                <w:sz w:val="21"/>
+              </w:rPr>
+              <w:t>Mitglied des Organisationsteams</w:t>
+            </w:r>
+          </w:p>
         </w:tc>
         <w:tc>
           <w:tcPr>
@@ -5664,19 +5670,6 @@
                 <w:sz w:val="22"/>
               </w:rPr>
               <w:t>07/2021</w:t>
-            </w:r>
-          </w:p>
-          <w:p>
-            <w:pPr>
-              <w:spacing w:before="0" w:after="0"/>
-              <w:jc w:val="right"/>
-            </w:pPr>
-            <w:r>
-              <w:rPr>
-                <w:i/>
-                <w:sz w:val="21"/>
-              </w:rPr>
-              <w:t>Mitglied des Organisationsteams</w:t>
             </w:r>
           </w:p>
         </w:tc>
@@ -5745,6 +5738,18 @@
               <w:t>„Ökologische, gesellschaftliche und individuelle Umbrüche und ihre Bedeutung für BNE“</w:t>
             </w:r>
           </w:p>
+          <w:p>
+            <w:pPr>
+              <w:spacing w:before="0" w:after="0"/>
+            </w:pPr>
+            <w:r>
+              <w:rPr>
+                <w:i/>
+                <w:sz w:val="21"/>
+              </w:rPr>
+              <w:t>Organisation, Durchführung</w:t>
+            </w:r>
+          </w:p>
         </w:tc>
         <w:tc>
           <w:tcPr>
@@ -5761,19 +5766,6 @@
                 <w:sz w:val="22"/>
               </w:rPr>
               <w:t>Sept. 2022</w:t>
-            </w:r>
-          </w:p>
-          <w:p>
-            <w:pPr>
-              <w:spacing w:before="0" w:after="0"/>
-              <w:jc w:val="right"/>
-            </w:pPr>
-            <w:r>
-              <w:rPr>
-                <w:i/>
-                <w:sz w:val="21"/>
-              </w:rPr>
-              <w:t>Organisation, Durchführung</w:t>
             </w:r>
           </w:p>
         </w:tc>
@@ -5842,6 +5834,18 @@
               <w:t>„Kontroversen und Debatten im Kontext von Bildung für nachhaltige Entwicklung“</w:t>
             </w:r>
           </w:p>
+          <w:p>
+            <w:pPr>
+              <w:spacing w:before="0" w:after="0"/>
+            </w:pPr>
+            <w:r>
+              <w:rPr>
+                <w:i/>
+                <w:sz w:val="21"/>
+              </w:rPr>
+              <w:t>Mitglied des Organisationsteams, inkl. Begutachtung der Einreichungen</w:t>
+            </w:r>
+          </w:p>
         </w:tc>
         <w:tc>
           <w:tcPr>
@@ -5858,19 +5862,6 @@
                 <w:sz w:val="22"/>
               </w:rPr>
               <w:t>Sept. 2023</w:t>
-            </w:r>
-          </w:p>
-          <w:p>
-            <w:pPr>
-              <w:spacing w:before="0" w:after="0"/>
-              <w:jc w:val="right"/>
-            </w:pPr>
-            <w:r>
-              <w:rPr>
-                <w:i/>
-                <w:sz w:val="21"/>
-              </w:rPr>
-              <w:t>Mitglied des Organisationsteams, inkl. Begutachtung der Einreichungen</w:t>
             </w:r>
           </w:p>
         </w:tc>
@@ -5939,6 +5930,18 @@
               <w:t>Areas of tension between education for sustainable development and the increasing differentiation of the field</w:t>
             </w:r>
           </w:p>
+          <w:p>
+            <w:pPr>
+              <w:spacing w:before="0" w:after="0"/>
+            </w:pPr>
+            <w:r>
+              <w:rPr>
+                <w:i/>
+                <w:sz w:val="21"/>
+              </w:rPr>
+              <w:t>Mitglied des Organisationsteams (mit J. Costa, A.-K. Holfelder, J. Hufnagl, M. Osterrieder, A. Scheunpflug, M. Singer-Brodowski, D. Taube)</w:t>
+            </w:r>
+          </w:p>
         </w:tc>
         <w:tc>
           <w:tcPr>
@@ -5955,19 +5958,6 @@
                 <w:sz w:val="22"/>
               </w:rPr>
               <w:t>18.–20.09.2024, Bamberg</w:t>
-            </w:r>
-          </w:p>
-          <w:p>
-            <w:pPr>
-              <w:spacing w:before="0" w:after="0"/>
-              <w:jc w:val="right"/>
-            </w:pPr>
-            <w:r>
-              <w:rPr>
-                <w:i/>
-                <w:sz w:val="21"/>
-              </w:rPr>
-              <w:t>Mitglied des Organisationsteams (mit J. Costa, A.-K. Holfelder, J. Hufnagl, M. Osterrieder, A. Scheunpflug, M. Singer-Brodowski, D. Taube)</w:t>
             </w:r>
           </w:p>
         </w:tc>
@@ -6036,6 +6026,18 @@
               <w:t>DGfE Dialogue Workshop: „Sustainability and planetary futures as a transformation challenge for educational science“</w:t>
             </w:r>
           </w:p>
+          <w:p>
+            <w:pPr>
+              <w:spacing w:before="0" w:after="0"/>
+            </w:pPr>
+            <w:r>
+              <w:rPr>
+                <w:i/>
+                <w:sz w:val="21"/>
+              </w:rPr>
+              <w:t>Mitglied des Organisationsteams (mit J. Costa, M. Singer-Brodowski, Ch. Wulf, U. Stenger, L. Klepacki, N. Grünberger, J. Engel)</w:t>
+            </w:r>
+          </w:p>
         </w:tc>
         <w:tc>
           <w:tcPr>
@@ -6052,19 +6054,6 @@
                 <w:sz w:val="22"/>
               </w:rPr>
               <w:t>14.–15.11.2024, Nürnberg</w:t>
-            </w:r>
-          </w:p>
-          <w:p>
-            <w:pPr>
-              <w:spacing w:before="0" w:after="0"/>
-              <w:jc w:val="right"/>
-            </w:pPr>
-            <w:r>
-              <w:rPr>
-                <w:i/>
-                <w:sz w:val="21"/>
-              </w:rPr>
-              <w:t>Mitglied des Organisationsteams (mit J. Costa, M. Singer-Brodowski, Ch. Wulf, U. Stenger, L. Klepacki, N. Grünberger, J. Engel)</w:t>
             </w:r>
           </w:p>
         </w:tc>
@@ -6133,6 +6122,18 @@
               <w:t>Transnationalization of social and ecological inequalities and their relevance to educational science</w:t>
             </w:r>
           </w:p>
+          <w:p>
+            <w:pPr>
+              <w:spacing w:before="0" w:after="0"/>
+            </w:pPr>
+            <w:r>
+              <w:rPr>
+                <w:i/>
+                <w:sz w:val="21"/>
+              </w:rPr>
+              <w:t>Mitglied des Organisationsteams (mit D. Amirpur, N. Bernhard, J. Costa, A. Dogmus, K. Falkenberg, S. Hartong, R. Nikolai, J. Panagiotopoulou, S. Ress, M. Singer-Brodowski)</w:t>
+            </w:r>
+          </w:p>
         </w:tc>
         <w:tc>
           <w:tcPr>
@@ -6149,19 +6150,6 @@
                 <w:sz w:val="22"/>
               </w:rPr>
               <w:t>20.–21.03.2025, Berlin (TU)</w:t>
-            </w:r>
-          </w:p>
-          <w:p>
-            <w:pPr>
-              <w:spacing w:before="0" w:after="0"/>
-              <w:jc w:val="right"/>
-            </w:pPr>
-            <w:r>
-              <w:rPr>
-                <w:i/>
-                <w:sz w:val="21"/>
-              </w:rPr>
-              <w:t>Mitglied des Organisationsteams (mit D. Amirpur, N. Bernhard, J. Costa, A. Dogmus, K. Falkenberg, S. Hartong, R. Nikolai, J. Panagiotopoulou, S. Ress, M. Singer-Brodowski)</w:t>
             </w:r>
           </w:p>
         </w:tc>
@@ -6230,6 +6218,18 @@
               <w:t>Erziehungswissenschaft und Nachhaltigkeit – Widerstände bearbeiten. Zukünfte gestalten. Auftakttagung der DGfE-AG „Nachhaltigkeit bzw. Nicht-Nachhaltigkeit und planetare Zukünfte“</w:t>
             </w:r>
           </w:p>
+          <w:p>
+            <w:pPr>
+              <w:spacing w:before="0" w:after="0"/>
+            </w:pPr>
+            <w:r>
+              <w:rPr>
+                <w:i/>
+                <w:sz w:val="21"/>
+              </w:rPr>
+              <w:t>Mitglied des Organisationsteams (mit M. Singer-Brodowski, U. Stenger, Ch. Wulf, O. Bilgi, J. Dinkelaker, J. Elven, S. Gaubitz, L. Klepacki, T. Klepacki, S. Ress, O. Sanders)</w:t>
+            </w:r>
+          </w:p>
         </w:tc>
         <w:tc>
           <w:tcPr>
@@ -6246,19 +6246,6 @@
                 <w:sz w:val="22"/>
               </w:rPr>
               <w:t>29.09.–01.10.2025, Köln</w:t>
-            </w:r>
-          </w:p>
-          <w:p>
-            <w:pPr>
-              <w:spacing w:before="0" w:after="0"/>
-              <w:jc w:val="right"/>
-            </w:pPr>
-            <w:r>
-              <w:rPr>
-                <w:i/>
-                <w:sz w:val="21"/>
-              </w:rPr>
-              <w:t>Mitglied des Organisationsteams (mit M. Singer-Brodowski, U. Stenger, Ch. Wulf, O. Bilgi, J. Dinkelaker, J. Elven, S. Gaubitz, L. Klepacki, T. Klepacki, S. Ress, O. Sanders)</w:t>
             </w:r>
           </w:p>
         </w:tc>
@@ -10374,6 +10361,18 @@
               <w:t>DFG</w:t>
             </w:r>
           </w:p>
+          <w:p>
+            <w:pPr>
+              <w:spacing w:before="0" w:after="0"/>
+            </w:pPr>
+            <w:r>
+              <w:rPr>
+                <w:i/>
+                <w:sz w:val="21"/>
+              </w:rPr>
+              <w:t>ca. 50.000 € (in Vorbereitung)</w:t>
+            </w:r>
+          </w:p>
         </w:tc>
         <w:tc>
           <w:tcPr>
@@ -10390,19 +10389,6 @@
                 <w:sz w:val="22"/>
               </w:rPr>
               <w:t>2023</w:t>
-            </w:r>
-          </w:p>
-          <w:p>
-            <w:pPr>
-              <w:spacing w:before="0" w:after="0"/>
-              <w:jc w:val="right"/>
-            </w:pPr>
-            <w:r>
-              <w:rPr>
-                <w:i/>
-                <w:sz w:val="21"/>
-              </w:rPr>
-              <w:t>ca. 50.000 € (in Vorbereitung)</w:t>
             </w:r>
           </w:p>
         </w:tc>

</xml_diff>

<commit_message>
Fix floating dates and ragged wrapping in both PDF and Word
Entries with an empty title field rendered the date on its own line above the
text (a 2-row table with an empty first row). Convert those 25 entries to
\resumeProjectHeading{text}{date}, which is a single row (text left, date right)
in LaTeX and in the Word renderer, so the date sits on the entry's line.

Also merge the 14 long 4th-field role descriptions (Veranstaltungen) into the
left subtitle so they stop wrapping into a ragged stack in the narrow right
column. Update the Word builder to render \resumeProjectHeading's date.

Co-Authored-By: Claude Opus 4.8 <noreply@anthropic.com>
</commit_message>
<xml_diff>
--- a/Helge_Kminek_Lebenslauf.docx
+++ b/Helge_Kminek_Lebenslauf.docx
@@ -118,6 +118,7 @@
             </w:pPr>
             <w:r>
               <w:rPr>
+                <w:b w:val="0"/>
                 <w:i/>
                 <w:sz w:val="21"/>
               </w:rPr>
@@ -137,7 +138,7 @@
             </w:pPr>
             <w:r>
               <w:rPr>
-                <w:sz w:val="22"/>
+                <w:sz w:val="21"/>
               </w:rPr>
               <w:t>05/2017</w:t>
             </w:r>
@@ -151,7 +152,7 @@
       </w:pPr>
       <w:r>
         <w:rPr>
-          <w:sz w:val="6"/>
+          <w:sz w:val="4"/>
         </w:rPr>
       </w:r>
     </w:p>
@@ -190,6 +191,7 @@
             </w:pPr>
             <w:r>
               <w:rPr>
+                <w:b w:val="0"/>
                 <w:i/>
                 <w:sz w:val="21"/>
               </w:rPr>
@@ -209,7 +211,7 @@
             </w:pPr>
             <w:r>
               <w:rPr>
-                <w:sz w:val="22"/>
+                <w:sz w:val="21"/>
               </w:rPr>
               <w:t>04/2010</w:t>
             </w:r>
@@ -223,7 +225,7 @@
       </w:pPr>
       <w:r>
         <w:rPr>
-          <w:sz w:val="6"/>
+          <w:sz w:val="4"/>
         </w:rPr>
       </w:r>
     </w:p>
@@ -262,6 +264,7 @@
             </w:pPr>
             <w:r>
               <w:rPr>
+                <w:b w:val="0"/>
                 <w:i/>
                 <w:sz w:val="21"/>
               </w:rPr>
@@ -281,7 +284,7 @@
             </w:pPr>
             <w:r>
               <w:rPr>
-                <w:sz w:val="22"/>
+                <w:sz w:val="21"/>
               </w:rPr>
               <w:t>10/2006</w:t>
             </w:r>
@@ -295,7 +298,7 @@
       </w:pPr>
       <w:r>
         <w:rPr>
-          <w:sz w:val="6"/>
+          <w:sz w:val="4"/>
         </w:rPr>
       </w:r>
     </w:p>
@@ -2497,6 +2500,7 @@
             </w:pPr>
             <w:r>
               <w:rPr>
+                <w:b w:val="0"/>
                 <w:i/>
                 <w:sz w:val="21"/>
               </w:rPr>
@@ -2516,7 +2520,7 @@
             </w:pPr>
             <w:r>
               <w:rPr>
-                <w:sz w:val="22"/>
+                <w:sz w:val="21"/>
               </w:rPr>
               <w:t>Herbstsem. 2017</w:t>
             </w:r>
@@ -2530,7 +2534,7 @@
       </w:pPr>
       <w:r>
         <w:rPr>
-          <w:sz w:val="6"/>
+          <w:sz w:val="4"/>
         </w:rPr>
       </w:r>
     </w:p>
@@ -2569,6 +2573,7 @@
             </w:pPr>
             <w:r>
               <w:rPr>
+                <w:b w:val="0"/>
                 <w:i/>
                 <w:sz w:val="21"/>
               </w:rPr>
@@ -2588,7 +2593,7 @@
             </w:pPr>
             <w:r>
               <w:rPr>
-                <w:sz w:val="22"/>
+                <w:sz w:val="21"/>
               </w:rPr>
               <w:t>Frühjahrssem. 2019</w:t>
             </w:r>
@@ -2602,7 +2607,7 @@
       </w:pPr>
       <w:r>
         <w:rPr>
-          <w:sz w:val="6"/>
+          <w:sz w:val="4"/>
         </w:rPr>
       </w:r>
     </w:p>
@@ -2641,6 +2646,7 @@
             </w:pPr>
             <w:r>
               <w:rPr>
+                <w:b w:val="0"/>
                 <w:i/>
                 <w:sz w:val="21"/>
               </w:rPr>
@@ -2660,7 +2666,7 @@
             </w:pPr>
             <w:r>
               <w:rPr>
-                <w:sz w:val="22"/>
+                <w:sz w:val="21"/>
               </w:rPr>
               <w:t>Sommersem. 2019</w:t>
             </w:r>
@@ -2674,7 +2680,7 @@
       </w:pPr>
       <w:r>
         <w:rPr>
-          <w:sz w:val="6"/>
+          <w:sz w:val="4"/>
         </w:rPr>
       </w:r>
     </w:p>
@@ -4966,19 +4972,7 @@
                 <w:i/>
                 <w:sz w:val="21"/>
               </w:rPr>
-              <w:t>Kolloquium der Fachdidaktiken der Goethe-Universität Frankfurt am Main (halbjährlich)</w:t>
-            </w:r>
-          </w:p>
-          <w:p>
-            <w:pPr>
-              <w:spacing w:before="0" w:after="0"/>
-            </w:pPr>
-            <w:r>
-              <w:rPr>
-                <w:i/>
-                <w:sz w:val="21"/>
-              </w:rPr>
-              <w:t>Organisation, Durchführung, eigener Vortrag</w:t>
+              <w:t>Kolloquium der Fachdidaktiken der Goethe-Universität Frankfurt am Main (halbjährlich) – Organisation, Durchführung, eigener Vortrag</w:t>
             </w:r>
           </w:p>
         </w:tc>
@@ -5062,19 +5056,7 @@
                 <w:i/>
                 <w:sz w:val="21"/>
               </w:rPr>
-              <w:t>1.–5. Arbeitstagung für Doktorand_innen und Habilitand_innen der Philosophiedidaktik (jährlich)</w:t>
-            </w:r>
-          </w:p>
-          <w:p>
-            <w:pPr>
-              <w:spacing w:before="0" w:after="0"/>
-            </w:pPr>
-            <w:r>
-              <w:rPr>
-                <w:i/>
-                <w:sz w:val="21"/>
-              </w:rPr>
-              <w:t>Organisation, Durchführung, eigener Vortrag</w:t>
+              <w:t>1.–5. Arbeitstagung für Doktorand_innen und Habilitand_innen der Philosophiedidaktik (jährlich) – Organisation, Durchführung, eigener Vortrag</w:t>
             </w:r>
           </w:p>
         </w:tc>
@@ -5158,19 +5140,7 @@
                 <w:i/>
                 <w:sz w:val="21"/>
               </w:rPr>
-              <w:t>1. Internationale Arbeitstagung der Philosophiedidaktik: Zwischen Präskription und Deskription</w:t>
-            </w:r>
-          </w:p>
-          <w:p>
-            <w:pPr>
-              <w:spacing w:before="0" w:after="0"/>
-            </w:pPr>
-            <w:r>
-              <w:rPr>
-                <w:i/>
-                <w:sz w:val="21"/>
-              </w:rPr>
-              <w:t>Organisation, Durchführung, eigener Vortrag</w:t>
+              <w:t>1. Internationale Arbeitstagung der Philosophiedidaktik: Zwischen Präskription und Deskription – Organisation, Durchführung, eigener Vortrag</w:t>
             </w:r>
           </w:p>
         </w:tc>
@@ -5351,19 +5321,7 @@
                 <w:i/>
                 <w:sz w:val="21"/>
               </w:rPr>
-              <w:t>Transnationale Perspektiven auf Schule und Bildung</w:t>
-            </w:r>
-          </w:p>
-          <w:p>
-            <w:pPr>
-              <w:spacing w:before="0" w:after="0"/>
-            </w:pPr>
-            <w:r>
-              <w:rPr>
-                <w:i/>
-                <w:sz w:val="21"/>
-              </w:rPr>
-              <w:t>Mitglied des Organisationsteams, inkl. Begutachtung der Einreichungen</w:t>
+              <w:t>Transnationale Perspektiven auf Schule und Bildung – Mitglied des Organisationsteams, inkl. Begutachtung der Einreichungen</w:t>
             </w:r>
           </w:p>
         </w:tc>
@@ -5447,19 +5405,7 @@
                 <w:i/>
                 <w:sz w:val="21"/>
               </w:rPr>
-              <w:t>11. Tagung der AG Kasuistik in der Lehrer_innenbildung (SIG der DGfE)</w:t>
-            </w:r>
-          </w:p>
-          <w:p>
-            <w:pPr>
-              <w:spacing w:before="0" w:after="0"/>
-            </w:pPr>
-            <w:r>
-              <w:rPr>
-                <w:i/>
-                <w:sz w:val="21"/>
-              </w:rPr>
-              <w:t>Mitglied des Organisationsteams, inkl. Begutachtung der Einreichungen</w:t>
+              <w:t>11. Tagung der AG Kasuistik in der Lehrer_innenbildung (SIG der DGfE) – Mitglied des Organisationsteams, inkl. Begutachtung der Einreichungen</w:t>
             </w:r>
           </w:p>
         </w:tc>
@@ -5543,19 +5489,7 @@
                 <w:i/>
                 <w:sz w:val="21"/>
               </w:rPr>
-              <w:t>Planetary Thinking (interdisziplinäre Arbeitsgruppe, Goethe-Universität)</w:t>
-            </w:r>
-          </w:p>
-          <w:p>
-            <w:pPr>
-              <w:spacing w:before="0" w:after="0"/>
-            </w:pPr>
-            <w:r>
-              <w:rPr>
-                <w:i/>
-                <w:sz w:val="21"/>
-              </w:rPr>
-              <w:t>Mitglied des Organisationsteams, eigener Vortrag (02/2022)</w:t>
+              <w:t>Planetary Thinking (interdisziplinäre Arbeitsgruppe, Goethe-Universität) – Mitglied des Organisationsteams, eigener Vortrag (02/2022)</w:t>
             </w:r>
           </w:p>
         </w:tc>
@@ -5639,19 +5573,7 @@
                 <w:i/>
                 <w:sz w:val="21"/>
               </w:rPr>
-              <w:t>Planetary Boundaries – between Facts and Norms (mit Forschungskolleg Humanwissenschaften, Bad Homburg)</w:t>
-            </w:r>
-          </w:p>
-          <w:p>
-            <w:pPr>
-              <w:spacing w:before="0" w:after="0"/>
-            </w:pPr>
-            <w:r>
-              <w:rPr>
-                <w:i/>
-                <w:sz w:val="21"/>
-              </w:rPr>
-              <w:t>Mitglied des Organisationsteams</w:t>
+              <w:t>Planetary Boundaries – between Facts and Norms (mit Forschungskolleg Humanwissenschaften, Bad Homburg) – Mitglied des Organisationsteams</w:t>
             </w:r>
           </w:p>
         </w:tc>
@@ -5735,19 +5657,7 @@
                 <w:i/>
                 <w:sz w:val="21"/>
               </w:rPr>
-              <w:t>„Ökologische, gesellschaftliche und individuelle Umbrüche und ihre Bedeutung für BNE“</w:t>
-            </w:r>
-          </w:p>
-          <w:p>
-            <w:pPr>
-              <w:spacing w:before="0" w:after="0"/>
-            </w:pPr>
-            <w:r>
-              <w:rPr>
-                <w:i/>
-                <w:sz w:val="21"/>
-              </w:rPr>
-              <w:t>Organisation, Durchführung</w:t>
+              <w:t>„Ökologische, gesellschaftliche und individuelle Umbrüche und ihre Bedeutung für BNE“ – Organisation, Durchführung</w:t>
             </w:r>
           </w:p>
         </w:tc>
@@ -5831,19 +5741,7 @@
                 <w:i/>
                 <w:sz w:val="21"/>
               </w:rPr>
-              <w:t>„Kontroversen und Debatten im Kontext von Bildung für nachhaltige Entwicklung“</w:t>
-            </w:r>
-          </w:p>
-          <w:p>
-            <w:pPr>
-              <w:spacing w:before="0" w:after="0"/>
-            </w:pPr>
-            <w:r>
-              <w:rPr>
-                <w:i/>
-                <w:sz w:val="21"/>
-              </w:rPr>
-              <w:t>Mitglied des Organisationsteams, inkl. Begutachtung der Einreichungen</w:t>
+              <w:t>„Kontroversen und Debatten im Kontext von Bildung für nachhaltige Entwicklung“ – Mitglied des Organisationsteams, inkl. Begutachtung der Einreichungen</w:t>
             </w:r>
           </w:p>
         </w:tc>
@@ -5927,19 +5825,7 @@
                 <w:i/>
                 <w:sz w:val="21"/>
               </w:rPr>
-              <w:t>Areas of tension between education for sustainable development and the increasing differentiation of the field</w:t>
-            </w:r>
-          </w:p>
-          <w:p>
-            <w:pPr>
-              <w:spacing w:before="0" w:after="0"/>
-            </w:pPr>
-            <w:r>
-              <w:rPr>
-                <w:i/>
-                <w:sz w:val="21"/>
-              </w:rPr>
-              <w:t>Mitglied des Organisationsteams (mit J. Costa, A.-K. Holfelder, J. Hufnagl, M. Osterrieder, A. Scheunpflug, M. Singer-Brodowski, D. Taube)</w:t>
+              <w:t>Areas of tension between education for sustainable development and the increasing differentiation of the field – Mitglied des Organisationsteams (mit J. Costa, A.-K. Holfelder, J. Hufnagl, M. Osterrieder, A. Scheunpflug, M. Singer-Brodowski, D. Taube)</w:t>
             </w:r>
           </w:p>
         </w:tc>
@@ -6023,19 +5909,7 @@
                 <w:i/>
                 <w:sz w:val="21"/>
               </w:rPr>
-              <w:t>DGfE Dialogue Workshop: „Sustainability and planetary futures as a transformation challenge for educational science“</w:t>
-            </w:r>
-          </w:p>
-          <w:p>
-            <w:pPr>
-              <w:spacing w:before="0" w:after="0"/>
-            </w:pPr>
-            <w:r>
-              <w:rPr>
-                <w:i/>
-                <w:sz w:val="21"/>
-              </w:rPr>
-              <w:t>Mitglied des Organisationsteams (mit J. Costa, M. Singer-Brodowski, Ch. Wulf, U. Stenger, L. Klepacki, N. Grünberger, J. Engel)</w:t>
+              <w:t>DGfE Dialogue Workshop: „Sustainability and planetary futures as a transformation challenge for educational science“ – Mitglied des Organisationsteams (mit J. Costa, M. Singer-Brodowski, Ch. Wulf, U. Stenger, L. Klepacki, N. Grünberger, J. Engel)</w:t>
             </w:r>
           </w:p>
         </w:tc>
@@ -6119,19 +5993,7 @@
                 <w:i/>
                 <w:sz w:val="21"/>
               </w:rPr>
-              <w:t>Transnationalization of social and ecological inequalities and their relevance to educational science</w:t>
-            </w:r>
-          </w:p>
-          <w:p>
-            <w:pPr>
-              <w:spacing w:before="0" w:after="0"/>
-            </w:pPr>
-            <w:r>
-              <w:rPr>
-                <w:i/>
-                <w:sz w:val="21"/>
-              </w:rPr>
-              <w:t>Mitglied des Organisationsteams (mit D. Amirpur, N. Bernhard, J. Costa, A. Dogmus, K. Falkenberg, S. Hartong, R. Nikolai, J. Panagiotopoulou, S. Ress, M. Singer-Brodowski)</w:t>
+              <w:t>Transnationalization of social and ecological inequalities and their relevance to educational science – Mitglied des Organisationsteams (mit D. Amirpur, N. Bernhard, J. Costa, A. Dogmus, K. Falkenberg, S. Hartong, R. Nikolai, J. Panagiotopoulou, S. Ress, M. Singer-Brodowski)</w:t>
             </w:r>
           </w:p>
         </w:tc>
@@ -6215,19 +6077,7 @@
                 <w:i/>
                 <w:sz w:val="21"/>
               </w:rPr>
-              <w:t>Erziehungswissenschaft und Nachhaltigkeit – Widerstände bearbeiten. Zukünfte gestalten. Auftakttagung der DGfE-AG „Nachhaltigkeit bzw. Nicht-Nachhaltigkeit und planetare Zukünfte“</w:t>
-            </w:r>
-          </w:p>
-          <w:p>
-            <w:pPr>
-              <w:spacing w:before="0" w:after="0"/>
-            </w:pPr>
-            <w:r>
-              <w:rPr>
-                <w:i/>
-                <w:sz w:val="21"/>
-              </w:rPr>
-              <w:t>Mitglied des Organisationsteams (mit M. Singer-Brodowski, U. Stenger, Ch. Wulf, O. Bilgi, J. Dinkelaker, J. Elven, S. Gaubitz, L. Klepacki, T. Klepacki, S. Ress, O. Sanders)</w:t>
+              <w:t>Erziehungswissenschaft und Nachhaltigkeit – Widerstände bearbeiten. Zukünfte gestalten. Auftakttagung der DGfE-AG „Nachhaltigkeit bzw. Nicht-Nachhaltigkeit und planetare Zukünfte“ – Mitglied des Organisationsteams (mit M. Singer-Brodowski, U. Stenger, Ch. Wulf, O. Bilgi, J. Dinkelaker, J. Elven, S. Gaubitz, L. Klepacki, T. Klepacki, S. Ress, O. Sanders)</w:t>
             </w:r>
           </w:p>
         </w:tc>
@@ -7541,6 +7391,7 @@
             </w:pPr>
             <w:r>
               <w:rPr>
+                <w:b w:val="0"/>
                 <w:i/>
                 <w:sz w:val="21"/>
               </w:rPr>
@@ -7560,7 +7411,7 @@
             </w:pPr>
             <w:r>
               <w:rPr>
-                <w:sz w:val="22"/>
+                <w:sz w:val="21"/>
               </w:rPr>
               <w:t>03/2026</w:t>
             </w:r>
@@ -7574,7 +7425,7 @@
       </w:pPr>
       <w:r>
         <w:rPr>
-          <w:sz w:val="6"/>
+          <w:sz w:val="4"/>
         </w:rPr>
       </w:r>
     </w:p>
@@ -8058,6 +7909,7 @@
             </w:pPr>
             <w:r>
               <w:rPr>
+                <w:b w:val="0"/>
                 <w:i/>
                 <w:sz w:val="21"/>
               </w:rPr>
@@ -8077,7 +7929,7 @@
             </w:pPr>
             <w:r>
               <w:rPr>
-                <w:sz w:val="22"/>
+                <w:sz w:val="21"/>
               </w:rPr>
               <w:t>02–04/2025</w:t>
             </w:r>
@@ -8091,7 +7943,7 @@
       </w:pPr>
       <w:r>
         <w:rPr>
-          <w:sz w:val="6"/>
+          <w:sz w:val="4"/>
         </w:rPr>
       </w:r>
     </w:p>
@@ -8130,6 +7982,7 @@
             </w:pPr>
             <w:r>
               <w:rPr>
+                <w:b w:val="0"/>
                 <w:i/>
                 <w:sz w:val="21"/>
               </w:rPr>
@@ -8149,7 +8002,7 @@
             </w:pPr>
             <w:r>
               <w:rPr>
-                <w:sz w:val="22"/>
+                <w:sz w:val="21"/>
               </w:rPr>
               <w:t>02–04/2025</w:t>
             </w:r>
@@ -8163,7 +8016,7 @@
       </w:pPr>
       <w:r>
         <w:rPr>
-          <w:sz w:val="6"/>
+          <w:sz w:val="4"/>
         </w:rPr>
       </w:r>
     </w:p>
@@ -8648,6 +8501,7 @@
             </w:pPr>
             <w:r>
               <w:rPr>
+                <w:b w:val="0"/>
                 <w:i/>
                 <w:sz w:val="21"/>
               </w:rPr>
@@ -8667,7 +8521,7 @@
             </w:pPr>
             <w:r>
               <w:rPr>
-                <w:sz w:val="22"/>
+                <w:sz w:val="21"/>
               </w:rPr>
               <w:t>04/2024–03/2025</w:t>
             </w:r>
@@ -8681,7 +8535,7 @@
       </w:pPr>
       <w:r>
         <w:rPr>
-          <w:sz w:val="6"/>
+          <w:sz w:val="4"/>
         </w:rPr>
       </w:r>
     </w:p>
@@ -8720,6 +8574,7 @@
             </w:pPr>
             <w:r>
               <w:rPr>
+                <w:b w:val="0"/>
                 <w:i/>
                 <w:sz w:val="21"/>
               </w:rPr>
@@ -8739,7 +8594,7 @@
             </w:pPr>
             <w:r>
               <w:rPr>
-                <w:sz w:val="22"/>
+                <w:sz w:val="21"/>
               </w:rPr>
               <w:t>04/2024–03/2027</w:t>
             </w:r>
@@ -8753,7 +8608,7 @@
       </w:pPr>
       <w:r>
         <w:rPr>
-          <w:sz w:val="6"/>
+          <w:sz w:val="4"/>
         </w:rPr>
       </w:r>
     </w:p>
@@ -8792,6 +8647,7 @@
             </w:pPr>
             <w:r>
               <w:rPr>
+                <w:b w:val="0"/>
                 <w:i/>
                 <w:sz w:val="21"/>
               </w:rPr>
@@ -8811,7 +8667,7 @@
             </w:pPr>
             <w:r>
               <w:rPr>
-                <w:sz w:val="22"/>
+                <w:sz w:val="21"/>
               </w:rPr>
               <w:t>04/2024–11/2025</w:t>
             </w:r>
@@ -8825,7 +8681,7 @@
       </w:pPr>
       <w:r>
         <w:rPr>
-          <w:sz w:val="6"/>
+          <w:sz w:val="4"/>
         </w:rPr>
       </w:r>
     </w:p>
@@ -8864,6 +8720,7 @@
             </w:pPr>
             <w:r>
               <w:rPr>
+                <w:b w:val="0"/>
                 <w:i/>
                 <w:sz w:val="21"/>
               </w:rPr>
@@ -8883,7 +8740,7 @@
             </w:pPr>
             <w:r>
               <w:rPr>
-                <w:sz w:val="22"/>
+                <w:sz w:val="21"/>
               </w:rPr>
               <w:t>seit 06/2025</w:t>
             </w:r>
@@ -8897,7 +8754,7 @@
       </w:pPr>
       <w:r>
         <w:rPr>
-          <w:sz w:val="6"/>
+          <w:sz w:val="4"/>
         </w:rPr>
       </w:r>
     </w:p>
@@ -8936,6 +8793,7 @@
             </w:pPr>
             <w:r>
               <w:rPr>
+                <w:b w:val="0"/>
                 <w:i/>
                 <w:sz w:val="21"/>
               </w:rPr>
@@ -8955,7 +8813,7 @@
             </w:pPr>
             <w:r>
               <w:rPr>
-                <w:sz w:val="22"/>
+                <w:sz w:val="21"/>
               </w:rPr>
               <w:t>seit 04/2026</w:t>
             </w:r>
@@ -8969,7 +8827,7 @@
       </w:pPr>
       <w:r>
         <w:rPr>
-          <w:sz w:val="6"/>
+          <w:sz w:val="4"/>
         </w:rPr>
       </w:r>
     </w:p>
@@ -10358,19 +10216,7 @@
                 <w:i/>
                 <w:sz w:val="21"/>
               </w:rPr>
-              <w:t>DFG</w:t>
-            </w:r>
-          </w:p>
-          <w:p>
-            <w:pPr>
-              <w:spacing w:before="0" w:after="0"/>
-            </w:pPr>
-            <w:r>
-              <w:rPr>
-                <w:i/>
-                <w:sz w:val="21"/>
-              </w:rPr>
-              <w:t>ca. 50.000 € (in Vorbereitung)</w:t>
+              <w:t>DFG – ca. 50.000 € (in Vorbereitung)</w:t>
             </w:r>
           </w:p>
         </w:tc>
@@ -10455,6 +10301,7 @@
             </w:pPr>
             <w:r>
               <w:rPr>
+                <w:b w:val="0"/>
                 <w:i/>
                 <w:sz w:val="21"/>
               </w:rPr>
@@ -10474,7 +10321,7 @@
             </w:pPr>
             <w:r>
               <w:rPr>
-                <w:sz w:val="22"/>
+                <w:sz w:val="21"/>
               </w:rPr>
               <w:t>seit 03/2021</w:t>
             </w:r>
@@ -10488,7 +10335,7 @@
       </w:pPr>
       <w:r>
         <w:rPr>
-          <w:sz w:val="6"/>
+          <w:sz w:val="4"/>
         </w:rPr>
       </w:r>
     </w:p>
@@ -10527,6 +10374,7 @@
             </w:pPr>
             <w:r>
               <w:rPr>
+                <w:b w:val="0"/>
                 <w:i/>
                 <w:sz w:val="21"/>
               </w:rPr>
@@ -10546,7 +10394,7 @@
             </w:pPr>
             <w:r>
               <w:rPr>
-                <w:sz w:val="22"/>
+                <w:sz w:val="21"/>
               </w:rPr>
               <w:t>seit 2018</w:t>
             </w:r>
@@ -10560,7 +10408,7 @@
       </w:pPr>
       <w:r>
         <w:rPr>
-          <w:sz w:val="6"/>
+          <w:sz w:val="4"/>
         </w:rPr>
       </w:r>
     </w:p>
@@ -10599,6 +10447,7 @@
             </w:pPr>
             <w:r>
               <w:rPr>
+                <w:b w:val="0"/>
                 <w:i/>
                 <w:sz w:val="21"/>
               </w:rPr>
@@ -10618,7 +10467,7 @@
             </w:pPr>
             <w:r>
               <w:rPr>
-                <w:sz w:val="22"/>
+                <w:sz w:val="21"/>
               </w:rPr>
               <w:t>2020–2023</w:t>
             </w:r>
@@ -10632,7 +10481,7 @@
       </w:pPr>
       <w:r>
         <w:rPr>
-          <w:sz w:val="6"/>
+          <w:sz w:val="4"/>
         </w:rPr>
       </w:r>
     </w:p>
@@ -10671,6 +10520,7 @@
             </w:pPr>
             <w:r>
               <w:rPr>
+                <w:b w:val="0"/>
                 <w:i/>
                 <w:sz w:val="21"/>
               </w:rPr>
@@ -10690,7 +10540,7 @@
             </w:pPr>
             <w:r>
               <w:rPr>
-                <w:sz w:val="22"/>
+                <w:sz w:val="21"/>
               </w:rPr>
               <w:t>seit 2016</w:t>
             </w:r>
@@ -10704,7 +10554,7 @@
       </w:pPr>
       <w:r>
         <w:rPr>
-          <w:sz w:val="6"/>
+          <w:sz w:val="4"/>
         </w:rPr>
       </w:r>
     </w:p>
@@ -10743,6 +10593,7 @@
             </w:pPr>
             <w:r>
               <w:rPr>
+                <w:b w:val="0"/>
                 <w:i/>
                 <w:sz w:val="21"/>
               </w:rPr>
@@ -10762,7 +10613,7 @@
             </w:pPr>
             <w:r>
               <w:rPr>
-                <w:sz w:val="22"/>
+                <w:sz w:val="21"/>
               </w:rPr>
               <w:t>2017–2019</w:t>
             </w:r>
@@ -10776,7 +10627,7 @@
       </w:pPr>
       <w:r>
         <w:rPr>
-          <w:sz w:val="6"/>
+          <w:sz w:val="4"/>
         </w:rPr>
       </w:r>
     </w:p>
@@ -10815,6 +10666,7 @@
             </w:pPr>
             <w:r>
               <w:rPr>
+                <w:b w:val="0"/>
                 <w:i/>
                 <w:sz w:val="21"/>
               </w:rPr>
@@ -10834,7 +10686,7 @@
             </w:pPr>
             <w:r>
               <w:rPr>
-                <w:sz w:val="22"/>
+                <w:sz w:val="21"/>
               </w:rPr>
               <w:t>2016–2017</w:t>
             </w:r>
@@ -10848,7 +10700,7 @@
       </w:pPr>
       <w:r>
         <w:rPr>
-          <w:sz w:val="6"/>
+          <w:sz w:val="4"/>
         </w:rPr>
       </w:r>
     </w:p>
@@ -10887,6 +10739,7 @@
             </w:pPr>
             <w:r>
               <w:rPr>
+                <w:b w:val="0"/>
                 <w:i/>
                 <w:sz w:val="21"/>
               </w:rPr>
@@ -10906,7 +10759,7 @@
             </w:pPr>
             <w:r>
               <w:rPr>
-                <w:sz w:val="22"/>
+                <w:sz w:val="21"/>
               </w:rPr>
               <w:t>2010–2012</w:t>
             </w:r>
@@ -10920,7 +10773,7 @@
       </w:pPr>
       <w:r>
         <w:rPr>
-          <w:sz w:val="6"/>
+          <w:sz w:val="4"/>
         </w:rPr>
       </w:r>
     </w:p>
@@ -11031,6 +10884,7 @@
             </w:pPr>
             <w:r>
               <w:rPr>
+                <w:b w:val="0"/>
                 <w:i/>
                 <w:sz w:val="21"/>
               </w:rPr>
@@ -11050,7 +10904,7 @@
             </w:pPr>
             <w:r>
               <w:rPr>
-                <w:sz w:val="22"/>
+                <w:sz w:val="21"/>
               </w:rPr>
               <w:t>2003–2005</w:t>
             </w:r>
@@ -11064,7 +10918,7 @@
       </w:pPr>
       <w:r>
         <w:rPr>
-          <w:sz w:val="6"/>
+          <w:sz w:val="4"/>
         </w:rPr>
       </w:r>
     </w:p>
@@ -11119,6 +10973,7 @@
             </w:pPr>
             <w:r>
               <w:rPr>
+                <w:b w:val="0"/>
                 <w:i/>
                 <w:sz w:val="21"/>
               </w:rPr>
@@ -11138,7 +10993,7 @@
             </w:pPr>
             <w:r>
               <w:rPr>
-                <w:sz w:val="22"/>
+                <w:sz w:val="21"/>
               </w:rPr>
               <w:t>2014</w:t>
             </w:r>
@@ -11152,7 +11007,7 @@
       </w:pPr>
       <w:r>
         <w:rPr>
-          <w:sz w:val="6"/>
+          <w:sz w:val="4"/>
         </w:rPr>
       </w:r>
     </w:p>
@@ -11263,6 +11118,7 @@
             </w:pPr>
             <w:r>
               <w:rPr>
+                <w:b w:val="0"/>
                 <w:i/>
                 <w:sz w:val="21"/>
               </w:rPr>
@@ -11282,7 +11138,7 @@
             </w:pPr>
             <w:r>
               <w:rPr>
-                <w:sz w:val="22"/>
+                <w:sz w:val="21"/>
               </w:rPr>
               <w:t>2018</w:t>
             </w:r>
@@ -11296,7 +11152,7 @@
       </w:pPr>
       <w:r>
         <w:rPr>
-          <w:sz w:val="6"/>
+          <w:sz w:val="4"/>
         </w:rPr>
       </w:r>
     </w:p>
@@ -11335,6 +11191,7 @@
             </w:pPr>
             <w:r>
               <w:rPr>
+                <w:b w:val="0"/>
                 <w:i/>
                 <w:sz w:val="21"/>
               </w:rPr>
@@ -11354,7 +11211,7 @@
             </w:pPr>
             <w:r>
               <w:rPr>
-                <w:sz w:val="22"/>
+                <w:sz w:val="21"/>
               </w:rPr>
               <w:t>2019</w:t>
             </w:r>
@@ -11368,7 +11225,7 @@
       </w:pPr>
       <w:r>
         <w:rPr>
-          <w:sz w:val="6"/>
+          <w:sz w:val="4"/>
         </w:rPr>
       </w:r>
     </w:p>

</xml_diff>

<commit_message>
Apply Helge's answers: editor dedup, Marburg removal, AAU semesters
- Remove the two duplicate Editor entries from Funktionen (kept under
  Herausgeberschaften per Helge; resolves the 2016 vs 04/2024 date conflict).
- Remove the cancelled Marburg 'Ausblick' teaching entry entirely.
- Add AAU Klagenfurt teaching headings for WS 2024/25, SS 2025, WS 2025/26
  (courses to be filled later) and note no teaching in SoSe 2024.
- Keep 'in Vorbereitung' entries (Helge will adjust at the end).

Co-Authored-By: Claude Opus 4.8 <noreply@anthropic.com>
</commit_message>
<xml_diff>
--- a/Helge_Kminek_Lebenslauf.docx
+++ b/Helge_Kminek_Lebenslauf.docx
@@ -1178,6 +1178,20 @@
     </w:p>
     <w:p>
       <w:pPr>
+        <w:keepNext/>
+        <w:spacing w:before="120" w:after="40"/>
+      </w:pPr>
+      <w:r>
+        <w:rPr>
+          <w:b/>
+          <w:i/>
+          <w:sz w:val="20"/>
+        </w:rPr>
+        <w:t>Sommersemester 2026</w:t>
+      </w:r>
+    </w:p>
+    <w:p>
+      <w:pPr>
         <w:pStyle w:val="ListBullet"/>
         <w:spacing w:before="0" w:after="0"/>
         <w:ind w:left="360"/>
@@ -1185,10 +1199,25 @@
       <w:r>
         <w:rPr>
           <w:b w:val="0"/>
-          <w:i/>
+          <w:i w:val="0"/>
           <w:sz w:val="20"/>
         </w:rPr>
-        <w:t>Kein Lehrangebot im Sommersemester 2024.</w:t>
+        <w:t>Sustainable Development II (gemeinsam mit J. Malojer und S. Preiml)</w:t>
+      </w:r>
+    </w:p>
+    <w:p>
+      <w:pPr>
+        <w:pStyle w:val="ListBullet"/>
+        <w:spacing w:before="0" w:after="0"/>
+        <w:ind w:left="360"/>
+      </w:pPr>
+      <w:r>
+        <w:rPr>
+          <w:b w:val="0"/>
+          <w:i w:val="0"/>
+          <w:sz w:val="20"/>
+        </w:rPr>
+        <w:t>Reflexion des pädagogischen Praktikums im schulischen/außerschulischen Bereich</w:t>
       </w:r>
     </w:p>
     <w:p>
@@ -1202,7 +1231,49 @@
           <w:i/>
           <w:sz w:val="20"/>
         </w:rPr>
-        <w:t>Sommersemester 2026</w:t>
+        <w:t>Wintersemester 2025/2026</w:t>
+      </w:r>
+    </w:p>
+    <w:p>
+      <w:pPr>
+        <w:keepNext/>
+        <w:spacing w:before="120" w:after="40"/>
+      </w:pPr>
+      <w:r>
+        <w:rPr>
+          <w:b/>
+          <w:i/>
+          <w:sz w:val="20"/>
+        </w:rPr>
+        <w:t>Sommersemester 2025</w:t>
+      </w:r>
+    </w:p>
+    <w:p>
+      <w:pPr>
+        <w:keepNext/>
+        <w:spacing w:before="120" w:after="40"/>
+      </w:pPr>
+      <w:r>
+        <w:rPr>
+          <w:b/>
+          <w:i/>
+          <w:sz w:val="20"/>
+        </w:rPr>
+        <w:t>Wintersemester 2024/2025</w:t>
+      </w:r>
+    </w:p>
+    <w:p>
+      <w:pPr>
+        <w:keepNext/>
+        <w:spacing w:before="120" w:after="40"/>
+      </w:pPr>
+      <w:r>
+        <w:rPr>
+          <w:b/>
+          <w:i/>
+          <w:sz w:val="20"/>
+        </w:rPr>
+        <w:t>Sommersemester 2024</w:t>
       </w:r>
     </w:p>
     <w:p>
@@ -1214,25 +1285,10 @@
       <w:r>
         <w:rPr>
           <w:b w:val="0"/>
-          <w:i w:val="0"/>
+          <w:i/>
           <w:sz w:val="20"/>
         </w:rPr>
-        <w:t>Sustainable Development II (gemeinsam mit J. Malojer und S. Preiml)</w:t>
-      </w:r>
-    </w:p>
-    <w:p>
-      <w:pPr>
-        <w:pStyle w:val="ListBullet"/>
-        <w:spacing w:before="0" w:after="0"/>
-        <w:ind w:left="360"/>
-      </w:pPr>
-      <w:r>
-        <w:rPr>
-          <w:b w:val="0"/>
-          <w:i w:val="0"/>
-          <w:sz w:val="20"/>
-        </w:rPr>
-        <w:t>Reflexion des pädagogischen Praktikums im schulischen/außerschulischen Bereich</w:t>
+        <w:t>Kein Lehrangebot.</w:t>
       </w:r>
     </w:p>
     <w:p>
@@ -2682,35 +2738,6 @@
         <w:rPr>
           <w:sz w:val="4"/>
         </w:rPr>
-      </w:r>
-    </w:p>
-    <w:p>
-      <w:pPr>
-        <w:keepNext/>
-        <w:spacing w:before="120" w:after="40"/>
-      </w:pPr>
-      <w:r>
-        <w:rPr>
-          <w:b/>
-          <w:i/>
-          <w:sz w:val="20"/>
-        </w:rPr>
-        <w:t>Ausblick</w:t>
-      </w:r>
-    </w:p>
-    <w:p>
-      <w:pPr>
-        <w:pStyle w:val="ListBullet"/>
-        <w:spacing w:before="0" w:after="0"/>
-        <w:ind w:left="360"/>
-      </w:pPr>
-      <w:r>
-        <w:rPr>
-          <w:b w:val="0"/>
-          <w:i w:val="0"/>
-          <w:sz w:val="20"/>
-        </w:rPr>
-        <w:t>On educational theory of professionalisation and education for sustainable development – Wintersemester 2023/2024, Universität Marburg.</w:t>
       </w:r>
     </w:p>
     <w:p>
@@ -6354,187 +6381,6 @@
                 <w:sz w:val="22"/>
               </w:rPr>
               <w:t>seit 11/2025</w:t>
-            </w:r>
-          </w:p>
-        </w:tc>
-      </w:tr>
-    </w:tbl>
-    <w:p>
-      <w:pPr>
-        <w:spacing w:before="0" w:after="0"/>
-      </w:pPr>
-      <w:r>
-        <w:rPr>
-          <w:sz w:val="6"/>
-        </w:rPr>
-      </w:r>
-    </w:p>
-    <w:p>
-      <w:pPr>
-        <w:spacing w:before="0" w:after="0"/>
-      </w:pPr>
-      <w:r>
-        <w:rPr>
-          <w:b/>
-          <w:i w:val="0"/>
-          <w:sz w:val="20"/>
-        </w:rPr>
-        <w:t>Editorial-/Herausgebertätigkeit bei Zeitschriften und Schriftenreihen</w:t>
-      </w:r>
-    </w:p>
-    <w:tbl>
-      <w:tblPr>
-        <w:tblW w:type="auto" w:w="0"/>
-        <w:tblLayout w:type="fixed"/>
-        <w:tblLook w:firstColumn="1" w:firstRow="1" w:lastColumn="0" w:lastRow="0" w:noHBand="0" w:noVBand="1" w:val="04A0"/>
-        <w:tblBorders>
-          <w:top w:val="none"/>
-          <w:left w:val="none"/>
-          <w:bottom w:val="none"/>
-          <w:right w:val="none"/>
-          <w:insideH w:val="none"/>
-          <w:insideV w:val="none"/>
-        </w:tblBorders>
-        <w:tblLayout w:type="fixed"/>
-        <w:tblW w:w="10224" w:type="dxa"/>
-      </w:tblPr>
-      <w:tblGrid>
-        <w:gridCol w:w="7920"/>
-        <w:gridCol w:w="2304"/>
-      </w:tblGrid>
-      <w:tr>
-        <w:trPr>
-          <w:cantSplit/>
-        </w:trPr>
-        <w:tc>
-          <w:tcPr>
-            <w:tcW w:type="dxa" w:w="7920"/>
-            <w:vAlign w:val="top"/>
-          </w:tcPr>
-          <w:p>
-            <w:pPr>
-              <w:spacing w:before="0" w:after="0"/>
-            </w:pPr>
-            <w:r>
-              <w:rPr>
-                <w:b/>
-                <w:sz w:val="22"/>
-              </w:rPr>
-              <w:t>Editor – datum &amp; diskurs</w:t>
-            </w:r>
-          </w:p>
-          <w:p>
-            <w:pPr>
-              <w:spacing w:before="0" w:after="0"/>
-            </w:pPr>
-            <w:r>
-              <w:rPr>
-                <w:i/>
-                <w:sz w:val="21"/>
-              </w:rPr>
-              <w:t>Zeitschrift für Komplementär-, Sekundär- und Reanalysen im Feld der qualitativen Schul- und Unterrichtsforschung.</w:t>
-            </w:r>
-          </w:p>
-        </w:tc>
-        <w:tc>
-          <w:tcPr>
-            <w:tcW w:type="dxa" w:w="2304"/>
-            <w:vAlign w:val="top"/>
-          </w:tcPr>
-          <w:p>
-            <w:pPr>
-              <w:spacing w:before="0" w:after="0"/>
-              <w:jc w:val="right"/>
-            </w:pPr>
-            <w:r>
-              <w:rPr>
-                <w:sz w:val="22"/>
-              </w:rPr>
-              <w:t>seit 04/2024</w:t>
-            </w:r>
-          </w:p>
-        </w:tc>
-      </w:tr>
-    </w:tbl>
-    <w:p>
-      <w:pPr>
-        <w:spacing w:before="0" w:after="0"/>
-      </w:pPr>
-      <w:r>
-        <w:rPr>
-          <w:sz w:val="6"/>
-        </w:rPr>
-      </w:r>
-    </w:p>
-    <w:tbl>
-      <w:tblPr>
-        <w:tblW w:type="auto" w:w="0"/>
-        <w:tblLayout w:type="fixed"/>
-        <w:tblLook w:firstColumn="1" w:firstRow="1" w:lastColumn="0" w:lastRow="0" w:noHBand="0" w:noVBand="1" w:val="04A0"/>
-        <w:tblBorders>
-          <w:top w:val="none"/>
-          <w:left w:val="none"/>
-          <w:bottom w:val="none"/>
-          <w:right w:val="none"/>
-          <w:insideH w:val="none"/>
-          <w:insideV w:val="none"/>
-        </w:tblBorders>
-        <w:tblLayout w:type="fixed"/>
-        <w:tblW w:w="10224" w:type="dxa"/>
-      </w:tblPr>
-      <w:tblGrid>
-        <w:gridCol w:w="7920"/>
-        <w:gridCol w:w="2304"/>
-      </w:tblGrid>
-      <w:tr>
-        <w:trPr>
-          <w:cantSplit/>
-        </w:trPr>
-        <w:tc>
-          <w:tcPr>
-            <w:tcW w:type="dxa" w:w="7920"/>
-            <w:vAlign w:val="top"/>
-          </w:tcPr>
-          <w:p>
-            <w:pPr>
-              <w:spacing w:before="0" w:after="0"/>
-            </w:pPr>
-            <w:r>
-              <w:rPr>
-                <w:b/>
-                <w:sz w:val="22"/>
-              </w:rPr>
-              <w:t>Editor</w:t>
-            </w:r>
-          </w:p>
-          <w:p>
-            <w:pPr>
-              <w:spacing w:before="0" w:after="0"/>
-            </w:pPr>
-            <w:r>
-              <w:rPr>
-                <w:i/>
-                <w:sz w:val="21"/>
-              </w:rPr>
-              <w:t>Wissenschaftliche Beiträge zur Philosophiedidaktik und Bildungsphilosophie (Scientific Contributions to Philosophy Didactics and Educational Philosophy).</w:t>
-            </w:r>
-          </w:p>
-        </w:tc>
-        <w:tc>
-          <w:tcPr>
-            <w:tcW w:type="dxa" w:w="2304"/>
-            <w:vAlign w:val="top"/>
-          </w:tcPr>
-          <w:p>
-            <w:pPr>
-              <w:spacing w:before="0" w:after="0"/>
-              <w:jc w:val="right"/>
-            </w:pPr>
-            <w:r>
-              <w:rPr>
-                <w:sz w:val="22"/>
-              </w:rPr>
-              <w:t>seit 04/2024</w:t>
             </w:r>
           </w:p>
         </w:tc>

</xml_diff>

<commit_message>
Make all single-item entries consistent (fix bold/blank-row unevenness)
20 single-item entries (Abitur, the journal-review list, L-Netzes, Brasilien,
etc.) had their text in field #1, so they rendered bold with an empty second
table row — producing inconsistent styling and uneven gaps next to their italic
single-line siblings. Convert them to \resumeProjectHeading{\textit{text}}{date}
so every single-item entry is one aligned italic line with a right-aligned date.

Co-Authored-By: Claude Opus 4.8 <noreply@anthropic.com>
</commit_message>
<xml_diff>
--- a/Helge_Kminek_Lebenslauf.docx
+++ b/Helge_Kminek_Lebenslauf.docx
@@ -337,8 +337,9 @@
             </w:pPr>
             <w:r>
               <w:rPr>
-                <w:b/>
-                <w:sz w:val="22"/>
+                <w:b w:val="0"/>
+                <w:i/>
+                <w:sz w:val="21"/>
               </w:rPr>
               <w:t>Abitur, Goethe Gymnasium Neu-Isenburg.</w:t>
             </w:r>
@@ -356,7 +357,7 @@
             </w:pPr>
             <w:r>
               <w:rPr>
-                <w:sz w:val="22"/>
+                <w:sz w:val="21"/>
               </w:rPr>
               <w:t>06/1999</w:t>
             </w:r>
@@ -370,7 +371,7 @@
       </w:pPr>
       <w:r>
         <w:rPr>
-          <w:sz w:val="6"/>
+          <w:sz w:val="4"/>
         </w:rPr>
       </w:r>
     </w:p>
@@ -6202,8 +6203,9 @@
             </w:pPr>
             <w:r>
               <w:rPr>
-                <w:b/>
-                <w:sz w:val="22"/>
+                <w:b w:val="0"/>
+                <w:i/>
+                <w:sz w:val="21"/>
               </w:rPr>
               <w:t>Journal of Decolonising Disciplines.</w:t>
             </w:r>
@@ -6221,7 +6223,7 @@
             </w:pPr>
             <w:r>
               <w:rPr>
-                <w:sz w:val="22"/>
+                <w:sz w:val="21"/>
               </w:rPr>
               <w:t>2018</w:t>
             </w:r>
@@ -6235,7 +6237,7 @@
       </w:pPr>
       <w:r>
         <w:rPr>
-          <w:sz w:val="6"/>
+          <w:sz w:val="4"/>
         </w:rPr>
       </w:r>
     </w:p>
@@ -6287,8 +6289,9 @@
             </w:pPr>
             <w:r>
               <w:rPr>
-                <w:b/>
-                <w:sz w:val="22"/>
+                <w:b w:val="0"/>
+                <w:i/>
+                <w:sz w:val="21"/>
               </w:rPr>
               <w:t>Journal of Didactics of Philosophy.</w:t>
             </w:r>
@@ -6306,7 +6309,7 @@
             </w:pPr>
             <w:r>
               <w:rPr>
-                <w:sz w:val="22"/>
+                <w:sz w:val="21"/>
               </w:rPr>
               <w:t>2016</w:t>
             </w:r>
@@ -6320,7 +6323,7 @@
       </w:pPr>
       <w:r>
         <w:rPr>
-          <w:sz w:val="6"/>
+          <w:sz w:val="4"/>
         </w:rPr>
       </w:r>
     </w:p>
@@ -6359,8 +6362,9 @@
             </w:pPr>
             <w:r>
               <w:rPr>
-                <w:b/>
-                <w:sz w:val="22"/>
+                <w:b w:val="0"/>
+                <w:i/>
+                <w:sz w:val="21"/>
               </w:rPr>
               <w:t>Educations (openscience.fr/Educations).</w:t>
             </w:r>
@@ -6378,7 +6382,7 @@
             </w:pPr>
             <w:r>
               <w:rPr>
-                <w:sz w:val="22"/>
+                <w:sz w:val="21"/>
               </w:rPr>
               <w:t>seit 11/2025</w:t>
             </w:r>
@@ -6392,7 +6396,7 @@
       </w:pPr>
       <w:r>
         <w:rPr>
-          <w:sz w:val="6"/>
+          <w:sz w:val="4"/>
         </w:rPr>
       </w:r>
     </w:p>
@@ -6577,8 +6581,9 @@
             </w:pPr>
             <w:r>
               <w:rPr>
-                <w:b/>
-                <w:sz w:val="22"/>
+                <w:b w:val="0"/>
+                <w:i/>
+                <w:sz w:val="21"/>
               </w:rPr>
               <w:t>The Journal of Environmental Education.</w:t>
             </w:r>
@@ -6596,7 +6601,7 @@
             </w:pPr>
             <w:r>
               <w:rPr>
-                <w:sz w:val="22"/>
+                <w:sz w:val="21"/>
               </w:rPr>
               <w:t>04–04/2024</w:t>
             </w:r>
@@ -6610,7 +6615,7 @@
       </w:pPr>
       <w:r>
         <w:rPr>
-          <w:sz w:val="6"/>
+          <w:sz w:val="4"/>
         </w:rPr>
       </w:r>
     </w:p>
@@ -6649,8 +6654,9 @@
             </w:pPr>
             <w:r>
               <w:rPr>
-                <w:b/>
-                <w:sz w:val="22"/>
+                <w:b w:val="0"/>
+                <w:i/>
+                <w:sz w:val="21"/>
               </w:rPr>
               <w:t>Journal for Educational Science.</w:t>
             </w:r>
@@ -6668,7 +6674,7 @@
             </w:pPr>
             <w:r>
               <w:rPr>
-                <w:sz w:val="22"/>
+                <w:sz w:val="21"/>
               </w:rPr>
               <w:t>11–12/2024</w:t>
             </w:r>
@@ -6682,7 +6688,7 @@
       </w:pPr>
       <w:r>
         <w:rPr>
-          <w:sz w:val="6"/>
+          <w:sz w:val="4"/>
         </w:rPr>
       </w:r>
     </w:p>
@@ -6721,8 +6727,9 @@
             </w:pPr>
             <w:r>
               <w:rPr>
-                <w:b/>
-                <w:sz w:val="22"/>
+                <w:b w:val="0"/>
+                <w:i/>
+                <w:sz w:val="21"/>
               </w:rPr>
               <w:t>Discover Education.</w:t>
             </w:r>
@@ -6740,7 +6747,7 @@
             </w:pPr>
             <w:r>
               <w:rPr>
-                <w:sz w:val="22"/>
+                <w:sz w:val="21"/>
               </w:rPr>
               <w:t>04/2025</w:t>
             </w:r>
@@ -6754,7 +6761,7 @@
       </w:pPr>
       <w:r>
         <w:rPr>
-          <w:sz w:val="6"/>
+          <w:sz w:val="4"/>
         </w:rPr>
       </w:r>
     </w:p>
@@ -6877,8 +6884,9 @@
             </w:pPr>
             <w:r>
               <w:rPr>
-                <w:b/>
-                <w:sz w:val="22"/>
+                <w:b w:val="0"/>
+                <w:i/>
+                <w:sz w:val="21"/>
               </w:rPr>
               <w:t>Foundations of Science.</w:t>
             </w:r>
@@ -6896,7 +6904,7 @@
             </w:pPr>
             <w:r>
               <w:rPr>
-                <w:sz w:val="22"/>
+                <w:sz w:val="21"/>
               </w:rPr>
               <w:t>11–12/2025</w:t>
             </w:r>
@@ -6910,7 +6918,7 @@
       </w:pPr>
       <w:r>
         <w:rPr>
-          <w:sz w:val="6"/>
+          <w:sz w:val="4"/>
         </w:rPr>
       </w:r>
     </w:p>
@@ -6949,8 +6957,9 @@
             </w:pPr>
             <w:r>
               <w:rPr>
-                <w:b/>
-                <w:sz w:val="22"/>
+                <w:b w:val="0"/>
+                <w:i/>
+                <w:sz w:val="21"/>
               </w:rPr>
               <w:t>Discover Sustainability.</w:t>
             </w:r>
@@ -6968,7 +6977,7 @@
             </w:pPr>
             <w:r>
               <w:rPr>
-                <w:sz w:val="22"/>
+                <w:sz w:val="21"/>
               </w:rPr>
               <w:t>01/2026</w:t>
             </w:r>
@@ -6982,7 +6991,7 @@
       </w:pPr>
       <w:r>
         <w:rPr>
-          <w:sz w:val="6"/>
+          <w:sz w:val="4"/>
         </w:rPr>
       </w:r>
     </w:p>
@@ -7021,8 +7030,9 @@
             </w:pPr>
             <w:r>
               <w:rPr>
-                <w:b/>
-                <w:sz w:val="22"/>
+                <w:b w:val="0"/>
+                <w:i/>
+                <w:sz w:val="21"/>
               </w:rPr>
               <w:t>Discover Sustainability.</w:t>
             </w:r>
@@ -7040,7 +7050,7 @@
             </w:pPr>
             <w:r>
               <w:rPr>
-                <w:sz w:val="22"/>
+                <w:sz w:val="21"/>
               </w:rPr>
               <w:t>02–03/2026</w:t>
             </w:r>
@@ -7054,7 +7064,7 @@
       </w:pPr>
       <w:r>
         <w:rPr>
-          <w:sz w:val="6"/>
+          <w:sz w:val="4"/>
         </w:rPr>
       </w:r>
     </w:p>
@@ -7093,8 +7103,9 @@
             </w:pPr>
             <w:r>
               <w:rPr>
-                <w:b/>
-                <w:sz w:val="22"/>
+                <w:b w:val="0"/>
+                <w:i/>
+                <w:sz w:val="21"/>
               </w:rPr>
               <w:t>Journal of Curriculum Studies.</w:t>
             </w:r>
@@ -7112,7 +7123,7 @@
             </w:pPr>
             <w:r>
               <w:rPr>
-                <w:sz w:val="22"/>
+                <w:sz w:val="21"/>
               </w:rPr>
               <w:t>02–05/2026</w:t>
             </w:r>
@@ -7126,7 +7137,7 @@
       </w:pPr>
       <w:r>
         <w:rPr>
-          <w:sz w:val="6"/>
+          <w:sz w:val="4"/>
         </w:rPr>
       </w:r>
     </w:p>
@@ -7165,8 +7176,9 @@
             </w:pPr>
             <w:r>
               <w:rPr>
-                <w:b/>
-                <w:sz w:val="22"/>
+                <w:b w:val="0"/>
+                <w:i/>
+                <w:sz w:val="21"/>
               </w:rPr>
               <w:t>Journal of Didactics of Philosophy.</w:t>
             </w:r>
@@ -7184,7 +7196,7 @@
             </w:pPr>
             <w:r>
               <w:rPr>
-                <w:sz w:val="22"/>
+                <w:sz w:val="21"/>
               </w:rPr>
               <w:t>03/2026</w:t>
             </w:r>
@@ -7198,7 +7210,7 @@
       </w:pPr>
       <w:r>
         <w:rPr>
-          <w:sz w:val="6"/>
+          <w:sz w:val="4"/>
         </w:rPr>
       </w:r>
     </w:p>
@@ -7310,8 +7322,9 @@
             </w:pPr>
             <w:r>
               <w:rPr>
-                <w:b/>
-                <w:sz w:val="22"/>
+                <w:b w:val="0"/>
+                <w:i/>
+                <w:sz w:val="21"/>
               </w:rPr>
               <w:t>Education Sciences.</w:t>
             </w:r>
@@ -7329,7 +7342,7 @@
             </w:pPr>
             <w:r>
               <w:rPr>
-                <w:sz w:val="22"/>
+                <w:sz w:val="21"/>
               </w:rPr>
               <w:t>05/2026</w:t>
             </w:r>
@@ -7343,7 +7356,7 @@
       </w:pPr>
       <w:r>
         <w:rPr>
-          <w:sz w:val="6"/>
+          <w:sz w:val="4"/>
         </w:rPr>
       </w:r>
     </w:p>
@@ -7382,8 +7395,9 @@
             </w:pPr>
             <w:r>
               <w:rPr>
-                <w:b/>
-                <w:sz w:val="22"/>
+                <w:b w:val="0"/>
+                <w:i/>
+                <w:sz w:val="21"/>
               </w:rPr>
               <w:t>Sustainability.</w:t>
             </w:r>
@@ -7401,7 +7415,7 @@
             </w:pPr>
             <w:r>
               <w:rPr>
-                <w:sz w:val="22"/>
+                <w:sz w:val="21"/>
               </w:rPr>
               <w:t>05/2026</w:t>
             </w:r>
@@ -7415,7 +7429,7 @@
       </w:pPr>
       <w:r>
         <w:rPr>
-          <w:sz w:val="6"/>
+          <w:sz w:val="4"/>
         </w:rPr>
       </w:r>
     </w:p>
@@ -7454,8 +7468,9 @@
             </w:pPr>
             <w:r>
               <w:rPr>
-                <w:b/>
-                <w:sz w:val="22"/>
+                <w:b w:val="0"/>
+                <w:i/>
+                <w:sz w:val="21"/>
               </w:rPr>
               <w:t>Sustainability, Education Sciences.</w:t>
             </w:r>
@@ -7473,7 +7488,7 @@
             </w:pPr>
             <w:r>
               <w:rPr>
-                <w:sz w:val="22"/>
+                <w:sz w:val="21"/>
               </w:rPr>
               <w:t>05/2026–04/2027</w:t>
             </w:r>
@@ -7487,7 +7502,7 @@
       </w:pPr>
       <w:r>
         <w:rPr>
-          <w:sz w:val="6"/>
+          <w:sz w:val="4"/>
         </w:rPr>
       </w:r>
     </w:p>
@@ -7526,8 +7541,9 @@
             </w:pPr>
             <w:r>
               <w:rPr>
-                <w:b/>
-                <w:sz w:val="22"/>
+                <w:b w:val="0"/>
+                <w:i/>
+                <w:sz w:val="21"/>
               </w:rPr>
               <w:t>Frontiers in Sociology.</w:t>
             </w:r>
@@ -7545,7 +7561,7 @@
             </w:pPr>
             <w:r>
               <w:rPr>
-                <w:sz w:val="22"/>
+                <w:sz w:val="21"/>
               </w:rPr>
               <w:t>05–06/2026</w:t>
             </w:r>
@@ -7559,7 +7575,7 @@
       </w:pPr>
       <w:r>
         <w:rPr>
-          <w:sz w:val="6"/>
+          <w:sz w:val="4"/>
         </w:rPr>
       </w:r>
     </w:p>
@@ -7598,8 +7614,9 @@
             </w:pPr>
             <w:r>
               <w:rPr>
-                <w:b/>
-                <w:sz w:val="22"/>
+                <w:b w:val="0"/>
+                <w:i/>
+                <w:sz w:val="21"/>
               </w:rPr>
               <w:t>Sustainability.</w:t>
             </w:r>
@@ -7617,7 +7634,7 @@
             </w:pPr>
             <w:r>
               <w:rPr>
-                <w:sz w:val="22"/>
+                <w:sz w:val="21"/>
               </w:rPr>
               <w:t>06/2026</w:t>
             </w:r>
@@ -7631,7 +7648,7 @@
       </w:pPr>
       <w:r>
         <w:rPr>
-          <w:sz w:val="6"/>
+          <w:sz w:val="4"/>
         </w:rPr>
       </w:r>
     </w:p>
@@ -7670,8 +7687,9 @@
             </w:pPr>
             <w:r>
               <w:rPr>
-                <w:b/>
-                <w:sz w:val="22"/>
+                <w:b w:val="0"/>
+                <w:i/>
+                <w:sz w:val="21"/>
               </w:rPr>
               <w:t>Revue Education.</w:t>
             </w:r>
@@ -7689,7 +7707,7 @@
             </w:pPr>
             <w:r>
               <w:rPr>
-                <w:sz w:val="22"/>
+                <w:sz w:val="21"/>
               </w:rPr>
               <w:t>06/2026</w:t>
             </w:r>
@@ -7703,7 +7721,7 @@
       </w:pPr>
       <w:r>
         <w:rPr>
-          <w:sz w:val="6"/>
+          <w:sz w:val="4"/>
         </w:rPr>
       </w:r>
     </w:p>
@@ -10658,8 +10676,9 @@
             </w:pPr>
             <w:r>
               <w:rPr>
-                <w:b/>
-                <w:sz w:val="22"/>
+                <w:b w:val="0"/>
+                <w:i/>
+                <w:sz w:val="21"/>
               </w:rPr>
               <w:t>Mitglied des L-Netzes der Universität Frankfurt.</w:t>
             </w:r>
@@ -10677,7 +10696,7 @@
             </w:pPr>
             <w:r>
               <w:rPr>
-                <w:sz w:val="22"/>
+                <w:sz w:val="21"/>
               </w:rPr>
               <w:t>2007–2009</w:t>
             </w:r>
@@ -10691,7 +10710,7 @@
       </w:pPr>
       <w:r>
         <w:rPr>
-          <w:sz w:val="6"/>
+          <w:sz w:val="4"/>
         </w:rPr>
       </w:r>
     </w:p>
@@ -10892,8 +10911,9 @@
             </w:pPr>
             <w:r>
               <w:rPr>
-                <w:b/>
-                <w:sz w:val="22"/>
+                <w:b w:val="0"/>
+                <w:i/>
+                <w:sz w:val="21"/>
               </w:rPr>
               <w:t>Vortragsreise nach Brasilien (DAAD gefördert).</w:t>
             </w:r>
@@ -10911,7 +10931,7 @@
             </w:pPr>
             <w:r>
               <w:rPr>
-                <w:sz w:val="22"/>
+                <w:sz w:val="21"/>
               </w:rPr>
               <w:t>2016</w:t>
             </w:r>
@@ -10925,7 +10945,7 @@
       </w:pPr>
       <w:r>
         <w:rPr>
-          <w:sz w:val="6"/>
+          <w:sz w:val="4"/>
         </w:rPr>
       </w:r>
     </w:p>

</xml_diff>

<commit_message>
Leave blank space under the empty AAU semesters for Helge to fill in
Per Helge's request, the three AAU semesters with no course list yet
(WS 2024/25, SS 2025, WS 2025/26) now have a blank line beneath each heading so
he can type the course titles himself later. Word: blank gap after any empty
sub-heading; PDF: \vspace after each (ignored by the Word parser, so no
double spacing).

Co-Authored-By: Claude Opus 4.8 <noreply@anthropic.com>
</commit_message>
<xml_diff>
--- a/Helge_Kminek_Lebenslauf.docx
+++ b/Helge_Kminek_Lebenslauf.docx
@@ -1179,6 +1179,16 @@
     </w:p>
     <w:p>
       <w:pPr>
+        <w:spacing w:before="0" w:after="0"/>
+      </w:pPr>
+      <w:r>
+        <w:rPr>
+          <w:sz w:val="26"/>
+        </w:rPr>
+      </w:r>
+    </w:p>
+    <w:p>
+      <w:pPr>
         <w:keepNext/>
         <w:spacing w:before="120" w:after="40"/>
       </w:pPr>
@@ -1237,6 +1247,16 @@
     </w:p>
     <w:p>
       <w:pPr>
+        <w:spacing w:before="0" w:after="0"/>
+      </w:pPr>
+      <w:r>
+        <w:rPr>
+          <w:sz w:val="26"/>
+        </w:rPr>
+      </w:r>
+    </w:p>
+    <w:p>
+      <w:pPr>
         <w:keepNext/>
         <w:spacing w:before="120" w:after="40"/>
       </w:pPr>
@@ -1251,6 +1271,16 @@
     </w:p>
     <w:p>
       <w:pPr>
+        <w:spacing w:before="0" w:after="0"/>
+      </w:pPr>
+      <w:r>
+        <w:rPr>
+          <w:sz w:val="26"/>
+        </w:rPr>
+      </w:r>
+    </w:p>
+    <w:p>
+      <w:pPr>
         <w:keepNext/>
         <w:spacing w:before="120" w:after="40"/>
       </w:pPr>
@@ -1265,6 +1295,16 @@
     </w:p>
     <w:p>
       <w:pPr>
+        <w:spacing w:before="0" w:after="0"/>
+      </w:pPr>
+      <w:r>
+        <w:rPr>
+          <w:sz w:val="26"/>
+        </w:rPr>
+      </w:r>
+    </w:p>
+    <w:p>
+      <w:pPr>
         <w:keepNext/>
         <w:spacing w:before="120" w:after="40"/>
       </w:pPr>
@@ -1304,6 +1344,16 @@
           <w:sz w:val="20"/>
         </w:rPr>
         <w:t>Goethe-Universität Frankfurt am Main</w:t>
+      </w:r>
+    </w:p>
+    <w:p>
+      <w:pPr>
+        <w:spacing w:before="0" w:after="0"/>
+      </w:pPr>
+      <w:r>
+        <w:rPr>
+          <w:sz w:val="26"/>
+        </w:rPr>
       </w:r>
     </w:p>
     <w:p>

</xml_diff>

<commit_message>
Use an empty bullet under each blank AAU semester to match the list structure
The filled semesters list courses as bullets, so give the three empty semesters
(WS 2024/25, SS 2025, WS 2025/26) an empty bullet each instead of plain blank
space, matching the structure so Helge can type his course straight into it.

Co-Authored-By: Claude Opus 4.8 <noreply@anthropic.com>
</commit_message>
<xml_diff>
--- a/Helge_Kminek_Lebenslauf.docx
+++ b/Helge_Kminek_Lebenslauf.docx
@@ -1247,13 +1247,10 @@
     </w:p>
     <w:p>
       <w:pPr>
+        <w:pStyle w:val="ListBullet"/>
         <w:spacing w:before="0" w:after="0"/>
-      </w:pPr>
-      <w:r>
-        <w:rPr>
-          <w:sz w:val="26"/>
-        </w:rPr>
-      </w:r>
+        <w:ind w:left="360"/>
+      </w:pPr>
     </w:p>
     <w:p>
       <w:pPr>
@@ -1271,13 +1268,10 @@
     </w:p>
     <w:p>
       <w:pPr>
+        <w:pStyle w:val="ListBullet"/>
         <w:spacing w:before="0" w:after="0"/>
-      </w:pPr>
-      <w:r>
-        <w:rPr>
-          <w:sz w:val="26"/>
-        </w:rPr>
-      </w:r>
+        <w:ind w:left="360"/>
+      </w:pPr>
     </w:p>
     <w:p>
       <w:pPr>
@@ -1295,13 +1289,10 @@
     </w:p>
     <w:p>
       <w:pPr>
+        <w:pStyle w:val="ListBullet"/>
         <w:spacing w:before="0" w:after="0"/>
-      </w:pPr>
-      <w:r>
-        <w:rPr>
-          <w:sz w:val="26"/>
-        </w:rPr>
-      </w:r>
+        <w:ind w:left="360"/>
+      </w:pPr>
     </w:p>
     <w:p>
       <w:pPr>

</xml_diff>

<commit_message>
Label the empty AAU semester bullets as placeholders
Replace the truly-empty bullets with an italic placeholder
('Lehrveranstaltungen werden ergänzt') so the three semesters awaiting course
titles read as intentional and cannot be sent looking unfinished.

Co-Authored-By: Claude Opus 4.8 <noreply@anthropic.com>
</commit_message>
<xml_diff>
--- a/Helge_Kminek_Lebenslauf.docx
+++ b/Helge_Kminek_Lebenslauf.docx
@@ -1251,6 +1251,14 @@
         <w:spacing w:before="0" w:after="0"/>
         <w:ind w:left="360"/>
       </w:pPr>
+      <w:r>
+        <w:rPr>
+          <w:b w:val="0"/>
+          <w:i/>
+          <w:sz w:val="20"/>
+        </w:rPr>
+        <w:t>Lehrveranstaltungen werden ergänzt</w:t>
+      </w:r>
     </w:p>
     <w:p>
       <w:pPr>
@@ -1272,6 +1280,14 @@
         <w:spacing w:before="0" w:after="0"/>
         <w:ind w:left="360"/>
       </w:pPr>
+      <w:r>
+        <w:rPr>
+          <w:b w:val="0"/>
+          <w:i/>
+          <w:sz w:val="20"/>
+        </w:rPr>
+        <w:t>Lehrveranstaltungen werden ergänzt</w:t>
+      </w:r>
     </w:p>
     <w:p>
       <w:pPr>
@@ -1293,6 +1309,14 @@
         <w:spacing w:before="0" w:after="0"/>
         <w:ind w:left="360"/>
       </w:pPr>
+      <w:r>
+        <w:rPr>
+          <w:b w:val="0"/>
+          <w:i/>
+          <w:sz w:val="20"/>
+        </w:rPr>
+        <w:t>Lehrveranstaltungen werden ergänzt</w:t>
+      </w:r>
     </w:p>
     <w:p>
       <w:pPr>

</xml_diff>

<commit_message>
Remove spurious blank line after sub-headings
The 'blank line after an empty sub-heading' rule became unnecessary once the
empty semesters got placeholder bullets, and was instead adding a useless gap
after the university-name headings (which are followed by a semester heading).
Remove it so spacing is even.

Co-Authored-By: Claude Opus 4.8 <noreply@anthropic.com>
</commit_message>
<xml_diff>
--- a/Helge_Kminek_Lebenslauf.docx
+++ b/Helge_Kminek_Lebenslauf.docx
@@ -1179,16 +1179,6 @@
     </w:p>
     <w:p>
       <w:pPr>
-        <w:spacing w:before="0" w:after="0"/>
-      </w:pPr>
-      <w:r>
-        <w:rPr>
-          <w:sz w:val="26"/>
-        </w:rPr>
-      </w:r>
-    </w:p>
-    <w:p>
-      <w:pPr>
         <w:keepNext/>
         <w:spacing w:before="120" w:after="40"/>
       </w:pPr>
@@ -1359,16 +1349,6 @@
           <w:sz w:val="20"/>
         </w:rPr>
         <w:t>Goethe-Universität Frankfurt am Main</w:t>
-      </w:r>
-    </w:p>
-    <w:p>
-      <w:pPr>
-        <w:spacing w:before="0" w:after="0"/>
-      </w:pPr>
-      <w:r>
-        <w:rPr>
-          <w:sz w:val="26"/>
-        </w:rPr>
       </w:r>
     </w:p>
     <w:p>

</xml_diff>

<commit_message>
Align entries flush-left and add space above section sub-labels
- Zero table cell padding and table indent so entry text lines up with the
  plain-paragraph section labels (was drifting ~0.08in to the right).
- Give the bold section sub-labels (Buchreihe, Editorial Advisor,
  Gutachtertätigkeiten, etc.) space above them so sections are visually separated.

Co-Authored-By: Claude Opus 4.8 <noreply@anthropic.com>
</commit_message>
<xml_diff>
--- a/Helge_Kminek_Lebenslauf.docx
+++ b/Helge_Kminek_Lebenslauf.docx
@@ -98,6 +98,11 @@
         </w:tblBorders>
         <w:tblLayout w:type="fixed"/>
         <w:tblW w:w="10224" w:type="dxa"/>
+        <w:tblInd w:w="0" w:type="dxa"/>
+        <w:tblCellMar>
+          <w:left w:w="0" w:type="dxa"/>
+          <w:right w:w="0" w:type="dxa"/>
+        </w:tblCellMar>
       </w:tblPr>
       <w:tblGrid>
         <w:gridCol w:w="7920"/>
@@ -171,6 +176,11 @@
         </w:tblBorders>
         <w:tblLayout w:type="fixed"/>
         <w:tblW w:w="10224" w:type="dxa"/>
+        <w:tblInd w:w="0" w:type="dxa"/>
+        <w:tblCellMar>
+          <w:left w:w="0" w:type="dxa"/>
+          <w:right w:w="0" w:type="dxa"/>
+        </w:tblCellMar>
       </w:tblPr>
       <w:tblGrid>
         <w:gridCol w:w="7920"/>
@@ -244,6 +254,11 @@
         </w:tblBorders>
         <w:tblLayout w:type="fixed"/>
         <w:tblW w:w="10224" w:type="dxa"/>
+        <w:tblInd w:w="0" w:type="dxa"/>
+        <w:tblCellMar>
+          <w:left w:w="0" w:type="dxa"/>
+          <w:right w:w="0" w:type="dxa"/>
+        </w:tblCellMar>
       </w:tblPr>
       <w:tblGrid>
         <w:gridCol w:w="7920"/>
@@ -317,6 +332,11 @@
         </w:tblBorders>
         <w:tblLayout w:type="fixed"/>
         <w:tblW w:w="10224" w:type="dxa"/>
+        <w:tblInd w:w="0" w:type="dxa"/>
+        <w:tblCellMar>
+          <w:left w:w="0" w:type="dxa"/>
+          <w:right w:w="0" w:type="dxa"/>
+        </w:tblCellMar>
       </w:tblPr>
       <w:tblGrid>
         <w:gridCol w:w="7920"/>
@@ -406,6 +426,11 @@
         </w:tblBorders>
         <w:tblLayout w:type="fixed"/>
         <w:tblW w:w="10224" w:type="dxa"/>
+        <w:tblInd w:w="0" w:type="dxa"/>
+        <w:tblCellMar>
+          <w:left w:w="0" w:type="dxa"/>
+          <w:right w:w="0" w:type="dxa"/>
+        </w:tblCellMar>
       </w:tblPr>
       <w:tblGrid>
         <w:gridCol w:w="7920"/>
@@ -490,6 +515,11 @@
         </w:tblBorders>
         <w:tblLayout w:type="fixed"/>
         <w:tblW w:w="10224" w:type="dxa"/>
+        <w:tblInd w:w="0" w:type="dxa"/>
+        <w:tblCellMar>
+          <w:left w:w="0" w:type="dxa"/>
+          <w:right w:w="0" w:type="dxa"/>
+        </w:tblCellMar>
       </w:tblPr>
       <w:tblGrid>
         <w:gridCol w:w="7920"/>
@@ -574,6 +604,11 @@
         </w:tblBorders>
         <w:tblLayout w:type="fixed"/>
         <w:tblW w:w="10224" w:type="dxa"/>
+        <w:tblInd w:w="0" w:type="dxa"/>
+        <w:tblCellMar>
+          <w:left w:w="0" w:type="dxa"/>
+          <w:right w:w="0" w:type="dxa"/>
+        </w:tblCellMar>
       </w:tblPr>
       <w:tblGrid>
         <w:gridCol w:w="7920"/>
@@ -658,6 +693,11 @@
         </w:tblBorders>
         <w:tblLayout w:type="fixed"/>
         <w:tblW w:w="10224" w:type="dxa"/>
+        <w:tblInd w:w="0" w:type="dxa"/>
+        <w:tblCellMar>
+          <w:left w:w="0" w:type="dxa"/>
+          <w:right w:w="0" w:type="dxa"/>
+        </w:tblCellMar>
       </w:tblPr>
       <w:tblGrid>
         <w:gridCol w:w="7920"/>
@@ -742,6 +782,11 @@
         </w:tblBorders>
         <w:tblLayout w:type="fixed"/>
         <w:tblW w:w="10224" w:type="dxa"/>
+        <w:tblInd w:w="0" w:type="dxa"/>
+        <w:tblCellMar>
+          <w:left w:w="0" w:type="dxa"/>
+          <w:right w:w="0" w:type="dxa"/>
+        </w:tblCellMar>
       </w:tblPr>
       <w:tblGrid>
         <w:gridCol w:w="7920"/>
@@ -826,6 +871,11 @@
         </w:tblBorders>
         <w:tblLayout w:type="fixed"/>
         <w:tblW w:w="10224" w:type="dxa"/>
+        <w:tblInd w:w="0" w:type="dxa"/>
+        <w:tblCellMar>
+          <w:left w:w="0" w:type="dxa"/>
+          <w:right w:w="0" w:type="dxa"/>
+        </w:tblCellMar>
       </w:tblPr>
       <w:tblGrid>
         <w:gridCol w:w="7920"/>
@@ -910,6 +960,11 @@
         </w:tblBorders>
         <w:tblLayout w:type="fixed"/>
         <w:tblW w:w="10224" w:type="dxa"/>
+        <w:tblInd w:w="0" w:type="dxa"/>
+        <w:tblCellMar>
+          <w:left w:w="0" w:type="dxa"/>
+          <w:right w:w="0" w:type="dxa"/>
+        </w:tblCellMar>
       </w:tblPr>
       <w:tblGrid>
         <w:gridCol w:w="7920"/>
@@ -994,6 +1049,11 @@
         </w:tblBorders>
         <w:tblLayout w:type="fixed"/>
         <w:tblW w:w="10224" w:type="dxa"/>
+        <w:tblInd w:w="0" w:type="dxa"/>
+        <w:tblCellMar>
+          <w:left w:w="0" w:type="dxa"/>
+          <w:right w:w="0" w:type="dxa"/>
+        </w:tblCellMar>
       </w:tblPr>
       <w:tblGrid>
         <w:gridCol w:w="7920"/>
@@ -1078,6 +1138,11 @@
         </w:tblBorders>
         <w:tblLayout w:type="fixed"/>
         <w:tblW w:w="10224" w:type="dxa"/>
+        <w:tblInd w:w="0" w:type="dxa"/>
+        <w:tblCellMar>
+          <w:left w:w="0" w:type="dxa"/>
+          <w:right w:w="0" w:type="dxa"/>
+        </w:tblCellMar>
       </w:tblPr>
       <w:tblGrid>
         <w:gridCol w:w="7920"/>
@@ -2582,6 +2647,11 @@
         </w:tblBorders>
         <w:tblLayout w:type="fixed"/>
         <w:tblW w:w="10224" w:type="dxa"/>
+        <w:tblInd w:w="0" w:type="dxa"/>
+        <w:tblCellMar>
+          <w:left w:w="0" w:type="dxa"/>
+          <w:right w:w="0" w:type="dxa"/>
+        </w:tblCellMar>
       </w:tblPr>
       <w:tblGrid>
         <w:gridCol w:w="7920"/>
@@ -2655,6 +2725,11 @@
         </w:tblBorders>
         <w:tblLayout w:type="fixed"/>
         <w:tblW w:w="10224" w:type="dxa"/>
+        <w:tblInd w:w="0" w:type="dxa"/>
+        <w:tblCellMar>
+          <w:left w:w="0" w:type="dxa"/>
+          <w:right w:w="0" w:type="dxa"/>
+        </w:tblCellMar>
       </w:tblPr>
       <w:tblGrid>
         <w:gridCol w:w="7920"/>
@@ -2728,6 +2803,11 @@
         </w:tblBorders>
         <w:tblLayout w:type="fixed"/>
         <w:tblW w:w="10224" w:type="dxa"/>
+        <w:tblInd w:w="0" w:type="dxa"/>
+        <w:tblCellMar>
+          <w:left w:w="0" w:type="dxa"/>
+          <w:right w:w="0" w:type="dxa"/>
+        </w:tblCellMar>
       </w:tblPr>
       <w:tblGrid>
         <w:gridCol w:w="7920"/>
@@ -2804,7 +2884,8 @@
     </w:p>
     <w:p>
       <w:pPr>
-        <w:spacing w:before="0" w:after="0"/>
+        <w:keepNext/>
+        <w:spacing w:before="160" w:after="40"/>
       </w:pPr>
       <w:r>
         <w:rPr>
@@ -2847,7 +2928,8 @@
     </w:p>
     <w:p>
       <w:pPr>
-        <w:spacing w:before="0" w:after="0"/>
+        <w:keepNext/>
+        <w:spacing w:before="160" w:after="40"/>
       </w:pPr>
       <w:r>
         <w:rPr>
@@ -3067,7 +3149,8 @@
     </w:p>
     <w:p>
       <w:pPr>
-        <w:spacing w:before="0" w:after="0"/>
+        <w:keepNext/>
+        <w:spacing w:before="160" w:after="40"/>
       </w:pPr>
       <w:r>
         <w:rPr>
@@ -3275,7 +3358,8 @@
     </w:p>
     <w:p>
       <w:pPr>
-        <w:spacing w:before="0" w:after="0"/>
+        <w:keepNext/>
+        <w:spacing w:before="160" w:after="40"/>
       </w:pPr>
       <w:r>
         <w:rPr>
@@ -3922,7 +4006,8 @@
     </w:p>
     <w:p>
       <w:pPr>
-        <w:spacing w:before="0" w:after="0"/>
+        <w:keepNext/>
+        <w:spacing w:before="160" w:after="40"/>
       </w:pPr>
       <w:r>
         <w:rPr>
@@ -4880,7 +4965,8 @@
     </w:p>
     <w:p>
       <w:pPr>
-        <w:spacing w:before="0" w:after="0"/>
+        <w:keepNext/>
+        <w:spacing w:before="160" w:after="40"/>
       </w:pPr>
       <w:r>
         <w:rPr>
@@ -4908,7 +4994,8 @@
     </w:p>
     <w:p>
       <w:pPr>
-        <w:spacing w:before="0" w:after="0"/>
+        <w:keepNext/>
+        <w:spacing w:before="160" w:after="40"/>
       </w:pPr>
       <w:r>
         <w:rPr>
@@ -5010,6 +5097,11 @@
         </w:tblBorders>
         <w:tblLayout w:type="fixed"/>
         <w:tblW w:w="10224" w:type="dxa"/>
+        <w:tblInd w:w="0" w:type="dxa"/>
+        <w:tblCellMar>
+          <w:left w:w="0" w:type="dxa"/>
+          <w:right w:w="0" w:type="dxa"/>
+        </w:tblCellMar>
       </w:tblPr>
       <w:tblGrid>
         <w:gridCol w:w="7920"/>
@@ -5094,6 +5186,11 @@
         </w:tblBorders>
         <w:tblLayout w:type="fixed"/>
         <w:tblW w:w="10224" w:type="dxa"/>
+        <w:tblInd w:w="0" w:type="dxa"/>
+        <w:tblCellMar>
+          <w:left w:w="0" w:type="dxa"/>
+          <w:right w:w="0" w:type="dxa"/>
+        </w:tblCellMar>
       </w:tblPr>
       <w:tblGrid>
         <w:gridCol w:w="7920"/>
@@ -5178,6 +5275,11 @@
         </w:tblBorders>
         <w:tblLayout w:type="fixed"/>
         <w:tblW w:w="10224" w:type="dxa"/>
+        <w:tblInd w:w="0" w:type="dxa"/>
+        <w:tblCellMar>
+          <w:left w:w="0" w:type="dxa"/>
+          <w:right w:w="0" w:type="dxa"/>
+        </w:tblCellMar>
       </w:tblPr>
       <w:tblGrid>
         <w:gridCol w:w="7920"/>
@@ -5262,6 +5364,11 @@
         </w:tblBorders>
         <w:tblLayout w:type="fixed"/>
         <w:tblW w:w="10224" w:type="dxa"/>
+        <w:tblInd w:w="0" w:type="dxa"/>
+        <w:tblCellMar>
+          <w:left w:w="0" w:type="dxa"/>
+          <w:right w:w="0" w:type="dxa"/>
+        </w:tblCellMar>
       </w:tblPr>
       <w:tblGrid>
         <w:gridCol w:w="7920"/>
@@ -5359,6 +5466,11 @@
         </w:tblBorders>
         <w:tblLayout w:type="fixed"/>
         <w:tblW w:w="10224" w:type="dxa"/>
+        <w:tblInd w:w="0" w:type="dxa"/>
+        <w:tblCellMar>
+          <w:left w:w="0" w:type="dxa"/>
+          <w:right w:w="0" w:type="dxa"/>
+        </w:tblCellMar>
       </w:tblPr>
       <w:tblGrid>
         <w:gridCol w:w="7920"/>
@@ -5443,6 +5555,11 @@
         </w:tblBorders>
         <w:tblLayout w:type="fixed"/>
         <w:tblW w:w="10224" w:type="dxa"/>
+        <w:tblInd w:w="0" w:type="dxa"/>
+        <w:tblCellMar>
+          <w:left w:w="0" w:type="dxa"/>
+          <w:right w:w="0" w:type="dxa"/>
+        </w:tblCellMar>
       </w:tblPr>
       <w:tblGrid>
         <w:gridCol w:w="7920"/>
@@ -5527,6 +5644,11 @@
         </w:tblBorders>
         <w:tblLayout w:type="fixed"/>
         <w:tblW w:w="10224" w:type="dxa"/>
+        <w:tblInd w:w="0" w:type="dxa"/>
+        <w:tblCellMar>
+          <w:left w:w="0" w:type="dxa"/>
+          <w:right w:w="0" w:type="dxa"/>
+        </w:tblCellMar>
       </w:tblPr>
       <w:tblGrid>
         <w:gridCol w:w="7920"/>
@@ -5611,6 +5733,11 @@
         </w:tblBorders>
         <w:tblLayout w:type="fixed"/>
         <w:tblW w:w="10224" w:type="dxa"/>
+        <w:tblInd w:w="0" w:type="dxa"/>
+        <w:tblCellMar>
+          <w:left w:w="0" w:type="dxa"/>
+          <w:right w:w="0" w:type="dxa"/>
+        </w:tblCellMar>
       </w:tblPr>
       <w:tblGrid>
         <w:gridCol w:w="7920"/>
@@ -5695,6 +5822,11 @@
         </w:tblBorders>
         <w:tblLayout w:type="fixed"/>
         <w:tblW w:w="10224" w:type="dxa"/>
+        <w:tblInd w:w="0" w:type="dxa"/>
+        <w:tblCellMar>
+          <w:left w:w="0" w:type="dxa"/>
+          <w:right w:w="0" w:type="dxa"/>
+        </w:tblCellMar>
       </w:tblPr>
       <w:tblGrid>
         <w:gridCol w:w="7920"/>
@@ -5779,6 +5911,11 @@
         </w:tblBorders>
         <w:tblLayout w:type="fixed"/>
         <w:tblW w:w="10224" w:type="dxa"/>
+        <w:tblInd w:w="0" w:type="dxa"/>
+        <w:tblCellMar>
+          <w:left w:w="0" w:type="dxa"/>
+          <w:right w:w="0" w:type="dxa"/>
+        </w:tblCellMar>
       </w:tblPr>
       <w:tblGrid>
         <w:gridCol w:w="7920"/>
@@ -5863,6 +6000,11 @@
         </w:tblBorders>
         <w:tblLayout w:type="fixed"/>
         <w:tblW w:w="10224" w:type="dxa"/>
+        <w:tblInd w:w="0" w:type="dxa"/>
+        <w:tblCellMar>
+          <w:left w:w="0" w:type="dxa"/>
+          <w:right w:w="0" w:type="dxa"/>
+        </w:tblCellMar>
       </w:tblPr>
       <w:tblGrid>
         <w:gridCol w:w="7920"/>
@@ -5947,6 +6089,11 @@
         </w:tblBorders>
         <w:tblLayout w:type="fixed"/>
         <w:tblW w:w="10224" w:type="dxa"/>
+        <w:tblInd w:w="0" w:type="dxa"/>
+        <w:tblCellMar>
+          <w:left w:w="0" w:type="dxa"/>
+          <w:right w:w="0" w:type="dxa"/>
+        </w:tblCellMar>
       </w:tblPr>
       <w:tblGrid>
         <w:gridCol w:w="7920"/>
@@ -6031,6 +6178,11 @@
         </w:tblBorders>
         <w:tblLayout w:type="fixed"/>
         <w:tblW w:w="10224" w:type="dxa"/>
+        <w:tblInd w:w="0" w:type="dxa"/>
+        <w:tblCellMar>
+          <w:left w:w="0" w:type="dxa"/>
+          <w:right w:w="0" w:type="dxa"/>
+        </w:tblCellMar>
       </w:tblPr>
       <w:tblGrid>
         <w:gridCol w:w="7920"/>
@@ -6115,6 +6267,11 @@
         </w:tblBorders>
         <w:tblLayout w:type="fixed"/>
         <w:tblW w:w="10224" w:type="dxa"/>
+        <w:tblInd w:w="0" w:type="dxa"/>
+        <w:tblCellMar>
+          <w:left w:w="0" w:type="dxa"/>
+          <w:right w:w="0" w:type="dxa"/>
+        </w:tblCellMar>
       </w:tblPr>
       <w:tblGrid>
         <w:gridCol w:w="7920"/>
@@ -6202,7 +6359,8 @@
     </w:p>
     <w:p>
       <w:pPr>
-        <w:spacing w:before="0" w:after="0"/>
+        <w:keepNext/>
+        <w:spacing w:before="160" w:after="40"/>
       </w:pPr>
       <w:r>
         <w:rPr>
@@ -6228,6 +6386,11 @@
         </w:tblBorders>
         <w:tblLayout w:type="fixed"/>
         <w:tblW w:w="10224" w:type="dxa"/>
+        <w:tblInd w:w="0" w:type="dxa"/>
+        <w:tblCellMar>
+          <w:left w:w="0" w:type="dxa"/>
+          <w:right w:w="0" w:type="dxa"/>
+        </w:tblCellMar>
       </w:tblPr>
       <w:tblGrid>
         <w:gridCol w:w="7920"/>
@@ -6288,7 +6451,8 @@
     </w:p>
     <w:p>
       <w:pPr>
-        <w:spacing w:before="0" w:after="0"/>
+        <w:keepNext/>
+        <w:spacing w:before="160" w:after="40"/>
       </w:pPr>
       <w:r>
         <w:rPr>
@@ -6314,6 +6478,11 @@
         </w:tblBorders>
         <w:tblLayout w:type="fixed"/>
         <w:tblW w:w="10224" w:type="dxa"/>
+        <w:tblInd w:w="0" w:type="dxa"/>
+        <w:tblCellMar>
+          <w:left w:w="0" w:type="dxa"/>
+          <w:right w:w="0" w:type="dxa"/>
+        </w:tblCellMar>
       </w:tblPr>
       <w:tblGrid>
         <w:gridCol w:w="7920"/>
@@ -6387,6 +6556,11 @@
         </w:tblBorders>
         <w:tblLayout w:type="fixed"/>
         <w:tblW w:w="10224" w:type="dxa"/>
+        <w:tblInd w:w="0" w:type="dxa"/>
+        <w:tblCellMar>
+          <w:left w:w="0" w:type="dxa"/>
+          <w:right w:w="0" w:type="dxa"/>
+        </w:tblCellMar>
       </w:tblPr>
       <w:tblGrid>
         <w:gridCol w:w="7920"/>
@@ -6447,7 +6621,8 @@
     </w:p>
     <w:p>
       <w:pPr>
-        <w:spacing w:before="0" w:after="0"/>
+        <w:keepNext/>
+        <w:spacing w:before="160" w:after="40"/>
       </w:pPr>
       <w:r>
         <w:rPr>
@@ -6580,7 +6755,8 @@
     </w:p>
     <w:p>
       <w:pPr>
-        <w:spacing w:before="0" w:after="0"/>
+        <w:keepNext/>
+        <w:spacing w:before="160" w:after="40"/>
       </w:pPr>
       <w:r>
         <w:rPr>
@@ -6606,6 +6782,11 @@
         </w:tblBorders>
         <w:tblLayout w:type="fixed"/>
         <w:tblW w:w="10224" w:type="dxa"/>
+        <w:tblInd w:w="0" w:type="dxa"/>
+        <w:tblCellMar>
+          <w:left w:w="0" w:type="dxa"/>
+          <w:right w:w="0" w:type="dxa"/>
+        </w:tblCellMar>
       </w:tblPr>
       <w:tblGrid>
         <w:gridCol w:w="7920"/>
@@ -6679,6 +6860,11 @@
         </w:tblBorders>
         <w:tblLayout w:type="fixed"/>
         <w:tblW w:w="10224" w:type="dxa"/>
+        <w:tblInd w:w="0" w:type="dxa"/>
+        <w:tblCellMar>
+          <w:left w:w="0" w:type="dxa"/>
+          <w:right w:w="0" w:type="dxa"/>
+        </w:tblCellMar>
       </w:tblPr>
       <w:tblGrid>
         <w:gridCol w:w="7920"/>
@@ -6752,6 +6938,11 @@
         </w:tblBorders>
         <w:tblLayout w:type="fixed"/>
         <w:tblW w:w="10224" w:type="dxa"/>
+        <w:tblInd w:w="0" w:type="dxa"/>
+        <w:tblCellMar>
+          <w:left w:w="0" w:type="dxa"/>
+          <w:right w:w="0" w:type="dxa"/>
+        </w:tblCellMar>
       </w:tblPr>
       <w:tblGrid>
         <w:gridCol w:w="7920"/>
@@ -6825,6 +7016,11 @@
         </w:tblBorders>
         <w:tblLayout w:type="fixed"/>
         <w:tblW w:w="10224" w:type="dxa"/>
+        <w:tblInd w:w="0" w:type="dxa"/>
+        <w:tblCellMar>
+          <w:left w:w="0" w:type="dxa"/>
+          <w:right w:w="0" w:type="dxa"/>
+        </w:tblCellMar>
       </w:tblPr>
       <w:tblGrid>
         <w:gridCol w:w="7920"/>
@@ -6909,6 +7105,11 @@
         </w:tblBorders>
         <w:tblLayout w:type="fixed"/>
         <w:tblW w:w="10224" w:type="dxa"/>
+        <w:tblInd w:w="0" w:type="dxa"/>
+        <w:tblCellMar>
+          <w:left w:w="0" w:type="dxa"/>
+          <w:right w:w="0" w:type="dxa"/>
+        </w:tblCellMar>
       </w:tblPr>
       <w:tblGrid>
         <w:gridCol w:w="7920"/>
@@ -6982,6 +7183,11 @@
         </w:tblBorders>
         <w:tblLayout w:type="fixed"/>
         <w:tblW w:w="10224" w:type="dxa"/>
+        <w:tblInd w:w="0" w:type="dxa"/>
+        <w:tblCellMar>
+          <w:left w:w="0" w:type="dxa"/>
+          <w:right w:w="0" w:type="dxa"/>
+        </w:tblCellMar>
       </w:tblPr>
       <w:tblGrid>
         <w:gridCol w:w="7920"/>
@@ -7055,6 +7261,11 @@
         </w:tblBorders>
         <w:tblLayout w:type="fixed"/>
         <w:tblW w:w="10224" w:type="dxa"/>
+        <w:tblInd w:w="0" w:type="dxa"/>
+        <w:tblCellMar>
+          <w:left w:w="0" w:type="dxa"/>
+          <w:right w:w="0" w:type="dxa"/>
+        </w:tblCellMar>
       </w:tblPr>
       <w:tblGrid>
         <w:gridCol w:w="7920"/>
@@ -7128,6 +7339,11 @@
         </w:tblBorders>
         <w:tblLayout w:type="fixed"/>
         <w:tblW w:w="10224" w:type="dxa"/>
+        <w:tblInd w:w="0" w:type="dxa"/>
+        <w:tblCellMar>
+          <w:left w:w="0" w:type="dxa"/>
+          <w:right w:w="0" w:type="dxa"/>
+        </w:tblCellMar>
       </w:tblPr>
       <w:tblGrid>
         <w:gridCol w:w="7920"/>
@@ -7201,6 +7417,11 @@
         </w:tblBorders>
         <w:tblLayout w:type="fixed"/>
         <w:tblW w:w="10224" w:type="dxa"/>
+        <w:tblInd w:w="0" w:type="dxa"/>
+        <w:tblCellMar>
+          <w:left w:w="0" w:type="dxa"/>
+          <w:right w:w="0" w:type="dxa"/>
+        </w:tblCellMar>
       </w:tblPr>
       <w:tblGrid>
         <w:gridCol w:w="7920"/>
@@ -7274,6 +7495,11 @@
         </w:tblBorders>
         <w:tblLayout w:type="fixed"/>
         <w:tblW w:w="10224" w:type="dxa"/>
+        <w:tblInd w:w="0" w:type="dxa"/>
+        <w:tblCellMar>
+          <w:left w:w="0" w:type="dxa"/>
+          <w:right w:w="0" w:type="dxa"/>
+        </w:tblCellMar>
       </w:tblPr>
       <w:tblGrid>
         <w:gridCol w:w="7920"/>
@@ -7347,6 +7573,11 @@
         </w:tblBorders>
         <w:tblLayout w:type="fixed"/>
         <w:tblW w:w="10224" w:type="dxa"/>
+        <w:tblInd w:w="0" w:type="dxa"/>
+        <w:tblCellMar>
+          <w:left w:w="0" w:type="dxa"/>
+          <w:right w:w="0" w:type="dxa"/>
+        </w:tblCellMar>
       </w:tblPr>
       <w:tblGrid>
         <w:gridCol w:w="7920"/>
@@ -7420,6 +7651,11 @@
         </w:tblBorders>
         <w:tblLayout w:type="fixed"/>
         <w:tblW w:w="10224" w:type="dxa"/>
+        <w:tblInd w:w="0" w:type="dxa"/>
+        <w:tblCellMar>
+          <w:left w:w="0" w:type="dxa"/>
+          <w:right w:w="0" w:type="dxa"/>
+        </w:tblCellMar>
       </w:tblPr>
       <w:tblGrid>
         <w:gridCol w:w="7920"/>
@@ -7493,6 +7729,11 @@
         </w:tblBorders>
         <w:tblLayout w:type="fixed"/>
         <w:tblW w:w="10224" w:type="dxa"/>
+        <w:tblInd w:w="0" w:type="dxa"/>
+        <w:tblCellMar>
+          <w:left w:w="0" w:type="dxa"/>
+          <w:right w:w="0" w:type="dxa"/>
+        </w:tblCellMar>
       </w:tblPr>
       <w:tblGrid>
         <w:gridCol w:w="7920"/>
@@ -7566,6 +7807,11 @@
         </w:tblBorders>
         <w:tblLayout w:type="fixed"/>
         <w:tblW w:w="10224" w:type="dxa"/>
+        <w:tblInd w:w="0" w:type="dxa"/>
+        <w:tblCellMar>
+          <w:left w:w="0" w:type="dxa"/>
+          <w:right w:w="0" w:type="dxa"/>
+        </w:tblCellMar>
       </w:tblPr>
       <w:tblGrid>
         <w:gridCol w:w="7920"/>
@@ -7639,6 +7885,11 @@
         </w:tblBorders>
         <w:tblLayout w:type="fixed"/>
         <w:tblW w:w="10224" w:type="dxa"/>
+        <w:tblInd w:w="0" w:type="dxa"/>
+        <w:tblCellMar>
+          <w:left w:w="0" w:type="dxa"/>
+          <w:right w:w="0" w:type="dxa"/>
+        </w:tblCellMar>
       </w:tblPr>
       <w:tblGrid>
         <w:gridCol w:w="7920"/>
@@ -7712,6 +7963,11 @@
         </w:tblBorders>
         <w:tblLayout w:type="fixed"/>
         <w:tblW w:w="10224" w:type="dxa"/>
+        <w:tblInd w:w="0" w:type="dxa"/>
+        <w:tblCellMar>
+          <w:left w:w="0" w:type="dxa"/>
+          <w:right w:w="0" w:type="dxa"/>
+        </w:tblCellMar>
       </w:tblPr>
       <w:tblGrid>
         <w:gridCol w:w="7920"/>
@@ -7772,7 +8028,8 @@
     </w:p>
     <w:p>
       <w:pPr>
-        <w:spacing w:before="0" w:after="0"/>
+        <w:keepNext/>
+        <w:spacing w:before="160" w:after="40"/>
       </w:pPr>
       <w:r>
         <w:rPr>
@@ -7798,6 +8055,11 @@
         </w:tblBorders>
         <w:tblLayout w:type="fixed"/>
         <w:tblW w:w="10224" w:type="dxa"/>
+        <w:tblInd w:w="0" w:type="dxa"/>
+        <w:tblCellMar>
+          <w:left w:w="0" w:type="dxa"/>
+          <w:right w:w="0" w:type="dxa"/>
+        </w:tblCellMar>
       </w:tblPr>
       <w:tblGrid>
         <w:gridCol w:w="7920"/>
@@ -7871,6 +8133,11 @@
         </w:tblBorders>
         <w:tblLayout w:type="fixed"/>
         <w:tblW w:w="10224" w:type="dxa"/>
+        <w:tblInd w:w="0" w:type="dxa"/>
+        <w:tblCellMar>
+          <w:left w:w="0" w:type="dxa"/>
+          <w:right w:w="0" w:type="dxa"/>
+        </w:tblCellMar>
       </w:tblPr>
       <w:tblGrid>
         <w:gridCol w:w="7920"/>
@@ -7931,7 +8198,8 @@
     </w:p>
     <w:p>
       <w:pPr>
-        <w:spacing w:before="0" w:after="0"/>
+        <w:keepNext/>
+        <w:spacing w:before="160" w:after="40"/>
       </w:pPr>
       <w:r>
         <w:rPr>
@@ -7957,6 +8225,11 @@
         </w:tblBorders>
         <w:tblLayout w:type="fixed"/>
         <w:tblW w:w="10224" w:type="dxa"/>
+        <w:tblInd w:w="0" w:type="dxa"/>
+        <w:tblCellMar>
+          <w:left w:w="0" w:type="dxa"/>
+          <w:right w:w="0" w:type="dxa"/>
+        </w:tblCellMar>
       </w:tblPr>
       <w:tblGrid>
         <w:gridCol w:w="7920"/>
@@ -8041,6 +8314,11 @@
         </w:tblBorders>
         <w:tblLayout w:type="fixed"/>
         <w:tblW w:w="10224" w:type="dxa"/>
+        <w:tblInd w:w="0" w:type="dxa"/>
+        <w:tblCellMar>
+          <w:left w:w="0" w:type="dxa"/>
+          <w:right w:w="0" w:type="dxa"/>
+        </w:tblCellMar>
       </w:tblPr>
       <w:tblGrid>
         <w:gridCol w:w="7920"/>
@@ -8125,6 +8403,11 @@
         </w:tblBorders>
         <w:tblLayout w:type="fixed"/>
         <w:tblW w:w="10224" w:type="dxa"/>
+        <w:tblInd w:w="0" w:type="dxa"/>
+        <w:tblCellMar>
+          <w:left w:w="0" w:type="dxa"/>
+          <w:right w:w="0" w:type="dxa"/>
+        </w:tblCellMar>
       </w:tblPr>
       <w:tblGrid>
         <w:gridCol w:w="7920"/>
@@ -8209,6 +8492,11 @@
         </w:tblBorders>
         <w:tblLayout w:type="fixed"/>
         <w:tblW w:w="10224" w:type="dxa"/>
+        <w:tblInd w:w="0" w:type="dxa"/>
+        <w:tblCellMar>
+          <w:left w:w="0" w:type="dxa"/>
+          <w:right w:w="0" w:type="dxa"/>
+        </w:tblCellMar>
       </w:tblPr>
       <w:tblGrid>
         <w:gridCol w:w="7920"/>
@@ -8293,6 +8581,11 @@
         </w:tblBorders>
         <w:tblLayout w:type="fixed"/>
         <w:tblW w:w="10224" w:type="dxa"/>
+        <w:tblInd w:w="0" w:type="dxa"/>
+        <w:tblCellMar>
+          <w:left w:w="0" w:type="dxa"/>
+          <w:right w:w="0" w:type="dxa"/>
+        </w:tblCellMar>
       </w:tblPr>
       <w:tblGrid>
         <w:gridCol w:w="7920"/>
@@ -8364,7 +8657,8 @@
     </w:p>
     <w:p>
       <w:pPr>
-        <w:spacing w:before="0" w:after="0"/>
+        <w:keepNext/>
+        <w:spacing w:before="160" w:after="40"/>
       </w:pPr>
       <w:r>
         <w:rPr>
@@ -8390,6 +8684,11 @@
         </w:tblBorders>
         <w:tblLayout w:type="fixed"/>
         <w:tblW w:w="10224" w:type="dxa"/>
+        <w:tblInd w:w="0" w:type="dxa"/>
+        <w:tblCellMar>
+          <w:left w:w="0" w:type="dxa"/>
+          <w:right w:w="0" w:type="dxa"/>
+        </w:tblCellMar>
       </w:tblPr>
       <w:tblGrid>
         <w:gridCol w:w="7920"/>
@@ -8463,6 +8762,11 @@
         </w:tblBorders>
         <w:tblLayout w:type="fixed"/>
         <w:tblW w:w="10224" w:type="dxa"/>
+        <w:tblInd w:w="0" w:type="dxa"/>
+        <w:tblCellMar>
+          <w:left w:w="0" w:type="dxa"/>
+          <w:right w:w="0" w:type="dxa"/>
+        </w:tblCellMar>
       </w:tblPr>
       <w:tblGrid>
         <w:gridCol w:w="7920"/>
@@ -8536,6 +8840,11 @@
         </w:tblBorders>
         <w:tblLayout w:type="fixed"/>
         <w:tblW w:w="10224" w:type="dxa"/>
+        <w:tblInd w:w="0" w:type="dxa"/>
+        <w:tblCellMar>
+          <w:left w:w="0" w:type="dxa"/>
+          <w:right w:w="0" w:type="dxa"/>
+        </w:tblCellMar>
       </w:tblPr>
       <w:tblGrid>
         <w:gridCol w:w="7920"/>
@@ -8609,6 +8918,11 @@
         </w:tblBorders>
         <w:tblLayout w:type="fixed"/>
         <w:tblW w:w="10224" w:type="dxa"/>
+        <w:tblInd w:w="0" w:type="dxa"/>
+        <w:tblCellMar>
+          <w:left w:w="0" w:type="dxa"/>
+          <w:right w:w="0" w:type="dxa"/>
+        </w:tblCellMar>
       </w:tblPr>
       <w:tblGrid>
         <w:gridCol w:w="7920"/>
@@ -8682,6 +8996,11 @@
         </w:tblBorders>
         <w:tblLayout w:type="fixed"/>
         <w:tblW w:w="10224" w:type="dxa"/>
+        <w:tblInd w:w="0" w:type="dxa"/>
+        <w:tblCellMar>
+          <w:left w:w="0" w:type="dxa"/>
+          <w:right w:w="0" w:type="dxa"/>
+        </w:tblCellMar>
       </w:tblPr>
       <w:tblGrid>
         <w:gridCol w:w="7920"/>
@@ -8742,7 +9061,8 @@
     </w:p>
     <w:p>
       <w:pPr>
-        <w:spacing w:before="0" w:after="0"/>
+        <w:keepNext/>
+        <w:spacing w:before="160" w:after="40"/>
       </w:pPr>
       <w:r>
         <w:rPr>
@@ -8829,6 +9149,11 @@
         </w:tblBorders>
         <w:tblLayout w:type="fixed"/>
         <w:tblW w:w="10224" w:type="dxa"/>
+        <w:tblInd w:w="0" w:type="dxa"/>
+        <w:tblCellMar>
+          <w:left w:w="0" w:type="dxa"/>
+          <w:right w:w="0" w:type="dxa"/>
+        </w:tblCellMar>
       </w:tblPr>
       <w:tblGrid>
         <w:gridCol w:w="7920"/>
@@ -8926,6 +9251,11 @@
         </w:tblBorders>
         <w:tblLayout w:type="fixed"/>
         <w:tblW w:w="10224" w:type="dxa"/>
+        <w:tblInd w:w="0" w:type="dxa"/>
+        <w:tblCellMar>
+          <w:left w:w="0" w:type="dxa"/>
+          <w:right w:w="0" w:type="dxa"/>
+        </w:tblCellMar>
       </w:tblPr>
       <w:tblGrid>
         <w:gridCol w:w="7920"/>
@@ -9023,6 +9353,11 @@
         </w:tblBorders>
         <w:tblLayout w:type="fixed"/>
         <w:tblW w:w="10224" w:type="dxa"/>
+        <w:tblInd w:w="0" w:type="dxa"/>
+        <w:tblCellMar>
+          <w:left w:w="0" w:type="dxa"/>
+          <w:right w:w="0" w:type="dxa"/>
+        </w:tblCellMar>
       </w:tblPr>
       <w:tblGrid>
         <w:gridCol w:w="7920"/>
@@ -9120,6 +9455,11 @@
         </w:tblBorders>
         <w:tblLayout w:type="fixed"/>
         <w:tblW w:w="10224" w:type="dxa"/>
+        <w:tblInd w:w="0" w:type="dxa"/>
+        <w:tblCellMar>
+          <w:left w:w="0" w:type="dxa"/>
+          <w:right w:w="0" w:type="dxa"/>
+        </w:tblCellMar>
       </w:tblPr>
       <w:tblGrid>
         <w:gridCol w:w="7920"/>
@@ -9217,6 +9557,11 @@
         </w:tblBorders>
         <w:tblLayout w:type="fixed"/>
         <w:tblW w:w="10224" w:type="dxa"/>
+        <w:tblInd w:w="0" w:type="dxa"/>
+        <w:tblCellMar>
+          <w:left w:w="0" w:type="dxa"/>
+          <w:right w:w="0" w:type="dxa"/>
+        </w:tblCellMar>
       </w:tblPr>
       <w:tblGrid>
         <w:gridCol w:w="7920"/>
@@ -9314,6 +9659,11 @@
         </w:tblBorders>
         <w:tblLayout w:type="fixed"/>
         <w:tblW w:w="10224" w:type="dxa"/>
+        <w:tblInd w:w="0" w:type="dxa"/>
+        <w:tblCellMar>
+          <w:left w:w="0" w:type="dxa"/>
+          <w:right w:w="0" w:type="dxa"/>
+        </w:tblCellMar>
       </w:tblPr>
       <w:tblGrid>
         <w:gridCol w:w="7920"/>
@@ -9411,6 +9761,11 @@
         </w:tblBorders>
         <w:tblLayout w:type="fixed"/>
         <w:tblW w:w="10224" w:type="dxa"/>
+        <w:tblInd w:w="0" w:type="dxa"/>
+        <w:tblCellMar>
+          <w:left w:w="0" w:type="dxa"/>
+          <w:right w:w="0" w:type="dxa"/>
+        </w:tblCellMar>
       </w:tblPr>
       <w:tblGrid>
         <w:gridCol w:w="7920"/>
@@ -9508,6 +9863,11 @@
         </w:tblBorders>
         <w:tblLayout w:type="fixed"/>
         <w:tblW w:w="10224" w:type="dxa"/>
+        <w:tblInd w:w="0" w:type="dxa"/>
+        <w:tblCellMar>
+          <w:left w:w="0" w:type="dxa"/>
+          <w:right w:w="0" w:type="dxa"/>
+        </w:tblCellMar>
       </w:tblPr>
       <w:tblGrid>
         <w:gridCol w:w="7920"/>
@@ -9605,6 +9965,11 @@
         </w:tblBorders>
         <w:tblLayout w:type="fixed"/>
         <w:tblW w:w="10224" w:type="dxa"/>
+        <w:tblInd w:w="0" w:type="dxa"/>
+        <w:tblCellMar>
+          <w:left w:w="0" w:type="dxa"/>
+          <w:right w:w="0" w:type="dxa"/>
+        </w:tblCellMar>
       </w:tblPr>
       <w:tblGrid>
         <w:gridCol w:w="7920"/>
@@ -9702,6 +10067,11 @@
         </w:tblBorders>
         <w:tblLayout w:type="fixed"/>
         <w:tblW w:w="10224" w:type="dxa"/>
+        <w:tblInd w:w="0" w:type="dxa"/>
+        <w:tblCellMar>
+          <w:left w:w="0" w:type="dxa"/>
+          <w:right w:w="0" w:type="dxa"/>
+        </w:tblCellMar>
       </w:tblPr>
       <w:tblGrid>
         <w:gridCol w:w="7920"/>
@@ -9799,6 +10169,11 @@
         </w:tblBorders>
         <w:tblLayout w:type="fixed"/>
         <w:tblW w:w="10224" w:type="dxa"/>
+        <w:tblInd w:w="0" w:type="dxa"/>
+        <w:tblCellMar>
+          <w:left w:w="0" w:type="dxa"/>
+          <w:right w:w="0" w:type="dxa"/>
+        </w:tblCellMar>
       </w:tblPr>
       <w:tblGrid>
         <w:gridCol w:w="7920"/>
@@ -9896,6 +10271,11 @@
         </w:tblBorders>
         <w:tblLayout w:type="fixed"/>
         <w:tblW w:w="10224" w:type="dxa"/>
+        <w:tblInd w:w="0" w:type="dxa"/>
+        <w:tblCellMar>
+          <w:left w:w="0" w:type="dxa"/>
+          <w:right w:w="0" w:type="dxa"/>
+        </w:tblCellMar>
       </w:tblPr>
       <w:tblGrid>
         <w:gridCol w:w="7920"/>
@@ -9993,6 +10373,11 @@
         </w:tblBorders>
         <w:tblLayout w:type="fixed"/>
         <w:tblW w:w="10224" w:type="dxa"/>
+        <w:tblInd w:w="0" w:type="dxa"/>
+        <w:tblCellMar>
+          <w:left w:w="0" w:type="dxa"/>
+          <w:right w:w="0" w:type="dxa"/>
+        </w:tblCellMar>
       </w:tblPr>
       <w:tblGrid>
         <w:gridCol w:w="7920"/>
@@ -10090,6 +10475,11 @@
         </w:tblBorders>
         <w:tblLayout w:type="fixed"/>
         <w:tblW w:w="10224" w:type="dxa"/>
+        <w:tblInd w:w="0" w:type="dxa"/>
+        <w:tblCellMar>
+          <w:left w:w="0" w:type="dxa"/>
+          <w:right w:w="0" w:type="dxa"/>
+        </w:tblCellMar>
       </w:tblPr>
       <w:tblGrid>
         <w:gridCol w:w="7920"/>
@@ -10190,6 +10580,11 @@
         </w:tblBorders>
         <w:tblLayout w:type="fixed"/>
         <w:tblW w:w="10224" w:type="dxa"/>
+        <w:tblInd w:w="0" w:type="dxa"/>
+        <w:tblCellMar>
+          <w:left w:w="0" w:type="dxa"/>
+          <w:right w:w="0" w:type="dxa"/>
+        </w:tblCellMar>
       </w:tblPr>
       <w:tblGrid>
         <w:gridCol w:w="7920"/>
@@ -10263,6 +10658,11 @@
         </w:tblBorders>
         <w:tblLayout w:type="fixed"/>
         <w:tblW w:w="10224" w:type="dxa"/>
+        <w:tblInd w:w="0" w:type="dxa"/>
+        <w:tblCellMar>
+          <w:left w:w="0" w:type="dxa"/>
+          <w:right w:w="0" w:type="dxa"/>
+        </w:tblCellMar>
       </w:tblPr>
       <w:tblGrid>
         <w:gridCol w:w="7920"/>
@@ -10336,6 +10736,11 @@
         </w:tblBorders>
         <w:tblLayout w:type="fixed"/>
         <w:tblW w:w="10224" w:type="dxa"/>
+        <w:tblInd w:w="0" w:type="dxa"/>
+        <w:tblCellMar>
+          <w:left w:w="0" w:type="dxa"/>
+          <w:right w:w="0" w:type="dxa"/>
+        </w:tblCellMar>
       </w:tblPr>
       <w:tblGrid>
         <w:gridCol w:w="7920"/>
@@ -10409,6 +10814,11 @@
         </w:tblBorders>
         <w:tblLayout w:type="fixed"/>
         <w:tblW w:w="10224" w:type="dxa"/>
+        <w:tblInd w:w="0" w:type="dxa"/>
+        <w:tblCellMar>
+          <w:left w:w="0" w:type="dxa"/>
+          <w:right w:w="0" w:type="dxa"/>
+        </w:tblCellMar>
       </w:tblPr>
       <w:tblGrid>
         <w:gridCol w:w="7920"/>
@@ -10482,6 +10892,11 @@
         </w:tblBorders>
         <w:tblLayout w:type="fixed"/>
         <w:tblW w:w="10224" w:type="dxa"/>
+        <w:tblInd w:w="0" w:type="dxa"/>
+        <w:tblCellMar>
+          <w:left w:w="0" w:type="dxa"/>
+          <w:right w:w="0" w:type="dxa"/>
+        </w:tblCellMar>
       </w:tblPr>
       <w:tblGrid>
         <w:gridCol w:w="7920"/>
@@ -10555,6 +10970,11 @@
         </w:tblBorders>
         <w:tblLayout w:type="fixed"/>
         <w:tblW w:w="10224" w:type="dxa"/>
+        <w:tblInd w:w="0" w:type="dxa"/>
+        <w:tblCellMar>
+          <w:left w:w="0" w:type="dxa"/>
+          <w:right w:w="0" w:type="dxa"/>
+        </w:tblCellMar>
       </w:tblPr>
       <w:tblGrid>
         <w:gridCol w:w="7920"/>
@@ -10628,6 +11048,11 @@
         </w:tblBorders>
         <w:tblLayout w:type="fixed"/>
         <w:tblW w:w="10224" w:type="dxa"/>
+        <w:tblInd w:w="0" w:type="dxa"/>
+        <w:tblCellMar>
+          <w:left w:w="0" w:type="dxa"/>
+          <w:right w:w="0" w:type="dxa"/>
+        </w:tblCellMar>
       </w:tblPr>
       <w:tblGrid>
         <w:gridCol w:w="7920"/>
@@ -10701,6 +11126,11 @@
         </w:tblBorders>
         <w:tblLayout w:type="fixed"/>
         <w:tblW w:w="10224" w:type="dxa"/>
+        <w:tblInd w:w="0" w:type="dxa"/>
+        <w:tblCellMar>
+          <w:left w:w="0" w:type="dxa"/>
+          <w:right w:w="0" w:type="dxa"/>
+        </w:tblCellMar>
       </w:tblPr>
       <w:tblGrid>
         <w:gridCol w:w="7920"/>
@@ -10774,6 +11204,11 @@
         </w:tblBorders>
         <w:tblLayout w:type="fixed"/>
         <w:tblW w:w="10224" w:type="dxa"/>
+        <w:tblInd w:w="0" w:type="dxa"/>
+        <w:tblCellMar>
+          <w:left w:w="0" w:type="dxa"/>
+          <w:right w:w="0" w:type="dxa"/>
+        </w:tblCellMar>
       </w:tblPr>
       <w:tblGrid>
         <w:gridCol w:w="7920"/>
@@ -10863,6 +11298,11 @@
         </w:tblBorders>
         <w:tblLayout w:type="fixed"/>
         <w:tblW w:w="10224" w:type="dxa"/>
+        <w:tblInd w:w="0" w:type="dxa"/>
+        <w:tblCellMar>
+          <w:left w:w="0" w:type="dxa"/>
+          <w:right w:w="0" w:type="dxa"/>
+        </w:tblCellMar>
       </w:tblPr>
       <w:tblGrid>
         <w:gridCol w:w="7920"/>
@@ -10936,6 +11376,11 @@
         </w:tblBorders>
         <w:tblLayout w:type="fixed"/>
         <w:tblW w:w="10224" w:type="dxa"/>
+        <w:tblInd w:w="0" w:type="dxa"/>
+        <w:tblCellMar>
+          <w:left w:w="0" w:type="dxa"/>
+          <w:right w:w="0" w:type="dxa"/>
+        </w:tblCellMar>
       </w:tblPr>
       <w:tblGrid>
         <w:gridCol w:w="7920"/>
@@ -11009,6 +11454,11 @@
         </w:tblBorders>
         <w:tblLayout w:type="fixed"/>
         <w:tblW w:w="10224" w:type="dxa"/>
+        <w:tblInd w:w="0" w:type="dxa"/>
+        <w:tblCellMar>
+          <w:left w:w="0" w:type="dxa"/>
+          <w:right w:w="0" w:type="dxa"/>
+        </w:tblCellMar>
       </w:tblPr>
       <w:tblGrid>
         <w:gridCol w:w="7920"/>
@@ -11082,6 +11532,11 @@
         </w:tblBorders>
         <w:tblLayout w:type="fixed"/>
         <w:tblW w:w="10224" w:type="dxa"/>
+        <w:tblInd w:w="0" w:type="dxa"/>
+        <w:tblCellMar>
+          <w:left w:w="0" w:type="dxa"/>
+          <w:right w:w="0" w:type="dxa"/>
+        </w:tblCellMar>
       </w:tblPr>
       <w:tblGrid>
         <w:gridCol w:w="7920"/>

</xml_diff>

<commit_message>
Cleanly sort newest-first the lists that were out of order in the source
Herausgeberbände, the [peer-reviewed] Aufsätze list, and Workshops had a few
entries out of chronological order in the original CV; sort them by year
(descending, stable) so they are perfectly newest-first. The two forthcoming
Bloomsbury handbook articles (no year yet) are placed at the top as in-press.

Co-Authored-By: Claude Opus 4.8 <noreply@anthropic.com>
</commit_message>
<xml_diff>
--- a/Helge_Kminek_Lebenslauf.docx
+++ b/Helge_Kminek_Lebenslauf.docx
@@ -1327,7 +1327,7 @@
           <w:i w:val="0"/>
           <w:sz w:val="20"/>
         </w:rPr>
-        <w:t>Costa, J./Kminek, H./Ruckelshauß, T./Singer-Brodowski, M./Weselek, J. (Hrsg.) (2025): Bildung für nachhaltige Entwicklung: Kontroversen und Debatten. (Schriftenreihe „Ökologie und Erziehungswissenschaft“ der Kommission Bildung für nachhaltige Entwicklung der DGfE). Opladen, Farmington Hills: Budrich, 166 S.</w:t>
+        <w:t>Kminek, H./Fingerle, M./Andresen, S. (Hrsg.) (2026): Erziehungswissenschaft und Ethik. Verstrickungen, Widersprüche und Spannungsfelder in Forschung und Lehre. Stuttgart: W. Kohlhammer, 112 S.</w:t>
       </w:r>
     </w:p>
     <w:p>
@@ -1342,7 +1342,7 @@
           <w:i w:val="0"/>
           <w:sz w:val="20"/>
         </w:rPr>
-        <w:t>Ertl, H./Holz, V./Idel, T.-S./Kminek, H./Singer-Brodowski, M./Wulf, Ch. (Hrsg.) (2025): Bildung für nachhaltige Entwicklung. Einblicke in aktuelle Forschungsprojekte. (Edition Zeitschrift für Erziehungswissenschaft, Bd. 17), 259 S.</w:t>
+        <w:t>Costa, J./Kminek, H./Ruckelshauß, T./Singer-Brodowski, M./Weselek, J. (Hrsg.) (2025): Bildung für nachhaltige Entwicklung: Kontroversen und Debatten. (Schriftenreihe „Ökologie und Erziehungswissenschaft“ der Kommission Bildung für nachhaltige Entwicklung der DGfE). Opladen, Farmington Hills: Budrich, 166 S.</w:t>
       </w:r>
     </w:p>
     <w:p>
@@ -1357,7 +1357,7 @@
           <w:i w:val="0"/>
           <w:sz w:val="20"/>
         </w:rPr>
-        <w:t>Kminek, H./Singer-Brodowski, M./Holz, V. (Hrsg.) (2024): Bildung für eine nachhaltige Entwicklung im Umbruch? Beiträge zur Theorieentwicklung angesichts ökologischer, gesellschaftlicher und individueller Umbrüche. (Schriftenreihe „Ökologie und Erziehungswissenschaft“ der Kommission Bildung für nachhaltige Entwicklung der DGfE). Opladen, Berlin, Toronto: Verlag Barbara Budrich, 213 S. DOI: 10.3224/84742736.</w:t>
+        <w:t>Ertl, H./Holz, V./Idel, T.-S./Kminek, H./Singer-Brodowski, M./Wulf, Ch. (Hrsg.) (2025): Bildung für nachhaltige Entwicklung. Einblicke in aktuelle Forschungsprojekte. (Edition Zeitschrift für Erziehungswissenschaft, Bd. 17), 259 S.</w:t>
       </w:r>
     </w:p>
     <w:p>
@@ -1372,7 +1372,7 @@
           <w:i w:val="0"/>
           <w:sz w:val="20"/>
         </w:rPr>
-        <w:t>Kminek, H./Fingerle, M./Andresen, S. (Hrsg.) (2026): Erziehungswissenschaft und Ethik. Verstrickungen, Widersprüche und Spannungsfelder in Forschung und Lehre. Stuttgart: W. Kohlhammer, 112 S.</w:t>
+        <w:t>Kminek, H./Singer-Brodowski, M./Holz, V. (Hrsg.) (2024): Bildung für eine nachhaltige Entwicklung im Umbruch? Beiträge zur Theorieentwicklung angesichts ökologischer, gesellschaftlicher und individueller Umbrüche. (Schriftenreihe „Ökologie und Erziehungswissenschaft“ der Kommission Bildung für nachhaltige Entwicklung der DGfE). Opladen, Berlin, Toronto: Verlag Barbara Budrich, 213 S. DOI: 10.3224/84742736.</w:t>
       </w:r>
     </w:p>
     <w:p>
@@ -1728,7 +1728,23 @@
           <w:i w:val="0"/>
           <w:sz w:val="20"/>
         </w:rPr>
-        <w:t>Ehras, C./Singer-Brodowski, M./Costa, J./Hemmer, I./Brenne, A./Denzin, A./Dick, M./Fischer, D./Kenner, S./Kminek, H./Kreid, S./Krengel, F./Lindau, A./Lohmann, J./Menthe, J./Meyer, M./Roczen, N./Schaal, S./Surkamp, C./Tacke, L./Weselek, J. (2026): Professionalisation of Teachers for Education for Sustainable Development in Germany: A Scoping Review. In: RISTAL – Research in Subject-matter Teaching and Learning, S. 1–64.</w:t>
+        <w:t>Kminek, H./Andresen, S.:</w:t>
+      </w:r>
+      <w:r>
+        <w:rPr>
+          <w:b w:val="0"/>
+          <w:i/>
+          <w:sz w:val="20"/>
+        </w:rPr>
+        <w:t>Historical Context</w:t>
+      </w:r>
+      <w:r>
+        <w:rPr>
+          <w:b w:val="0"/>
+          <w:i w:val="0"/>
+          <w:sz w:val="20"/>
+        </w:rPr>
+        <w:t>. In: Corsaro, W. (Hrsg.): Education and Childhood Studies. Bloomsbury. (Handbook article, angenommen)</w:t>
       </w:r>
     </w:p>
     <w:p>
@@ -1743,7 +1759,23 @@
           <w:i w:val="0"/>
           <w:sz w:val="20"/>
         </w:rPr>
-        <w:t>Kminek, H. (2026): About the Further Development of a Metatheoretical Analysis Grid for the Field of Education and (Non-)Sustainability. In: Education Sciences. Basel: MDPI Publishing, S. 1–23.</w:t>
+        <w:t>Dietz, T./Kminek, H./Wilmes, J.:</w:t>
+      </w:r>
+      <w:r>
+        <w:rPr>
+          <w:b w:val="0"/>
+          <w:i/>
+          <w:sz w:val="20"/>
+        </w:rPr>
+        <w:t>Health, Wellbeing and Welfare</w:t>
+      </w:r>
+      <w:r>
+        <w:rPr>
+          <w:b w:val="0"/>
+          <w:i w:val="0"/>
+          <w:sz w:val="20"/>
+        </w:rPr>
+        <w:t>. In: Corsaro, W. (Hrsg.): Education and Childhood Studies. Bloomsbury. (Handbook article, angenommen)</w:t>
       </w:r>
     </w:p>
     <w:p>
@@ -1758,7 +1790,7 @@
           <w:i w:val="0"/>
           <w:sz w:val="20"/>
         </w:rPr>
-        <w:t>Hempel, C./Heldt, I./Kater-Wettstädt, L./Kminek, H./Bieber, G. (2026): Editorial zum Schwerpunktthema: Schulische Querschnittsaufgaben (revisited). Zur (Über-)Fachlichkeit zeitgemäßer Bildung. In: Die Deutsche Schule. Münster, New York, München, Berlin: Waxmann, S. 4–9.</w:t>
+        <w:t>Ehras, C./Singer-Brodowski, M./Costa, J./Hemmer, I./Brenne, A./Denzin, A./Dick, M./Fischer, D./Kenner, S./Kminek, H./Kreid, S./Krengel, F./Lindau, A./Lohmann, J./Menthe, J./Meyer, M./Roczen, N./Schaal, S./Surkamp, C./Tacke, L./Weselek, J. (2026): Professionalisation of Teachers for Education for Sustainable Development in Germany: A Scoping Review. In: RISTAL – Research in Subject-matter Teaching and Learning, S. 1–64.</w:t>
       </w:r>
     </w:p>
     <w:p>
@@ -1773,7 +1805,7 @@
           <w:i w:val="0"/>
           <w:sz w:val="20"/>
         </w:rPr>
-        <w:t>Kminek, H. (2025): On Potentials, Limits and Concerns of Education for Sustainable Development in General, and Anthropology as Teaching Content in Particular. In: Paragrana. Internationale Zeitschrift für Historische Anthropologie. Berlin: Akademie Verlag, S. 174–185.</w:t>
+        <w:t>Kminek, H. (2026): About the Further Development of a Metatheoretical Analysis Grid for the Field of Education and (Non-)Sustainability. In: Education Sciences. Basel: MDPI Publishing, S. 1–23.</w:t>
       </w:r>
     </w:p>
     <w:p>
@@ -1788,7 +1820,7 @@
           <w:i w:val="0"/>
           <w:sz w:val="20"/>
         </w:rPr>
-        <w:t>Kminek, H. (2025): Politische Bildung und BNE in situ – zu Notwendigkeit, dem Potenzial und Grenzen rekonstruktiver Unterrichtsforschung. In: Frech, S./Geyer, R./Oberle, M. (Hrsg.): Politische Bildung für nachhaltige Entwicklung. Schwalbach/Ts.: Wochenschau Verlag, 21.10.2025, S. 151–166.</w:t>
+        <w:t>Hempel, C./Heldt, I./Kater-Wettstädt, L./Kminek, H./Bieber, G. (2026): Editorial zum Schwerpunktthema: Schulische Querschnittsaufgaben (revisited). Zur (Über-)Fachlichkeit zeitgemäßer Bildung. In: Die Deutsche Schule. Münster, New York, München, Berlin: Waxmann, S. 4–9.</w:t>
       </w:r>
     </w:p>
     <w:p>
@@ -1803,7 +1835,7 @@
           <w:i w:val="0"/>
           <w:sz w:val="20"/>
         </w:rPr>
-        <w:t>Kminek, H./Holfelder, A.-K. (2025): Klimabildung im Kontext von Bildungstheorie. In: Höttecke, D./Heinicke, S./Martens, H./Nehring, A./Rabe, T. (Hrsg.): Handbuch Klimabildung. Wiesbaden: Springer VS, 20.10.2025, S. 21–44.</w:t>
+        <w:t>Kminek, H. (2026): Zu den ethischen Fragen im Praktikum und den dialektischen Verstrickungen von Fördern und Fordern sowie von Fürsorge und Kontrolle. In: Kminek, H./Fingerle, M./Andresen, S. (Hrsg.) (2026): Erziehungswissenschaft und Ethik. Stuttgart: Kohlhammer, S. 75–92.</w:t>
       </w:r>
     </w:p>
     <w:p>
@@ -1818,7 +1850,7 @@
           <w:i w:val="0"/>
           <w:sz w:val="20"/>
         </w:rPr>
-        <w:t>Kminek, H. (2025): About a Metatheory of Education for Sustainable Development as a Cross-cutting Issue of Teacher Education. In: Hermes, M./Lengler, A./Meister, N./Saß, M. (Hrsg.): Lehrkräftebildung im Wandel. Marburg: Tectum Verlag, 11.04.2025, S. 149–170.</w:t>
+        <w:t>Kminek, H. (2025): On Potentials, Limits and Concerns of Education for Sustainable Development in General, and Anthropology as Teaching Content in Particular. In: Paragrana. Internationale Zeitschrift für Historische Anthropologie. Berlin: Akademie Verlag, S. 174–185.</w:t>
       </w:r>
     </w:p>
     <w:p>
@@ -1833,7 +1865,7 @@
           <w:i w:val="0"/>
           <w:sz w:val="20"/>
         </w:rPr>
-        <w:t>Kminek, H. (2024): Zum Beitrag der kritischen Bildungstheorie Peter Eulers im Anthropozän. In: Soziale Passagen. Berlin: Springer.</w:t>
+        <w:t>Kminek, H. (2025): Politische Bildung und BNE in situ – zu Notwendigkeit, dem Potenzial und Grenzen rekonstruktiver Unterrichtsforschung. In: Frech, S./Geyer, R./Oberle, M. (Hrsg.): Politische Bildung für nachhaltige Entwicklung. Schwalbach/Ts.: Wochenschau Verlag, 21.10.2025, S. 151–166.</w:t>
       </w:r>
     </w:p>
     <w:p>
@@ -1848,7 +1880,7 @@
           <w:i w:val="0"/>
           <w:sz w:val="20"/>
         </w:rPr>
-        <w:t>Kminek, H./Bonnes, J. (2024): As Little Media Use as Possible, as Much Media Education as Necessary. On the Content-related Provisions of a Normative Demand. In: Rieckmann, M./Maurer, B./Schluchter, J. (Hrsg.): Medien – Bildung – Nachhaltige Entwicklung. Weinheim, Basel: Beltz Juventa, 02.05.2024, S. 57–68.</w:t>
+        <w:t>Kminek, H./Holfelder, A.-K. (2025): Klimabildung im Kontext von Bildungstheorie. In: Höttecke, D./Heinicke, S./Martens, H./Nehring, A./Rabe, T. (Hrsg.): Handbuch Klimabildung. Wiesbaden: Springer VS, 20.10.2025, S. 21–44.</w:t>
       </w:r>
     </w:p>
     <w:p>
@@ -1863,7 +1895,7 @@
           <w:i w:val="0"/>
           <w:sz w:val="20"/>
         </w:rPr>
-        <w:t>Kminek, H. (2024): Survival through Bildung in the Face of the Destruction of Human Livelihoods. In: Kminek, H. (Hrsg.): Survival through Bildung. Opladen, Berlin, Toronto: Budrich, S. 35–62.</w:t>
+        <w:t>Kminek, H. (2025): About a Metatheory of Education for Sustainable Development as a Cross-cutting Issue of Teacher Education. In: Hermes, M./Lengler, A./Meister, N./Saß, M. (Hrsg.): Lehrkräftebildung im Wandel. Marburg: Tectum Verlag, 11.04.2025, S. 149–170.</w:t>
       </w:r>
     </w:p>
     <w:p>
@@ -1878,7 +1910,7 @@
           <w:i w:val="0"/>
           <w:sz w:val="20"/>
         </w:rPr>
-        <w:t>Kminek, H. (2026): Zu den ethischen Fragen im Praktikum und den dialektischen Verstrickungen von Fördern und Fordern sowie von Fürsorge und Kontrolle. In: Kminek, H./Fingerle, M./Andresen, S. (Hrsg.) (2026): Erziehungswissenschaft und Ethik. Stuttgart: Kohlhammer, S. 75–92.</w:t>
+        <w:t>Kminek, H. (2024): Zum Beitrag der kritischen Bildungstheorie Peter Eulers im Anthropozän. In: Soziale Passagen. Berlin: Springer.</w:t>
       </w:r>
     </w:p>
     <w:p>
@@ -1893,7 +1925,52 @@
           <w:i w:val="0"/>
           <w:sz w:val="20"/>
         </w:rPr>
-        <w:t>Kminek, H./Andresen, S.:</w:t>
+        <w:t>Kminek, H./Bonnes, J. (2024): As Little Media Use as Possible, as Much Media Education as Necessary. On the Content-related Provisions of a Normative Demand. In: Rieckmann, M./Maurer, B./Schluchter, J. (Hrsg.): Medien – Bildung – Nachhaltige Entwicklung. Weinheim, Basel: Beltz Juventa, 02.05.2024, S. 57–68.</w:t>
+      </w:r>
+    </w:p>
+    <w:p>
+      <w:pPr>
+        <w:pStyle w:val="ListBullet"/>
+        <w:spacing w:before="0" w:after="0"/>
+        <w:ind w:left="360"/>
+      </w:pPr>
+      <w:r>
+        <w:rPr>
+          <w:b w:val="0"/>
+          <w:i w:val="0"/>
+          <w:sz w:val="20"/>
+        </w:rPr>
+        <w:t>Kminek, H. (2024): Survival through Bildung in the Face of the Destruction of Human Livelihoods. In: Kminek, H. (Hrsg.): Survival through Bildung. Opladen, Berlin, Toronto: Budrich, S. 35–62.</w:t>
+      </w:r>
+    </w:p>
+    <w:p>
+      <w:pPr>
+        <w:pStyle w:val="ListBullet"/>
+        <w:spacing w:before="0" w:after="0"/>
+        <w:ind w:left="360"/>
+      </w:pPr>
+      <w:r>
+        <w:rPr>
+          <w:b w:val="0"/>
+          <w:i w:val="0"/>
+          <w:sz w:val="20"/>
+        </w:rPr>
+        <w:t>Krug, A./Kminek, H. (2024): Bildung für nachhaltige Entwicklung im Ethik- und Philosophieunterricht – Wertediskursiv, problemorientiert und kritisch-reflexiv. In: Carrapatoso, A./Rehm, M./Reinhardt, V./Wilhelm, M. (Hrsg.), Wirksamer Unterricht in BNE (Unterrichtsqualität, Bd. 19). Baltmannsweiler: Schneider Verlag Hohengehren, S. 91–103.</w:t>
+      </w:r>
+    </w:p>
+    <w:p>
+      <w:pPr>
+        <w:pStyle w:val="ListBullet"/>
+        <w:spacing w:before="0" w:after="0"/>
+        <w:ind w:left="360"/>
+      </w:pPr>
+      <w:r>
+        <w:rPr>
+          <w:b w:val="0"/>
+          <w:i w:val="0"/>
+          <w:sz w:val="20"/>
+        </w:rPr>
+        <w:t>Kminek, H. (2023):</w:t>
       </w:r>
       <w:r>
         <w:rPr>
@@ -1901,7 +1978,7 @@
           <w:i/>
           <w:sz w:val="20"/>
         </w:rPr>
-        <w:t>Historical Context</w:t>
+        <w:t>Gender</w:t>
       </w:r>
       <w:r>
         <w:rPr>
@@ -1924,7 +2001,7 @@
           <w:i w:val="0"/>
           <w:sz w:val="20"/>
         </w:rPr>
-        <w:t>Dietz, T./Kminek, H./Wilmes, J.:</w:t>
+        <w:t>Kminek, H. (2023):</w:t>
       </w:r>
       <w:r>
         <w:rPr>
@@ -1932,7 +2009,7 @@
           <w:i/>
           <w:sz w:val="20"/>
         </w:rPr>
-        <w:t>Health, Wellbeing and Welfare</w:t>
+        <w:t>Poverty</w:t>
       </w:r>
       <w:r>
         <w:rPr>
@@ -1941,83 +2018,6 @@
           <w:sz w:val="20"/>
         </w:rPr>
         <w:t>. In: Corsaro, W. (Hrsg.): Education and Childhood Studies. Bloomsbury. (Handbook article, angenommen)</w:t>
-      </w:r>
-    </w:p>
-    <w:p>
-      <w:pPr>
-        <w:pStyle w:val="ListBullet"/>
-        <w:spacing w:before="0" w:after="0"/>
-        <w:ind w:left="360"/>
-      </w:pPr>
-      <w:r>
-        <w:rPr>
-          <w:b w:val="0"/>
-          <w:i w:val="0"/>
-          <w:sz w:val="20"/>
-        </w:rPr>
-        <w:t>Kminek, H. (2023):</w:t>
-      </w:r>
-      <w:r>
-        <w:rPr>
-          <w:b w:val="0"/>
-          <w:i/>
-          <w:sz w:val="20"/>
-        </w:rPr>
-        <w:t>Gender</w:t>
-      </w:r>
-      <w:r>
-        <w:rPr>
-          <w:b w:val="0"/>
-          <w:i w:val="0"/>
-          <w:sz w:val="20"/>
-        </w:rPr>
-        <w:t>. In: Corsaro, W. (Hrsg.): Education and Childhood Studies. Bloomsbury. (Handbook article, angenommen)</w:t>
-      </w:r>
-    </w:p>
-    <w:p>
-      <w:pPr>
-        <w:pStyle w:val="ListBullet"/>
-        <w:spacing w:before="0" w:after="0"/>
-        <w:ind w:left="360"/>
-      </w:pPr>
-      <w:r>
-        <w:rPr>
-          <w:b w:val="0"/>
-          <w:i w:val="0"/>
-          <w:sz w:val="20"/>
-        </w:rPr>
-        <w:t>Kminek, H. (2023):</w:t>
-      </w:r>
-      <w:r>
-        <w:rPr>
-          <w:b w:val="0"/>
-          <w:i/>
-          <w:sz w:val="20"/>
-        </w:rPr>
-        <w:t>Poverty</w:t>
-      </w:r>
-      <w:r>
-        <w:rPr>
-          <w:b w:val="0"/>
-          <w:i w:val="0"/>
-          <w:sz w:val="20"/>
-        </w:rPr>
-        <w:t>. In: Corsaro, W. (Hrsg.): Education and Childhood Studies. Bloomsbury. (Handbook article, angenommen)</w:t>
-      </w:r>
-    </w:p>
-    <w:p>
-      <w:pPr>
-        <w:pStyle w:val="ListBullet"/>
-        <w:spacing w:before="0" w:after="0"/>
-        <w:ind w:left="360"/>
-      </w:pPr>
-      <w:r>
-        <w:rPr>
-          <w:b w:val="0"/>
-          <w:i w:val="0"/>
-          <w:sz w:val="20"/>
-        </w:rPr>
-        <w:t>Krug, A./Kminek, H. (2024): Bildung für nachhaltige Entwicklung im Ethik- und Philosophieunterricht – Wertediskursiv, problemorientiert und kritisch-reflexiv. In: Carrapatoso, A./Rehm, M./Reinhardt, V./Wilhelm, M. (Hrsg.), Wirksamer Unterricht in BNE (Unterrichtsqualität, Bd. 19). Baltmannsweiler: Schneider Verlag Hohengehren, S. 91–103.</w:t>
       </w:r>
     </w:p>
     <w:p>
@@ -3394,7 +3394,7 @@
           <w:i w:val="0"/>
           <w:sz w:val="20"/>
         </w:rPr>
-        <w:t>„Virtuelle Forschungsumgebung – eine Bereicherung für Forschung und Lehre?“. 22.–23.04.2016. 4. Tagung AG Kasuistik in der Lehrer_innenbildung. Göttingen.</w:t>
+        <w:t>„Möglichkeiten und Grenzen der Verbindung von Fachdidaktik und Kasuistik […]“ (gemeinsam mit JProf. Dr. A. Burkard und M. Frank). 3.–4.03.2017. 6. Arbeitstagung AG Kasuistik in der Lehrer_innenbildung. Halle (Saale).</w:t>
       </w:r>
     </w:p>
     <w:p>
@@ -3409,7 +3409,7 @@
           <w:i w:val="0"/>
           <w:sz w:val="20"/>
         </w:rPr>
-        <w:t>„Möglichkeiten und Grenzen der Verbindung von Fachdidaktik und Kasuistik […]“ (gemeinsam mit JProf. Dr. A. Burkard und M. Frank). 3.–4.03.2017. 6. Arbeitstagung AG Kasuistik in der Lehrer_innenbildung. Halle (Saale).</w:t>
+        <w:t>„Virtuelle Forschungsumgebung – eine Bereicherung für Forschung und Lehre?“. 22.–23.04.2016. 4. Tagung AG Kasuistik in der Lehrer_innenbildung. Göttingen.</w:t>
       </w:r>
     </w:p>
     <w:p>

</xml_diff>

<commit_message>
Update per Helge: publish Schneider et al. 2026, delete 3 abandoned papers
The Schneider co-authored paper was published as 'About transformation in
transdisciplinary approaches' in Environmental Sciences Europe (2026); replaced
its old in-Vorbereitung placeholder with the full citation and DOI
(10.1186/s12302-026-01402-y). Per Helge, the other three in-Vorbereitung 2023
articles (Planetary Thinking; Engaging with Philosophy of Science in
Environmental Education Research; On Education for Sustainable Development
During the Lack of a Socio-ecological Transformation) will not appear as
separate publications, so removed them.

Co-Authored-By: Claude Opus 4.8 <noreply@anthropic.com>
</commit_message>
<xml_diff>
--- a/Helge_Kminek_Lebenslauf.docx
+++ b/Helge_Kminek_Lebenslauf.docx
@@ -1519,52 +1519,7 @@
           <w:i w:val="0"/>
           <w:sz w:val="20"/>
         </w:rPr>
-        <w:t>Kminek, H./Schink, P./Bogards, R./Böhning-Gaese, K./Curtius, J./Döll, P./Hickler, T./Holler, H./Hummel, D./Lemke, T./Lutz-Bachmann, M./Marg, O./Mollendorf, D. (2023): Planetary Thinking – A Systematic Outline of a Future Research Programme. (Arbeitstitel, in Vorbereitung)</w:t>
-      </w:r>
-    </w:p>
-    <w:p>
-      <w:pPr>
-        <w:pStyle w:val="ListBullet"/>
-        <w:spacing w:before="0" w:after="0"/>
-        <w:ind w:left="360"/>
-      </w:pPr>
-      <w:r>
-        <w:rPr>
-          <w:b w:val="0"/>
-          <w:i w:val="0"/>
-          <w:sz w:val="20"/>
-        </w:rPr>
-        <w:t>Kminek, H./Schneider, F./Böhning-Gaese, K./Döll, P./Holler, H./Marg, O./Mollendorf, D./Schlottmann, A. (2023): On the Philosophy of Science Reflection of Transdisciplinary Research. A Theoretical Review. (Arbeitstitel, in Vorbereitung)</w:t>
-      </w:r>
-    </w:p>
-    <w:p>
-      <w:pPr>
-        <w:pStyle w:val="ListBullet"/>
-        <w:spacing w:before="0" w:after="0"/>
-        <w:ind w:left="360"/>
-      </w:pPr>
-      <w:r>
-        <w:rPr>
-          <w:b w:val="0"/>
-          <w:i w:val="0"/>
-          <w:sz w:val="20"/>
-        </w:rPr>
-        <w:t>Kminek, H./Graber, J. (2023): Engaging with Philosophy of Science in Environmental Education Research. (Arbeitstitel, in Vorbereitung)</w:t>
-      </w:r>
-    </w:p>
-    <w:p>
-      <w:pPr>
-        <w:pStyle w:val="ListBullet"/>
-        <w:spacing w:before="0" w:after="0"/>
-        <w:ind w:left="360"/>
-      </w:pPr>
-      <w:r>
-        <w:rPr>
-          <w:b w:val="0"/>
-          <w:i w:val="0"/>
-          <w:sz w:val="20"/>
-        </w:rPr>
-        <w:t>Kminek, H. (2023): On Education for Sustainable Development During the Lack of a Socio-ecological Transformation. (Arbeitstitel, in Vorbereitung)</w:t>
+        <w:t>Schneider, F./Kminek, H./Böhning-Gaese, K. (2026): About transformation in transdisciplinary approaches. Environmental Sciences Europe. DOI: 10.1186/s12302-026-01402-y.</w:t>
       </w:r>
     </w:p>
     <w:p>

</xml_diff>